<commit_message>
Update besar pada UI
</commit_message>
<xml_diff>
--- a/dokumen/02_DOKUMENTASI_PROGRAM.docx
+++ b/dokumen/02_DOKUMENTASI_PROGRAM.docx
@@ -573,7 +573,7 @@
                 <w:sz w:val="19"/>
                 <w:szCs w:val="19"/>
               </w:rPr>
-              <w:t xml:space="preserve">PHPUnit 11 — 66 test, 221 assertion, semua lulus</w:t>
+              <w:t xml:space="preserve">PHPUnit 11 — 75 test, 257 assertion, semua lulus</w:t>
             </w:r>
           </w:p>
         </w:tc>
@@ -1106,7 +1106,7 @@
           </w:pPr>
           <w:hyperlink w:history="1" w:anchor="_Toc20">
             <w:r>
-              <w:t xml:space="preserve">7.8 Penanganan Error 419 — bootstrap/app.php</w:t>
+              <w:t xml:space="preserve">7.8 Suasana Login dan Audio — App\Support\Suasana</w:t>
             </w:r>
             <w:r>
               <w:tab/>
@@ -1121,14 +1121,15 @@
         </w:p>
         <w:p>
           <w:pPr>
-            <w:pStyle w:val="TOC1"/>
+            <w:pStyle w:val="TOC2"/>
             <w:tabs>
               <w:tab w:val="right" w:pos="9638" w:leader="dot"/>
             </w:tabs>
+            <w:ind w:left="220"/>
           </w:pPr>
           <w:hyperlink w:history="1" w:anchor="_Toc21">
             <w:r>
-              <w:t xml:space="preserve">8. Keamanan</w:t>
+              <w:t xml:space="preserve">7.9 Mode Terang / Gelap — resources/js/tema.js</w:t>
             </w:r>
             <w:r>
               <w:tab/>
@@ -1143,14 +1144,15 @@
         </w:p>
         <w:p>
           <w:pPr>
-            <w:pStyle w:val="TOC1"/>
+            <w:pStyle w:val="TOC2"/>
             <w:tabs>
               <w:tab w:val="right" w:pos="9638" w:leader="dot"/>
             </w:tabs>
+            <w:ind w:left="220"/>
           </w:pPr>
           <w:hyperlink w:history="1" w:anchor="_Toc22">
             <w:r>
-              <w:t xml:space="preserve">9. Debugging</w:t>
+              <w:t xml:space="preserve">7.10 Musik Bad Apple!! — resources/js/musik.js</w:t>
             </w:r>
             <w:r>
               <w:tab/>
@@ -1173,7 +1175,7 @@
           </w:pPr>
           <w:hyperlink w:history="1" w:anchor="_Toc23">
             <w:r>
-              <w:t xml:space="preserve">9.1 Bug yang Ditemukan dan Perbaikannya</w:t>
+              <w:t xml:space="preserve">7.11 Tanpa Pindah Halaman dan Popup — Turbo</w:t>
             </w:r>
             <w:r>
               <w:tab/>
@@ -1196,7 +1198,7 @@
           </w:pPr>
           <w:hyperlink w:history="1" w:anchor="_Toc24">
             <w:r>
-              <w:t xml:space="preserve">9.2 Teknik Debugging</w:t>
+              <w:t xml:space="preserve">7.12 Penanganan Error 419 — bootstrap/app.php</w:t>
             </w:r>
             <w:r>
               <w:tab/>
@@ -1218,7 +1220,7 @@
           </w:pPr>
           <w:hyperlink w:history="1" w:anchor="_Toc25">
             <w:r>
-              <w:t xml:space="preserve">10. Pengujian Unit Program</w:t>
+              <w:t xml:space="preserve">8. Keamanan</w:t>
             </w:r>
             <w:r>
               <w:tab/>
@@ -1240,7 +1242,7 @@
           </w:pPr>
           <w:hyperlink w:history="1" w:anchor="_Toc26">
             <w:r>
-              <w:t xml:space="preserve">11. Pemetaan Unit Kompetensi</w:t>
+              <w:t xml:space="preserve">9. Debugging</w:t>
             </w:r>
             <w:r>
               <w:tab/>
@@ -1248,6 +1250,52 @@
             <w:r>
               <w:fldChar w:fldCharType="begin" w:dirty="true"/>
               <w:instrText xml:space="preserve">PAGEREF _Toc26 \h</w:instrText>
+              <w:fldChar w:fldCharType="separate"/>
+              <w:fldChar w:fldCharType="end"/>
+            </w:r>
+          </w:hyperlink>
+        </w:p>
+        <w:p>
+          <w:pPr>
+            <w:pStyle w:val="TOC2"/>
+            <w:tabs>
+              <w:tab w:val="right" w:pos="9638" w:leader="dot"/>
+            </w:tabs>
+            <w:ind w:left="220"/>
+          </w:pPr>
+          <w:hyperlink w:history="1" w:anchor="_Toc27">
+            <w:r>
+              <w:t xml:space="preserve">9.1 Bug yang Ditemukan dan Perbaikannya</w:t>
+            </w:r>
+            <w:r>
+              <w:tab/>
+            </w:r>
+            <w:r>
+              <w:fldChar w:fldCharType="begin" w:dirty="true"/>
+              <w:instrText xml:space="preserve">PAGEREF _Toc27 \h</w:instrText>
+              <w:fldChar w:fldCharType="separate"/>
+              <w:fldChar w:fldCharType="end"/>
+            </w:r>
+          </w:hyperlink>
+        </w:p>
+        <w:p>
+          <w:pPr>
+            <w:pStyle w:val="TOC2"/>
+            <w:tabs>
+              <w:tab w:val="right" w:pos="9638" w:leader="dot"/>
+            </w:tabs>
+            <w:ind w:left="220"/>
+          </w:pPr>
+          <w:hyperlink w:history="1" w:anchor="_Toc28">
+            <w:r>
+              <w:t xml:space="preserve">9.2 Teknik Debugging</w:t>
+            </w:r>
+            <w:r>
+              <w:tab/>
+            </w:r>
+            <w:r>
+              <w:fldChar w:fldCharType="begin" w:dirty="true"/>
+              <w:instrText xml:space="preserve">PAGEREF _Toc28 \h</w:instrText>
               <w:fldChar w:fldCharType="separate"/>
               <w:fldChar w:fldCharType="end"/>
             </w:r>
@@ -1260,7 +1308,51 @@
               <w:tab w:val="right" w:pos="9638" w:leader="dot"/>
             </w:tabs>
           </w:pPr>
-          <w:hyperlink w:history="1" w:anchor="_Toc27">
+          <w:hyperlink w:history="1" w:anchor="_Toc29">
+            <w:r>
+              <w:t xml:space="preserve">10. Pengujian Unit Program</w:t>
+            </w:r>
+            <w:r>
+              <w:tab/>
+            </w:r>
+            <w:r>
+              <w:fldChar w:fldCharType="begin" w:dirty="true"/>
+              <w:instrText xml:space="preserve">PAGEREF _Toc29 \h</w:instrText>
+              <w:fldChar w:fldCharType="separate"/>
+              <w:fldChar w:fldCharType="end"/>
+            </w:r>
+          </w:hyperlink>
+        </w:p>
+        <w:p>
+          <w:pPr>
+            <w:pStyle w:val="TOC1"/>
+            <w:tabs>
+              <w:tab w:val="right" w:pos="9638" w:leader="dot"/>
+            </w:tabs>
+          </w:pPr>
+          <w:hyperlink w:history="1" w:anchor="_Toc30">
+            <w:r>
+              <w:t xml:space="preserve">11. Pemetaan Unit Kompetensi</w:t>
+            </w:r>
+            <w:r>
+              <w:tab/>
+            </w:r>
+            <w:r>
+              <w:fldChar w:fldCharType="begin" w:dirty="true"/>
+              <w:instrText xml:space="preserve">PAGEREF _Toc30 \h</w:instrText>
+              <w:fldChar w:fldCharType="separate"/>
+              <w:fldChar w:fldCharType="end"/>
+            </w:r>
+          </w:hyperlink>
+        </w:p>
+        <w:p>
+          <w:pPr>
+            <w:pStyle w:val="TOC1"/>
+            <w:tabs>
+              <w:tab w:val="right" w:pos="9638" w:leader="dot"/>
+            </w:tabs>
+          </w:pPr>
+          <w:hyperlink w:history="1" w:anchor="_Toc31">
             <w:r>
               <w:t xml:space="preserve">12. Skenario Demo</w:t>
             </w:r>
@@ -1269,7 +1361,7 @@
             </w:r>
             <w:r>
               <w:fldChar w:fldCharType="begin" w:dirty="true"/>
-              <w:instrText xml:space="preserve">PAGEREF _Toc27 \h</w:instrText>
+              <w:instrText xml:space="preserve">PAGEREF _Toc31 \h</w:instrText>
               <w:fldChar w:fldCharType="separate"/>
               <w:fldChar w:fldCharType="end"/>
             </w:r>
@@ -1775,9 +1867,9 @@
         </w:tblBorders>
       </w:tblPr>
       <w:tblGrid>
-        <w:gridCol w:w="713"/>
-        <w:gridCol w:w="1784"/>
-        <w:gridCol w:w="7141"/>
+        <w:gridCol w:w="572"/>
+        <w:gridCol w:w="3339"/>
+        <w:gridCol w:w="5727"/>
       </w:tblGrid>
       <w:tr>
         <w:trPr>
@@ -1785,7 +1877,7 @@
         </w:trPr>
         <w:tc>
           <w:tcPr>
-            <w:tcW w:type="dxa" w:w="713"/>
+            <w:tcW w:type="dxa" w:w="572"/>
             <w:tcBorders>
               <w:top w:val="single" w:color="BFBFBF" w:sz="4"/>
               <w:left w:val="single" w:color="BFBFBF" w:sz="4"/>
@@ -1815,7 +1907,7 @@
         </w:tc>
         <w:tc>
           <w:tcPr>
-            <w:tcW w:type="dxa" w:w="1784"/>
+            <w:tcW w:type="dxa" w:w="3339"/>
             <w:tcBorders>
               <w:top w:val="single" w:color="BFBFBF" w:sz="4"/>
               <w:left w:val="single" w:color="BFBFBF" w:sz="4"/>
@@ -1845,7 +1937,7 @@
         </w:tc>
         <w:tc>
           <w:tcPr>
-            <w:tcW w:type="dxa" w:w="7141"/>
+            <w:tcW w:type="dxa" w:w="5727"/>
             <w:tcBorders>
               <w:top w:val="single" w:color="BFBFBF" w:sz="4"/>
               <w:left w:val="single" w:color="BFBFBF" w:sz="4"/>
@@ -1880,7 +1972,7 @@
         </w:trPr>
         <w:tc>
           <w:tcPr>
-            <w:tcW w:type="dxa" w:w="713"/>
+            <w:tcW w:type="dxa" w:w="572"/>
             <w:tcBorders>
               <w:top w:val="single" w:color="BFBFBF" w:sz="4"/>
               <w:left w:val="single" w:color="BFBFBF" w:sz="4"/>
@@ -1906,7 +1998,7 @@
         </w:tc>
         <w:tc>
           <w:tcPr>
-            <w:tcW w:type="dxa" w:w="1784"/>
+            <w:tcW w:type="dxa" w:w="3339"/>
             <w:tcBorders>
               <w:top w:val="single" w:color="BFBFBF" w:sz="4"/>
               <w:left w:val="single" w:color="BFBFBF" w:sz="4"/>
@@ -1932,27 +2024,27 @@
         </w:tc>
         <w:tc>
           <w:tcPr>
-            <w:tcW w:type="dxa" w:w="7141"/>
-            <w:tcBorders>
-              <w:top w:val="single" w:color="BFBFBF" w:sz="4"/>
-              <w:left w:val="single" w:color="BFBFBF" w:sz="4"/>
-              <w:bottom w:val="single" w:color="BFBFBF" w:sz="4"/>
-              <w:right w:val="single" w:color="BFBFBF" w:sz="4"/>
-            </w:tcBorders>
-            <w:tcMar>
-              <w:top w:type="dxa" w:w="60"/>
-              <w:left w:type="dxa" w:w="100"/>
-              <w:bottom w:type="dxa" w:w="60"/>
-              <w:right w:type="dxa" w:w="100"/>
-            </w:tcMar>
-          </w:tcPr>
-          <w:p>
-            <w:r>
-              <w:rPr>
-                <w:sz w:val="19"/>
-                <w:szCs w:val="19"/>
-              </w:rPr>
-              <w:t xml:space="preserve">Login memakai username dan password (password tersimpan ter-hash)</w:t>
+            <w:tcW w:type="dxa" w:w="5727"/>
+            <w:tcBorders>
+              <w:top w:val="single" w:color="BFBFBF" w:sz="4"/>
+              <w:left w:val="single" w:color="BFBFBF" w:sz="4"/>
+              <w:bottom w:val="single" w:color="BFBFBF" w:sz="4"/>
+              <w:right w:val="single" w:color="BFBFBF" w:sz="4"/>
+            </w:tcBorders>
+            <w:tcMar>
+              <w:top w:type="dxa" w:w="60"/>
+              <w:left w:type="dxa" w:w="100"/>
+              <w:bottom w:type="dxa" w:w="60"/>
+              <w:right w:type="dxa" w:w="100"/>
+            </w:tcMar>
+          </w:tcPr>
+          <w:p>
+            <w:r>
+              <w:rPr>
+                <w:sz w:val="19"/>
+                <w:szCs w:val="19"/>
+              </w:rPr>
+              <w:t xml:space="preserve">Login memakai username dan password (password tersimpan ter-hash); halaman login bergaya siluet monokrom dengan animasi, jam berjalan, salam dan suara suasana (audio) sesuai waktu pagi/siang/sore/malam</w:t>
             </w:r>
           </w:p>
         </w:tc>
@@ -1963,7 +2055,7 @@
         </w:trPr>
         <w:tc>
           <w:tcPr>
-            <w:tcW w:type="dxa" w:w="713"/>
+            <w:tcW w:type="dxa" w:w="572"/>
             <w:tcBorders>
               <w:top w:val="single" w:color="BFBFBF" w:sz="4"/>
               <w:left w:val="single" w:color="BFBFBF" w:sz="4"/>
@@ -1989,7 +2081,7 @@
         </w:tc>
         <w:tc>
           <w:tcPr>
-            <w:tcW w:type="dxa" w:w="1784"/>
+            <w:tcW w:type="dxa" w:w="3339"/>
             <w:tcBorders>
               <w:top w:val="single" w:color="BFBFBF" w:sz="4"/>
               <w:left w:val="single" w:color="BFBFBF" w:sz="4"/>
@@ -2015,7 +2107,7 @@
         </w:tc>
         <w:tc>
           <w:tcPr>
-            <w:tcW w:type="dxa" w:w="7141"/>
+            <w:tcW w:type="dxa" w:w="5727"/>
             <w:tcBorders>
               <w:top w:val="single" w:color="BFBFBF" w:sz="4"/>
               <w:left w:val="single" w:color="BFBFBF" w:sz="4"/>
@@ -2046,7 +2138,7 @@
         </w:trPr>
         <w:tc>
           <w:tcPr>
-            <w:tcW w:type="dxa" w:w="713"/>
+            <w:tcW w:type="dxa" w:w="572"/>
             <w:tcBorders>
               <w:top w:val="single" w:color="BFBFBF" w:sz="4"/>
               <w:left w:val="single" w:color="BFBFBF" w:sz="4"/>
@@ -2072,7 +2164,7 @@
         </w:tc>
         <w:tc>
           <w:tcPr>
-            <w:tcW w:type="dxa" w:w="1784"/>
+            <w:tcW w:type="dxa" w:w="3339"/>
             <w:tcBorders>
               <w:top w:val="single" w:color="BFBFBF" w:sz="4"/>
               <w:left w:val="single" w:color="BFBFBF" w:sz="4"/>
@@ -2098,27 +2190,27 @@
         </w:tc>
         <w:tc>
           <w:tcPr>
-            <w:tcW w:type="dxa" w:w="7141"/>
-            <w:tcBorders>
-              <w:top w:val="single" w:color="BFBFBF" w:sz="4"/>
-              <w:left w:val="single" w:color="BFBFBF" w:sz="4"/>
-              <w:bottom w:val="single" w:color="BFBFBF" w:sz="4"/>
-              <w:right w:val="single" w:color="BFBFBF" w:sz="4"/>
-            </w:tcBorders>
-            <w:tcMar>
-              <w:top w:type="dxa" w:w="60"/>
-              <w:left w:type="dxa" w:w="100"/>
-              <w:bottom w:type="dxa" w:w="60"/>
-              <w:right w:type="dxa" w:w="100"/>
-            </w:tcMar>
-          </w:tcPr>
-          <w:p>
-            <w:r>
-              <w:rPr>
-                <w:sz w:val="19"/>
-                <w:szCs w:val="19"/>
-              </w:rPr>
-              <w:t xml:space="preserve">Ubah nama, foto profil, dan password (wajib password lama)</w:t>
+            <w:tcW w:type="dxa" w:w="5727"/>
+            <w:tcBorders>
+              <w:top w:val="single" w:color="BFBFBF" w:sz="4"/>
+              <w:left w:val="single" w:color="BFBFBF" w:sz="4"/>
+              <w:bottom w:val="single" w:color="BFBFBF" w:sz="4"/>
+              <w:right w:val="single" w:color="BFBFBF" w:sz="4"/>
+            </w:tcBorders>
+            <w:tcMar>
+              <w:top w:type="dxa" w:w="60"/>
+              <w:left w:type="dxa" w:w="100"/>
+              <w:bottom w:type="dxa" w:w="60"/>
+              <w:right w:type="dxa" w:w="100"/>
+            </w:tcMar>
+          </w:tcPr>
+          <w:p>
+            <w:r>
+              <w:rPr>
+                <w:sz w:val="19"/>
+                <w:szCs w:val="19"/>
+              </w:rPr>
+              <w:t xml:space="preserve">Klik foto profil → panel kanan untuk ubah nama, foto profil, dan password (wajib password lama)</w:t>
             </w:r>
           </w:p>
         </w:tc>
@@ -2129,7 +2221,7 @@
         </w:trPr>
         <w:tc>
           <w:tcPr>
-            <w:tcW w:type="dxa" w:w="713"/>
+            <w:tcW w:type="dxa" w:w="572"/>
             <w:tcBorders>
               <w:top w:val="single" w:color="BFBFBF" w:sz="4"/>
               <w:left w:val="single" w:color="BFBFBF" w:sz="4"/>
@@ -2155,7 +2247,7 @@
         </w:tc>
         <w:tc>
           <w:tcPr>
-            <w:tcW w:type="dxa" w:w="1784"/>
+            <w:tcW w:type="dxa" w:w="3339"/>
             <w:tcBorders>
               <w:top w:val="single" w:color="BFBFBF" w:sz="4"/>
               <w:left w:val="single" w:color="BFBFBF" w:sz="4"/>
@@ -2181,7 +2273,7 @@
         </w:tc>
         <w:tc>
           <w:tcPr>
-            <w:tcW w:type="dxa" w:w="7141"/>
+            <w:tcW w:type="dxa" w:w="5727"/>
             <w:tcBorders>
               <w:top w:val="single" w:color="BFBFBF" w:sz="4"/>
               <w:left w:val="single" w:color="BFBFBF" w:sz="4"/>
@@ -2212,7 +2304,7 @@
         </w:trPr>
         <w:tc>
           <w:tcPr>
-            <w:tcW w:type="dxa" w:w="713"/>
+            <w:tcW w:type="dxa" w:w="572"/>
             <w:tcBorders>
               <w:top w:val="single" w:color="BFBFBF" w:sz="4"/>
               <w:left w:val="single" w:color="BFBFBF" w:sz="4"/>
@@ -2238,7 +2330,7 @@
         </w:tc>
         <w:tc>
           <w:tcPr>
-            <w:tcW w:type="dxa" w:w="1784"/>
+            <w:tcW w:type="dxa" w:w="3339"/>
             <w:tcBorders>
               <w:top w:val="single" w:color="BFBFBF" w:sz="4"/>
               <w:left w:val="single" w:color="BFBFBF" w:sz="4"/>
@@ -2264,7 +2356,7 @@
         </w:tc>
         <w:tc>
           <w:tcPr>
-            <w:tcW w:type="dxa" w:w="7141"/>
+            <w:tcW w:type="dxa" w:w="5727"/>
             <w:tcBorders>
               <w:top w:val="single" w:color="BFBFBF" w:sz="4"/>
               <w:left w:val="single" w:color="BFBFBF" w:sz="4"/>
@@ -2295,7 +2387,7 @@
         </w:trPr>
         <w:tc>
           <w:tcPr>
-            <w:tcW w:type="dxa" w:w="713"/>
+            <w:tcW w:type="dxa" w:w="572"/>
             <w:tcBorders>
               <w:top w:val="single" w:color="BFBFBF" w:sz="4"/>
               <w:left w:val="single" w:color="BFBFBF" w:sz="4"/>
@@ -2321,7 +2413,7 @@
         </w:tc>
         <w:tc>
           <w:tcPr>
-            <w:tcW w:type="dxa" w:w="1784"/>
+            <w:tcW w:type="dxa" w:w="3339"/>
             <w:tcBorders>
               <w:top w:val="single" w:color="BFBFBF" w:sz="4"/>
               <w:left w:val="single" w:color="BFBFBF" w:sz="4"/>
@@ -2347,7 +2439,7 @@
         </w:tc>
         <w:tc>
           <w:tcPr>
-            <w:tcW w:type="dxa" w:w="7141"/>
+            <w:tcW w:type="dxa" w:w="5727"/>
             <w:tcBorders>
               <w:top w:val="single" w:color="BFBFBF" w:sz="4"/>
               <w:left w:val="single" w:color="BFBFBF" w:sz="4"/>
@@ -2378,7 +2470,7 @@
         </w:trPr>
         <w:tc>
           <w:tcPr>
-            <w:tcW w:type="dxa" w:w="713"/>
+            <w:tcW w:type="dxa" w:w="572"/>
             <w:tcBorders>
               <w:top w:val="single" w:color="BFBFBF" w:sz="4"/>
               <w:left w:val="single" w:color="BFBFBF" w:sz="4"/>
@@ -2404,7 +2496,7 @@
         </w:tc>
         <w:tc>
           <w:tcPr>
-            <w:tcW w:type="dxa" w:w="1784"/>
+            <w:tcW w:type="dxa" w:w="3339"/>
             <w:tcBorders>
               <w:top w:val="single" w:color="BFBFBF" w:sz="4"/>
               <w:left w:val="single" w:color="BFBFBF" w:sz="4"/>
@@ -2430,7 +2522,7 @@
         </w:tc>
         <w:tc>
           <w:tcPr>
-            <w:tcW w:type="dxa" w:w="7141"/>
+            <w:tcW w:type="dxa" w:w="5727"/>
             <w:tcBorders>
               <w:top w:val="single" w:color="BFBFBF" w:sz="4"/>
               <w:left w:val="single" w:color="BFBFBF" w:sz="4"/>
@@ -2461,7 +2553,7 @@
         </w:trPr>
         <w:tc>
           <w:tcPr>
-            <w:tcW w:type="dxa" w:w="713"/>
+            <w:tcW w:type="dxa" w:w="572"/>
             <w:tcBorders>
               <w:top w:val="single" w:color="BFBFBF" w:sz="4"/>
               <w:left w:val="single" w:color="BFBFBF" w:sz="4"/>
@@ -2487,7 +2579,7 @@
         </w:tc>
         <w:tc>
           <w:tcPr>
-            <w:tcW w:type="dxa" w:w="1784"/>
+            <w:tcW w:type="dxa" w:w="3339"/>
             <w:tcBorders>
               <w:top w:val="single" w:color="BFBFBF" w:sz="4"/>
               <w:left w:val="single" w:color="BFBFBF" w:sz="4"/>
@@ -2513,7 +2605,7 @@
         </w:tc>
         <w:tc>
           <w:tcPr>
-            <w:tcW w:type="dxa" w:w="7141"/>
+            <w:tcW w:type="dxa" w:w="5727"/>
             <w:tcBorders>
               <w:top w:val="single" w:color="BFBFBF" w:sz="4"/>
               <w:left w:val="single" w:color="BFBFBF" w:sz="4"/>
@@ -2544,7 +2636,7 @@
         </w:trPr>
         <w:tc>
           <w:tcPr>
-            <w:tcW w:type="dxa" w:w="713"/>
+            <w:tcW w:type="dxa" w:w="572"/>
             <w:tcBorders>
               <w:top w:val="single" w:color="BFBFBF" w:sz="4"/>
               <w:left w:val="single" w:color="BFBFBF" w:sz="4"/>
@@ -2570,7 +2662,7 @@
         </w:tc>
         <w:tc>
           <w:tcPr>
-            <w:tcW w:type="dxa" w:w="1784"/>
+            <w:tcW w:type="dxa" w:w="3339"/>
             <w:tcBorders>
               <w:top w:val="single" w:color="BFBFBF" w:sz="4"/>
               <w:left w:val="single" w:color="BFBFBF" w:sz="4"/>
@@ -2596,7 +2688,7 @@
         </w:tc>
         <w:tc>
           <w:tcPr>
-            <w:tcW w:type="dxa" w:w="7141"/>
+            <w:tcW w:type="dxa" w:w="5727"/>
             <w:tcBorders>
               <w:top w:val="single" w:color="BFBFBF" w:sz="4"/>
               <w:left w:val="single" w:color="BFBFBF" w:sz="4"/>
@@ -2617,6 +2709,338 @@
                 <w:szCs w:val="19"/>
               </w:rPr>
               <w:t xml:space="preserve">Daftar barang, barang masuk, dan barang keluar dapat dicetak</w:t>
+            </w:r>
+          </w:p>
+        </w:tc>
+      </w:tr>
+      <w:tr>
+        <w:trPr>
+          <w:tblHeader w:val="off"/>
+        </w:trPr>
+        <w:tc>
+          <w:tcPr>
+            <w:tcW w:type="dxa" w:w="572"/>
+            <w:tcBorders>
+              <w:top w:val="single" w:color="BFBFBF" w:sz="4"/>
+              <w:left w:val="single" w:color="BFBFBF" w:sz="4"/>
+              <w:bottom w:val="single" w:color="BFBFBF" w:sz="4"/>
+              <w:right w:val="single" w:color="BFBFBF" w:sz="4"/>
+            </w:tcBorders>
+            <w:tcMar>
+              <w:top w:type="dxa" w:w="60"/>
+              <w:left w:type="dxa" w:w="100"/>
+              <w:bottom w:type="dxa" w:w="60"/>
+              <w:right w:type="dxa" w:w="100"/>
+            </w:tcMar>
+          </w:tcPr>
+          <w:p>
+            <w:r>
+              <w:rPr>
+                <w:sz w:val="19"/>
+                <w:szCs w:val="19"/>
+              </w:rPr>
+              <w:t xml:space="preserve">10</w:t>
+            </w:r>
+          </w:p>
+        </w:tc>
+        <w:tc>
+          <w:tcPr>
+            <w:tcW w:type="dxa" w:w="3339"/>
+            <w:tcBorders>
+              <w:top w:val="single" w:color="BFBFBF" w:sz="4"/>
+              <w:left w:val="single" w:color="BFBFBF" w:sz="4"/>
+              <w:bottom w:val="single" w:color="BFBFBF" w:sz="4"/>
+              <w:right w:val="single" w:color="BFBFBF" w:sz="4"/>
+            </w:tcBorders>
+            <w:tcMar>
+              <w:top w:type="dxa" w:w="60"/>
+              <w:left w:type="dxa" w:w="100"/>
+              <w:bottom w:type="dxa" w:w="60"/>
+              <w:right w:type="dxa" w:w="100"/>
+            </w:tcMar>
+          </w:tcPr>
+          <w:p>
+            <w:r>
+              <w:rPr>
+                <w:sz w:val="19"/>
+                <w:szCs w:val="19"/>
+              </w:rPr>
+              <w:t xml:space="preserve">Tema monokrom &amp; mode terang / gelap</w:t>
+            </w:r>
+          </w:p>
+        </w:tc>
+        <w:tc>
+          <w:tcPr>
+            <w:tcW w:type="dxa" w:w="5727"/>
+            <w:tcBorders>
+              <w:top w:val="single" w:color="BFBFBF" w:sz="4"/>
+              <w:left w:val="single" w:color="BFBFBF" w:sz="4"/>
+              <w:bottom w:val="single" w:color="BFBFBF" w:sz="4"/>
+              <w:right w:val="single" w:color="BFBFBF" w:sz="4"/>
+            </w:tcBorders>
+            <w:tcMar>
+              <w:top w:type="dxa" w:w="60"/>
+              <w:left w:type="dxa" w:w="100"/>
+              <w:bottom w:type="dxa" w:w="60"/>
+              <w:right w:type="dxa" w:w="100"/>
+            </w:tcMar>
+          </w:tcPr>
+          <w:p>
+            <w:r>
+              <w:rPr>
+                <w:sz w:val="19"/>
+                <w:szCs w:val="19"/>
+              </w:rPr>
+              <w:t xml:space="preserve">Tampilan hitam-putih ala video Bad Apple!!; tombol bulan/matahari di topbar dan login; tema baru muncul dengan efek lingkaran membesar; tema awal mengikuti jam (malam = gelap)</w:t>
+            </w:r>
+          </w:p>
+        </w:tc>
+      </w:tr>
+      <w:tr>
+        <w:trPr>
+          <w:tblHeader w:val="off"/>
+        </w:trPr>
+        <w:tc>
+          <w:tcPr>
+            <w:tcW w:type="dxa" w:w="572"/>
+            <w:tcBorders>
+              <w:top w:val="single" w:color="BFBFBF" w:sz="4"/>
+              <w:left w:val="single" w:color="BFBFBF" w:sz="4"/>
+              <w:bottom w:val="single" w:color="BFBFBF" w:sz="4"/>
+              <w:right w:val="single" w:color="BFBFBF" w:sz="4"/>
+            </w:tcBorders>
+            <w:tcMar>
+              <w:top w:type="dxa" w:w="60"/>
+              <w:left w:type="dxa" w:w="100"/>
+              <w:bottom w:type="dxa" w:w="60"/>
+              <w:right w:type="dxa" w:w="100"/>
+            </w:tcMar>
+          </w:tcPr>
+          <w:p>
+            <w:r>
+              <w:rPr>
+                <w:sz w:val="19"/>
+                <w:szCs w:val="19"/>
+              </w:rPr>
+              <w:t xml:space="preserve">11</w:t>
+            </w:r>
+          </w:p>
+        </w:tc>
+        <w:tc>
+          <w:tcPr>
+            <w:tcW w:type="dxa" w:w="3339"/>
+            <w:tcBorders>
+              <w:top w:val="single" w:color="BFBFBF" w:sz="4"/>
+              <w:left w:val="single" w:color="BFBFBF" w:sz="4"/>
+              <w:bottom w:val="single" w:color="BFBFBF" w:sz="4"/>
+              <w:right w:val="single" w:color="BFBFBF" w:sz="4"/>
+            </w:tcBorders>
+            <w:tcMar>
+              <w:top w:type="dxa" w:w="60"/>
+              <w:left w:type="dxa" w:w="100"/>
+              <w:bottom w:type="dxa" w:w="60"/>
+              <w:right w:type="dxa" w:w="100"/>
+            </w:tcMar>
+          </w:tcPr>
+          <w:p>
+            <w:r>
+              <w:rPr>
+                <w:sz w:val="19"/>
+                <w:szCs w:val="19"/>
+              </w:rPr>
+              <w:t xml:space="preserve">Musik Bad Apple!!</w:t>
+            </w:r>
+          </w:p>
+        </w:tc>
+        <w:tc>
+          <w:tcPr>
+            <w:tcW w:type="dxa" w:w="5727"/>
+            <w:tcBorders>
+              <w:top w:val="single" w:color="BFBFBF" w:sz="4"/>
+              <w:left w:val="single" w:color="BFBFBF" w:sz="4"/>
+              <w:bottom w:val="single" w:color="BFBFBF" w:sz="4"/>
+              <w:right w:val="single" w:color="BFBFBF" w:sz="4"/>
+            </w:tcBorders>
+            <w:tcMar>
+              <w:top w:type="dxa" w:w="60"/>
+              <w:left w:type="dxa" w:w="100"/>
+              <w:bottom w:type="dxa" w:w="60"/>
+              <w:right w:type="dxa" w:w="100"/>
+            </w:tcMar>
+          </w:tcPr>
+          <w:p>
+            <w:r>
+              <w:rPr>
+                <w:sz w:val="19"/>
+                <w:szCs w:val="19"/>
+              </w:rPr>
+              <w:t xml:space="preserve">Tombol not musik di topbar dan login untuk memutar / menjeda lagu Bad Apple!! (MP3), posisi lagu berlanjut saat pindah halaman</w:t>
+            </w:r>
+          </w:p>
+        </w:tc>
+      </w:tr>
+      <w:tr>
+        <w:trPr>
+          <w:tblHeader w:val="off"/>
+        </w:trPr>
+        <w:tc>
+          <w:tcPr>
+            <w:tcW w:type="dxa" w:w="572"/>
+            <w:tcBorders>
+              <w:top w:val="single" w:color="BFBFBF" w:sz="4"/>
+              <w:left w:val="single" w:color="BFBFBF" w:sz="4"/>
+              <w:bottom w:val="single" w:color="BFBFBF" w:sz="4"/>
+              <w:right w:val="single" w:color="BFBFBF" w:sz="4"/>
+            </w:tcBorders>
+            <w:tcMar>
+              <w:top w:type="dxa" w:w="60"/>
+              <w:left w:type="dxa" w:w="100"/>
+              <w:bottom w:type="dxa" w:w="60"/>
+              <w:right w:type="dxa" w:w="100"/>
+            </w:tcMar>
+          </w:tcPr>
+          <w:p>
+            <w:r>
+              <w:rPr>
+                <w:sz w:val="19"/>
+                <w:szCs w:val="19"/>
+              </w:rPr>
+              <w:t xml:space="preserve">12</w:t>
+            </w:r>
+          </w:p>
+        </w:tc>
+        <w:tc>
+          <w:tcPr>
+            <w:tcW w:type="dxa" w:w="3339"/>
+            <w:tcBorders>
+              <w:top w:val="single" w:color="BFBFBF" w:sz="4"/>
+              <w:left w:val="single" w:color="BFBFBF" w:sz="4"/>
+              <w:bottom w:val="single" w:color="BFBFBF" w:sz="4"/>
+              <w:right w:val="single" w:color="BFBFBF" w:sz="4"/>
+            </w:tcBorders>
+            <w:tcMar>
+              <w:top w:type="dxa" w:w="60"/>
+              <w:left w:type="dxa" w:w="100"/>
+              <w:bottom w:type="dxa" w:w="60"/>
+              <w:right w:type="dxa" w:w="100"/>
+            </w:tcMar>
+          </w:tcPr>
+          <w:p>
+            <w:r>
+              <w:rPr>
+                <w:sz w:val="19"/>
+                <w:szCs w:val="19"/>
+              </w:rPr>
+              <w:t xml:space="preserve">Tanpa pindah halaman</w:t>
+            </w:r>
+          </w:p>
+        </w:tc>
+        <w:tc>
+          <w:tcPr>
+            <w:tcW w:type="dxa" w:w="5727"/>
+            <w:tcBorders>
+              <w:top w:val="single" w:color="BFBFBF" w:sz="4"/>
+              <w:left w:val="single" w:color="BFBFBF" w:sz="4"/>
+              <w:bottom w:val="single" w:color="BFBFBF" w:sz="4"/>
+              <w:right w:val="single" w:color="BFBFBF" w:sz="4"/>
+            </w:tcBorders>
+            <w:tcMar>
+              <w:top w:type="dxa" w:w="60"/>
+              <w:left w:type="dxa" w:w="100"/>
+              <w:bottom w:type="dxa" w:w="60"/>
+              <w:right w:type="dxa" w:w="100"/>
+            </w:tcMar>
+          </w:tcPr>
+          <w:p>
+            <w:r>
+              <w:rPr>
+                <w:sz w:val="19"/>
+                <w:szCs w:val="19"/>
+              </w:rPr>
+              <w:t xml:space="preserve">Menu dibuka tanpa memuat ulang halaman (Turbo); form tambah, ubah, dan detail tampil sebagai popup</w:t>
+            </w:r>
+          </w:p>
+        </w:tc>
+      </w:tr>
+      <w:tr>
+        <w:trPr>
+          <w:tblHeader w:val="off"/>
+        </w:trPr>
+        <w:tc>
+          <w:tcPr>
+            <w:tcW w:type="dxa" w:w="572"/>
+            <w:tcBorders>
+              <w:top w:val="single" w:color="BFBFBF" w:sz="4"/>
+              <w:left w:val="single" w:color="BFBFBF" w:sz="4"/>
+              <w:bottom w:val="single" w:color="BFBFBF" w:sz="4"/>
+              <w:right w:val="single" w:color="BFBFBF" w:sz="4"/>
+            </w:tcBorders>
+            <w:tcMar>
+              <w:top w:type="dxa" w:w="60"/>
+              <w:left w:type="dxa" w:w="100"/>
+              <w:bottom w:type="dxa" w:w="60"/>
+              <w:right w:type="dxa" w:w="100"/>
+            </w:tcMar>
+          </w:tcPr>
+          <w:p>
+            <w:r>
+              <w:rPr>
+                <w:sz w:val="19"/>
+                <w:szCs w:val="19"/>
+              </w:rPr>
+              <w:t xml:space="preserve">13</w:t>
+            </w:r>
+          </w:p>
+        </w:tc>
+        <w:tc>
+          <w:tcPr>
+            <w:tcW w:type="dxa" w:w="3339"/>
+            <w:tcBorders>
+              <w:top w:val="single" w:color="BFBFBF" w:sz="4"/>
+              <w:left w:val="single" w:color="BFBFBF" w:sz="4"/>
+              <w:bottom w:val="single" w:color="BFBFBF" w:sz="4"/>
+              <w:right w:val="single" w:color="BFBFBF" w:sz="4"/>
+            </w:tcBorders>
+            <w:tcMar>
+              <w:top w:type="dxa" w:w="60"/>
+              <w:left w:type="dxa" w:w="100"/>
+              <w:bottom w:type="dxa" w:w="60"/>
+              <w:right w:type="dxa" w:w="100"/>
+            </w:tcMar>
+          </w:tcPr>
+          <w:p>
+            <w:r>
+              <w:rPr>
+                <w:sz w:val="19"/>
+                <w:szCs w:val="19"/>
+              </w:rPr>
+              <w:t xml:space="preserve">Sidebar bisa ditutup</w:t>
+            </w:r>
+          </w:p>
+        </w:tc>
+        <w:tc>
+          <w:tcPr>
+            <w:tcW w:type="dxa" w:w="5727"/>
+            <w:tcBorders>
+              <w:top w:val="single" w:color="BFBFBF" w:sz="4"/>
+              <w:left w:val="single" w:color="BFBFBF" w:sz="4"/>
+              <w:bottom w:val="single" w:color="BFBFBF" w:sz="4"/>
+              <w:right w:val="single" w:color="BFBFBF" w:sz="4"/>
+            </w:tcBorders>
+            <w:tcMar>
+              <w:top w:type="dxa" w:w="60"/>
+              <w:left w:type="dxa" w:w="100"/>
+              <w:bottom w:type="dxa" w:w="60"/>
+              <w:right w:type="dxa" w:w="100"/>
+            </w:tcMar>
+          </w:tcPr>
+          <w:p>
+            <w:r>
+              <w:rPr>
+                <w:sz w:val="19"/>
+                <w:szCs w:val="19"/>
+              </w:rPr>
+              <w:t xml:space="preserve">Tombol burger menutup / membuka sidebar; posisinya diingat</w:t>
             </w:r>
           </w:p>
         </w:tc>
@@ -6763,7 +7187,7 @@
                 <w:sz w:val="17"/>
                 <w:szCs w:val="17"/>
               </w:rPr>
-              <w:t xml:space="preserve">app/Exceptions/StokTidakCukupException.php</w:t>
+              <w:t xml:space="preserve">app/Support/Suasana.php</w:t>
             </w:r>
           </w:p>
         </w:tc>
@@ -6789,7 +7213,7 @@
                 <w:sz w:val="19"/>
                 <w:szCs w:val="19"/>
               </w:rPr>
-              <w:t xml:space="preserve">Error khusus saat stok tidak mencukupi</w:t>
+              <w:t xml:space="preserve">Penentu suasana pagi / siang / sore / malam: salam dashboard, animasi dan audio login</w:t>
             </w:r>
           </w:p>
         </w:tc>
@@ -6822,7 +7246,7 @@
                 <w:sz w:val="17"/>
                 <w:szCs w:val="17"/>
               </w:rPr>
-              <w:t xml:space="preserve">app/Providers/AppServiceProvider.php</w:t>
+              <w:t xml:space="preserve">app/Exceptions/StokTidakCukupException.php</w:t>
             </w:r>
           </w:p>
         </w:tc>
@@ -6848,7 +7272,7 @@
                 <w:sz w:val="19"/>
                 <w:szCs w:val="19"/>
               </w:rPr>
-              <w:t xml:space="preserve">Pagination berbahasa Indonesia, jumlah Pending untuk menu, paksa https di produksi</w:t>
+              <w:t xml:space="preserve">Error khusus saat stok tidak mencukupi</w:t>
             </w:r>
           </w:p>
         </w:tc>
@@ -6881,7 +7305,7 @@
                 <w:sz w:val="17"/>
                 <w:szCs w:val="17"/>
               </w:rPr>
-              <w:t xml:space="preserve">bootstrap/app.php</w:t>
+              <w:t xml:space="preserve">app/Providers/AppServiceProvider.php</w:t>
             </w:r>
           </w:p>
         </w:tc>
@@ -6907,23 +7331,7 @@
                 <w:sz w:val="19"/>
                 <w:szCs w:val="19"/>
               </w:rPr>
-              <w:t xml:space="preserve">Alias middleware </w:t>
-            </w:r>
-            <w:r>
-              <w:rPr>
-                <w:rFonts w:ascii="Consolas" w:cs="Consolas" w:eastAsia="Consolas" w:hAnsi="Consolas"/>
-                <w:color w:val="1F4E79"/>
-                <w:sz w:val="17"/>
-                <w:szCs w:val="17"/>
-              </w:rPr>
-              <w:t xml:space="preserve">role</w:t>
-            </w:r>
-            <w:r>
-              <w:rPr>
-                <w:sz w:val="19"/>
-                <w:szCs w:val="19"/>
-              </w:rPr>
-              <w:t xml:space="preserve">, proxy tepercaya, penanganan error 419</w:t>
+              <w:t xml:space="preserve">Pagination berbahasa Indonesia, jumlah Pending untuk menu, paksa https di produksi</w:t>
             </w:r>
           </w:p>
         </w:tc>
@@ -6956,7 +7364,7 @@
                 <w:sz w:val="17"/>
                 <w:szCs w:val="17"/>
               </w:rPr>
-              <w:t xml:space="preserve">config/filesystems.php</w:t>
+              <w:t xml:space="preserve">bootstrap/app.php</w:t>
             </w:r>
           </w:p>
         </w:tc>
@@ -6982,7 +7390,7 @@
                 <w:sz w:val="19"/>
                 <w:szCs w:val="19"/>
               </w:rPr>
-              <w:t xml:space="preserve">Lokasi penyimpanan gambar (</w:t>
+              <w:t xml:space="preserve">Alias middleware </w:t>
             </w:r>
             <w:r>
               <w:rPr>
@@ -6991,46 +7399,14 @@
                 <w:sz w:val="17"/>
                 <w:szCs w:val="17"/>
               </w:rPr>
-              <w:t xml:space="preserve">UPLOAD_DISK</w:t>
-            </w:r>
-            <w:r>
-              <w:rPr>
-                <w:sz w:val="19"/>
-                <w:szCs w:val="19"/>
-              </w:rPr>
-              <w:t xml:space="preserve">: </w:t>
-            </w:r>
-            <w:r>
-              <w:rPr>
-                <w:rFonts w:ascii="Consolas" w:cs="Consolas" w:eastAsia="Consolas" w:hAnsi="Consolas"/>
-                <w:color w:val="1F4E79"/>
-                <w:sz w:val="17"/>
-                <w:szCs w:val="17"/>
-              </w:rPr>
-              <w:t xml:space="preserve">public</w:t>
-            </w:r>
-            <w:r>
-              <w:rPr>
-                <w:sz w:val="19"/>
-                <w:szCs w:val="19"/>
-              </w:rPr>
-              <w:t xml:space="preserve"> atau </w:t>
-            </w:r>
-            <w:r>
-              <w:rPr>
-                <w:rFonts w:ascii="Consolas" w:cs="Consolas" w:eastAsia="Consolas" w:hAnsi="Consolas"/>
-                <w:color w:val="1F4E79"/>
-                <w:sz w:val="17"/>
-                <w:szCs w:val="17"/>
-              </w:rPr>
-              <w:t xml:space="preserve">s3</w:t>
-            </w:r>
-            <w:r>
-              <w:rPr>
-                <w:sz w:val="19"/>
-                <w:szCs w:val="19"/>
-              </w:rPr>
-              <w:t xml:space="preserve">)</w:t>
+              <w:t xml:space="preserve">role</w:t>
+            </w:r>
+            <w:r>
+              <w:rPr>
+                <w:sz w:val="19"/>
+                <w:szCs w:val="19"/>
+              </w:rPr>
+              <w:t xml:space="preserve">, proxy tepercaya, penanganan error 419</w:t>
             </w:r>
           </w:p>
         </w:tc>
@@ -7063,14 +7439,33 @@
                 <w:sz w:val="17"/>
                 <w:szCs w:val="17"/>
               </w:rPr>
-              <w:t xml:space="preserve">database/migrations/</w:t>
-            </w:r>
-            <w:r>
-              <w:rPr>
-                <w:sz w:val="19"/>
-                <w:szCs w:val="19"/>
-              </w:rPr>
-              <w:t xml:space="preserve">, </w:t>
+              <w:t xml:space="preserve">config/filesystems.php</w:t>
+            </w:r>
+          </w:p>
+        </w:tc>
+        <w:tc>
+          <w:tcPr>
+            <w:tcW w:type="dxa" w:w="4819"/>
+            <w:tcBorders>
+              <w:top w:val="single" w:color="BFBFBF" w:sz="4"/>
+              <w:left w:val="single" w:color="BFBFBF" w:sz="4"/>
+              <w:bottom w:val="single" w:color="BFBFBF" w:sz="4"/>
+              <w:right w:val="single" w:color="BFBFBF" w:sz="4"/>
+            </w:tcBorders>
+            <w:tcMar>
+              <w:top w:type="dxa" w:w="60"/>
+              <w:left w:type="dxa" w:w="100"/>
+              <w:bottom w:type="dxa" w:w="60"/>
+              <w:right w:type="dxa" w:w="100"/>
+            </w:tcMar>
+          </w:tcPr>
+          <w:p>
+            <w:r>
+              <w:rPr>
+                <w:sz w:val="19"/>
+                <w:szCs w:val="19"/>
+              </w:rPr>
+              <w:t xml:space="preserve">Lokasi penyimpanan gambar (</w:t>
             </w:r>
             <w:r>
               <w:rPr>
@@ -7079,14 +7474,14 @@
                 <w:sz w:val="17"/>
                 <w:szCs w:val="17"/>
               </w:rPr>
-              <w:t xml:space="preserve">database/seeders/</w:t>
-            </w:r>
-            <w:r>
-              <w:rPr>
-                <w:sz w:val="19"/>
-                <w:szCs w:val="19"/>
-              </w:rPr>
-              <w:t xml:space="preserve">, </w:t>
+              <w:t xml:space="preserve">UPLOAD_DISK</w:t>
+            </w:r>
+            <w:r>
+              <w:rPr>
+                <w:sz w:val="19"/>
+                <w:szCs w:val="19"/>
+              </w:rPr>
+              <w:t xml:space="preserve">: </w:t>
             </w:r>
             <w:r>
               <w:rPr>
@@ -7095,33 +7490,30 @@
                 <w:sz w:val="17"/>
                 <w:szCs w:val="17"/>
               </w:rPr>
-              <w:t xml:space="preserve">database/factories/</w:t>
-            </w:r>
-          </w:p>
-        </w:tc>
-        <w:tc>
-          <w:tcPr>
-            <w:tcW w:type="dxa" w:w="4819"/>
-            <w:tcBorders>
-              <w:top w:val="single" w:color="BFBFBF" w:sz="4"/>
-              <w:left w:val="single" w:color="BFBFBF" w:sz="4"/>
-              <w:bottom w:val="single" w:color="BFBFBF" w:sz="4"/>
-              <w:right w:val="single" w:color="BFBFBF" w:sz="4"/>
-            </w:tcBorders>
-            <w:tcMar>
-              <w:top w:type="dxa" w:w="60"/>
-              <w:left w:type="dxa" w:w="100"/>
-              <w:bottom w:type="dxa" w:w="60"/>
-              <w:right w:type="dxa" w:w="100"/>
-            </w:tcMar>
-          </w:tcPr>
-          <w:p>
-            <w:r>
-              <w:rPr>
-                <w:sz w:val="19"/>
-                <w:szCs w:val="19"/>
-              </w:rPr>
-              <w:t xml:space="preserve">Struktur tabel, data sampel, data palsu untuk pengujian</w:t>
+              <w:t xml:space="preserve">public</w:t>
+            </w:r>
+            <w:r>
+              <w:rPr>
+                <w:sz w:val="19"/>
+                <w:szCs w:val="19"/>
+              </w:rPr>
+              <w:t xml:space="preserve"> atau </w:t>
+            </w:r>
+            <w:r>
+              <w:rPr>
+                <w:rFonts w:ascii="Consolas" w:cs="Consolas" w:eastAsia="Consolas" w:hAnsi="Consolas"/>
+                <w:color w:val="1F4E79"/>
+                <w:sz w:val="17"/>
+                <w:szCs w:val="17"/>
+              </w:rPr>
+              <w:t xml:space="preserve">s3</w:t>
+            </w:r>
+            <w:r>
+              <w:rPr>
+                <w:sz w:val="19"/>
+                <w:szCs w:val="19"/>
+              </w:rPr>
+              <w:t xml:space="preserve">)</w:t>
             </w:r>
           </w:p>
         </w:tc>
@@ -7154,7 +7546,39 @@
                 <w:sz w:val="17"/>
                 <w:szCs w:val="17"/>
               </w:rPr>
-              <w:t xml:space="preserve">resources/views/</w:t>
+              <w:t xml:space="preserve">database/migrations/</w:t>
+            </w:r>
+            <w:r>
+              <w:rPr>
+                <w:sz w:val="19"/>
+                <w:szCs w:val="19"/>
+              </w:rPr>
+              <w:t xml:space="preserve">, </w:t>
+            </w:r>
+            <w:r>
+              <w:rPr>
+                <w:rFonts w:ascii="Consolas" w:cs="Consolas" w:eastAsia="Consolas" w:hAnsi="Consolas"/>
+                <w:color w:val="1F4E79"/>
+                <w:sz w:val="17"/>
+                <w:szCs w:val="17"/>
+              </w:rPr>
+              <w:t xml:space="preserve">database/seeders/</w:t>
+            </w:r>
+            <w:r>
+              <w:rPr>
+                <w:sz w:val="19"/>
+                <w:szCs w:val="19"/>
+              </w:rPr>
+              <w:t xml:space="preserve">, </w:t>
+            </w:r>
+            <w:r>
+              <w:rPr>
+                <w:rFonts w:ascii="Consolas" w:cs="Consolas" w:eastAsia="Consolas" w:hAnsi="Consolas"/>
+                <w:color w:val="1F4E79"/>
+                <w:sz w:val="17"/>
+                <w:szCs w:val="17"/>
+              </w:rPr>
+              <w:t xml:space="preserve">database/factories/</w:t>
             </w:r>
           </w:p>
         </w:tc>
@@ -7180,7 +7604,7 @@
                 <w:sz w:val="19"/>
                 <w:szCs w:val="19"/>
               </w:rPr>
-              <w:t xml:space="preserve">Halaman Blade: layout, login, dashboard, profil, user, kategori, barang, barang-masuk, barang-keluar</w:t>
+              <w:t xml:space="preserve">Struktur tabel, data sampel, data palsu untuk pengujian</w:t>
             </w:r>
           </w:p>
         </w:tc>
@@ -7213,7 +7637,7 @@
                 <w:sz w:val="17"/>
                 <w:szCs w:val="17"/>
               </w:rPr>
-              <w:t xml:space="preserve">resources/views/components/</w:t>
+              <w:t xml:space="preserve">resources/views/</w:t>
             </w:r>
           </w:p>
         </w:tc>
@@ -7239,96 +7663,7 @@
                 <w:sz w:val="19"/>
                 <w:szCs w:val="19"/>
               </w:rPr>
-              <w:t xml:space="preserve">Komponen: </w:t>
-            </w:r>
-            <w:r>
-              <w:rPr>
-                <w:rFonts w:ascii="Consolas" w:cs="Consolas" w:eastAsia="Consolas" w:hAnsi="Consolas"/>
-                <w:color w:val="1F4E79"/>
-                <w:sz w:val="17"/>
-                <w:szCs w:val="17"/>
-              </w:rPr>
-              <w:t xml:space="preserve">icon</w:t>
-            </w:r>
-            <w:r>
-              <w:rPr>
-                <w:sz w:val="19"/>
-                <w:szCs w:val="19"/>
-              </w:rPr>
-              <w:t xml:space="preserve">, </w:t>
-            </w:r>
-            <w:r>
-              <w:rPr>
-                <w:rFonts w:ascii="Consolas" w:cs="Consolas" w:eastAsia="Consolas" w:hAnsi="Consolas"/>
-                <w:color w:val="1F4E79"/>
-                <w:sz w:val="17"/>
-                <w:szCs w:val="17"/>
-              </w:rPr>
-              <w:t xml:space="preserve">badge</w:t>
-            </w:r>
-            <w:r>
-              <w:rPr>
-                <w:sz w:val="19"/>
-                <w:szCs w:val="19"/>
-              </w:rPr>
-              <w:t xml:space="preserve">, </w:t>
-            </w:r>
-            <w:r>
-              <w:rPr>
-                <w:rFonts w:ascii="Consolas" w:cs="Consolas" w:eastAsia="Consolas" w:hAnsi="Consolas"/>
-                <w:color w:val="1F4E79"/>
-                <w:sz w:val="17"/>
-                <w:szCs w:val="17"/>
-              </w:rPr>
-              <w:t xml:space="preserve">empty</w:t>
-            </w:r>
-            <w:r>
-              <w:rPr>
-                <w:sz w:val="19"/>
-                <w:szCs w:val="19"/>
-              </w:rPr>
-              <w:t xml:space="preserve">, </w:t>
-            </w:r>
-            <w:r>
-              <w:rPr>
-                <w:rFonts w:ascii="Consolas" w:cs="Consolas" w:eastAsia="Consolas" w:hAnsi="Consolas"/>
-                <w:color w:val="1F4E79"/>
-                <w:sz w:val="17"/>
-                <w:szCs w:val="17"/>
-              </w:rPr>
-              <w:t xml:space="preserve">error</w:t>
-            </w:r>
-            <w:r>
-              <w:rPr>
-                <w:sz w:val="19"/>
-                <w:szCs w:val="19"/>
-              </w:rPr>
-              <w:t xml:space="preserve">, </w:t>
-            </w:r>
-            <w:r>
-              <w:rPr>
-                <w:rFonts w:ascii="Consolas" w:cs="Consolas" w:eastAsia="Consolas" w:hAnsi="Consolas"/>
-                <w:color w:val="1F4E79"/>
-                <w:sz w:val="17"/>
-                <w:szCs w:val="17"/>
-              </w:rPr>
-              <w:t xml:space="preserve">avatar</w:t>
-            </w:r>
-            <w:r>
-              <w:rPr>
-                <w:sz w:val="19"/>
-                <w:szCs w:val="19"/>
-              </w:rPr>
-              <w:t xml:space="preserve">, </w:t>
-            </w:r>
-            <w:r>
-              <w:rPr>
-                <w:rFonts w:ascii="Consolas" w:cs="Consolas" w:eastAsia="Consolas" w:hAnsi="Consolas"/>
-                <w:color w:val="1F4E79"/>
-                <w:sz w:val="17"/>
-                <w:szCs w:val="17"/>
-              </w:rPr>
-              <w:t xml:space="preserve">unggah-gambar</w:t>
+              <w:t xml:space="preserve">Halaman Blade: layout, login, dashboard, profil, user, kategori, barang, barang-masuk, barang-keluar</w:t>
             </w:r>
           </w:p>
         </w:tc>
@@ -7361,7 +7696,7 @@
                 <w:sz w:val="17"/>
                 <w:szCs w:val="17"/>
               </w:rPr>
-              <w:t xml:space="preserve">resources/views/partials/</w:t>
+              <w:t xml:space="preserve">resources/views/components/</w:t>
             </w:r>
           </w:p>
         </w:tc>
@@ -7382,6 +7717,13 @@
             </w:tcMar>
           </w:tcPr>
           <w:p>
+            <w:r>
+              <w:rPr>
+                <w:sz w:val="19"/>
+                <w:szCs w:val="19"/>
+              </w:rPr>
+              <w:t xml:space="preserve">Komponen: </w:t>
+            </w:r>
             <w:r>
               <w:rPr>
                 <w:rFonts w:ascii="Consolas" w:cs="Consolas" w:eastAsia="Consolas" w:hAnsi="Consolas"/>
@@ -7389,14 +7731,14 @@
                 <w:sz w:val="17"/>
                 <w:szCs w:val="17"/>
               </w:rPr>
-              <w:t xml:space="preserve">flash</w:t>
-            </w:r>
-            <w:r>
-              <w:rPr>
-                <w:sz w:val="19"/>
-                <w:szCs w:val="19"/>
-              </w:rPr>
-              <w:t xml:space="preserve"> (pesan notifikasi) dan </w:t>
+              <w:t xml:space="preserve">icon</w:t>
+            </w:r>
+            <w:r>
+              <w:rPr>
+                <w:sz w:val="19"/>
+                <w:szCs w:val="19"/>
+              </w:rPr>
+              <w:t xml:space="preserve">, </w:t>
             </w:r>
             <w:r>
               <w:rPr>
@@ -7405,7 +7747,87 @@
                 <w:sz w:val="17"/>
                 <w:szCs w:val="17"/>
               </w:rPr>
-              <w:t xml:space="preserve">pagination</w:t>
+              <w:t xml:space="preserve">badge</w:t>
+            </w:r>
+            <w:r>
+              <w:rPr>
+                <w:sz w:val="19"/>
+                <w:szCs w:val="19"/>
+              </w:rPr>
+              <w:t xml:space="preserve">, </w:t>
+            </w:r>
+            <w:r>
+              <w:rPr>
+                <w:rFonts w:ascii="Consolas" w:cs="Consolas" w:eastAsia="Consolas" w:hAnsi="Consolas"/>
+                <w:color w:val="1F4E79"/>
+                <w:sz w:val="17"/>
+                <w:szCs w:val="17"/>
+              </w:rPr>
+              <w:t xml:space="preserve">empty</w:t>
+            </w:r>
+            <w:r>
+              <w:rPr>
+                <w:sz w:val="19"/>
+                <w:szCs w:val="19"/>
+              </w:rPr>
+              <w:t xml:space="preserve">, </w:t>
+            </w:r>
+            <w:r>
+              <w:rPr>
+                <w:rFonts w:ascii="Consolas" w:cs="Consolas" w:eastAsia="Consolas" w:hAnsi="Consolas"/>
+                <w:color w:val="1F4E79"/>
+                <w:sz w:val="17"/>
+                <w:szCs w:val="17"/>
+              </w:rPr>
+              <w:t xml:space="preserve">error</w:t>
+            </w:r>
+            <w:r>
+              <w:rPr>
+                <w:sz w:val="19"/>
+                <w:szCs w:val="19"/>
+              </w:rPr>
+              <w:t xml:space="preserve">, </w:t>
+            </w:r>
+            <w:r>
+              <w:rPr>
+                <w:rFonts w:ascii="Consolas" w:cs="Consolas" w:eastAsia="Consolas" w:hAnsi="Consolas"/>
+                <w:color w:val="1F4E79"/>
+                <w:sz w:val="17"/>
+                <w:szCs w:val="17"/>
+              </w:rPr>
+              <w:t xml:space="preserve">avatar</w:t>
+            </w:r>
+            <w:r>
+              <w:rPr>
+                <w:sz w:val="19"/>
+                <w:szCs w:val="19"/>
+              </w:rPr>
+              <w:t xml:space="preserve">, </w:t>
+            </w:r>
+            <w:r>
+              <w:rPr>
+                <w:rFonts w:ascii="Consolas" w:cs="Consolas" w:eastAsia="Consolas" w:hAnsi="Consolas"/>
+                <w:color w:val="1F4E79"/>
+                <w:sz w:val="17"/>
+                <w:szCs w:val="17"/>
+              </w:rPr>
+              <w:t xml:space="preserve">unggah-gambar</w:t>
+            </w:r>
+            <w:r>
+              <w:rPr>
+                <w:sz w:val="19"/>
+                <w:szCs w:val="19"/>
+              </w:rPr>
+              <w:t xml:space="preserve">, </w:t>
+            </w:r>
+            <w:r>
+              <w:rPr>
+                <w:rFonts w:ascii="Consolas" w:cs="Consolas" w:eastAsia="Consolas" w:hAnsi="Consolas"/>
+                <w:color w:val="1F4E79"/>
+                <w:sz w:val="17"/>
+                <w:szCs w:val="17"/>
+              </w:rPr>
+              <w:t xml:space="preserve">tombol-tema</w:t>
             </w:r>
           </w:p>
         </w:tc>
@@ -7438,15 +7860,27 @@
                 <w:sz w:val="17"/>
                 <w:szCs w:val="17"/>
               </w:rPr>
-              <w:t xml:space="preserve">resources/css/app.css</w:t>
-            </w:r>
-            <w:r>
-              <w:rPr>
-                <w:sz w:val="19"/>
-                <w:szCs w:val="19"/>
-              </w:rPr>
-              <w:t xml:space="preserve">, </w:t>
-            </w:r>
+              <w:t xml:space="preserve">resources/views/partials/</w:t>
+            </w:r>
+          </w:p>
+        </w:tc>
+        <w:tc>
+          <w:tcPr>
+            <w:tcW w:type="dxa" w:w="4819"/>
+            <w:tcBorders>
+              <w:top w:val="single" w:color="BFBFBF" w:sz="4"/>
+              <w:left w:val="single" w:color="BFBFBF" w:sz="4"/>
+              <w:bottom w:val="single" w:color="BFBFBF" w:sz="4"/>
+              <w:right w:val="single" w:color="BFBFBF" w:sz="4"/>
+            </w:tcBorders>
+            <w:tcMar>
+              <w:top w:type="dxa" w:w="60"/>
+              <w:left w:type="dxa" w:w="100"/>
+              <w:bottom w:type="dxa" w:w="60"/>
+              <w:right w:type="dxa" w:w="100"/>
+            </w:tcMar>
+          </w:tcPr>
+          <w:p>
             <w:r>
               <w:rPr>
                 <w:rFonts w:ascii="Consolas" w:cs="Consolas" w:eastAsia="Consolas" w:hAnsi="Consolas"/>
@@ -7454,33 +7888,46 @@
                 <w:sz w:val="17"/>
                 <w:szCs w:val="17"/>
               </w:rPr>
-              <w:t xml:space="preserve">resources/js/app.js</w:t>
-            </w:r>
-          </w:p>
-        </w:tc>
-        <w:tc>
-          <w:tcPr>
-            <w:tcW w:type="dxa" w:w="4819"/>
-            <w:tcBorders>
-              <w:top w:val="single" w:color="BFBFBF" w:sz="4"/>
-              <w:left w:val="single" w:color="BFBFBF" w:sz="4"/>
-              <w:bottom w:val="single" w:color="BFBFBF" w:sz="4"/>
-              <w:right w:val="single" w:color="BFBFBF" w:sz="4"/>
-            </w:tcBorders>
-            <w:tcMar>
-              <w:top w:type="dxa" w:w="60"/>
-              <w:left w:type="dxa" w:w="100"/>
-              <w:bottom w:type="dxa" w:w="60"/>
-              <w:right w:type="dxa" w:w="100"/>
-            </w:tcMar>
-          </w:tcPr>
-          <w:p>
-            <w:r>
-              <w:rPr>
-                <w:sz w:val="19"/>
-                <w:szCs w:val="19"/>
-              </w:rPr>
-              <w:t xml:space="preserve">Gaya tampilan dan interaksi kecil (menu HP, notifikasi, lihat password, pratinjau gambar)</w:t>
+              <w:t xml:space="preserve">flash</w:t>
+            </w:r>
+            <w:r>
+              <w:rPr>
+                <w:sz w:val="19"/>
+                <w:szCs w:val="19"/>
+              </w:rPr>
+              <w:t xml:space="preserve"> (pesan notifikasi), </w:t>
+            </w:r>
+            <w:r>
+              <w:rPr>
+                <w:rFonts w:ascii="Consolas" w:cs="Consolas" w:eastAsia="Consolas" w:hAnsi="Consolas"/>
+                <w:color w:val="1F4E79"/>
+                <w:sz w:val="17"/>
+                <w:szCs w:val="17"/>
+              </w:rPr>
+              <w:t xml:space="preserve">pagination</w:t>
+            </w:r>
+            <w:r>
+              <w:rPr>
+                <w:sz w:val="19"/>
+                <w:szCs w:val="19"/>
+              </w:rPr>
+              <w:t xml:space="preserve">, dan </w:t>
+            </w:r>
+            <w:r>
+              <w:rPr>
+                <w:rFonts w:ascii="Consolas" w:cs="Consolas" w:eastAsia="Consolas" w:hAnsi="Consolas"/>
+                <w:color w:val="1F4E79"/>
+                <w:sz w:val="17"/>
+                <w:szCs w:val="17"/>
+              </w:rPr>
+              <w:t xml:space="preserve">tema-awal</w:t>
+            </w:r>
+            <w:r>
+              <w:rPr>
+                <w:sz w:val="19"/>
+                <w:szCs w:val="19"/>
+              </w:rPr>
+              <w:t xml:space="preserve"> (skrip mode gelap)</w:t>
             </w:r>
           </w:p>
         </w:tc>
@@ -7513,23 +7960,7 @@
                 <w:sz w:val="17"/>
                 <w:szCs w:val="17"/>
               </w:rPr>
-              <w:t xml:space="preserve">tests/Unit</w:t>
-            </w:r>
-            <w:r>
-              <w:rPr>
-                <w:sz w:val="19"/>
-                <w:szCs w:val="19"/>
-              </w:rPr>
-              <w:t xml:space="preserve">, </w:t>
-            </w:r>
-            <w:r>
-              <w:rPr>
-                <w:rFonts w:ascii="Consolas" w:cs="Consolas" w:eastAsia="Consolas" w:hAnsi="Consolas"/>
-                <w:color w:val="1F4E79"/>
-                <w:sz w:val="17"/>
-                <w:szCs w:val="17"/>
-              </w:rPr>
-              <w:t xml:space="preserve">tests/Feature</w:t>
+              <w:t xml:space="preserve">resources/css/app.css</w:t>
             </w:r>
           </w:p>
         </w:tc>
@@ -7555,7 +7986,7 @@
                 <w:sz w:val="19"/>
                 <w:szCs w:val="19"/>
               </w:rPr>
-              <w:t xml:space="preserve">66 test PHPUnit</w:t>
+              <w:t xml:space="preserve">Gaya tampilan, animasi halaman login, dan warna mode gelap</w:t>
             </w:r>
           </w:p>
         </w:tc>
@@ -7588,15 +8019,27 @@
                 <w:sz w:val="17"/>
                 <w:szCs w:val="17"/>
               </w:rPr>
-              <w:t xml:space="preserve">vercel.json</w:t>
-            </w:r>
-            <w:r>
-              <w:rPr>
-                <w:sz w:val="19"/>
-                <w:szCs w:val="19"/>
-              </w:rPr>
-              <w:t xml:space="preserve">, </w:t>
-            </w:r>
+              <w:t xml:space="preserve">resources/js/</w:t>
+            </w:r>
+          </w:p>
+        </w:tc>
+        <w:tc>
+          <w:tcPr>
+            <w:tcW w:type="dxa" w:w="4819"/>
+            <w:tcBorders>
+              <w:top w:val="single" w:color="BFBFBF" w:sz="4"/>
+              <w:left w:val="single" w:color="BFBFBF" w:sz="4"/>
+              <w:bottom w:val="single" w:color="BFBFBF" w:sz="4"/>
+              <w:right w:val="single" w:color="BFBFBF" w:sz="4"/>
+            </w:tcBorders>
+            <w:tcMar>
+              <w:top w:type="dxa" w:w="60"/>
+              <w:left w:type="dxa" w:w="100"/>
+              <w:bottom w:type="dxa" w:w="60"/>
+              <w:right w:type="dxa" w:w="100"/>
+            </w:tcMar>
+          </w:tcPr>
+          <w:p>
             <w:r>
               <w:rPr>
                 <w:rFonts w:ascii="Consolas" w:cs="Consolas" w:eastAsia="Consolas" w:hAnsi="Consolas"/>
@@ -7604,33 +8047,62 @@
                 <w:sz w:val="17"/>
                 <w:szCs w:val="17"/>
               </w:rPr>
-              <w:t xml:space="preserve">api/index.php</w:t>
-            </w:r>
-          </w:p>
-        </w:tc>
-        <w:tc>
-          <w:tcPr>
-            <w:tcW w:type="dxa" w:w="4819"/>
-            <w:tcBorders>
-              <w:top w:val="single" w:color="BFBFBF" w:sz="4"/>
-              <w:left w:val="single" w:color="BFBFBF" w:sz="4"/>
-              <w:bottom w:val="single" w:color="BFBFBF" w:sz="4"/>
-              <w:right w:val="single" w:color="BFBFBF" w:sz="4"/>
-            </w:tcBorders>
-            <w:tcMar>
-              <w:top w:type="dxa" w:w="60"/>
-              <w:left w:type="dxa" w:w="100"/>
-              <w:bottom w:type="dxa" w:w="60"/>
-              <w:right w:type="dxa" w:w="100"/>
-            </w:tcMar>
-          </w:tcPr>
-          <w:p>
-            <w:r>
-              <w:rPr>
-                <w:sz w:val="19"/>
-                <w:szCs w:val="19"/>
-              </w:rPr>
-              <w:t xml:space="preserve">Konfigurasi hosting Vercel</w:t>
+              <w:t xml:space="preserve">app.js</w:t>
+            </w:r>
+            <w:r>
+              <w:rPr>
+                <w:sz w:val="19"/>
+                <w:szCs w:val="19"/>
+              </w:rPr>
+              <w:t xml:space="preserve"> (menu HP, notifikasi, lihat password, pratinjau gambar), </w:t>
+            </w:r>
+            <w:r>
+              <w:rPr>
+                <w:rFonts w:ascii="Consolas" w:cs="Consolas" w:eastAsia="Consolas" w:hAnsi="Consolas"/>
+                <w:color w:val="1F4E79"/>
+                <w:sz w:val="17"/>
+                <w:szCs w:val="17"/>
+              </w:rPr>
+              <w:t xml:space="preserve">tema.js</w:t>
+            </w:r>
+            <w:r>
+              <w:rPr>
+                <w:sz w:val="19"/>
+                <w:szCs w:val="19"/>
+              </w:rPr>
+              <w:t xml:space="preserve"> (mode gelap), </w:t>
+            </w:r>
+            <w:r>
+              <w:rPr>
+                <w:rFonts w:ascii="Consolas" w:cs="Consolas" w:eastAsia="Consolas" w:hAnsi="Consolas"/>
+                <w:color w:val="1F4E79"/>
+                <w:sz w:val="17"/>
+                <w:szCs w:val="17"/>
+              </w:rPr>
+              <w:t xml:space="preserve">suasana.js</w:t>
+            </w:r>
+            <w:r>
+              <w:rPr>
+                <w:sz w:val="19"/>
+                <w:szCs w:val="19"/>
+              </w:rPr>
+              <w:t xml:space="preserve"> (salam, jam, dan audio login), </w:t>
+            </w:r>
+            <w:r>
+              <w:rPr>
+                <w:rFonts w:ascii="Consolas" w:cs="Consolas" w:eastAsia="Consolas" w:hAnsi="Consolas"/>
+                <w:color w:val="1F4E79"/>
+                <w:sz w:val="17"/>
+                <w:szCs w:val="17"/>
+              </w:rPr>
+              <w:t xml:space="preserve">musik.js</w:t>
+            </w:r>
+            <w:r>
+              <w:rPr>
+                <w:sz w:val="19"/>
+                <w:szCs w:val="19"/>
+              </w:rPr>
+              <w:t xml:space="preserve"> (musik Bad Apple!!)</w:t>
             </w:r>
           </w:p>
         </w:tc>
@@ -7663,15 +8135,58 @@
                 <w:sz w:val="17"/>
                 <w:szCs w:val="17"/>
               </w:rPr>
-              <w:t xml:space="preserve">Dockerfile</w:t>
-            </w:r>
-            <w:r>
-              <w:rPr>
-                <w:sz w:val="19"/>
-                <w:szCs w:val="19"/>
-              </w:rPr>
-              <w:t xml:space="preserve">, </w:t>
-            </w:r>
+              <w:t xml:space="preserve">public/images/siluet.png</w:t>
+            </w:r>
+          </w:p>
+        </w:tc>
+        <w:tc>
+          <w:tcPr>
+            <w:tcW w:type="dxa" w:w="4819"/>
+            <w:tcBorders>
+              <w:top w:val="single" w:color="BFBFBF" w:sz="4"/>
+              <w:left w:val="single" w:color="BFBFBF" w:sz="4"/>
+              <w:bottom w:val="single" w:color="BFBFBF" w:sz="4"/>
+              <w:right w:val="single" w:color="BFBFBF" w:sz="4"/>
+            </w:tcBorders>
+            <w:tcMar>
+              <w:top w:type="dxa" w:w="60"/>
+              <w:left w:type="dxa" w:w="100"/>
+              <w:bottom w:type="dxa" w:w="60"/>
+              <w:right w:type="dxa" w:w="100"/>
+            </w:tcMar>
+          </w:tcPr>
+          <w:p>
+            <w:r>
+              <w:rPr>
+                <w:sz w:val="19"/>
+                <w:szCs w:val="19"/>
+              </w:rPr>
+              <w:t xml:space="preserve">Gambar siluet halaman login (PNG transparan)</w:t>
+            </w:r>
+          </w:p>
+        </w:tc>
+      </w:tr>
+      <w:tr>
+        <w:trPr>
+          <w:tblHeader w:val="off"/>
+        </w:trPr>
+        <w:tc>
+          <w:tcPr>
+            <w:tcW w:type="dxa" w:w="4819"/>
+            <w:tcBorders>
+              <w:top w:val="single" w:color="BFBFBF" w:sz="4"/>
+              <w:left w:val="single" w:color="BFBFBF" w:sz="4"/>
+              <w:bottom w:val="single" w:color="BFBFBF" w:sz="4"/>
+              <w:right w:val="single" w:color="BFBFBF" w:sz="4"/>
+            </w:tcBorders>
+            <w:tcMar>
+              <w:top w:type="dxa" w:w="60"/>
+              <w:left w:type="dxa" w:w="100"/>
+              <w:bottom w:type="dxa" w:w="60"/>
+              <w:right w:type="dxa" w:w="100"/>
+            </w:tcMar>
+          </w:tcPr>
+          <w:p>
             <w:r>
               <w:rPr>
                 <w:rFonts w:ascii="Consolas" w:cs="Consolas" w:eastAsia="Consolas" w:hAnsi="Consolas"/>
@@ -7679,7 +8194,7 @@
                 <w:sz w:val="17"/>
                 <w:szCs w:val="17"/>
               </w:rPr>
-              <w:t xml:space="preserve">docker/entrypoint.sh</w:t>
+              <w:t xml:space="preserve">public/audio/</w:t>
             </w:r>
           </w:p>
         </w:tc>
@@ -7705,7 +8220,230 @@
                 <w:sz w:val="19"/>
                 <w:szCs w:val="19"/>
               </w:rPr>
-              <w:t xml:space="preserve">Alternatif hosting berbasis Docker</w:t>
+              <w:t xml:space="preserve">Suara suasana (</w:t>
+            </w:r>
+            <w:r>
+              <w:rPr>
+                <w:rFonts w:ascii="Consolas" w:cs="Consolas" w:eastAsia="Consolas" w:hAnsi="Consolas"/>
+                <w:color w:val="1F4E79"/>
+                <w:sz w:val="17"/>
+                <w:szCs w:val="17"/>
+              </w:rPr>
+              <w:t xml:space="preserve">pagi.wav</w:t>
+            </w:r>
+            <w:r>
+              <w:rPr>
+                <w:sz w:val="19"/>
+                <w:szCs w:val="19"/>
+              </w:rPr>
+              <w:t xml:space="preserve">, </w:t>
+            </w:r>
+            <w:r>
+              <w:rPr>
+                <w:rFonts w:ascii="Consolas" w:cs="Consolas" w:eastAsia="Consolas" w:hAnsi="Consolas"/>
+                <w:color w:val="1F4E79"/>
+                <w:sz w:val="17"/>
+                <w:szCs w:val="17"/>
+              </w:rPr>
+              <w:t xml:space="preserve">siang.wav</w:t>
+            </w:r>
+            <w:r>
+              <w:rPr>
+                <w:sz w:val="19"/>
+                <w:szCs w:val="19"/>
+              </w:rPr>
+              <w:t xml:space="preserve">, </w:t>
+            </w:r>
+            <w:r>
+              <w:rPr>
+                <w:rFonts w:ascii="Consolas" w:cs="Consolas" w:eastAsia="Consolas" w:hAnsi="Consolas"/>
+                <w:color w:val="1F4E79"/>
+                <w:sz w:val="17"/>
+                <w:szCs w:val="17"/>
+              </w:rPr>
+              <w:t xml:space="preserve">sore.wav</w:t>
+            </w:r>
+            <w:r>
+              <w:rPr>
+                <w:sz w:val="19"/>
+                <w:szCs w:val="19"/>
+              </w:rPr>
+              <w:t xml:space="preserve">, </w:t>
+            </w:r>
+            <w:r>
+              <w:rPr>
+                <w:rFonts w:ascii="Consolas" w:cs="Consolas" w:eastAsia="Consolas" w:hAnsi="Consolas"/>
+                <w:color w:val="1F4E79"/>
+                <w:sz w:val="17"/>
+                <w:szCs w:val="17"/>
+              </w:rPr>
+              <w:t xml:space="preserve">malam.wav</w:t>
+            </w:r>
+            <w:r>
+              <w:rPr>
+                <w:sz w:val="19"/>
+                <w:szCs w:val="19"/>
+              </w:rPr>
+              <w:t xml:space="preserve">) dan lagu </w:t>
+            </w:r>
+            <w:r>
+              <w:rPr>
+                <w:rFonts w:ascii="Consolas" w:cs="Consolas" w:eastAsia="Consolas" w:hAnsi="Consolas"/>
+                <w:color w:val="1F4E79"/>
+                <w:sz w:val="17"/>
+                <w:szCs w:val="17"/>
+              </w:rPr>
+              <w:t xml:space="preserve">bad-apple.mp3</w:t>
+            </w:r>
+          </w:p>
+        </w:tc>
+      </w:tr>
+      <w:tr>
+        <w:trPr>
+          <w:tblHeader w:val="off"/>
+        </w:trPr>
+        <w:tc>
+          <w:tcPr>
+            <w:tcW w:type="dxa" w:w="4819"/>
+            <w:tcBorders>
+              <w:top w:val="single" w:color="BFBFBF" w:sz="4"/>
+              <w:left w:val="single" w:color="BFBFBF" w:sz="4"/>
+              <w:bottom w:val="single" w:color="BFBFBF" w:sz="4"/>
+              <w:right w:val="single" w:color="BFBFBF" w:sz="4"/>
+            </w:tcBorders>
+            <w:tcMar>
+              <w:top w:type="dxa" w:w="60"/>
+              <w:left w:type="dxa" w:w="100"/>
+              <w:bottom w:type="dxa" w:w="60"/>
+              <w:right w:type="dxa" w:w="100"/>
+            </w:tcMar>
+          </w:tcPr>
+          <w:p>
+            <w:r>
+              <w:rPr>
+                <w:rFonts w:ascii="Consolas" w:cs="Consolas" w:eastAsia="Consolas" w:hAnsi="Consolas"/>
+                <w:color w:val="1F4E79"/>
+                <w:sz w:val="17"/>
+                <w:szCs w:val="17"/>
+              </w:rPr>
+              <w:t xml:space="preserve">tests/Unit</w:t>
+            </w:r>
+            <w:r>
+              <w:rPr>
+                <w:sz w:val="19"/>
+                <w:szCs w:val="19"/>
+              </w:rPr>
+              <w:t xml:space="preserve">, </w:t>
+            </w:r>
+            <w:r>
+              <w:rPr>
+                <w:rFonts w:ascii="Consolas" w:cs="Consolas" w:eastAsia="Consolas" w:hAnsi="Consolas"/>
+                <w:color w:val="1F4E79"/>
+                <w:sz w:val="17"/>
+                <w:szCs w:val="17"/>
+              </w:rPr>
+              <w:t xml:space="preserve">tests/Feature</w:t>
+            </w:r>
+          </w:p>
+        </w:tc>
+        <w:tc>
+          <w:tcPr>
+            <w:tcW w:type="dxa" w:w="4819"/>
+            <w:tcBorders>
+              <w:top w:val="single" w:color="BFBFBF" w:sz="4"/>
+              <w:left w:val="single" w:color="BFBFBF" w:sz="4"/>
+              <w:bottom w:val="single" w:color="BFBFBF" w:sz="4"/>
+              <w:right w:val="single" w:color="BFBFBF" w:sz="4"/>
+            </w:tcBorders>
+            <w:tcMar>
+              <w:top w:type="dxa" w:w="60"/>
+              <w:left w:type="dxa" w:w="100"/>
+              <w:bottom w:type="dxa" w:w="60"/>
+              <w:right w:type="dxa" w:w="100"/>
+            </w:tcMar>
+          </w:tcPr>
+          <w:p>
+            <w:r>
+              <w:rPr>
+                <w:sz w:val="19"/>
+                <w:szCs w:val="19"/>
+              </w:rPr>
+              <w:t xml:space="preserve">75 test PHPUnit</w:t>
+            </w:r>
+          </w:p>
+        </w:tc>
+      </w:tr>
+      <w:tr>
+        <w:trPr>
+          <w:tblHeader w:val="off"/>
+        </w:trPr>
+        <w:tc>
+          <w:tcPr>
+            <w:tcW w:type="dxa" w:w="4819"/>
+            <w:tcBorders>
+              <w:top w:val="single" w:color="BFBFBF" w:sz="4"/>
+              <w:left w:val="single" w:color="BFBFBF" w:sz="4"/>
+              <w:bottom w:val="single" w:color="BFBFBF" w:sz="4"/>
+              <w:right w:val="single" w:color="BFBFBF" w:sz="4"/>
+            </w:tcBorders>
+            <w:tcMar>
+              <w:top w:type="dxa" w:w="60"/>
+              <w:left w:type="dxa" w:w="100"/>
+              <w:bottom w:type="dxa" w:w="60"/>
+              <w:right w:type="dxa" w:w="100"/>
+            </w:tcMar>
+          </w:tcPr>
+          <w:p>
+            <w:r>
+              <w:rPr>
+                <w:rFonts w:ascii="Consolas" w:cs="Consolas" w:eastAsia="Consolas" w:hAnsi="Consolas"/>
+                <w:color w:val="1F4E79"/>
+                <w:sz w:val="17"/>
+                <w:szCs w:val="17"/>
+              </w:rPr>
+              <w:t xml:space="preserve">vercel.json</w:t>
+            </w:r>
+            <w:r>
+              <w:rPr>
+                <w:sz w:val="19"/>
+                <w:szCs w:val="19"/>
+              </w:rPr>
+              <w:t xml:space="preserve">, </w:t>
+            </w:r>
+            <w:r>
+              <w:rPr>
+                <w:rFonts w:ascii="Consolas" w:cs="Consolas" w:eastAsia="Consolas" w:hAnsi="Consolas"/>
+                <w:color w:val="1F4E79"/>
+                <w:sz w:val="17"/>
+                <w:szCs w:val="17"/>
+              </w:rPr>
+              <w:t xml:space="preserve">api/index.php</w:t>
+            </w:r>
+          </w:p>
+        </w:tc>
+        <w:tc>
+          <w:tcPr>
+            <w:tcW w:type="dxa" w:w="4819"/>
+            <w:tcBorders>
+              <w:top w:val="single" w:color="BFBFBF" w:sz="4"/>
+              <w:left w:val="single" w:color="BFBFBF" w:sz="4"/>
+              <w:bottom w:val="single" w:color="BFBFBF" w:sz="4"/>
+              <w:right w:val="single" w:color="BFBFBF" w:sz="4"/>
+            </w:tcBorders>
+            <w:tcMar>
+              <w:top w:type="dxa" w:w="60"/>
+              <w:left w:type="dxa" w:w="100"/>
+              <w:bottom w:type="dxa" w:w="60"/>
+              <w:right w:type="dxa" w:w="100"/>
+            </w:tcMar>
+          </w:tcPr>
+          <w:p>
+            <w:r>
+              <w:rPr>
+                <w:sz w:val="19"/>
+                <w:szCs w:val="19"/>
+              </w:rPr>
+              <w:t xml:space="preserve">Konfigurasi hosting Vercel</w:t>
             </w:r>
           </w:p>
         </w:tc>
@@ -7872,7 +8610,164 @@
         <w:t xml:space="preserve">Siap cetak</w:t>
       </w:r>
       <w:r>
-        <w:t xml:space="preserve">: tombol Cetak menyembunyikan menu, filter, dan tombol aksi.</w:t>
+        <w:t xml:space="preserve">: tombol Cetak menyembunyikan menu, filter, dan tombol aksi; saat dicetak selalu memakai mode terang.</w:t>
+      </w:r>
+    </w:p>
+    <w:p>
+      <w:pPr>
+        <w:pStyle w:val="ListParagraph"/>
+        <w:numPr>
+          <w:ilvl w:val="0"/>
+          <w:numId w:val="2"/>
+        </w:numPr>
+      </w:pPr>
+      <w:r>
+        <w:rPr>
+          <w:b/>
+          <w:bCs/>
+        </w:rPr>
+        <w:t xml:space="preserve">Mode terang / gelap</w:t>
+      </w:r>
+      <w:r>
+        <w:t xml:space="preserve">: seluruh warna memakai variabel CSS yang ditukar nilainya saat </w:t>
+      </w:r>
+      <w:r>
+        <w:rPr>
+          <w:rFonts w:ascii="Consolas" w:cs="Consolas" w:eastAsia="Consolas" w:hAnsi="Consolas"/>
+          <w:color w:val="1F4E79"/>
+          <w:sz w:val="20"/>
+          <w:szCs w:val="20"/>
+        </w:rPr>
+        <w:t xml:space="preserve">&lt;html class="dark"&gt;</w:t>
+      </w:r>
+      <w:r>
+        <w:t xml:space="preserve"> (</w:t>
+      </w:r>
+      <w:r>
+        <w:rPr>
+          <w:rFonts w:ascii="Consolas" w:cs="Consolas" w:eastAsia="Consolas" w:hAnsi="Consolas"/>
+          <w:color w:val="1F4E79"/>
+          <w:sz w:val="20"/>
+          <w:szCs w:val="20"/>
+        </w:rPr>
+        <w:t xml:space="preserve">resources/css/app.css</w:t>
+      </w:r>
+      <w:r>
+        <w:t xml:space="preserve"> bagian MODE GELAP).</w:t>
+      </w:r>
+    </w:p>
+    <w:p>
+      <w:pPr>
+        <w:pStyle w:val="ListParagraph"/>
+        <w:numPr>
+          <w:ilvl w:val="0"/>
+          <w:numId w:val="2"/>
+        </w:numPr>
+      </w:pPr>
+      <w:r>
+        <w:rPr>
+          <w:b/>
+          <w:bCs/>
+        </w:rPr>
+        <w:t xml:space="preserve">Tema monokrom</w:t>
+      </w:r>
+      <w:r>
+        <w:t xml:space="preserve">: warna utama hitam-putih ala video Bad Apple!!; sidebar dan banner mengikuti tema; warna status tetap berwarna.</w:t>
+      </w:r>
+    </w:p>
+    <w:p>
+      <w:pPr>
+        <w:pStyle w:val="ListParagraph"/>
+        <w:numPr>
+          <w:ilvl w:val="0"/>
+          <w:numId w:val="2"/>
+        </w:numPr>
+      </w:pPr>
+      <w:r>
+        <w:rPr>
+          <w:b/>
+          <w:bCs/>
+        </w:rPr>
+        <w:t xml:space="preserve">Tanpa pindah halaman</w:t>
+      </w:r>
+      <w:r>
+        <w:t xml:space="preserve">: Turbo mengganti isi halaman tanpa muat ulang; tambah, ubah, dan detail tampil sebagai popup; profil di panel kanan.</w:t>
+      </w:r>
+    </w:p>
+    <w:p>
+      <w:pPr>
+        <w:pStyle w:val="ListParagraph"/>
+        <w:numPr>
+          <w:ilvl w:val="0"/>
+          <w:numId w:val="2"/>
+        </w:numPr>
+      </w:pPr>
+      <w:r>
+        <w:rPr>
+          <w:b/>
+          <w:bCs/>
+        </w:rPr>
+        <w:t xml:space="preserve">Latar karakter</w:t>
+      </w:r>
+      <w:r>
+        <w:t xml:space="preserve">: karakter tersenyum bersayap tampil besar di tengah belakang halaman, hitam di mode terang dan putih di mode gelap, ditemani percikan cahaya yang naik lalu menghilang.</w:t>
+      </w:r>
+    </w:p>
+    <w:p>
+      <w:pPr>
+        <w:pStyle w:val="ListParagraph"/>
+        <w:numPr>
+          <w:ilvl w:val="0"/>
+          <w:numId w:val="2"/>
+        </w:numPr>
+      </w:pPr>
+      <w:r>
+        <w:rPr>
+          <w:b/>
+          <w:bCs/>
+        </w:rPr>
+        <w:t xml:space="preserve">Kotak ikut tema</w:t>
+      </w:r>
+      <w:r>
+        <w:t xml:space="preserve">: kotak (kartu) mengikuti tema; di mode gelap diberi cahaya putih tipis di tepinya.</w:t>
+      </w:r>
+    </w:p>
+    <w:p>
+      <w:pPr>
+        <w:pStyle w:val="ListParagraph"/>
+        <w:numPr>
+          <w:ilvl w:val="0"/>
+          <w:numId w:val="2"/>
+        </w:numPr>
+      </w:pPr>
+      <w:r>
+        <w:rPr>
+          <w:b/>
+          <w:bCs/>
+        </w:rPr>
+        <w:t xml:space="preserve">Hiasan karakter</w:t>
+      </w:r>
+      <w:r>
+        <w:t xml:space="preserve">: penyihir samar di banner dashboard dan karakter samar di latar sidebar; warnanya ikut tema.</w:t>
+      </w:r>
+    </w:p>
+    <w:p>
+      <w:pPr>
+        <w:pStyle w:val="ListParagraph"/>
+        <w:numPr>
+          <w:ilvl w:val="0"/>
+          <w:numId w:val="2"/>
+        </w:numPr>
+      </w:pPr>
+      <w:r>
+        <w:rPr>
+          <w:b/>
+          <w:bCs/>
+        </w:rPr>
+        <w:t xml:space="preserve">Login siluet</w:t>
+      </w:r>
+      <w:r>
+        <w:t xml:space="preserve">: mode terang = siluet hitam di kiri dengan kartu di kanan; mode gelap = siluet putih di kanan dengan kartu di kiri. Ruang kosong diisi tulisan raksasa "GUDANG SEKOLAH" bergaris tipis dan apel kecil yang jatuh; cahaya apel berdenyut mengikuti waktu.</w:t>
       </w:r>
     </w:p>
     <w:p>
@@ -8864,7 +9759,7 @@
       </w:pPr>
       <w:bookmarkStart w:name="_Toc20" w:id="20"/>
       <w:r>
-        <w:t xml:space="preserve">7.8 Penanganan Error 419 — </w:t>
+        <w:t xml:space="preserve">7.8 Suasana Login dan Audio — </w:t>
       </w:r>
       <w:r>
         <w:rPr>
@@ -8873,9 +9768,696 @@
           <w:sz w:val="20"/>
           <w:szCs w:val="20"/>
         </w:rPr>
+        <w:t xml:space="preserve">App\Support\Suasana</w:t>
+      </w:r>
+      <w:bookmarkEnd w:id="20"/>
+    </w:p>
+    <w:p>
+      <w:pPr>
+        <w:pStyle w:val="ListParagraph"/>
+        <w:numPr>
+          <w:ilvl w:val="0"/>
+          <w:numId w:val="7"/>
+        </w:numPr>
+      </w:pPr>
+      <w:r>
+        <w:rPr>
+          <w:rFonts w:ascii="Consolas" w:cs="Consolas" w:eastAsia="Consolas" w:hAnsi="Consolas"/>
+          <w:color w:val="1F4E79"/>
+          <w:sz w:val="20"/>
+          <w:szCs w:val="20"/>
+        </w:rPr>
+        <w:t xml:space="preserve">Suasana::DAFTAR</w:t>
+      </w:r>
+      <w:r>
+        <w:t xml:space="preserve"> menyimpan data tiap waktu: jam mulai, salam, kalimat, dan file audio (</w:t>
+      </w:r>
+      <w:r>
+        <w:rPr>
+          <w:rFonts w:ascii="Consolas" w:cs="Consolas" w:eastAsia="Consolas" w:hAnsi="Consolas"/>
+          <w:color w:val="1F4E79"/>
+          <w:sz w:val="20"/>
+          <w:szCs w:val="20"/>
+        </w:rPr>
+        <w:t xml:space="preserve">public/audio/*.wav</w:t>
+      </w:r>
+      <w:r>
+        <w:t xml:space="preserve">).</w:t>
+      </w:r>
+    </w:p>
+    <w:p>
+      <w:pPr>
+        <w:pStyle w:val="ListParagraph"/>
+        <w:numPr>
+          <w:ilvl w:val="0"/>
+          <w:numId w:val="7"/>
+        </w:numPr>
+      </w:pPr>
+      <w:r>
+        <w:rPr>
+          <w:rFonts w:ascii="Consolas" w:cs="Consolas" w:eastAsia="Consolas" w:hAnsi="Consolas"/>
+          <w:color w:val="1F4E79"/>
+          <w:sz w:val="20"/>
+          <w:szCs w:val="20"/>
+        </w:rPr>
+        <w:t xml:space="preserve">Suasana::dariJam()</w:t>
+      </w:r>
+      <w:r>
+        <w:t xml:space="preserve"> menentukan waktu: pagi 04.00-10.59, siang 11.00-14.59, sore 15.00-17.59, malam 18.00-03.59. Fungsi yang sama dipakai untuk salam di dashboard.</w:t>
+      </w:r>
+    </w:p>
+    <w:p>
+      <w:pPr>
+        <w:pStyle w:val="ListParagraph"/>
+        <w:numPr>
+          <w:ilvl w:val="0"/>
+          <w:numId w:val="7"/>
+        </w:numPr>
+      </w:pPr>
+      <w:r>
+        <w:rPr>
+          <w:rFonts w:ascii="Consolas" w:cs="Consolas" w:eastAsia="Consolas" w:hAnsi="Consolas"/>
+          <w:color w:val="1F4E79"/>
+          <w:sz w:val="20"/>
+          <w:szCs w:val="20"/>
+        </w:rPr>
+        <w:t xml:space="preserve">AuthController::index()</w:t>
+      </w:r>
+      <w:r>
+        <w:t xml:space="preserve"> mengirim data ke halaman login; Blade menuliskannya sebagai JSON (</w:t>
+      </w:r>
+      <w:r>
+        <w:rPr>
+          <w:rFonts w:ascii="Consolas" w:cs="Consolas" w:eastAsia="Consolas" w:hAnsi="Consolas"/>
+          <w:color w:val="1F4E79"/>
+          <w:sz w:val="20"/>
+          <w:szCs w:val="20"/>
+        </w:rPr>
+        <w:t xml:space="preserve">@json</w:t>
+      </w:r>
+      <w:r>
+        <w:t xml:space="preserve">) agar dibaca </w:t>
+      </w:r>
+      <w:r>
+        <w:rPr>
+          <w:rFonts w:ascii="Consolas" w:cs="Consolas" w:eastAsia="Consolas" w:hAnsi="Consolas"/>
+          <w:color w:val="1F4E79"/>
+          <w:sz w:val="20"/>
+          <w:szCs w:val="20"/>
+        </w:rPr>
+        <w:t xml:space="preserve">resources/js/suasana.js</w:t>
+      </w:r>
+      <w:r>
+        <w:t xml:space="preserve">.</w:t>
+      </w:r>
+    </w:p>
+    <w:p>
+      <w:pPr>
+        <w:pStyle w:val="ListParagraph"/>
+        <w:numPr>
+          <w:ilvl w:val="0"/>
+          <w:numId w:val="7"/>
+        </w:numPr>
+      </w:pPr>
+      <w:r>
+        <w:t xml:space="preserve">JavaScript memperbarui jam setiap detik dan mengganti atribut </w:t>
+      </w:r>
+      <w:r>
+        <w:rPr>
+          <w:rFonts w:ascii="Consolas" w:cs="Consolas" w:eastAsia="Consolas" w:hAnsi="Consolas"/>
+          <w:color w:val="1F4E79"/>
+          <w:sz w:val="20"/>
+          <w:szCs w:val="20"/>
+        </w:rPr>
+        <w:t xml:space="preserve">data-waktu</w:t>
+      </w:r>
+      <w:r>
+        <w:t xml:space="preserve">; CSS mengubah warna cahaya apel berdasarkan atribut tersebut.</w:t>
+      </w:r>
+    </w:p>
+    <w:p>
+      <w:pPr>
+        <w:pStyle w:val="ListParagraph"/>
+        <w:numPr>
+          <w:ilvl w:val="0"/>
+          <w:numId w:val="7"/>
+        </w:numPr>
+      </w:pPr>
+      <w:r>
+        <w:t xml:space="preserve">Tombol "Putar suara" memutar elemen </w:t>
+      </w:r>
+      <w:r>
+        <w:rPr>
+          <w:rFonts w:ascii="Consolas" w:cs="Consolas" w:eastAsia="Consolas" w:hAnsi="Consolas"/>
+          <w:color w:val="1F4E79"/>
+          <w:sz w:val="20"/>
+          <w:szCs w:val="20"/>
+        </w:rPr>
+        <w:t xml:space="preserve">&lt;audio loop&gt;</w:t>
+      </w:r>
+      <w:r>
+        <w:t xml:space="preserve"> dengan volume naik perlahan. Suara dibuat sendiri secara sintetis sehingga bebas hak cipta.</w:t>
+      </w:r>
+    </w:p>
+    <w:p>
+      <w:pPr>
+        <w:pStyle w:val="Heading2"/>
+        <w:keepNext/>
+      </w:pPr>
+      <w:bookmarkStart w:name="_Toc21" w:id="21"/>
+      <w:r>
+        <w:t xml:space="preserve">7.9 Mode Terang / Gelap — </w:t>
+      </w:r>
+      <w:r>
+        <w:rPr>
+          <w:rFonts w:ascii="Consolas" w:cs="Consolas" w:eastAsia="Consolas" w:hAnsi="Consolas"/>
+          <w:color w:val="1F4E79"/>
+          <w:sz w:val="20"/>
+          <w:szCs w:val="20"/>
+        </w:rPr>
+        <w:t xml:space="preserve">resources/js/tema.js</w:t>
+      </w:r>
+      <w:bookmarkEnd w:id="21"/>
+    </w:p>
+    <w:p>
+      <w:pPr>
+        <w:pStyle w:val="ListParagraph"/>
+        <w:numPr>
+          <w:ilvl w:val="0"/>
+          <w:numId w:val="8"/>
+        </w:numPr>
+      </w:pPr>
+      <w:r>
+        <w:rPr>
+          <w:rFonts w:ascii="Consolas" w:cs="Consolas" w:eastAsia="Consolas" w:hAnsi="Consolas"/>
+          <w:color w:val="1F4E79"/>
+          <w:sz w:val="20"/>
+          <w:szCs w:val="20"/>
+        </w:rPr>
+        <w:t xml:space="preserve">partials/tema-awal.blade.php</w:t>
+      </w:r>
+      <w:r>
+        <w:t xml:space="preserve"> dijalankan paling awal di </w:t>
+      </w:r>
+      <w:r>
+        <w:rPr>
+          <w:rFonts w:ascii="Consolas" w:cs="Consolas" w:eastAsia="Consolas" w:hAnsi="Consolas"/>
+          <w:color w:val="1F4E79"/>
+          <w:sz w:val="20"/>
+          <w:szCs w:val="20"/>
+        </w:rPr>
+        <w:t xml:space="preserve">&lt;head&gt;</w:t>
+      </w:r>
+      <w:r>
+        <w:t xml:space="preserve"> agar halaman tidak berkedip putih.</w:t>
+      </w:r>
+    </w:p>
+    <w:p>
+      <w:pPr>
+        <w:pStyle w:val="ListParagraph"/>
+        <w:numPr>
+          <w:ilvl w:val="0"/>
+          <w:numId w:val="8"/>
+        </w:numPr>
+      </w:pPr>
+      <w:r>
+        <w:rPr>
+          <w:rFonts w:ascii="Consolas" w:cs="Consolas" w:eastAsia="Consolas" w:hAnsi="Consolas"/>
+          <w:color w:val="1F4E79"/>
+          <w:sz w:val="20"/>
+          <w:szCs w:val="20"/>
+        </w:rPr>
+        <w:t xml:space="preserve">gantiTema()</w:t>
+      </w:r>
+      <w:r>
+        <w:t xml:space="preserve"> menukar class </w:t>
+      </w:r>
+      <w:r>
+        <w:rPr>
+          <w:rFonts w:ascii="Consolas" w:cs="Consolas" w:eastAsia="Consolas" w:hAnsi="Consolas"/>
+          <w:color w:val="1F4E79"/>
+          <w:sz w:val="20"/>
+          <w:szCs w:val="20"/>
+        </w:rPr>
+        <w:t xml:space="preserve">dark</w:t>
+      </w:r>
+      <w:r>
+        <w:t xml:space="preserve"> di </w:t>
+      </w:r>
+      <w:r>
+        <w:rPr>
+          <w:rFonts w:ascii="Consolas" w:cs="Consolas" w:eastAsia="Consolas" w:hAnsi="Consolas"/>
+          <w:color w:val="1F4E79"/>
+          <w:sz w:val="20"/>
+          <w:szCs w:val="20"/>
+        </w:rPr>
+        <w:t xml:space="preserve">&lt;html&gt;</w:t>
+      </w:r>
+      <w:r>
+        <w:t xml:space="preserve"> dan menyimpan pilihan di </w:t>
+      </w:r>
+      <w:r>
+        <w:rPr>
+          <w:rFonts w:ascii="Consolas" w:cs="Consolas" w:eastAsia="Consolas" w:hAnsi="Consolas"/>
+          <w:color w:val="1F4E79"/>
+          <w:sz w:val="20"/>
+          <w:szCs w:val="20"/>
+        </w:rPr>
+        <w:t xml:space="preserve">sessionStorage</w:t>
+      </w:r>
+      <w:r>
+        <w:t xml:space="preserve">. Bila belum memilih, tema mengikuti jam: malam (18.00-03.59) gelap, selain itu terang. Bila browser mendukung View Transitions API, tema baru muncul sebagai lingkaran yang membesar dari tombol.</w:t>
+      </w:r>
+    </w:p>
+    <w:p>
+      <w:pPr>
+        <w:pStyle w:val="ListParagraph"/>
+        <w:numPr>
+          <w:ilvl w:val="0"/>
+          <w:numId w:val="8"/>
+        </w:numPr>
+      </w:pPr>
+      <w:r>
+        <w:t xml:space="preserve">Di CSS, </w:t>
+      </w:r>
+      <w:r>
+        <w:rPr>
+          <w:rFonts w:ascii="Consolas" w:cs="Consolas" w:eastAsia="Consolas" w:hAnsi="Consolas"/>
+          <w:color w:val="1F4E79"/>
+          <w:sz w:val="20"/>
+          <w:szCs w:val="20"/>
+        </w:rPr>
+        <w:t xml:space="preserve">html.dark</w:t>
+      </w:r>
+      <w:r>
+        <w:t xml:space="preserve"> menukar nilai variabel warna, sehingga sidebar, banner, popup, dan latar karakter ikut berubah warna.</w:t>
+      </w:r>
+    </w:p>
+    <w:p>
+      <w:pPr>
+        <w:pStyle w:val="ListParagraph"/>
+        <w:numPr>
+          <w:ilvl w:val="0"/>
+          <w:numId w:val="8"/>
+        </w:numPr>
+      </w:pPr>
+      <w:r>
+        <w:t xml:space="preserve">Warna utama (</w:t>
+      </w:r>
+      <w:r>
+        <w:rPr>
+          <w:rFonts w:ascii="Consolas" w:cs="Consolas" w:eastAsia="Consolas" w:hAnsi="Consolas"/>
+          <w:color w:val="1F4E79"/>
+          <w:sz w:val="20"/>
+          <w:szCs w:val="20"/>
+        </w:rPr>
+        <w:t xml:space="preserve">brand</w:t>
+      </w:r>
+      <w:r>
+        <w:t xml:space="preserve">) dibuat hitam dan abu-abu (</w:t>
+      </w:r>
+      <w:r>
+        <w:rPr>
+          <w:rFonts w:ascii="Consolas" w:cs="Consolas" w:eastAsia="Consolas" w:hAnsi="Consolas"/>
+          <w:color w:val="1F4E79"/>
+          <w:sz w:val="20"/>
+          <w:szCs w:val="20"/>
+        </w:rPr>
+        <w:t xml:space="preserve">slate</w:t>
+      </w:r>
+      <w:r>
+        <w:t xml:space="preserve">) dibuat netral sehingga seluruh aplikasi bergaya monokrom.</w:t>
+      </w:r>
+    </w:p>
+    <w:p>
+      <w:pPr>
+        <w:pStyle w:val="Heading2"/>
+        <w:keepNext/>
+      </w:pPr>
+      <w:bookmarkStart w:name="_Toc22" w:id="22"/>
+      <w:r>
+        <w:t xml:space="preserve">7.10 Musik Bad Apple!! — </w:t>
+      </w:r>
+      <w:r>
+        <w:rPr>
+          <w:rFonts w:ascii="Consolas" w:cs="Consolas" w:eastAsia="Consolas" w:hAnsi="Consolas"/>
+          <w:color w:val="1F4E79"/>
+          <w:sz w:val="20"/>
+          <w:szCs w:val="20"/>
+        </w:rPr>
+        <w:t xml:space="preserve">resources/js/musik.js</w:t>
+      </w:r>
+      <w:bookmarkEnd w:id="22"/>
+    </w:p>
+    <w:p>
+      <w:pPr>
+        <w:pStyle w:val="ListParagraph"/>
+        <w:numPr>
+          <w:ilvl w:val="0"/>
+          <w:numId w:val="9"/>
+        </w:numPr>
+      </w:pPr>
+      <w:r>
+        <w:t xml:space="preserve">File lagu </w:t>
+      </w:r>
+      <w:r>
+        <w:rPr>
+          <w:rFonts w:ascii="Consolas" w:cs="Consolas" w:eastAsia="Consolas" w:hAnsi="Consolas"/>
+          <w:color w:val="1F4E79"/>
+          <w:sz w:val="20"/>
+          <w:szCs w:val="20"/>
+        </w:rPr>
+        <w:t xml:space="preserve">public/audio/bad-apple.mp3</w:t>
+      </w:r>
+      <w:r>
+        <w:t xml:space="preserve"> diputar oleh elemen </w:t>
+      </w:r>
+      <w:r>
+        <w:rPr>
+          <w:rFonts w:ascii="Consolas" w:cs="Consolas" w:eastAsia="Consolas" w:hAnsi="Consolas"/>
+          <w:color w:val="1F4E79"/>
+          <w:sz w:val="20"/>
+          <w:szCs w:val="20"/>
+        </w:rPr>
+        <w:t xml:space="preserve">&lt;audio loop preload="none"&gt;</w:t>
+      </w:r>
+      <w:r>
+        <w:t xml:space="preserve"> di </w:t>
+      </w:r>
+      <w:r>
+        <w:rPr>
+          <w:rFonts w:ascii="Consolas" w:cs="Consolas" w:eastAsia="Consolas" w:hAnsi="Consolas"/>
+          <w:color w:val="1F4E79"/>
+          <w:sz w:val="20"/>
+          <w:szCs w:val="20"/>
+        </w:rPr>
+        <w:t xml:space="preserve">partials/pemutar-musik.blade.php</w:t>
+      </w:r>
+      <w:r>
+        <w:t xml:space="preserve">.</w:t>
+      </w:r>
+    </w:p>
+    <w:p>
+      <w:pPr>
+        <w:pStyle w:val="ListParagraph"/>
+        <w:numPr>
+          <w:ilvl w:val="0"/>
+          <w:numId w:val="9"/>
+        </w:numPr>
+      </w:pPr>
+      <w:r>
+        <w:t xml:space="preserve">Tombol not musik memanggil </w:t>
+      </w:r>
+      <w:r>
+        <w:rPr>
+          <w:rFonts w:ascii="Consolas" w:cs="Consolas" w:eastAsia="Consolas" w:hAnsi="Consolas"/>
+          <w:color w:val="1F4E79"/>
+          <w:sz w:val="20"/>
+          <w:szCs w:val="20"/>
+        </w:rPr>
+        <w:t xml:space="preserve">play()</w:t>
+      </w:r>
+      <w:r>
+        <w:t xml:space="preserve"> / </w:t>
+      </w:r>
+      <w:r>
+        <w:rPr>
+          <w:rFonts w:ascii="Consolas" w:cs="Consolas" w:eastAsia="Consolas" w:hAnsi="Consolas"/>
+          <w:color w:val="1F4E79"/>
+          <w:sz w:val="20"/>
+          <w:szCs w:val="20"/>
+        </w:rPr>
+        <w:t xml:space="preserve">pause()</w:t>
+      </w:r>
+      <w:r>
+        <w:t xml:space="preserve">; ikon berubah sesuai status.</w:t>
+      </w:r>
+    </w:p>
+    <w:p>
+      <w:pPr>
+        <w:pStyle w:val="ListParagraph"/>
+        <w:numPr>
+          <w:ilvl w:val="0"/>
+          <w:numId w:val="9"/>
+        </w:numPr>
+      </w:pPr>
+      <w:r>
+        <w:t xml:space="preserve">Posisi lagu disimpan di </w:t>
+      </w:r>
+      <w:r>
+        <w:rPr>
+          <w:rFonts w:ascii="Consolas" w:cs="Consolas" w:eastAsia="Consolas" w:hAnsi="Consolas"/>
+          <w:color w:val="1F4E79"/>
+          <w:sz w:val="20"/>
+          <w:szCs w:val="20"/>
+        </w:rPr>
+        <w:t xml:space="preserve">sessionStorage</w:t>
+      </w:r>
+      <w:r>
+        <w:t xml:space="preserve"> saat meninggalkan halaman, sehingga di halaman berikutnya lagu dilanjutkan dari detik terakhir.</w:t>
+      </w:r>
+    </w:p>
+    <w:p>
+      <w:pPr>
+        <w:pStyle w:val="ListParagraph"/>
+        <w:numPr>
+          <w:ilvl w:val="0"/>
+          <w:numId w:val="9"/>
+        </w:numPr>
+      </w:pPr>
+      <w:r>
+        <w:t xml:space="preserve">Memutar musik menjeda suara suasana di halaman login, dan sebaliknya.</w:t>
+      </w:r>
+    </w:p>
+    <w:p>
+      <w:pPr>
+        <w:pStyle w:val="Heading2"/>
+        <w:keepNext/>
+      </w:pPr>
+      <w:bookmarkStart w:name="_Toc23" w:id="23"/>
+      <w:r>
+        <w:t xml:space="preserve">7.11 Tanpa Pindah Halaman dan Popup — Turbo</w:t>
+      </w:r>
+      <w:bookmarkEnd w:id="23"/>
+    </w:p>
+    <w:p>
+      <w:pPr>
+        <w:pStyle w:val="ListParagraph"/>
+        <w:numPr>
+          <w:ilvl w:val="0"/>
+          <w:numId w:val="10"/>
+        </w:numPr>
+      </w:pPr>
+      <w:r>
+        <w:rPr>
+          <w:b/>
+          <w:bCs/>
+        </w:rPr>
+        <w:t xml:space="preserve">Turbo Drive</w:t>
+      </w:r>
+      <w:r>
+        <w:t xml:space="preserve"> (</w:t>
+      </w:r>
+      <w:r>
+        <w:rPr>
+          <w:rFonts w:ascii="Consolas" w:cs="Consolas" w:eastAsia="Consolas" w:hAnsi="Consolas"/>
+          <w:color w:val="1F4E79"/>
+          <w:sz w:val="20"/>
+          <w:szCs w:val="20"/>
+        </w:rPr>
+        <w:t xml:space="preserve">resources/js/app.js</w:t>
+      </w:r>
+      <w:r>
+        <w:t xml:space="preserve">) mengambil halaman tujuan di belakang layar lalu mengganti isi </w:t>
+      </w:r>
+      <w:r>
+        <w:rPr>
+          <w:rFonts w:ascii="Consolas" w:cs="Consolas" w:eastAsia="Consolas" w:hAnsi="Consolas"/>
+          <w:color w:val="1F4E79"/>
+          <w:sz w:val="20"/>
+          <w:szCs w:val="20"/>
+        </w:rPr>
+        <w:t xml:space="preserve">&lt;body&gt;</w:t>
+      </w:r>
+      <w:r>
+        <w:t xml:space="preserve">; halaman tidak dimuat ulang, sehingga lebih cepat dan musik tidak terputus.</w:t>
+      </w:r>
+    </w:p>
+    <w:p>
+      <w:pPr>
+        <w:pStyle w:val="ListParagraph"/>
+        <w:numPr>
+          <w:ilvl w:val="0"/>
+          <w:numId w:val="10"/>
+        </w:numPr>
+      </w:pPr>
+      <w:r>
+        <w:t xml:space="preserve">Tombol Tambah / Ubah / Detail diberi </w:t>
+      </w:r>
+      <w:r>
+        <w:rPr>
+          <w:rFonts w:ascii="Consolas" w:cs="Consolas" w:eastAsia="Consolas" w:hAnsi="Consolas"/>
+          <w:color w:val="1F4E79"/>
+          <w:sz w:val="20"/>
+          <w:szCs w:val="20"/>
+        </w:rPr>
+        <w:t xml:space="preserve">data-turbo-frame="modal"</w:t>
+      </w:r>
+      <w:r>
+        <w:t xml:space="preserve">. Turbo mengirim header </w:t>
+      </w:r>
+      <w:r>
+        <w:rPr>
+          <w:rFonts w:ascii="Consolas" w:cs="Consolas" w:eastAsia="Consolas" w:hAnsi="Consolas"/>
+          <w:color w:val="1F4E79"/>
+          <w:sz w:val="20"/>
+          <w:szCs w:val="20"/>
+        </w:rPr>
+        <w:t xml:space="preserve">Turbo-Frame: modal</w:t>
+      </w:r>
+      <w:r>
+        <w:t xml:space="preserve">; layout (</w:t>
+      </w:r>
+      <w:r>
+        <w:rPr>
+          <w:rFonts w:ascii="Consolas" w:cs="Consolas" w:eastAsia="Consolas" w:hAnsi="Consolas"/>
+          <w:color w:val="1F4E79"/>
+          <w:sz w:val="20"/>
+          <w:szCs w:val="20"/>
+        </w:rPr>
+        <w:t xml:space="preserve">layouts/app.blade.php</w:t>
+      </w:r>
+      <w:r>
+        <w:t xml:space="preserve">) lalu hanya mengirim isi halaman di dalam </w:t>
+      </w:r>
+      <w:r>
+        <w:rPr>
+          <w:rFonts w:ascii="Consolas" w:cs="Consolas" w:eastAsia="Consolas" w:hAnsi="Consolas"/>
+          <w:color w:val="1F4E79"/>
+          <w:sz w:val="20"/>
+          <w:szCs w:val="20"/>
+        </w:rPr>
+        <w:t xml:space="preserve">&lt;turbo-frame id="modal"&gt;</w:t>
+      </w:r>
+      <w:r>
+        <w:t xml:space="preserve"> yang ditampilkan dalam </w:t>
+      </w:r>
+      <w:r>
+        <w:rPr>
+          <w:rFonts w:ascii="Consolas" w:cs="Consolas" w:eastAsia="Consolas" w:hAnsi="Consolas"/>
+          <w:color w:val="1F4E79"/>
+          <w:sz w:val="20"/>
+          <w:szCs w:val="20"/>
+        </w:rPr>
+        <w:t xml:space="preserve">&lt;dialog&gt;</w:t>
+      </w:r>
+      <w:r>
+        <w:t xml:space="preserve">.</w:t>
+      </w:r>
+    </w:p>
+    <w:p>
+      <w:pPr>
+        <w:pStyle w:val="ListParagraph"/>
+        <w:numPr>
+          <w:ilvl w:val="0"/>
+          <w:numId w:val="10"/>
+        </w:numPr>
+      </w:pPr>
+      <w:r>
+        <w:t xml:space="preserve">Halaman yang boleh menjadi popup ditandai </w:t>
+      </w:r>
+      <w:r>
+        <w:rPr>
+          <w:rFonts w:ascii="Consolas" w:cs="Consolas" w:eastAsia="Consolas" w:hAnsi="Consolas"/>
+          <w:color w:val="1F4E79"/>
+          <w:sz w:val="20"/>
+          <w:szCs w:val="20"/>
+        </w:rPr>
+        <w:t xml:space="preserve">@section('popup', true)</w:t>
+      </w:r>
+      <w:r>
+        <w:t xml:space="preserve">. Tanpa Turbo, halaman yang sama tetap tampil utuh, sehingga route, controller, dan test tidak berubah.</w:t>
+      </w:r>
+    </w:p>
+    <w:p>
+      <w:pPr>
+        <w:pStyle w:val="ListParagraph"/>
+        <w:numPr>
+          <w:ilvl w:val="0"/>
+          <w:numId w:val="10"/>
+        </w:numPr>
+      </w:pPr>
+      <w:r>
+        <w:t xml:space="preserve">Validasi gagal → form tampil lagi di popup dengan pesan error. Simpan berhasil → popup ditutup dan halaman daftar tampil dengan pesan sukses (</w:t>
+      </w:r>
+      <w:r>
+        <w:rPr>
+          <w:rFonts w:ascii="Consolas" w:cs="Consolas" w:eastAsia="Consolas" w:hAnsi="Consolas"/>
+          <w:color w:val="1F4E79"/>
+          <w:sz w:val="20"/>
+          <w:szCs w:val="20"/>
+        </w:rPr>
+        <w:t xml:space="preserve">turbo:frame-missing</w:t>
+      </w:r>
+      <w:r>
+        <w:t xml:space="preserve"> di </w:t>
+      </w:r>
+      <w:r>
+        <w:rPr>
+          <w:rFonts w:ascii="Consolas" w:cs="Consolas" w:eastAsia="Consolas" w:hAnsi="Consolas"/>
+          <w:color w:val="1F4E79"/>
+          <w:sz w:val="20"/>
+          <w:szCs w:val="20"/>
+        </w:rPr>
+        <w:t xml:space="preserve">resources/js/popup.js</w:t>
+      </w:r>
+      <w:r>
+        <w:t xml:space="preserve">).</w:t>
+      </w:r>
+    </w:p>
+    <w:p>
+      <w:pPr>
+        <w:pStyle w:val="ListParagraph"/>
+        <w:numPr>
+          <w:ilvl w:val="0"/>
+          <w:numId w:val="10"/>
+        </w:numPr>
+      </w:pPr>
+      <w:r>
+        <w:t xml:space="preserve">Profil dibuka di panel kanan (</w:t>
+      </w:r>
+      <w:r>
+        <w:rPr>
+          <w:rFonts w:ascii="Consolas" w:cs="Consolas" w:eastAsia="Consolas" w:hAnsi="Consolas"/>
+          <w:color w:val="1F4E79"/>
+          <w:sz w:val="20"/>
+          <w:szCs w:val="20"/>
+        </w:rPr>
+        <w:t xml:space="preserve">data-turbo-frame="laci"</w:t>
+      </w:r>
+      <w:r>
+        <w:t xml:space="preserve">); setelah disimpan kembali ke halaman asal.</w:t>
+      </w:r>
+    </w:p>
+    <w:p>
+      <w:pPr>
+        <w:pStyle w:val="Heading2"/>
+        <w:keepNext/>
+      </w:pPr>
+      <w:bookmarkStart w:name="_Toc24" w:id="24"/>
+      <w:r>
+        <w:t xml:space="preserve">7.12 Penanganan Error 419 — </w:t>
+      </w:r>
+      <w:r>
+        <w:rPr>
+          <w:rFonts w:ascii="Consolas" w:cs="Consolas" w:eastAsia="Consolas" w:hAnsi="Consolas"/>
+          <w:color w:val="1F4E79"/>
+          <w:sz w:val="20"/>
+          <w:szCs w:val="20"/>
+        </w:rPr>
         <w:t xml:space="preserve">bootstrap/app.php</w:t>
       </w:r>
-      <w:bookmarkEnd w:id="20"/>
+      <w:bookmarkEnd w:id="24"/>
     </w:p>
     <w:p>
       <w:r>
@@ -8887,11 +10469,11 @@
         <w:pStyle w:val="Heading1"/>
         <w:keepNext/>
       </w:pPr>
-      <w:bookmarkStart w:name="_Toc21" w:id="21"/>
+      <w:bookmarkStart w:name="_Toc25" w:id="25"/>
       <w:r>
         <w:t xml:space="preserve">8. Keamanan</w:t>
       </w:r>
-      <w:bookmarkEnd w:id="21"/>
+      <w:bookmarkEnd w:id="25"/>
     </w:p>
     <w:tbl>
       <w:tblPr>
@@ -9703,22 +11285,22 @@
         <w:pStyle w:val="Heading1"/>
         <w:keepNext/>
       </w:pPr>
-      <w:bookmarkStart w:name="_Toc22" w:id="22"/>
+      <w:bookmarkStart w:name="_Toc26" w:id="26"/>
       <w:r>
         <w:t xml:space="preserve">9. Debugging</w:t>
       </w:r>
-      <w:bookmarkEnd w:id="22"/>
+      <w:bookmarkEnd w:id="26"/>
     </w:p>
     <w:p>
       <w:pPr>
         <w:pStyle w:val="Heading2"/>
         <w:keepNext/>
       </w:pPr>
-      <w:bookmarkStart w:name="_Toc23" w:id="23"/>
+      <w:bookmarkStart w:name="_Toc27" w:id="27"/>
       <w:r>
         <w:t xml:space="preserve">9.1 Bug yang Ditemukan dan Perbaikannya</w:t>
       </w:r>
-      <w:bookmarkEnd w:id="23"/>
+      <w:bookmarkEnd w:id="27"/>
     </w:p>
     <w:tbl>
       <w:tblPr>
@@ -12075,11 +13657,11 @@
         <w:pStyle w:val="Heading2"/>
         <w:keepNext/>
       </w:pPr>
-      <w:bookmarkStart w:name="_Toc24" w:id="24"/>
+      <w:bookmarkStart w:name="_Toc28" w:id="28"/>
       <w:r>
         <w:t xml:space="preserve">9.2 Teknik Debugging</w:t>
       </w:r>
-      <w:bookmarkEnd w:id="24"/>
+      <w:bookmarkEnd w:id="28"/>
     </w:p>
     <w:p>
       <w:pPr>
@@ -12280,11 +13862,11 @@
         <w:pStyle w:val="Heading1"/>
         <w:keepNext/>
       </w:pPr>
-      <w:bookmarkStart w:name="_Toc25" w:id="25"/>
+      <w:bookmarkStart w:name="_Toc29" w:id="29"/>
       <w:r>
         <w:t xml:space="preserve">10. Pengujian Unit Program</w:t>
       </w:r>
-      <w:bookmarkEnd w:id="25"/>
+      <w:bookmarkEnd w:id="29"/>
     </w:p>
     <w:p>
       <w:r>
@@ -12370,10 +13952,10 @@
           <w:b/>
           <w:bCs/>
         </w:rPr>
-        <w:t xml:space="preserve">66 passed (221 assertions)</w:t>
-      </w:r>
-      <w:r>
-        <w:t xml:space="preserve">, lulus di SQLite dan PostgreSQL.</w:t>
+        <w:t xml:space="preserve">75 passed (257 assertions)</w:t>
+      </w:r>
+      <w:r>
+        <w:t xml:space="preserve">.</w:t>
       </w:r>
     </w:p>
     <w:tbl>
@@ -12769,7 +14351,7 @@
                 <w:sz w:val="17"/>
                 <w:szCs w:val="17"/>
               </w:rPr>
-              <w:t xml:space="preserve">tests/Feature/AuthTest.php</w:t>
+              <w:t xml:space="preserve">tests/Unit/SuasanaTest.php</w:t>
             </w:r>
           </w:p>
         </w:tc>
@@ -12795,7 +14377,7 @@
                 <w:sz w:val="19"/>
                 <w:szCs w:val="19"/>
               </w:rPr>
-              <w:t xml:space="preserve">Fitur</w:t>
+              <w:t xml:space="preserve">Unit</w:t>
             </w:r>
           </w:p>
         </w:tc>
@@ -12821,7 +14403,7 @@
                 <w:sz w:val="19"/>
                 <w:szCs w:val="19"/>
               </w:rPr>
-              <w:t xml:space="preserve">6</w:t>
+              <w:t xml:space="preserve">3</w:t>
             </w:r>
           </w:p>
         </w:tc>
@@ -12847,7 +14429,7 @@
                 <w:sz w:val="19"/>
                 <w:szCs w:val="19"/>
               </w:rPr>
-              <w:t xml:space="preserve">Login berhasil / gagal, password ter-hash, tamu diarahkan ke login, logout</w:t>
+              <w:t xml:space="preserve">Suasana dan salam sesuai jam, file audio tersedia</w:t>
             </w:r>
           </w:p>
         </w:tc>
@@ -12880,7 +14462,7 @@
                 <w:sz w:val="17"/>
                 <w:szCs w:val="17"/>
               </w:rPr>
-              <w:t xml:space="preserve">tests/Feature/HakAksesTest.php</w:t>
+              <w:t xml:space="preserve">tests/Feature/AuthTest.php</w:t>
             </w:r>
           </w:p>
         </w:tc>
@@ -12932,7 +14514,7 @@
                 <w:sz w:val="19"/>
                 <w:szCs w:val="19"/>
               </w:rPr>
-              <w:t xml:space="preserve">6</w:t>
+              <w:t xml:space="preserve">7</w:t>
             </w:r>
           </w:p>
         </w:tc>
@@ -12958,7 +14540,7 @@
                 <w:sz w:val="19"/>
                 <w:szCs w:val="19"/>
               </w:rPr>
-              <w:t xml:space="preserve">Pembatasan halaman untuk Admin, Operator, Manager</w:t>
+              <w:t xml:space="preserve">Login berhasil / gagal, password ter-hash, tamu diarahkan ke login, logout, suasana login sesuai jam</w:t>
             </w:r>
           </w:p>
         </w:tc>
@@ -12991,7 +14573,7 @@
                 <w:sz w:val="17"/>
                 <w:szCs w:val="17"/>
               </w:rPr>
-              <w:t xml:space="preserve">tests/Feature/UserTest.php</w:t>
+              <w:t xml:space="preserve">tests/Feature/HakAksesTest.php</w:t>
             </w:r>
           </w:p>
         </w:tc>
@@ -13043,7 +14625,7 @@
                 <w:sz w:val="19"/>
                 <w:szCs w:val="19"/>
               </w:rPr>
-              <w:t xml:space="preserve">8</w:t>
+              <w:t xml:space="preserve">6</w:t>
             </w:r>
           </w:p>
         </w:tc>
@@ -13069,7 +14651,7 @@
                 <w:sz w:val="19"/>
                 <w:szCs w:val="19"/>
               </w:rPr>
-              <w:t xml:space="preserve">Kelola pengguna, username unik, role valid, Admin dapat mengubah nama / username sendiri tetapi tidak dapat mengubah role / menghapus akun sendiri</w:t>
+              <w:t xml:space="preserve">Pembatasan halaman untuk Admin, Operator, Manager</w:t>
             </w:r>
           </w:p>
         </w:tc>
@@ -13102,7 +14684,7 @@
                 <w:sz w:val="17"/>
                 <w:szCs w:val="17"/>
               </w:rPr>
-              <w:t xml:space="preserve">tests/Feature/ProfilTest.php</w:t>
+              <w:t xml:space="preserve">tests/Feature/UserTest.php</w:t>
             </w:r>
           </w:p>
         </w:tc>
@@ -13154,7 +14736,7 @@
                 <w:sz w:val="19"/>
                 <w:szCs w:val="19"/>
               </w:rPr>
-              <w:t xml:space="preserve">5</w:t>
+              <w:t xml:space="preserve">8</w:t>
             </w:r>
           </w:p>
         </w:tc>
@@ -13180,7 +14762,7 @@
                 <w:sz w:val="19"/>
                 <w:szCs w:val="19"/>
               </w:rPr>
-              <w:t xml:space="preserve">Ubah profil, unggah / ganti / hapus foto, ganti password</w:t>
+              <w:t xml:space="preserve">Kelola pengguna, username unik, role valid, Admin dapat mengubah nama / username sendiri tetapi tidak dapat mengubah role / menghapus akun sendiri</w:t>
             </w:r>
           </w:p>
         </w:tc>
@@ -13213,7 +14795,7 @@
                 <w:sz w:val="17"/>
                 <w:szCs w:val="17"/>
               </w:rPr>
-              <w:t xml:space="preserve">tests/Feature/KategoriBarangTest.php</w:t>
+              <w:t xml:space="preserve">tests/Feature/ProfilTest.php</w:t>
             </w:r>
           </w:p>
         </w:tc>
@@ -13265,7 +14847,7 @@
                 <w:sz w:val="19"/>
                 <w:szCs w:val="19"/>
               </w:rPr>
-              <w:t xml:space="preserve">8</w:t>
+              <w:t xml:space="preserve">5</w:t>
             </w:r>
           </w:p>
         </w:tc>
@@ -13291,7 +14873,7 @@
                 <w:sz w:val="19"/>
                 <w:szCs w:val="19"/>
               </w:rPr>
-              <w:t xml:space="preserve">CRUD kategori &amp; barang, validasi, pencarian, gambar barang</w:t>
+              <w:t xml:space="preserve">Ubah profil, unggah / ganti / hapus foto, ganti password</w:t>
             </w:r>
           </w:p>
         </w:tc>
@@ -13324,7 +14906,7 @@
                 <w:sz w:val="17"/>
                 <w:szCs w:val="17"/>
               </w:rPr>
-              <w:t xml:space="preserve">tests/Feature/TransaksiBarangTest.php</w:t>
+              <w:t xml:space="preserve">tests/Feature/KategoriBarangTest.php</w:t>
             </w:r>
           </w:p>
         </w:tc>
@@ -13376,7 +14958,7 @@
                 <w:sz w:val="19"/>
                 <w:szCs w:val="19"/>
               </w:rPr>
-              <w:t xml:space="preserve">18</w:t>
+              <w:t xml:space="preserve">8</w:t>
             </w:r>
           </w:p>
         </w:tc>
@@ -13402,7 +14984,7 @@
                 <w:sz w:val="19"/>
                 <w:szCs w:val="19"/>
               </w:rPr>
-              <w:t xml:space="preserve">Barang masuk, barang keluar, verifikasi, foto bukti</w:t>
+              <w:t xml:space="preserve">CRUD kategori &amp; barang, validasi, pencarian, gambar barang</w:t>
             </w:r>
           </w:p>
         </w:tc>
@@ -13435,6 +15017,117 @@
                 <w:sz w:val="17"/>
                 <w:szCs w:val="17"/>
               </w:rPr>
+              <w:t xml:space="preserve">tests/Feature/TransaksiBarangTest.php</w:t>
+            </w:r>
+          </w:p>
+        </w:tc>
+        <w:tc>
+          <w:tcPr>
+            <w:tcW w:type="dxa" w:w="520"/>
+            <w:tcBorders>
+              <w:top w:val="single" w:color="BFBFBF" w:sz="4"/>
+              <w:left w:val="single" w:color="BFBFBF" w:sz="4"/>
+              <w:bottom w:val="single" w:color="BFBFBF" w:sz="4"/>
+              <w:right w:val="single" w:color="BFBFBF" w:sz="4"/>
+            </w:tcBorders>
+            <w:tcMar>
+              <w:top w:type="dxa" w:w="60"/>
+              <w:left w:type="dxa" w:w="100"/>
+              <w:bottom w:type="dxa" w:w="60"/>
+              <w:right w:type="dxa" w:w="100"/>
+            </w:tcMar>
+          </w:tcPr>
+          <w:p>
+            <w:r>
+              <w:rPr>
+                <w:sz w:val="19"/>
+                <w:szCs w:val="19"/>
+              </w:rPr>
+              <w:t xml:space="preserve">Fitur</w:t>
+            </w:r>
+          </w:p>
+        </w:tc>
+        <w:tc>
+          <w:tcPr>
+            <w:tcW w:type="dxa" w:w="520"/>
+            <w:tcBorders>
+              <w:top w:val="single" w:color="BFBFBF" w:sz="4"/>
+              <w:left w:val="single" w:color="BFBFBF" w:sz="4"/>
+              <w:bottom w:val="single" w:color="BFBFBF" w:sz="4"/>
+              <w:right w:val="single" w:color="BFBFBF" w:sz="4"/>
+            </w:tcBorders>
+            <w:tcMar>
+              <w:top w:type="dxa" w:w="60"/>
+              <w:left w:type="dxa" w:w="100"/>
+              <w:bottom w:type="dxa" w:w="60"/>
+              <w:right w:type="dxa" w:w="100"/>
+            </w:tcMar>
+          </w:tcPr>
+          <w:p>
+            <w:r>
+              <w:rPr>
+                <w:sz w:val="19"/>
+                <w:szCs w:val="19"/>
+              </w:rPr>
+              <w:t xml:space="preserve">18</w:t>
+            </w:r>
+          </w:p>
+        </w:tc>
+        <w:tc>
+          <w:tcPr>
+            <w:tcW w:type="dxa" w:w="5212"/>
+            <w:tcBorders>
+              <w:top w:val="single" w:color="BFBFBF" w:sz="4"/>
+              <w:left w:val="single" w:color="BFBFBF" w:sz="4"/>
+              <w:bottom w:val="single" w:color="BFBFBF" w:sz="4"/>
+              <w:right w:val="single" w:color="BFBFBF" w:sz="4"/>
+            </w:tcBorders>
+            <w:tcMar>
+              <w:top w:type="dxa" w:w="60"/>
+              <w:left w:type="dxa" w:w="100"/>
+              <w:bottom w:type="dxa" w:w="60"/>
+              <w:right w:type="dxa" w:w="100"/>
+            </w:tcMar>
+          </w:tcPr>
+          <w:p>
+            <w:r>
+              <w:rPr>
+                <w:sz w:val="19"/>
+                <w:szCs w:val="19"/>
+              </w:rPr>
+              <w:t xml:space="preserve">Barang masuk, barang keluar, verifikasi, foto bukti</w:t>
+            </w:r>
+          </w:p>
+        </w:tc>
+      </w:tr>
+      <w:tr>
+        <w:trPr>
+          <w:tblHeader w:val="off"/>
+        </w:trPr>
+        <w:tc>
+          <w:tcPr>
+            <w:tcW w:type="dxa" w:w="3386"/>
+            <w:tcBorders>
+              <w:top w:val="single" w:color="BFBFBF" w:sz="4"/>
+              <w:left w:val="single" w:color="BFBFBF" w:sz="4"/>
+              <w:bottom w:val="single" w:color="BFBFBF" w:sz="4"/>
+              <w:right w:val="single" w:color="BFBFBF" w:sz="4"/>
+            </w:tcBorders>
+            <w:tcMar>
+              <w:top w:type="dxa" w:w="60"/>
+              <w:left w:type="dxa" w:w="100"/>
+              <w:bottom w:type="dxa" w:w="60"/>
+              <w:right w:type="dxa" w:w="100"/>
+            </w:tcMar>
+          </w:tcPr>
+          <w:p>
+            <w:r>
+              <w:rPr>
+                <w:rFonts w:ascii="Consolas" w:cs="Consolas" w:eastAsia="Consolas" w:hAnsi="Consolas"/>
+                <w:color w:val="1F4E79"/>
+                <w:sz w:val="17"/>
+                <w:szCs w:val="17"/>
+              </w:rPr>
               <w:t xml:space="preserve">tests/Feature/SesiKedaluwarsaTest.php</w:t>
             </w:r>
           </w:p>
@@ -13514,6 +15207,117 @@
                 <w:szCs w:val="19"/>
               </w:rPr>
               <w:t xml:space="preserve">Penanganan error 419</w:t>
+            </w:r>
+          </w:p>
+        </w:tc>
+      </w:tr>
+      <w:tr>
+        <w:trPr>
+          <w:tblHeader w:val="off"/>
+        </w:trPr>
+        <w:tc>
+          <w:tcPr>
+            <w:tcW w:type="dxa" w:w="3386"/>
+            <w:tcBorders>
+              <w:top w:val="single" w:color="BFBFBF" w:sz="4"/>
+              <w:left w:val="single" w:color="BFBFBF" w:sz="4"/>
+              <w:bottom w:val="single" w:color="BFBFBF" w:sz="4"/>
+              <w:right w:val="single" w:color="BFBFBF" w:sz="4"/>
+            </w:tcBorders>
+            <w:tcMar>
+              <w:top w:type="dxa" w:w="60"/>
+              <w:left w:type="dxa" w:w="100"/>
+              <w:bottom w:type="dxa" w:w="60"/>
+              <w:right w:type="dxa" w:w="100"/>
+            </w:tcMar>
+          </w:tcPr>
+          <w:p>
+            <w:r>
+              <w:rPr>
+                <w:rFonts w:ascii="Consolas" w:cs="Consolas" w:eastAsia="Consolas" w:hAnsi="Consolas"/>
+                <w:color w:val="1F4E79"/>
+                <w:sz w:val="17"/>
+                <w:szCs w:val="17"/>
+              </w:rPr>
+              <w:t xml:space="preserve">tests/Feature/PopupTest.php</w:t>
+            </w:r>
+          </w:p>
+        </w:tc>
+        <w:tc>
+          <w:tcPr>
+            <w:tcW w:type="dxa" w:w="520"/>
+            <w:tcBorders>
+              <w:top w:val="single" w:color="BFBFBF" w:sz="4"/>
+              <w:left w:val="single" w:color="BFBFBF" w:sz="4"/>
+              <w:bottom w:val="single" w:color="BFBFBF" w:sz="4"/>
+              <w:right w:val="single" w:color="BFBFBF" w:sz="4"/>
+            </w:tcBorders>
+            <w:tcMar>
+              <w:top w:type="dxa" w:w="60"/>
+              <w:left w:type="dxa" w:w="100"/>
+              <w:bottom w:type="dxa" w:w="60"/>
+              <w:right w:type="dxa" w:w="100"/>
+            </w:tcMar>
+          </w:tcPr>
+          <w:p>
+            <w:r>
+              <w:rPr>
+                <w:sz w:val="19"/>
+                <w:szCs w:val="19"/>
+              </w:rPr>
+              <w:t xml:space="preserve">Fitur</w:t>
+            </w:r>
+          </w:p>
+        </w:tc>
+        <w:tc>
+          <w:tcPr>
+            <w:tcW w:type="dxa" w:w="520"/>
+            <w:tcBorders>
+              <w:top w:val="single" w:color="BFBFBF" w:sz="4"/>
+              <w:left w:val="single" w:color="BFBFBF" w:sz="4"/>
+              <w:bottom w:val="single" w:color="BFBFBF" w:sz="4"/>
+              <w:right w:val="single" w:color="BFBFBF" w:sz="4"/>
+            </w:tcBorders>
+            <w:tcMar>
+              <w:top w:type="dxa" w:w="60"/>
+              <w:left w:type="dxa" w:w="100"/>
+              <w:bottom w:type="dxa" w:w="60"/>
+              <w:right w:type="dxa" w:w="100"/>
+            </w:tcMar>
+          </w:tcPr>
+          <w:p>
+            <w:r>
+              <w:rPr>
+                <w:sz w:val="19"/>
+                <w:szCs w:val="19"/>
+              </w:rPr>
+              <w:t xml:space="preserve">5</w:t>
+            </w:r>
+          </w:p>
+        </w:tc>
+        <w:tc>
+          <w:tcPr>
+            <w:tcW w:type="dxa" w:w="5212"/>
+            <w:tcBorders>
+              <w:top w:val="single" w:color="BFBFBF" w:sz="4"/>
+              <w:left w:val="single" w:color="BFBFBF" w:sz="4"/>
+              <w:bottom w:val="single" w:color="BFBFBF" w:sz="4"/>
+              <w:right w:val="single" w:color="BFBFBF" w:sz="4"/>
+            </w:tcBorders>
+            <w:tcMar>
+              <w:top w:type="dxa" w:w="60"/>
+              <w:left w:type="dxa" w:w="100"/>
+              <w:bottom w:type="dxa" w:w="60"/>
+              <w:right w:type="dxa" w:w="100"/>
+            </w:tcMar>
+          </w:tcPr>
+          <w:p>
+            <w:r>
+              <w:rPr>
+                <w:sz w:val="19"/>
+                <w:szCs w:val="19"/>
+              </w:rPr>
+              <w:t xml:space="preserve">Halaman dikirim sebagai isi popup / panel kanan, halaman daftar tetap utuh, simpan profil kembali ke halaman asal dan menolak alamat situs lain</w:t>
             </w:r>
           </w:p>
         </w:tc>
@@ -14555,11 +16359,11 @@
         <w:pStyle w:val="Heading1"/>
         <w:keepNext/>
       </w:pPr>
-      <w:bookmarkStart w:name="_Toc26" w:id="26"/>
+      <w:bookmarkStart w:name="_Toc30" w:id="30"/>
       <w:r>
         <w:t xml:space="preserve">11. Pemetaan Unit Kompetensi</w:t>
       </w:r>
-      <w:bookmarkEnd w:id="26"/>
+      <w:bookmarkEnd w:id="30"/>
     </w:p>
     <w:tbl>
       <w:tblPr>
@@ -15884,7 +17688,7 @@
                 <w:sz w:val="19"/>
                 <w:szCs w:val="19"/>
               </w:rPr>
-              <w:t xml:space="preserve">66 test PHPUnit unit dan fitur, lulus di SQLite dan PostgreSQL (Bagian 10)</w:t>
+              <w:t xml:space="preserve">75 test PHPUnit unit dan fitur (Bagian 10)</w:t>
             </w:r>
           </w:p>
         </w:tc>
@@ -15900,18 +17704,18 @@
         <w:pStyle w:val="Heading1"/>
         <w:keepNext/>
       </w:pPr>
-      <w:bookmarkStart w:name="_Toc27" w:id="27"/>
+      <w:bookmarkStart w:name="_Toc31" w:id="31"/>
       <w:r>
         <w:t xml:space="preserve">12. Skenario Demo</w:t>
       </w:r>
-      <w:bookmarkEnd w:id="27"/>
+      <w:bookmarkEnd w:id="31"/>
     </w:p>
     <w:p>
       <w:pPr>
         <w:pStyle w:val="ListParagraph"/>
         <w:numPr>
           <w:ilvl w:val="0"/>
-          <w:numId w:val="7"/>
+          <w:numId w:val="11"/>
         </w:numPr>
       </w:pPr>
       <w:r>
@@ -15933,18 +17737,21 @@
         <w:pStyle w:val="ListParagraph"/>
         <w:numPr>
           <w:ilvl w:val="0"/>
-          <w:numId w:val="7"/>
+          <w:numId w:val="11"/>
         </w:numPr>
       </w:pPr>
       <w:r>
+        <w:t xml:space="preserve">Klik </w:t>
+      </w:r>
+      <w:r>
         <w:rPr>
           <w:b/>
           <w:bCs/>
         </w:rPr>
-        <w:t xml:space="preserve">Profil Saya</w:t>
-      </w:r>
-      <w:r>
-        <w:t xml:space="preserve">: unggah foto profil; foto tampil di menu samping.</w:t>
+        <w:t xml:space="preserve">foto profil</w:t>
+      </w:r>
+      <w:r>
+        <w:t xml:space="preserve"> di kanan atas: panel profil muncul dari kanan; unggah foto; foto tampil di menu samping.</w:t>
       </w:r>
     </w:p>
     <w:p>
@@ -15952,7 +17759,7 @@
         <w:pStyle w:val="ListParagraph"/>
         <w:numPr>
           <w:ilvl w:val="0"/>
-          <w:numId w:val="7"/>
+          <w:numId w:val="11"/>
         </w:numPr>
       </w:pPr>
       <w:r>
@@ -15963,7 +17770,7 @@
         <w:t xml:space="preserve">Data Barang</w:t>
       </w:r>
       <w:r>
-        <w:t xml:space="preserve">: tambah barang beserta gambar; kode otomatis AT-002; pratinjau gambar.</w:t>
+        <w:t xml:space="preserve">: tambah barang di popup beserta gambar; kode otomatis AT-002; pratinjau gambar.</w:t>
       </w:r>
     </w:p>
     <w:p>
@@ -15971,7 +17778,7 @@
         <w:pStyle w:val="ListParagraph"/>
         <w:numPr>
           <w:ilvl w:val="0"/>
-          <w:numId w:val="7"/>
+          <w:numId w:val="11"/>
         </w:numPr>
       </w:pPr>
       <w:r>
@@ -15990,7 +17797,7 @@
         <w:pStyle w:val="ListParagraph"/>
         <w:numPr>
           <w:ilvl w:val="0"/>
-          <w:numId w:val="7"/>
+          <w:numId w:val="11"/>
         </w:numPr>
       </w:pPr>
       <w:r>
@@ -16009,7 +17816,7 @@
         <w:pStyle w:val="ListParagraph"/>
         <w:numPr>
           <w:ilvl w:val="0"/>
-          <w:numId w:val="7"/>
+          <w:numId w:val="11"/>
         </w:numPr>
       </w:pPr>
       <w:r>
@@ -16031,7 +17838,7 @@
         <w:pStyle w:val="ListParagraph"/>
         <w:numPr>
           <w:ilvl w:val="0"/>
-          <w:numId w:val="7"/>
+          <w:numId w:val="11"/>
         </w:numPr>
       </w:pPr>
       <w:r>
@@ -16053,7 +17860,7 @@
         <w:pStyle w:val="ListParagraph"/>
         <w:numPr>
           <w:ilvl w:val="0"/>
-          <w:numId w:val="7"/>
+          <w:numId w:val="11"/>
         </w:numPr>
       </w:pPr>
       <w:r>
@@ -16075,7 +17882,7 @@
         <w:pStyle w:val="ListParagraph"/>
         <w:numPr>
           <w:ilvl w:val="0"/>
-          <w:numId w:val="7"/>
+          <w:numId w:val="11"/>
         </w:numPr>
       </w:pPr>
       <w:r>
@@ -16091,7 +17898,7 @@
         <w:t xml:space="preserve">php artisan test</w:t>
       </w:r>
       <w:r>
-        <w:t xml:space="preserve"> → 66 test lulus.</w:t>
+        <w:t xml:space="preserve"> → 75 test lulus.</w:t>
       </w:r>
     </w:p>
     <w:p>
@@ -16381,6 +18188,30 @@
     </w:lvlOverride>
   </w:num>
   <w:num w:numId="7">
+    <w:abstractNumId w:val="3"/>
+    <w:lvlOverride w:ilvl="0">
+      <w:startOverride w:val="1"/>
+    </w:lvlOverride>
+  </w:num>
+  <w:num w:numId="8">
+    <w:abstractNumId w:val="3"/>
+    <w:lvlOverride w:ilvl="0">
+      <w:startOverride w:val="1"/>
+    </w:lvlOverride>
+  </w:num>
+  <w:num w:numId="9">
+    <w:abstractNumId w:val="3"/>
+    <w:lvlOverride w:ilvl="0">
+      <w:startOverride w:val="1"/>
+    </w:lvlOverride>
+  </w:num>
+  <w:num w:numId="10">
+    <w:abstractNumId w:val="3"/>
+    <w:lvlOverride w:ilvl="0">
+      <w:startOverride w:val="1"/>
+    </w:lvlOverride>
+  </w:num>
+  <w:num w:numId="11">
     <w:abstractNumId w:val="3"/>
     <w:lvlOverride w:ilvl="0">
       <w:startOverride w:val="1"/>

</xml_diff>

<commit_message>
Tangani gagal simpan gambar: pesan jelas, bukan error 500
</commit_message>
<xml_diff>
--- a/dokumen/02_DOKUMENTASI_PROGRAM.docx
+++ b/dokumen/02_DOKUMENTASI_PROGRAM.docx
@@ -573,7 +573,7 @@
                 <w:sz w:val="19"/>
                 <w:szCs w:val="19"/>
               </w:rPr>
-              <w:t xml:space="preserve">PHPUnit 11 — 75 test, 257 assertion, semua lulus</w:t>
+              <w:t xml:space="preserve">PHPUnit 11 — 78 test, 271 assertion, semua lulus</w:t>
             </w:r>
           </w:p>
         </w:tc>
@@ -643,18 +643,13 @@
     </w:p>
     <w:p>
       <w:pPr>
-        <w:spacing w:after="120" w:before="320"/>
+        <w:pStyle w:val="Heading1"/>
       </w:pPr>
-      <w:r>
-        <w:rPr>
-          <w:b/>
-          <w:bCs/>
-          <w:color w:val="1F4E79"/>
-          <w:sz w:val="28"/>
-          <w:szCs w:val="28"/>
-        </w:rPr>
+      <w:bookmarkStart w:name="_Toc1" w:id="1"/>
+      <w:r>
         <w:t xml:space="preserve">Daftar Isi</w:t>
       </w:r>
+      <w:bookmarkEnd w:id="1"/>
     </w:p>
     <w:sdt>
       <w:sdtPr>
@@ -675,7 +670,7 @@
           </w:r>
           <w:hyperlink w:history="1" w:anchor="_Toc1">
             <w:r>
-              <w:t xml:space="preserve">1. Deskripsi Program</w:t>
+              <w:t xml:space="preserve">Daftar Isi</w:t>
             </w:r>
             <w:r>
               <w:tab/>
@@ -683,6 +678,28 @@
             <w:r>
               <w:fldChar w:fldCharType="begin" w:dirty="true"/>
               <w:instrText xml:space="preserve">PAGEREF _Toc1 \h</w:instrText>
+              <w:fldChar w:fldCharType="separate"/>
+              <w:fldChar w:fldCharType="end"/>
+            </w:r>
+          </w:hyperlink>
+        </w:p>
+        <w:p>
+          <w:pPr>
+            <w:pStyle w:val="TOC1"/>
+            <w:tabs>
+              <w:tab w:val="right" w:pos="9638" w:leader="dot"/>
+            </w:tabs>
+          </w:pPr>
+          <w:hyperlink w:history="1" w:anchor="_Toc2">
+            <w:r>
+              <w:t xml:space="preserve">1. Deskripsi Program</w:t>
+            </w:r>
+            <w:r>
+              <w:tab/>
+            </w:r>
+            <w:r>
+              <w:fldChar w:fldCharType="begin" w:dirty="true"/>
+              <w:instrText xml:space="preserve">PAGEREF _Toc2 \h</w:instrText>
               <w:fldChar w:fldCharType="separate"/>
               <w:fldChar w:fldCharType="end"/>
             </w:r>
@@ -696,31 +713,9 @@
             </w:tabs>
             <w:ind w:left="220"/>
           </w:pPr>
-          <w:hyperlink w:history="1" w:anchor="_Toc2">
+          <w:hyperlink w:history="1" w:anchor="_Toc3">
             <w:r>
               <w:t xml:space="preserve">1.1 Daftar Fitur</w:t>
-            </w:r>
-            <w:r>
-              <w:tab/>
-            </w:r>
-            <w:r>
-              <w:fldChar w:fldCharType="begin" w:dirty="true"/>
-              <w:instrText xml:space="preserve">PAGEREF _Toc2 \h</w:instrText>
-              <w:fldChar w:fldCharType="separate"/>
-              <w:fldChar w:fldCharType="end"/>
-            </w:r>
-          </w:hyperlink>
-        </w:p>
-        <w:p>
-          <w:pPr>
-            <w:pStyle w:val="TOC1"/>
-            <w:tabs>
-              <w:tab w:val="right" w:pos="9638" w:leader="dot"/>
-            </w:tabs>
-          </w:pPr>
-          <w:hyperlink w:history="1" w:anchor="_Toc3">
-            <w:r>
-              <w:t xml:space="preserve">2. Cara Menjalankan Program</w:t>
             </w:r>
             <w:r>
               <w:tab/>
@@ -742,7 +737,7 @@
           </w:pPr>
           <w:hyperlink w:history="1" w:anchor="_Toc4">
             <w:r>
-              <w:t xml:space="preserve">3. Spesifikasi Program</w:t>
+              <w:t xml:space="preserve">2. Cara Menjalankan Program</w:t>
             </w:r>
             <w:r>
               <w:tab/>
@@ -757,15 +752,14 @@
         </w:p>
         <w:p>
           <w:pPr>
-            <w:pStyle w:val="TOC2"/>
+            <w:pStyle w:val="TOC1"/>
             <w:tabs>
               <w:tab w:val="right" w:pos="9638" w:leader="dot"/>
             </w:tabs>
-            <w:ind w:left="220"/>
           </w:pPr>
           <w:hyperlink w:history="1" w:anchor="_Toc5">
             <w:r>
-              <w:t xml:space="preserve">3.1 Hak Akses per Role</w:t>
+              <w:t xml:space="preserve">3. Spesifikasi Program</w:t>
             </w:r>
             <w:r>
               <w:tab/>
@@ -788,7 +782,7 @@
           </w:pPr>
           <w:hyperlink w:history="1" w:anchor="_Toc6">
             <w:r>
-              <w:t xml:space="preserve">3.2 Aturan Bisnis dan Validasi</w:t>
+              <w:t xml:space="preserve">3.1 Hak Akses per Role</w:t>
             </w:r>
             <w:r>
               <w:tab/>
@@ -811,7 +805,7 @@
           </w:pPr>
           <w:hyperlink w:history="1" w:anchor="_Toc7">
             <w:r>
-              <w:t xml:space="preserve">3.3 Alur Barang Keluar</w:t>
+              <w:t xml:space="preserve">3.2 Aturan Bisnis dan Validasi</w:t>
             </w:r>
             <w:r>
               <w:tab/>
@@ -834,7 +828,7 @@
           </w:pPr>
           <w:hyperlink w:history="1" w:anchor="_Toc8">
             <w:r>
-              <w:t xml:space="preserve">3.4 Batasan Sistem</w:t>
+              <w:t xml:space="preserve">3.3 Alur Barang Keluar</w:t>
             </w:r>
             <w:r>
               <w:tab/>
@@ -849,14 +843,15 @@
         </w:p>
         <w:p>
           <w:pPr>
-            <w:pStyle w:val="TOC1"/>
+            <w:pStyle w:val="TOC2"/>
             <w:tabs>
               <w:tab w:val="right" w:pos="9638" w:leader="dot"/>
             </w:tabs>
+            <w:ind w:left="220"/>
           </w:pPr>
           <w:hyperlink w:history="1" w:anchor="_Toc9">
             <w:r>
-              <w:t xml:space="preserve">4. Database</w:t>
+              <w:t xml:space="preserve">3.4 Batasan Sistem</w:t>
             </w:r>
             <w:r>
               <w:tab/>
@@ -878,7 +873,7 @@
           </w:pPr>
           <w:hyperlink w:history="1" w:anchor="_Toc10">
             <w:r>
-              <w:t xml:space="preserve">5. Struktur Program (MVC)</w:t>
+              <w:t xml:space="preserve">4. Database</w:t>
             </w:r>
             <w:r>
               <w:tab/>
@@ -900,7 +895,7 @@
           </w:pPr>
           <w:hyperlink w:history="1" w:anchor="_Toc11">
             <w:r>
-              <w:t xml:space="preserve">6. Desain Antarmuka</w:t>
+              <w:t xml:space="preserve">5. Struktur Program (MVC)</w:t>
             </w:r>
             <w:r>
               <w:tab/>
@@ -922,7 +917,7 @@
           </w:pPr>
           <w:hyperlink w:history="1" w:anchor="_Toc12">
             <w:r>
-              <w:t xml:space="preserve">7. Penjelasan Kode Penting</w:t>
+              <w:t xml:space="preserve">6. Desain Antarmuka</w:t>
             </w:r>
             <w:r>
               <w:tab/>
@@ -937,15 +932,14 @@
         </w:p>
         <w:p>
           <w:pPr>
-            <w:pStyle w:val="TOC2"/>
+            <w:pStyle w:val="TOC1"/>
             <w:tabs>
               <w:tab w:val="right" w:pos="9638" w:leader="dot"/>
             </w:tabs>
-            <w:ind w:left="220"/>
           </w:pPr>
           <w:hyperlink w:history="1" w:anchor="_Toc13">
             <w:r>
-              <w:t xml:space="preserve">7.1 Login — AuthController::login()</w:t>
+              <w:t xml:space="preserve">7. Penjelasan Kode Penting</w:t>
             </w:r>
             <w:r>
               <w:tab/>
@@ -968,7 +962,7 @@
           </w:pPr>
           <w:hyperlink w:history="1" w:anchor="_Toc14">
             <w:r>
-              <w:t xml:space="preserve">7.2 Hak Akses — CekRole::handle()</w:t>
+              <w:t xml:space="preserve">7.1 Login — AuthController::login()</w:t>
             </w:r>
             <w:r>
               <w:tab/>
@@ -991,7 +985,7 @@
           </w:pPr>
           <w:hyperlink w:history="1" w:anchor="_Toc15">
             <w:r>
-              <w:t xml:space="preserve">7.3 Kode Barang Otomatis — Barang::generateKode()</w:t>
+              <w:t xml:space="preserve">7.2 Hak Akses — CekRole::handle()</w:t>
             </w:r>
             <w:r>
               <w:tab/>
@@ -1014,7 +1008,7 @@
           </w:pPr>
           <w:hyperlink w:history="1" w:anchor="_Toc16">
             <w:r>
-              <w:t xml:space="preserve">7.4 Stok — StokService</w:t>
+              <w:t xml:space="preserve">7.3 Kode Barang Otomatis — Barang::generateKode()</w:t>
             </w:r>
             <w:r>
               <w:tab/>
@@ -1037,7 +1031,7 @@
           </w:pPr>
           <w:hyperlink w:history="1" w:anchor="_Toc17">
             <w:r>
-              <w:t xml:space="preserve">7.5 Verifikasi — BarangKeluarController::setujui() dan tolak()</w:t>
+              <w:t xml:space="preserve">7.4 Stok — StokService</w:t>
             </w:r>
             <w:r>
               <w:tab/>
@@ -1060,7 +1054,7 @@
           </w:pPr>
           <w:hyperlink w:history="1" w:anchor="_Toc18">
             <w:r>
-              <w:t xml:space="preserve">7.6 Validasi — Form Request</w:t>
+              <w:t xml:space="preserve">7.5 Verifikasi — BarangKeluarController::setujui() dan tolak()</w:t>
             </w:r>
             <w:r>
               <w:tab/>
@@ -1083,7 +1077,7 @@
           </w:pPr>
           <w:hyperlink w:history="1" w:anchor="_Toc19">
             <w:r>
-              <w:t xml:space="preserve">7.7 Unggah Gambar — GambarService</w:t>
+              <w:t xml:space="preserve">7.6 Validasi — Form Request</w:t>
             </w:r>
             <w:r>
               <w:tab/>
@@ -1106,7 +1100,7 @@
           </w:pPr>
           <w:hyperlink w:history="1" w:anchor="_Toc20">
             <w:r>
-              <w:t xml:space="preserve">7.8 Suasana Login dan Audio — App\Support\Suasana</w:t>
+              <w:t xml:space="preserve">7.7 Unggah Gambar — GambarService</w:t>
             </w:r>
             <w:r>
               <w:tab/>
@@ -1129,7 +1123,7 @@
           </w:pPr>
           <w:hyperlink w:history="1" w:anchor="_Toc21">
             <w:r>
-              <w:t xml:space="preserve">7.9 Mode Terang / Gelap — resources/js/tema.js</w:t>
+              <w:t xml:space="preserve">7.8 Suasana Login dan Audio — App\Support\Suasana</w:t>
             </w:r>
             <w:r>
               <w:tab/>
@@ -1152,7 +1146,7 @@
           </w:pPr>
           <w:hyperlink w:history="1" w:anchor="_Toc22">
             <w:r>
-              <w:t xml:space="preserve">7.10 Musik Bad Apple!! — resources/js/musik.js</w:t>
+              <w:t xml:space="preserve">7.9 Mode Terang / Gelap — resources/js/tema.js</w:t>
             </w:r>
             <w:r>
               <w:tab/>
@@ -1175,7 +1169,7 @@
           </w:pPr>
           <w:hyperlink w:history="1" w:anchor="_Toc23">
             <w:r>
-              <w:t xml:space="preserve">7.11 Tanpa Pindah Halaman dan Popup — Turbo</w:t>
+              <w:t xml:space="preserve">7.10 Musik Bad Apple!! — resources/js/musik.js</w:t>
             </w:r>
             <w:r>
               <w:tab/>
@@ -1198,7 +1192,7 @@
           </w:pPr>
           <w:hyperlink w:history="1" w:anchor="_Toc24">
             <w:r>
-              <w:t xml:space="preserve">7.12 Penanganan Error 419 — bootstrap/app.php</w:t>
+              <w:t xml:space="preserve">7.11 Tanpa Pindah Halaman dan Popup — Turbo</w:t>
             </w:r>
             <w:r>
               <w:tab/>
@@ -1213,14 +1207,15 @@
         </w:p>
         <w:p>
           <w:pPr>
-            <w:pStyle w:val="TOC1"/>
+            <w:pStyle w:val="TOC2"/>
             <w:tabs>
               <w:tab w:val="right" w:pos="9638" w:leader="dot"/>
             </w:tabs>
+            <w:ind w:left="220"/>
           </w:pPr>
           <w:hyperlink w:history="1" w:anchor="_Toc25">
             <w:r>
-              <w:t xml:space="preserve">8. Keamanan</w:t>
+              <w:t xml:space="preserve">7.12 Penanganan Error 419 — bootstrap/app.php</w:t>
             </w:r>
             <w:r>
               <w:tab/>
@@ -1242,7 +1237,7 @@
           </w:pPr>
           <w:hyperlink w:history="1" w:anchor="_Toc26">
             <w:r>
-              <w:t xml:space="preserve">9. Debugging</w:t>
+              <w:t xml:space="preserve">8. Keamanan</w:t>
             </w:r>
             <w:r>
               <w:tab/>
@@ -1257,15 +1252,14 @@
         </w:p>
         <w:p>
           <w:pPr>
-            <w:pStyle w:val="TOC2"/>
+            <w:pStyle w:val="TOC1"/>
             <w:tabs>
               <w:tab w:val="right" w:pos="9638" w:leader="dot"/>
             </w:tabs>
-            <w:ind w:left="220"/>
           </w:pPr>
           <w:hyperlink w:history="1" w:anchor="_Toc27">
             <w:r>
-              <w:t xml:space="preserve">9.1 Bug yang Ditemukan dan Perbaikannya</w:t>
+              <w:t xml:space="preserve">9. Debugging</w:t>
             </w:r>
             <w:r>
               <w:tab/>
@@ -1288,7 +1282,7 @@
           </w:pPr>
           <w:hyperlink w:history="1" w:anchor="_Toc28">
             <w:r>
-              <w:t xml:space="preserve">9.2 Teknik Debugging</w:t>
+              <w:t xml:space="preserve">9.1 Bug yang Ditemukan dan Perbaikannya</w:t>
             </w:r>
             <w:r>
               <w:tab/>
@@ -1303,14 +1297,15 @@
         </w:p>
         <w:p>
           <w:pPr>
-            <w:pStyle w:val="TOC1"/>
+            <w:pStyle w:val="TOC2"/>
             <w:tabs>
               <w:tab w:val="right" w:pos="9638" w:leader="dot"/>
             </w:tabs>
+            <w:ind w:left="220"/>
           </w:pPr>
           <w:hyperlink w:history="1" w:anchor="_Toc29">
             <w:r>
-              <w:t xml:space="preserve">10. Pengujian Unit Program</w:t>
+              <w:t xml:space="preserve">9.2 Teknik Debugging</w:t>
             </w:r>
             <w:r>
               <w:tab/>
@@ -1332,7 +1327,7 @@
           </w:pPr>
           <w:hyperlink w:history="1" w:anchor="_Toc30">
             <w:r>
-              <w:t xml:space="preserve">11. Pemetaan Unit Kompetensi</w:t>
+              <w:t xml:space="preserve">10. Pengujian Unit Program</w:t>
             </w:r>
             <w:r>
               <w:tab/>
@@ -1354,7 +1349,7 @@
           </w:pPr>
           <w:hyperlink w:history="1" w:anchor="_Toc31">
             <w:r>
-              <w:t xml:space="preserve">12. Skenario Demo</w:t>
+              <w:t xml:space="preserve">11. Pemetaan Unit Kompetensi</w:t>
             </w:r>
             <w:r>
               <w:tab/>
@@ -1362,6 +1357,28 @@
             <w:r>
               <w:fldChar w:fldCharType="begin" w:dirty="true"/>
               <w:instrText xml:space="preserve">PAGEREF _Toc31 \h</w:instrText>
+              <w:fldChar w:fldCharType="separate"/>
+              <w:fldChar w:fldCharType="end"/>
+            </w:r>
+          </w:hyperlink>
+        </w:p>
+        <w:p>
+          <w:pPr>
+            <w:pStyle w:val="TOC1"/>
+            <w:tabs>
+              <w:tab w:val="right" w:pos="9638" w:leader="dot"/>
+            </w:tabs>
+          </w:pPr>
+          <w:hyperlink w:history="1" w:anchor="_Toc32">
+            <w:r>
+              <w:t xml:space="preserve">12. Skenario Demo</w:t>
+            </w:r>
+            <w:r>
+              <w:tab/>
+            </w:r>
+            <w:r>
+              <w:fldChar w:fldCharType="begin" w:dirty="true"/>
+              <w:instrText xml:space="preserve">PAGEREF _Toc32 \h</w:instrText>
               <w:fldChar w:fldCharType="separate"/>
               <w:fldChar w:fldCharType="end"/>
             </w:r>
@@ -1376,19 +1393,30 @@
     </w:sdt>
     <w:p>
       <w:r>
+        <w:rPr>
+          <w:i/>
+          <w:iCs/>
+          <w:color w:val="808080"/>
+          <w:sz w:val="18"/>
+          <w:szCs w:val="18"/>
+        </w:rPr>
+        <w:t xml:space="preserve">(Bila daftar isi belum tampil, klik kanan di area ini lalu pilih "Update Field".)</w:t>
+      </w:r>
+    </w:p>
+    <w:p>
+      <w:r>
         <w:br w:type="page"/>
       </w:r>
     </w:p>
     <w:p>
       <w:pPr>
         <w:pStyle w:val="Heading1"/>
-        <w:keepNext/>
       </w:pPr>
-      <w:bookmarkStart w:name="_Toc1" w:id="1"/>
+      <w:bookmarkStart w:name="_Toc2" w:id="2"/>
       <w:r>
         <w:t xml:space="preserve">1. Deskripsi Program</w:t>
       </w:r>
-      <w:bookmarkEnd w:id="1"/>
+      <w:bookmarkEnd w:id="2"/>
     </w:p>
     <w:p>
       <w:r>
@@ -1846,13 +1874,12 @@
     <w:p>
       <w:pPr>
         <w:pStyle w:val="Heading2"/>
-        <w:keepNext/>
       </w:pPr>
-      <w:bookmarkStart w:name="_Toc2" w:id="2"/>
+      <w:bookmarkStart w:name="_Toc3" w:id="3"/>
       <w:r>
         <w:t xml:space="preserve">1.1 Daftar Fitur</w:t>
       </w:r>
-      <w:bookmarkEnd w:id="2"/>
+      <w:bookmarkEnd w:id="3"/>
     </w:p>
     <w:tbl>
       <w:tblPr>
@@ -3054,13 +3081,12 @@
     <w:p>
       <w:pPr>
         <w:pStyle w:val="Heading1"/>
-        <w:keepNext/>
       </w:pPr>
-      <w:bookmarkStart w:name="_Toc3" w:id="3"/>
+      <w:bookmarkStart w:name="_Toc4" w:id="4"/>
       <w:r>
         <w:t xml:space="preserve">2. Cara Menjalankan Program</w:t>
       </w:r>
-      <w:bookmarkEnd w:id="3"/>
+      <w:bookmarkEnd w:id="4"/>
     </w:p>
     <w:p>
       <w:r>
@@ -3387,24 +3413,22 @@
     <w:p>
       <w:pPr>
         <w:pStyle w:val="Heading1"/>
-        <w:keepNext/>
       </w:pPr>
-      <w:bookmarkStart w:name="_Toc4" w:id="4"/>
+      <w:bookmarkStart w:name="_Toc5" w:id="5"/>
       <w:r>
         <w:t xml:space="preserve">3. Spesifikasi Program</w:t>
       </w:r>
-      <w:bookmarkEnd w:id="4"/>
+      <w:bookmarkEnd w:id="5"/>
     </w:p>
     <w:p>
       <w:pPr>
         <w:pStyle w:val="Heading2"/>
-        <w:keepNext/>
       </w:pPr>
-      <w:bookmarkStart w:name="_Toc5" w:id="5"/>
+      <w:bookmarkStart w:name="_Toc6" w:id="6"/>
       <w:r>
         <w:t xml:space="preserve">3.1 Hak Akses per Role</w:t>
       </w:r>
-      <w:bookmarkEnd w:id="5"/>
+      <w:bookmarkEnd w:id="6"/>
     </w:p>
     <w:tbl>
       <w:tblPr>
@@ -5282,13 +5306,12 @@
     <w:p>
       <w:pPr>
         <w:pStyle w:val="Heading2"/>
-        <w:keepNext/>
       </w:pPr>
-      <w:bookmarkStart w:name="_Toc6" w:id="6"/>
+      <w:bookmarkStart w:name="_Toc7" w:id="7"/>
       <w:r>
         <w:t xml:space="preserve">3.2 Aturan Bisnis dan Validasi</w:t>
       </w:r>
-      <w:bookmarkEnd w:id="6"/>
+      <w:bookmarkEnd w:id="7"/>
     </w:p>
     <w:p>
       <w:pPr>
@@ -5449,13 +5472,12 @@
     <w:p>
       <w:pPr>
         <w:pStyle w:val="Heading2"/>
-        <w:keepNext/>
       </w:pPr>
-      <w:bookmarkStart w:name="_Toc7" w:id="7"/>
+      <w:bookmarkStart w:name="_Toc8" w:id="8"/>
       <w:r>
         <w:t xml:space="preserve">3.3 Alur Barang Keluar</w:t>
       </w:r>
-      <w:bookmarkEnd w:id="7"/>
+      <w:bookmarkEnd w:id="8"/>
     </w:p>
     <w:p>
       <w:pPr>
@@ -5580,13 +5602,12 @@
     <w:p>
       <w:pPr>
         <w:pStyle w:val="Heading2"/>
-        <w:keepNext/>
       </w:pPr>
-      <w:bookmarkStart w:name="_Toc8" w:id="8"/>
+      <w:bookmarkStart w:name="_Toc9" w:id="9"/>
       <w:r>
         <w:t xml:space="preserve">3.4 Batasan Sistem</w:t>
       </w:r>
-      <w:bookmarkEnd w:id="8"/>
+      <w:bookmarkEnd w:id="9"/>
     </w:p>
     <w:p>
       <w:pPr>
@@ -5627,13 +5648,12 @@
     <w:p>
       <w:pPr>
         <w:pStyle w:val="Heading1"/>
-        <w:keepNext/>
       </w:pPr>
-      <w:bookmarkStart w:name="_Toc9" w:id="9"/>
+      <w:bookmarkStart w:name="_Toc10" w:id="10"/>
       <w:r>
         <w:t xml:space="preserve">4. Database</w:t>
       </w:r>
-      <w:bookmarkEnd w:id="9"/>
+      <w:bookmarkEnd w:id="10"/>
     </w:p>
     <w:p>
       <w:r>
@@ -6601,13 +6621,12 @@
     <w:p>
       <w:pPr>
         <w:pStyle w:val="Heading1"/>
-        <w:keepNext/>
       </w:pPr>
-      <w:bookmarkStart w:name="_Toc10" w:id="10"/>
+      <w:bookmarkStart w:name="_Toc11" w:id="11"/>
       <w:r>
         <w:t xml:space="preserve">5. Struktur Program (MVC)</w:t>
       </w:r>
-      <w:bookmarkEnd w:id="10"/>
+      <w:bookmarkEnd w:id="11"/>
     </w:p>
     <w:p>
       <w:r>
@@ -8368,7 +8387,7 @@
                 <w:sz w:val="19"/>
                 <w:szCs w:val="19"/>
               </w:rPr>
-              <w:t xml:space="preserve">75 test PHPUnit</w:t>
+              <w:t xml:space="preserve">78 test PHPUnit</w:t>
             </w:r>
           </w:p>
         </w:tc>
@@ -8457,13 +8476,12 @@
     <w:p>
       <w:pPr>
         <w:pStyle w:val="Heading1"/>
-        <w:keepNext/>
       </w:pPr>
-      <w:bookmarkStart w:name="_Toc11" w:id="11"/>
+      <w:bookmarkStart w:name="_Toc12" w:id="12"/>
       <w:r>
         <w:t xml:space="preserve">6. Desain Antarmuka</w:t>
       </w:r>
-      <w:bookmarkEnd w:id="11"/>
+      <w:bookmarkEnd w:id="12"/>
     </w:p>
     <w:p>
       <w:pPr>
@@ -8773,20 +8791,18 @@
     <w:p>
       <w:pPr>
         <w:pStyle w:val="Heading1"/>
-        <w:keepNext/>
       </w:pPr>
-      <w:bookmarkStart w:name="_Toc12" w:id="12"/>
+      <w:bookmarkStart w:name="_Toc13" w:id="13"/>
       <w:r>
         <w:t xml:space="preserve">7. Penjelasan Kode Penting</w:t>
       </w:r>
-      <w:bookmarkEnd w:id="12"/>
+      <w:bookmarkEnd w:id="13"/>
     </w:p>
     <w:p>
       <w:pPr>
         <w:pStyle w:val="Heading2"/>
-        <w:keepNext/>
       </w:pPr>
-      <w:bookmarkStart w:name="_Toc13" w:id="13"/>
+      <w:bookmarkStart w:name="_Toc14" w:id="14"/>
       <w:r>
         <w:t xml:space="preserve">7.1 Login — </w:t>
       </w:r>
@@ -8799,7 +8815,7 @@
         </w:rPr>
         <w:t xml:space="preserve">AuthController::login()</w:t>
       </w:r>
-      <w:bookmarkEnd w:id="13"/>
+      <w:bookmarkEnd w:id="14"/>
     </w:p>
     <w:p>
       <w:r>
@@ -8864,9 +8880,8 @@
     <w:p>
       <w:pPr>
         <w:pStyle w:val="Heading2"/>
-        <w:keepNext/>
       </w:pPr>
-      <w:bookmarkStart w:name="_Toc14" w:id="14"/>
+      <w:bookmarkStart w:name="_Toc15" w:id="15"/>
       <w:r>
         <w:t xml:space="preserve">7.2 Hak Akses — </w:t>
       </w:r>
@@ -8879,7 +8894,7 @@
         </w:rPr>
         <w:t xml:space="preserve">CekRole::handle()</w:t>
       </w:r>
-      <w:bookmarkEnd w:id="14"/>
+      <w:bookmarkEnd w:id="15"/>
     </w:p>
     <w:p>
       <w:r>
@@ -8971,9 +8986,8 @@
     <w:p>
       <w:pPr>
         <w:pStyle w:val="Heading2"/>
-        <w:keepNext/>
       </w:pPr>
-      <w:bookmarkStart w:name="_Toc15" w:id="15"/>
+      <w:bookmarkStart w:name="_Toc16" w:id="16"/>
       <w:r>
         <w:t xml:space="preserve">7.3 Kode Barang Otomatis — </w:t>
       </w:r>
@@ -8986,7 +9000,7 @@
         </w:rPr>
         <w:t xml:space="preserve">Barang::generateKode()</w:t>
       </w:r>
-      <w:bookmarkEnd w:id="15"/>
+      <w:bookmarkEnd w:id="16"/>
     </w:p>
     <w:p>
       <w:pPr>
@@ -9111,9 +9125,8 @@
     <w:p>
       <w:pPr>
         <w:pStyle w:val="Heading2"/>
-        <w:keepNext/>
       </w:pPr>
-      <w:bookmarkStart w:name="_Toc16" w:id="16"/>
+      <w:bookmarkStart w:name="_Toc17" w:id="17"/>
       <w:r>
         <w:t xml:space="preserve">7.4 Stok — </w:t>
       </w:r>
@@ -9126,7 +9139,7 @@
         </w:rPr>
         <w:t xml:space="preserve">StokService</w:t>
       </w:r>
-      <w:bookmarkEnd w:id="16"/>
+      <w:bookmarkEnd w:id="17"/>
     </w:p>
     <w:p>
       <w:r>
@@ -9208,9 +9221,8 @@
     <w:p>
       <w:pPr>
         <w:pStyle w:val="Heading2"/>
-        <w:keepNext/>
       </w:pPr>
-      <w:bookmarkStart w:name="_Toc17" w:id="17"/>
+      <w:bookmarkStart w:name="_Toc18" w:id="18"/>
       <w:r>
         <w:t xml:space="preserve">7.5 Verifikasi — </w:t>
       </w:r>
@@ -9235,7 +9247,7 @@
         </w:rPr>
         <w:t xml:space="preserve">tolak()</w:t>
       </w:r>
-      <w:bookmarkEnd w:id="17"/>
+      <w:bookmarkEnd w:id="18"/>
     </w:p>
     <w:p>
       <w:r>
@@ -9305,13 +9317,12 @@
     <w:p>
       <w:pPr>
         <w:pStyle w:val="Heading2"/>
-        <w:keepNext/>
       </w:pPr>
-      <w:bookmarkStart w:name="_Toc18" w:id="18"/>
+      <w:bookmarkStart w:name="_Toc19" w:id="19"/>
       <w:r>
         <w:t xml:space="preserve">7.6 Validasi — Form Request</w:t>
       </w:r>
-      <w:bookmarkEnd w:id="18"/>
+      <w:bookmarkEnd w:id="19"/>
     </w:p>
     <w:p>
       <w:r>
@@ -9489,9 +9500,8 @@
     <w:p>
       <w:pPr>
         <w:pStyle w:val="Heading2"/>
-        <w:keepNext/>
       </w:pPr>
-      <w:bookmarkStart w:name="_Toc19" w:id="19"/>
+      <w:bookmarkStart w:name="_Toc20" w:id="20"/>
       <w:r>
         <w:t xml:space="preserve">7.7 Unggah Gambar — </w:t>
       </w:r>
@@ -9504,7 +9514,7 @@
         </w:rPr>
         <w:t xml:space="preserve">GambarService</w:t>
       </w:r>
-      <w:bookmarkEnd w:id="19"/>
+      <w:bookmarkEnd w:id="20"/>
     </w:p>
     <w:p>
       <w:pPr>
@@ -9754,12 +9764,14 @@
     </w:p>
     <w:p>
       <w:pPr>
-        <w:pStyle w:val="Heading2"/>
-        <w:keepNext/>
+        <w:pStyle w:val="ListParagraph"/>
+        <w:numPr>
+          <w:ilvl w:val="0"/>
+          <w:numId w:val="6"/>
+        </w:numPr>
       </w:pPr>
-      <w:bookmarkStart w:name="_Toc20" w:id="20"/>
-      <w:r>
-        <w:t xml:space="preserve">7.8 Suasana Login dan Audio — </w:t>
+      <w:r>
+        <w:t xml:space="preserve">Bila penyimpanan gagal (kunci salah, bucket tidak ada, koneksi putus), </w:t>
       </w:r>
       <w:r>
         <w:rPr>
@@ -9768,9 +9780,54 @@
           <w:sz w:val="20"/>
           <w:szCs w:val="20"/>
         </w:rPr>
+        <w:t xml:space="preserve">simpan()</w:t>
+      </w:r>
+      <w:r>
+        <w:t xml:space="preserve"> melempar </w:t>
+      </w:r>
+      <w:r>
+        <w:rPr>
+          <w:rFonts w:ascii="Consolas" w:cs="Consolas" w:eastAsia="Consolas" w:hAnsi="Consolas"/>
+          <w:color w:val="1F4E79"/>
+          <w:sz w:val="20"/>
+          <w:szCs w:val="20"/>
+        </w:rPr>
+        <w:t xml:space="preserve">GambarGagalDisimpanException</w:t>
+      </w:r>
+      <w:r>
+        <w:t xml:space="preserve">. </w:t>
+      </w:r>
+      <w:r>
+        <w:rPr>
+          <w:rFonts w:ascii="Consolas" w:cs="Consolas" w:eastAsia="Consolas" w:hAnsi="Consolas"/>
+          <w:color w:val="1F4E79"/>
+          <w:sz w:val="20"/>
+          <w:szCs w:val="20"/>
+        </w:rPr>
+        <w:t xml:space="preserve">bootstrap/app.php</w:t>
+      </w:r>
+      <w:r>
+        <w:t xml:space="preserve"> mengembalikan pengguna ke form dengan pesan jelas, dan penyebab aslinya dicatat ke log (di Vercel: menu Logs).</w:t>
+      </w:r>
+    </w:p>
+    <w:p>
+      <w:pPr>
+        <w:pStyle w:val="Heading2"/>
+      </w:pPr>
+      <w:bookmarkStart w:name="_Toc21" w:id="21"/>
+      <w:r>
+        <w:t xml:space="preserve">7.8 Suasana Login dan Audio — </w:t>
+      </w:r>
+      <w:r>
+        <w:rPr>
+          <w:rFonts w:ascii="Consolas" w:cs="Consolas" w:eastAsia="Consolas" w:hAnsi="Consolas"/>
+          <w:color w:val="1F4E79"/>
+          <w:sz w:val="20"/>
+          <w:szCs w:val="20"/>
+        </w:rPr>
         <w:t xml:space="preserve">App\Support\Suasana</w:t>
       </w:r>
-      <w:bookmarkEnd w:id="20"/>
+      <w:bookmarkEnd w:id="21"/>
     </w:p>
     <w:p>
       <w:pPr>
@@ -9922,9 +9979,8 @@
     <w:p>
       <w:pPr>
         <w:pStyle w:val="Heading2"/>
-        <w:keepNext/>
       </w:pPr>
-      <w:bookmarkStart w:name="_Toc21" w:id="21"/>
+      <w:bookmarkStart w:name="_Toc22" w:id="22"/>
       <w:r>
         <w:t xml:space="preserve">7.9 Mode Terang / Gelap — </w:t>
       </w:r>
@@ -9937,7 +9993,7 @@
         </w:rPr>
         <w:t xml:space="preserve">resources/js/tema.js</w:t>
       </w:r>
-      <w:bookmarkEnd w:id="21"/>
+      <w:bookmarkEnd w:id="22"/>
     </w:p>
     <w:p>
       <w:pPr>
@@ -10092,9 +10148,8 @@
     <w:p>
       <w:pPr>
         <w:pStyle w:val="Heading2"/>
-        <w:keepNext/>
       </w:pPr>
-      <w:bookmarkStart w:name="_Toc22" w:id="22"/>
+      <w:bookmarkStart w:name="_Toc23" w:id="23"/>
       <w:r>
         <w:t xml:space="preserve">7.10 Musik Bad Apple!! — </w:t>
       </w:r>
@@ -10107,7 +10162,7 @@
         </w:rPr>
         <w:t xml:space="preserve">resources/js/musik.js</w:t>
       </w:r>
-      <w:bookmarkEnd w:id="22"/>
+      <w:bookmarkEnd w:id="23"/>
     </w:p>
     <w:p>
       <w:pPr>
@@ -10232,13 +10287,12 @@
     <w:p>
       <w:pPr>
         <w:pStyle w:val="Heading2"/>
-        <w:keepNext/>
       </w:pPr>
-      <w:bookmarkStart w:name="_Toc23" w:id="23"/>
+      <w:bookmarkStart w:name="_Toc24" w:id="24"/>
       <w:r>
         <w:t xml:space="preserve">7.11 Tanpa Pindah Halaman dan Popup — Turbo</w:t>
       </w:r>
-      <w:bookmarkEnd w:id="23"/>
+      <w:bookmarkEnd w:id="24"/>
     </w:p>
     <w:p>
       <w:pPr>
@@ -10442,9 +10496,8 @@
     <w:p>
       <w:pPr>
         <w:pStyle w:val="Heading2"/>
-        <w:keepNext/>
       </w:pPr>
-      <w:bookmarkStart w:name="_Toc24" w:id="24"/>
+      <w:bookmarkStart w:name="_Toc25" w:id="25"/>
       <w:r>
         <w:t xml:space="preserve">7.12 Penanganan Error 419 — </w:t>
       </w:r>
@@ -10457,7 +10510,7 @@
         </w:rPr>
         <w:t xml:space="preserve">bootstrap/app.php</w:t>
       </w:r>
-      <w:bookmarkEnd w:id="24"/>
+      <w:bookmarkEnd w:id="25"/>
     </w:p>
     <w:p>
       <w:r>
@@ -10467,13 +10520,12 @@
     <w:p>
       <w:pPr>
         <w:pStyle w:val="Heading1"/>
-        <w:keepNext/>
       </w:pPr>
-      <w:bookmarkStart w:name="_Toc25" w:id="25"/>
+      <w:bookmarkStart w:name="_Toc26" w:id="26"/>
       <w:r>
         <w:t xml:space="preserve">8. Keamanan</w:t>
       </w:r>
-      <w:bookmarkEnd w:id="25"/>
+      <w:bookmarkEnd w:id="26"/>
     </w:p>
     <w:tbl>
       <w:tblPr>
@@ -11283,24 +11335,22 @@
     <w:p>
       <w:pPr>
         <w:pStyle w:val="Heading1"/>
-        <w:keepNext/>
       </w:pPr>
-      <w:bookmarkStart w:name="_Toc26" w:id="26"/>
+      <w:bookmarkStart w:name="_Toc27" w:id="27"/>
       <w:r>
         <w:t xml:space="preserve">9. Debugging</w:t>
       </w:r>
-      <w:bookmarkEnd w:id="26"/>
+      <w:bookmarkEnd w:id="27"/>
     </w:p>
     <w:p>
       <w:pPr>
         <w:pStyle w:val="Heading2"/>
-        <w:keepNext/>
       </w:pPr>
-      <w:bookmarkStart w:name="_Toc27" w:id="27"/>
+      <w:bookmarkStart w:name="_Toc28" w:id="28"/>
       <w:r>
         <w:t xml:space="preserve">9.1 Bug yang Ditemukan dan Perbaikannya</w:t>
       </w:r>
-      <w:bookmarkEnd w:id="27"/>
+      <w:bookmarkEnd w:id="28"/>
     </w:p>
     <w:tbl>
       <w:tblPr>
@@ -11315,11 +11365,11 @@
         </w:tblBorders>
       </w:tblPr>
       <w:tblGrid>
-        <w:gridCol w:w="280"/>
-        <w:gridCol w:w="1637"/>
-        <w:gridCol w:w="2807"/>
-        <w:gridCol w:w="2386"/>
-        <w:gridCol w:w="2528"/>
+        <w:gridCol w:w="252"/>
+        <w:gridCol w:w="1809"/>
+        <w:gridCol w:w="2525"/>
+        <w:gridCol w:w="2525"/>
+        <w:gridCol w:w="2527"/>
       </w:tblGrid>
       <w:tr>
         <w:trPr>
@@ -11327,7 +11377,7 @@
         </w:trPr>
         <w:tc>
           <w:tcPr>
-            <w:tcW w:type="dxa" w:w="280"/>
+            <w:tcW w:type="dxa" w:w="252"/>
             <w:tcBorders>
               <w:top w:val="single" w:color="BFBFBF" w:sz="4"/>
               <w:left w:val="single" w:color="BFBFBF" w:sz="4"/>
@@ -11357,7 +11407,7 @@
         </w:tc>
         <w:tc>
           <w:tcPr>
-            <w:tcW w:type="dxa" w:w="1637"/>
+            <w:tcW w:type="dxa" w:w="1809"/>
             <w:tcBorders>
               <w:top w:val="single" w:color="BFBFBF" w:sz="4"/>
               <w:left w:val="single" w:color="BFBFBF" w:sz="4"/>
@@ -11387,7 +11437,7 @@
         </w:tc>
         <w:tc>
           <w:tcPr>
-            <w:tcW w:type="dxa" w:w="2807"/>
+            <w:tcW w:type="dxa" w:w="2525"/>
             <w:tcBorders>
               <w:top w:val="single" w:color="BFBFBF" w:sz="4"/>
               <w:left w:val="single" w:color="BFBFBF" w:sz="4"/>
@@ -11417,7 +11467,7 @@
         </w:tc>
         <w:tc>
           <w:tcPr>
-            <w:tcW w:type="dxa" w:w="2386"/>
+            <w:tcW w:type="dxa" w:w="2525"/>
             <w:tcBorders>
               <w:top w:val="single" w:color="BFBFBF" w:sz="4"/>
               <w:left w:val="single" w:color="BFBFBF" w:sz="4"/>
@@ -11447,7 +11497,7 @@
         </w:tc>
         <w:tc>
           <w:tcPr>
-            <w:tcW w:type="dxa" w:w="2528"/>
+            <w:tcW w:type="dxa" w:w="2527"/>
             <w:tcBorders>
               <w:top w:val="single" w:color="BFBFBF" w:sz="4"/>
               <w:left w:val="single" w:color="BFBFBF" w:sz="4"/>
@@ -11482,7 +11532,7 @@
         </w:trPr>
         <w:tc>
           <w:tcPr>
-            <w:tcW w:type="dxa" w:w="280"/>
+            <w:tcW w:type="dxa" w:w="252"/>
             <w:tcBorders>
               <w:top w:val="single" w:color="BFBFBF" w:sz="4"/>
               <w:left w:val="single" w:color="BFBFBF" w:sz="4"/>
@@ -11508,7 +11558,7 @@
         </w:tc>
         <w:tc>
           <w:tcPr>
-            <w:tcW w:type="dxa" w:w="1637"/>
+            <w:tcW w:type="dxa" w:w="1809"/>
             <w:tcBorders>
               <w:top w:val="single" w:color="BFBFBF" w:sz="4"/>
               <w:left w:val="single" w:color="BFBFBF" w:sz="4"/>
@@ -11543,7 +11593,7 @@
         </w:tc>
         <w:tc>
           <w:tcPr>
-            <w:tcW w:type="dxa" w:w="2807"/>
+            <w:tcW w:type="dxa" w:w="2525"/>
             <w:tcBorders>
               <w:top w:val="single" w:color="BFBFBF" w:sz="4"/>
               <w:left w:val="single" w:color="BFBFBF" w:sz="4"/>
@@ -11578,7 +11628,7 @@
         </w:tc>
         <w:tc>
           <w:tcPr>
-            <w:tcW w:type="dxa" w:w="2386"/>
+            <w:tcW w:type="dxa" w:w="2525"/>
             <w:tcBorders>
               <w:top w:val="single" w:color="BFBFBF" w:sz="4"/>
               <w:left w:val="single" w:color="BFBFBF" w:sz="4"/>
@@ -11620,7 +11670,7 @@
         </w:tc>
         <w:tc>
           <w:tcPr>
-            <w:tcW w:type="dxa" w:w="2528"/>
+            <w:tcW w:type="dxa" w:w="2527"/>
             <w:tcBorders>
               <w:top w:val="single" w:color="BFBFBF" w:sz="4"/>
               <w:left w:val="single" w:color="BFBFBF" w:sz="4"/>
@@ -11660,7 +11710,7 @@
         </w:trPr>
         <w:tc>
           <w:tcPr>
-            <w:tcW w:type="dxa" w:w="280"/>
+            <w:tcW w:type="dxa" w:w="252"/>
             <w:tcBorders>
               <w:top w:val="single" w:color="BFBFBF" w:sz="4"/>
               <w:left w:val="single" w:color="BFBFBF" w:sz="4"/>
@@ -11686,7 +11736,7 @@
         </w:tc>
         <w:tc>
           <w:tcPr>
-            <w:tcW w:type="dxa" w:w="1637"/>
+            <w:tcW w:type="dxa" w:w="1809"/>
             <w:tcBorders>
               <w:top w:val="single" w:color="BFBFBF" w:sz="4"/>
               <w:left w:val="single" w:color="BFBFBF" w:sz="4"/>
@@ -11721,7 +11771,7 @@
         </w:tc>
         <w:tc>
           <w:tcPr>
-            <w:tcW w:type="dxa" w:w="2807"/>
+            <w:tcW w:type="dxa" w:w="2525"/>
             <w:tcBorders>
               <w:top w:val="single" w:color="BFBFBF" w:sz="4"/>
               <w:left w:val="single" w:color="BFBFBF" w:sz="4"/>
@@ -11781,7 +11831,7 @@
         </w:tc>
         <w:tc>
           <w:tcPr>
-            <w:tcW w:type="dxa" w:w="2386"/>
+            <w:tcW w:type="dxa" w:w="2525"/>
             <w:tcBorders>
               <w:top w:val="single" w:color="BFBFBF" w:sz="4"/>
               <w:left w:val="single" w:color="BFBFBF" w:sz="4"/>
@@ -11807,7 +11857,7 @@
         </w:tc>
         <w:tc>
           <w:tcPr>
-            <w:tcW w:type="dxa" w:w="2528"/>
+            <w:tcW w:type="dxa" w:w="2527"/>
             <w:tcBorders>
               <w:top w:val="single" w:color="BFBFBF" w:sz="4"/>
               <w:left w:val="single" w:color="BFBFBF" w:sz="4"/>
@@ -11847,7 +11897,7 @@
         </w:trPr>
         <w:tc>
           <w:tcPr>
-            <w:tcW w:type="dxa" w:w="280"/>
+            <w:tcW w:type="dxa" w:w="252"/>
             <w:tcBorders>
               <w:top w:val="single" w:color="BFBFBF" w:sz="4"/>
               <w:left w:val="single" w:color="BFBFBF" w:sz="4"/>
@@ -11873,7 +11923,7 @@
         </w:tc>
         <w:tc>
           <w:tcPr>
-            <w:tcW w:type="dxa" w:w="1637"/>
+            <w:tcW w:type="dxa" w:w="1809"/>
             <w:tcBorders>
               <w:top w:val="single" w:color="BFBFBF" w:sz="4"/>
               <w:left w:val="single" w:color="BFBFBF" w:sz="4"/>
@@ -11899,7 +11949,7 @@
         </w:tc>
         <w:tc>
           <w:tcPr>
-            <w:tcW w:type="dxa" w:w="2807"/>
+            <w:tcW w:type="dxa" w:w="2525"/>
             <w:tcBorders>
               <w:top w:val="single" w:color="BFBFBF" w:sz="4"/>
               <w:left w:val="single" w:color="BFBFBF" w:sz="4"/>
@@ -11934,7 +11984,7 @@
         </w:tc>
         <w:tc>
           <w:tcPr>
-            <w:tcW w:type="dxa" w:w="2386"/>
+            <w:tcW w:type="dxa" w:w="2525"/>
             <w:tcBorders>
               <w:top w:val="single" w:color="BFBFBF" w:sz="4"/>
               <w:left w:val="single" w:color="BFBFBF" w:sz="4"/>
@@ -11969,7 +12019,7 @@
         </w:tc>
         <w:tc>
           <w:tcPr>
-            <w:tcW w:type="dxa" w:w="2528"/>
+            <w:tcW w:type="dxa" w:w="2527"/>
             <w:tcBorders>
               <w:top w:val="single" w:color="BFBFBF" w:sz="4"/>
               <w:left w:val="single" w:color="BFBFBF" w:sz="4"/>
@@ -12016,7 +12066,7 @@
         </w:trPr>
         <w:tc>
           <w:tcPr>
-            <w:tcW w:type="dxa" w:w="280"/>
+            <w:tcW w:type="dxa" w:w="252"/>
             <w:tcBorders>
               <w:top w:val="single" w:color="BFBFBF" w:sz="4"/>
               <w:left w:val="single" w:color="BFBFBF" w:sz="4"/>
@@ -12042,7 +12092,7 @@
         </w:tc>
         <w:tc>
           <w:tcPr>
-            <w:tcW w:type="dxa" w:w="1637"/>
+            <w:tcW w:type="dxa" w:w="1809"/>
             <w:tcBorders>
               <w:top w:val="single" w:color="BFBFBF" w:sz="4"/>
               <w:left w:val="single" w:color="BFBFBF" w:sz="4"/>
@@ -12068,7 +12118,7 @@
         </w:tc>
         <w:tc>
           <w:tcPr>
-            <w:tcW w:type="dxa" w:w="2807"/>
+            <w:tcW w:type="dxa" w:w="2525"/>
             <w:tcBorders>
               <w:top w:val="single" w:color="BFBFBF" w:sz="4"/>
               <w:left w:val="single" w:color="BFBFBF" w:sz="4"/>
@@ -12094,7 +12144,7 @@
         </w:tc>
         <w:tc>
           <w:tcPr>
-            <w:tcW w:type="dxa" w:w="2386"/>
+            <w:tcW w:type="dxa" w:w="2525"/>
             <w:tcBorders>
               <w:top w:val="single" w:color="BFBFBF" w:sz="4"/>
               <w:left w:val="single" w:color="BFBFBF" w:sz="4"/>
@@ -12120,7 +12170,7 @@
         </w:tc>
         <w:tc>
           <w:tcPr>
-            <w:tcW w:type="dxa" w:w="2528"/>
+            <w:tcW w:type="dxa" w:w="2527"/>
             <w:tcBorders>
               <w:top w:val="single" w:color="BFBFBF" w:sz="4"/>
               <w:left w:val="single" w:color="BFBFBF" w:sz="4"/>
@@ -12151,7 +12201,7 @@
         </w:trPr>
         <w:tc>
           <w:tcPr>
-            <w:tcW w:type="dxa" w:w="280"/>
+            <w:tcW w:type="dxa" w:w="252"/>
             <w:tcBorders>
               <w:top w:val="single" w:color="BFBFBF" w:sz="4"/>
               <w:left w:val="single" w:color="BFBFBF" w:sz="4"/>
@@ -12177,7 +12227,7 @@
         </w:tc>
         <w:tc>
           <w:tcPr>
-            <w:tcW w:type="dxa" w:w="1637"/>
+            <w:tcW w:type="dxa" w:w="1809"/>
             <w:tcBorders>
               <w:top w:val="single" w:color="BFBFBF" w:sz="4"/>
               <w:left w:val="single" w:color="BFBFBF" w:sz="4"/>
@@ -12205,7 +12255,7 @@
         </w:tc>
         <w:tc>
           <w:tcPr>
-            <w:tcW w:type="dxa" w:w="2807"/>
+            <w:tcW w:type="dxa" w:w="2525"/>
             <w:tcBorders>
               <w:top w:val="single" w:color="BFBFBF" w:sz="4"/>
               <w:left w:val="single" w:color="BFBFBF" w:sz="4"/>
@@ -12231,7 +12281,7 @@
         </w:tc>
         <w:tc>
           <w:tcPr>
-            <w:tcW w:type="dxa" w:w="2386"/>
+            <w:tcW w:type="dxa" w:w="2525"/>
             <w:tcBorders>
               <w:top w:val="single" w:color="BFBFBF" w:sz="4"/>
               <w:left w:val="single" w:color="BFBFBF" w:sz="4"/>
@@ -12257,7 +12307,7 @@
         </w:tc>
         <w:tc>
           <w:tcPr>
-            <w:tcW w:type="dxa" w:w="2528"/>
+            <w:tcW w:type="dxa" w:w="2527"/>
             <w:tcBorders>
               <w:top w:val="single" w:color="BFBFBF" w:sz="4"/>
               <w:left w:val="single" w:color="BFBFBF" w:sz="4"/>
@@ -12304,7 +12354,7 @@
         </w:trPr>
         <w:tc>
           <w:tcPr>
-            <w:tcW w:type="dxa" w:w="280"/>
+            <w:tcW w:type="dxa" w:w="252"/>
             <w:tcBorders>
               <w:top w:val="single" w:color="BFBFBF" w:sz="4"/>
               <w:left w:val="single" w:color="BFBFBF" w:sz="4"/>
@@ -12330,7 +12380,7 @@
         </w:tc>
         <w:tc>
           <w:tcPr>
-            <w:tcW w:type="dxa" w:w="1637"/>
+            <w:tcW w:type="dxa" w:w="1809"/>
             <w:tcBorders>
               <w:top w:val="single" w:color="BFBFBF" w:sz="4"/>
               <w:left w:val="single" w:color="BFBFBF" w:sz="4"/>
@@ -12365,7 +12415,7 @@
         </w:tc>
         <w:tc>
           <w:tcPr>
-            <w:tcW w:type="dxa" w:w="2807"/>
+            <w:tcW w:type="dxa" w:w="2525"/>
             <w:tcBorders>
               <w:top w:val="single" w:color="BFBFBF" w:sz="4"/>
               <w:left w:val="single" w:color="BFBFBF" w:sz="4"/>
@@ -12391,7 +12441,7 @@
         </w:tc>
         <w:tc>
           <w:tcPr>
-            <w:tcW w:type="dxa" w:w="2386"/>
+            <w:tcW w:type="dxa" w:w="2525"/>
             <w:tcBorders>
               <w:top w:val="single" w:color="BFBFBF" w:sz="4"/>
               <w:left w:val="single" w:color="BFBFBF" w:sz="4"/>
@@ -12417,7 +12467,7 @@
         </w:tc>
         <w:tc>
           <w:tcPr>
-            <w:tcW w:type="dxa" w:w="2528"/>
+            <w:tcW w:type="dxa" w:w="2527"/>
             <w:tcBorders>
               <w:top w:val="single" w:color="BFBFBF" w:sz="4"/>
               <w:left w:val="single" w:color="BFBFBF" w:sz="4"/>
@@ -12448,7 +12498,7 @@
         </w:trPr>
         <w:tc>
           <w:tcPr>
-            <w:tcW w:type="dxa" w:w="280"/>
+            <w:tcW w:type="dxa" w:w="252"/>
             <w:tcBorders>
               <w:top w:val="single" w:color="BFBFBF" w:sz="4"/>
               <w:left w:val="single" w:color="BFBFBF" w:sz="4"/>
@@ -12474,7 +12524,7 @@
         </w:tc>
         <w:tc>
           <w:tcPr>
-            <w:tcW w:type="dxa" w:w="1637"/>
+            <w:tcW w:type="dxa" w:w="1809"/>
             <w:tcBorders>
               <w:top w:val="single" w:color="BFBFBF" w:sz="4"/>
               <w:left w:val="single" w:color="BFBFBF" w:sz="4"/>
@@ -12500,7 +12550,7 @@
         </w:tc>
         <w:tc>
           <w:tcPr>
-            <w:tcW w:type="dxa" w:w="2807"/>
+            <w:tcW w:type="dxa" w:w="2525"/>
             <w:tcBorders>
               <w:top w:val="single" w:color="BFBFBF" w:sz="4"/>
               <w:left w:val="single" w:color="BFBFBF" w:sz="4"/>
@@ -12535,7 +12585,7 @@
         </w:tc>
         <w:tc>
           <w:tcPr>
-            <w:tcW w:type="dxa" w:w="2386"/>
+            <w:tcW w:type="dxa" w:w="2525"/>
             <w:tcBorders>
               <w:top w:val="single" w:color="BFBFBF" w:sz="4"/>
               <w:left w:val="single" w:color="BFBFBF" w:sz="4"/>
@@ -12561,7 +12611,7 @@
         </w:tc>
         <w:tc>
           <w:tcPr>
-            <w:tcW w:type="dxa" w:w="2528"/>
+            <w:tcW w:type="dxa" w:w="2527"/>
             <w:tcBorders>
               <w:top w:val="single" w:color="BFBFBF" w:sz="4"/>
               <w:left w:val="single" w:color="BFBFBF" w:sz="4"/>
@@ -12608,7 +12658,7 @@
         </w:trPr>
         <w:tc>
           <w:tcPr>
-            <w:tcW w:type="dxa" w:w="280"/>
+            <w:tcW w:type="dxa" w:w="252"/>
             <w:tcBorders>
               <w:top w:val="single" w:color="BFBFBF" w:sz="4"/>
               <w:left w:val="single" w:color="BFBFBF" w:sz="4"/>
@@ -12634,7 +12684,7 @@
         </w:tc>
         <w:tc>
           <w:tcPr>
-            <w:tcW w:type="dxa" w:w="1637"/>
+            <w:tcW w:type="dxa" w:w="1809"/>
             <w:tcBorders>
               <w:top w:val="single" w:color="BFBFBF" w:sz="4"/>
               <w:left w:val="single" w:color="BFBFBF" w:sz="4"/>
@@ -12660,7 +12710,7 @@
         </w:tc>
         <w:tc>
           <w:tcPr>
-            <w:tcW w:type="dxa" w:w="2807"/>
+            <w:tcW w:type="dxa" w:w="2525"/>
             <w:tcBorders>
               <w:top w:val="single" w:color="BFBFBF" w:sz="4"/>
               <w:left w:val="single" w:color="BFBFBF" w:sz="4"/>
@@ -12695,7 +12745,7 @@
         </w:tc>
         <w:tc>
           <w:tcPr>
-            <w:tcW w:type="dxa" w:w="2386"/>
+            <w:tcW w:type="dxa" w:w="2525"/>
             <w:tcBorders>
               <w:top w:val="single" w:color="BFBFBF" w:sz="4"/>
               <w:left w:val="single" w:color="BFBFBF" w:sz="4"/>
@@ -12721,7 +12771,7 @@
         </w:tc>
         <w:tc>
           <w:tcPr>
-            <w:tcW w:type="dxa" w:w="2528"/>
+            <w:tcW w:type="dxa" w:w="2527"/>
             <w:tcBorders>
               <w:top w:val="single" w:color="BFBFBF" w:sz="4"/>
               <w:left w:val="single" w:color="BFBFBF" w:sz="4"/>
@@ -12761,7 +12811,7 @@
         </w:trPr>
         <w:tc>
           <w:tcPr>
-            <w:tcW w:type="dxa" w:w="280"/>
+            <w:tcW w:type="dxa" w:w="252"/>
             <w:tcBorders>
               <w:top w:val="single" w:color="BFBFBF" w:sz="4"/>
               <w:left w:val="single" w:color="BFBFBF" w:sz="4"/>
@@ -12787,7 +12837,7 @@
         </w:tc>
         <w:tc>
           <w:tcPr>
-            <w:tcW w:type="dxa" w:w="1637"/>
+            <w:tcW w:type="dxa" w:w="1809"/>
             <w:tcBorders>
               <w:top w:val="single" w:color="BFBFBF" w:sz="4"/>
               <w:left w:val="single" w:color="BFBFBF" w:sz="4"/>
@@ -12813,7 +12863,7 @@
         </w:tc>
         <w:tc>
           <w:tcPr>
-            <w:tcW w:type="dxa" w:w="2807"/>
+            <w:tcW w:type="dxa" w:w="2525"/>
             <w:tcBorders>
               <w:top w:val="single" w:color="BFBFBF" w:sz="4"/>
               <w:left w:val="single" w:color="BFBFBF" w:sz="4"/>
@@ -12839,7 +12889,7 @@
         </w:tc>
         <w:tc>
           <w:tcPr>
-            <w:tcW w:type="dxa" w:w="2386"/>
+            <w:tcW w:type="dxa" w:w="2525"/>
             <w:tcBorders>
               <w:top w:val="single" w:color="BFBFBF" w:sz="4"/>
               <w:left w:val="single" w:color="BFBFBF" w:sz="4"/>
@@ -12865,7 +12915,7 @@
         </w:tc>
         <w:tc>
           <w:tcPr>
-            <w:tcW w:type="dxa" w:w="2528"/>
+            <w:tcW w:type="dxa" w:w="2527"/>
             <w:tcBorders>
               <w:top w:val="single" w:color="BFBFBF" w:sz="4"/>
               <w:left w:val="single" w:color="BFBFBF" w:sz="4"/>
@@ -12896,7 +12946,7 @@
         </w:trPr>
         <w:tc>
           <w:tcPr>
-            <w:tcW w:type="dxa" w:w="280"/>
+            <w:tcW w:type="dxa" w:w="252"/>
             <w:tcBorders>
               <w:top w:val="single" w:color="BFBFBF" w:sz="4"/>
               <w:left w:val="single" w:color="BFBFBF" w:sz="4"/>
@@ -12922,7 +12972,7 @@
         </w:tc>
         <w:tc>
           <w:tcPr>
-            <w:tcW w:type="dxa" w:w="1637"/>
+            <w:tcW w:type="dxa" w:w="1809"/>
             <w:tcBorders>
               <w:top w:val="single" w:color="BFBFBF" w:sz="4"/>
               <w:left w:val="single" w:color="BFBFBF" w:sz="4"/>
@@ -12950,7 +13000,7 @@
         </w:tc>
         <w:tc>
           <w:tcPr>
-            <w:tcW w:type="dxa" w:w="2807"/>
+            <w:tcW w:type="dxa" w:w="2525"/>
             <w:tcBorders>
               <w:top w:val="single" w:color="BFBFBF" w:sz="4"/>
               <w:left w:val="single" w:color="BFBFBF" w:sz="4"/>
@@ -12976,7 +13026,7 @@
         </w:tc>
         <w:tc>
           <w:tcPr>
-            <w:tcW w:type="dxa" w:w="2386"/>
+            <w:tcW w:type="dxa" w:w="2525"/>
             <w:tcBorders>
               <w:top w:val="single" w:color="BFBFBF" w:sz="4"/>
               <w:left w:val="single" w:color="BFBFBF" w:sz="4"/>
@@ -13018,7 +13068,7 @@
         </w:tc>
         <w:tc>
           <w:tcPr>
-            <w:tcW w:type="dxa" w:w="2528"/>
+            <w:tcW w:type="dxa" w:w="2527"/>
             <w:tcBorders>
               <w:top w:val="single" w:color="BFBFBF" w:sz="4"/>
               <w:left w:val="single" w:color="BFBFBF" w:sz="4"/>
@@ -13058,7 +13108,7 @@
         </w:trPr>
         <w:tc>
           <w:tcPr>
-            <w:tcW w:type="dxa" w:w="280"/>
+            <w:tcW w:type="dxa" w:w="252"/>
             <w:tcBorders>
               <w:top w:val="single" w:color="BFBFBF" w:sz="4"/>
               <w:left w:val="single" w:color="BFBFBF" w:sz="4"/>
@@ -13084,7 +13134,7 @@
         </w:tc>
         <w:tc>
           <w:tcPr>
-            <w:tcW w:type="dxa" w:w="1637"/>
+            <w:tcW w:type="dxa" w:w="1809"/>
             <w:tcBorders>
               <w:top w:val="single" w:color="BFBFBF" w:sz="4"/>
               <w:left w:val="single" w:color="BFBFBF" w:sz="4"/>
@@ -13112,7 +13162,7 @@
         </w:tc>
         <w:tc>
           <w:tcPr>
-            <w:tcW w:type="dxa" w:w="2807"/>
+            <w:tcW w:type="dxa" w:w="2525"/>
             <w:tcBorders>
               <w:top w:val="single" w:color="BFBFBF" w:sz="4"/>
               <w:left w:val="single" w:color="BFBFBF" w:sz="4"/>
@@ -13147,7 +13197,7 @@
         </w:tc>
         <w:tc>
           <w:tcPr>
-            <w:tcW w:type="dxa" w:w="2386"/>
+            <w:tcW w:type="dxa" w:w="2525"/>
             <w:tcBorders>
               <w:top w:val="single" w:color="BFBFBF" w:sz="4"/>
               <w:left w:val="single" w:color="BFBFBF" w:sz="4"/>
@@ -13173,7 +13223,7 @@
         </w:tc>
         <w:tc>
           <w:tcPr>
-            <w:tcW w:type="dxa" w:w="2528"/>
+            <w:tcW w:type="dxa" w:w="2527"/>
             <w:tcBorders>
               <w:top w:val="single" w:color="BFBFBF" w:sz="4"/>
               <w:left w:val="single" w:color="BFBFBF" w:sz="4"/>
@@ -13220,7 +13270,7 @@
         </w:trPr>
         <w:tc>
           <w:tcPr>
-            <w:tcW w:type="dxa" w:w="280"/>
+            <w:tcW w:type="dxa" w:w="252"/>
             <w:tcBorders>
               <w:top w:val="single" w:color="BFBFBF" w:sz="4"/>
               <w:left w:val="single" w:color="BFBFBF" w:sz="4"/>
@@ -13246,7 +13296,7 @@
         </w:tc>
         <w:tc>
           <w:tcPr>
-            <w:tcW w:type="dxa" w:w="1637"/>
+            <w:tcW w:type="dxa" w:w="1809"/>
             <w:tcBorders>
               <w:top w:val="single" w:color="BFBFBF" w:sz="4"/>
               <w:left w:val="single" w:color="BFBFBF" w:sz="4"/>
@@ -13274,7 +13324,7 @@
         </w:tc>
         <w:tc>
           <w:tcPr>
-            <w:tcW w:type="dxa" w:w="2807"/>
+            <w:tcW w:type="dxa" w:w="2525"/>
             <w:tcBorders>
               <w:top w:val="single" w:color="BFBFBF" w:sz="4"/>
               <w:left w:val="single" w:color="BFBFBF" w:sz="4"/>
@@ -13316,7 +13366,7 @@
         </w:tc>
         <w:tc>
           <w:tcPr>
-            <w:tcW w:type="dxa" w:w="2386"/>
+            <w:tcW w:type="dxa" w:w="2525"/>
             <w:tcBorders>
               <w:top w:val="single" w:color="BFBFBF" w:sz="4"/>
               <w:left w:val="single" w:color="BFBFBF" w:sz="4"/>
@@ -13342,7 +13392,7 @@
         </w:tc>
         <w:tc>
           <w:tcPr>
-            <w:tcW w:type="dxa" w:w="2528"/>
+            <w:tcW w:type="dxa" w:w="2527"/>
             <w:tcBorders>
               <w:top w:val="single" w:color="BFBFBF" w:sz="4"/>
               <w:left w:val="single" w:color="BFBFBF" w:sz="4"/>
@@ -13373,7 +13423,7 @@
         </w:trPr>
         <w:tc>
           <w:tcPr>
-            <w:tcW w:type="dxa" w:w="280"/>
+            <w:tcW w:type="dxa" w:w="252"/>
             <w:tcBorders>
               <w:top w:val="single" w:color="BFBFBF" w:sz="4"/>
               <w:left w:val="single" w:color="BFBFBF" w:sz="4"/>
@@ -13399,7 +13449,7 @@
         </w:tc>
         <w:tc>
           <w:tcPr>
-            <w:tcW w:type="dxa" w:w="1637"/>
+            <w:tcW w:type="dxa" w:w="1809"/>
             <w:tcBorders>
               <w:top w:val="single" w:color="BFBFBF" w:sz="4"/>
               <w:left w:val="single" w:color="BFBFBF" w:sz="4"/>
@@ -13425,7 +13475,7 @@
         </w:tc>
         <w:tc>
           <w:tcPr>
-            <w:tcW w:type="dxa" w:w="2807"/>
+            <w:tcW w:type="dxa" w:w="2525"/>
             <w:tcBorders>
               <w:top w:val="single" w:color="BFBFBF" w:sz="4"/>
               <w:left w:val="single" w:color="BFBFBF" w:sz="4"/>
@@ -13460,7 +13510,7 @@
         </w:tc>
         <w:tc>
           <w:tcPr>
-            <w:tcW w:type="dxa" w:w="2386"/>
+            <w:tcW w:type="dxa" w:w="2525"/>
             <w:tcBorders>
               <w:top w:val="single" w:color="BFBFBF" w:sz="4"/>
               <w:left w:val="single" w:color="BFBFBF" w:sz="4"/>
@@ -13486,7 +13536,7 @@
         </w:tc>
         <w:tc>
           <w:tcPr>
-            <w:tcW w:type="dxa" w:w="2528"/>
+            <w:tcW w:type="dxa" w:w="2527"/>
             <w:tcBorders>
               <w:top w:val="single" w:color="BFBFBF" w:sz="4"/>
               <w:left w:val="single" w:color="BFBFBF" w:sz="4"/>
@@ -13517,7 +13567,7 @@
         </w:trPr>
         <w:tc>
           <w:tcPr>
-            <w:tcW w:type="dxa" w:w="280"/>
+            <w:tcW w:type="dxa" w:w="252"/>
             <w:tcBorders>
               <w:top w:val="single" w:color="BFBFBF" w:sz="4"/>
               <w:left w:val="single" w:color="BFBFBF" w:sz="4"/>
@@ -13543,7 +13593,7 @@
         </w:tc>
         <w:tc>
           <w:tcPr>
-            <w:tcW w:type="dxa" w:w="1637"/>
+            <w:tcW w:type="dxa" w:w="1809"/>
             <w:tcBorders>
               <w:top w:val="single" w:color="BFBFBF" w:sz="4"/>
               <w:left w:val="single" w:color="BFBFBF" w:sz="4"/>
@@ -13569,7 +13619,7 @@
         </w:tc>
         <w:tc>
           <w:tcPr>
-            <w:tcW w:type="dxa" w:w="2807"/>
+            <w:tcW w:type="dxa" w:w="2525"/>
             <w:tcBorders>
               <w:top w:val="single" w:color="BFBFBF" w:sz="4"/>
               <w:left w:val="single" w:color="BFBFBF" w:sz="4"/>
@@ -13595,7 +13645,7 @@
         </w:tc>
         <w:tc>
           <w:tcPr>
-            <w:tcW w:type="dxa" w:w="2386"/>
+            <w:tcW w:type="dxa" w:w="2525"/>
             <w:tcBorders>
               <w:top w:val="single" w:color="BFBFBF" w:sz="4"/>
               <w:left w:val="single" w:color="BFBFBF" w:sz="4"/>
@@ -13621,7 +13671,7 @@
         </w:tc>
         <w:tc>
           <w:tcPr>
-            <w:tcW w:type="dxa" w:w="2528"/>
+            <w:tcW w:type="dxa" w:w="2527"/>
             <w:tcBorders>
               <w:top w:val="single" w:color="BFBFBF" w:sz="4"/>
               <w:left w:val="single" w:color="BFBFBF" w:sz="4"/>
@@ -13642,6 +13692,214 @@
                 <w:szCs w:val="19"/>
               </w:rPr>
               <w:t xml:space="preserve">Error 419 ditangani: kembali dengan pesan, isian tetap</w:t>
+            </w:r>
+          </w:p>
+        </w:tc>
+      </w:tr>
+      <w:tr>
+        <w:trPr>
+          <w:tblHeader w:val="off"/>
+        </w:trPr>
+        <w:tc>
+          <w:tcPr>
+            <w:tcW w:type="dxa" w:w="252"/>
+            <w:tcBorders>
+              <w:top w:val="single" w:color="BFBFBF" w:sz="4"/>
+              <w:left w:val="single" w:color="BFBFBF" w:sz="4"/>
+              <w:bottom w:val="single" w:color="BFBFBF" w:sz="4"/>
+              <w:right w:val="single" w:color="BFBFBF" w:sz="4"/>
+            </w:tcBorders>
+            <w:tcMar>
+              <w:top w:type="dxa" w:w="60"/>
+              <w:left w:type="dxa" w:w="100"/>
+              <w:bottom w:type="dxa" w:w="60"/>
+              <w:right w:type="dxa" w:w="100"/>
+            </w:tcMar>
+          </w:tcPr>
+          <w:p>
+            <w:r>
+              <w:rPr>
+                <w:sz w:val="19"/>
+                <w:szCs w:val="19"/>
+              </w:rPr>
+              <w:t xml:space="preserve">15</w:t>
+            </w:r>
+          </w:p>
+        </w:tc>
+        <w:tc>
+          <w:tcPr>
+            <w:tcW w:type="dxa" w:w="1809"/>
+            <w:tcBorders>
+              <w:top w:val="single" w:color="BFBFBF" w:sz="4"/>
+              <w:left w:val="single" w:color="BFBFBF" w:sz="4"/>
+              <w:bottom w:val="single" w:color="BFBFBF" w:sz="4"/>
+              <w:right w:val="single" w:color="BFBFBF" w:sz="4"/>
+            </w:tcBorders>
+            <w:tcMar>
+              <w:top w:type="dxa" w:w="60"/>
+              <w:left w:type="dxa" w:w="100"/>
+              <w:bottom w:type="dxa" w:w="60"/>
+              <w:right w:type="dxa" w:w="100"/>
+            </w:tcMar>
+          </w:tcPr>
+          <w:p>
+            <w:r>
+              <w:rPr>
+                <w:rFonts w:ascii="Consolas" w:cs="Consolas" w:eastAsia="Consolas" w:hAnsi="Consolas"/>
+                <w:color w:val="1F4E79"/>
+                <w:sz w:val="17"/>
+                <w:szCs w:val="17"/>
+              </w:rPr>
+              <w:t xml:space="preserve">GambarService::simpan()</w:t>
+            </w:r>
+            <w:r>
+              <w:rPr>
+                <w:sz w:val="19"/>
+                <w:szCs w:val="19"/>
+              </w:rPr>
+              <w:t xml:space="preserve"> di website online</w:t>
+            </w:r>
+          </w:p>
+        </w:tc>
+        <w:tc>
+          <w:tcPr>
+            <w:tcW w:type="dxa" w:w="2525"/>
+            <w:tcBorders>
+              <w:top w:val="single" w:color="BFBFBF" w:sz="4"/>
+              <w:left w:val="single" w:color="BFBFBF" w:sz="4"/>
+              <w:bottom w:val="single" w:color="BFBFBF" w:sz="4"/>
+              <w:right w:val="single" w:color="BFBFBF" w:sz="4"/>
+            </w:tcBorders>
+            <w:tcMar>
+              <w:top w:type="dxa" w:w="60"/>
+              <w:left w:type="dxa" w:w="100"/>
+              <w:bottom w:type="dxa" w:w="60"/>
+              <w:right w:type="dxa" w:w="100"/>
+            </w:tcMar>
+          </w:tcPr>
+          <w:p>
+            <w:r>
+              <w:rPr>
+                <w:sz w:val="19"/>
+                <w:szCs w:val="19"/>
+              </w:rPr>
+              <w:t xml:space="preserve">Bila Supabase Storage menolak, </w:t>
+            </w:r>
+            <w:r>
+              <w:rPr>
+                <w:rFonts w:ascii="Consolas" w:cs="Consolas" w:eastAsia="Consolas" w:hAnsi="Consolas"/>
+                <w:color w:val="1F4E79"/>
+                <w:sz w:val="17"/>
+                <w:szCs w:val="17"/>
+              </w:rPr>
+              <w:t xml:space="preserve">putFile()</w:t>
+            </w:r>
+            <w:r>
+              <w:rPr>
+                <w:sz w:val="19"/>
+                <w:szCs w:val="19"/>
+              </w:rPr>
+              <w:t xml:space="preserve"> mengembalikan </w:t>
+            </w:r>
+            <w:r>
+              <w:rPr>
+                <w:rFonts w:ascii="Consolas" w:cs="Consolas" w:eastAsia="Consolas" w:hAnsi="Consolas"/>
+                <w:color w:val="1F4E79"/>
+                <w:sz w:val="17"/>
+                <w:szCs w:val="17"/>
+              </w:rPr>
+              <w:t xml:space="preserve">false</w:t>
+            </w:r>
+            <w:r>
+              <w:rPr>
+                <w:sz w:val="19"/>
+                <w:szCs w:val="19"/>
+              </w:rPr>
+              <w:t xml:space="preserve"> tanpa pesan, lalu </w:t>
+            </w:r>
+            <w:r>
+              <w:rPr>
+                <w:rFonts w:ascii="Consolas" w:cs="Consolas" w:eastAsia="Consolas" w:hAnsi="Consolas"/>
+                <w:color w:val="1F4E79"/>
+                <w:sz w:val="17"/>
+                <w:szCs w:val="17"/>
+              </w:rPr>
+              <w:t xml:space="preserve">false</w:t>
+            </w:r>
+            <w:r>
+              <w:rPr>
+                <w:sz w:val="19"/>
+                <w:szCs w:val="19"/>
+              </w:rPr>
+              <w:t xml:space="preserve"> ikut disimpan ke kolom foto</w:t>
+            </w:r>
+          </w:p>
+        </w:tc>
+        <w:tc>
+          <w:tcPr>
+            <w:tcW w:type="dxa" w:w="2525"/>
+            <w:tcBorders>
+              <w:top w:val="single" w:color="BFBFBF" w:sz="4"/>
+              <w:left w:val="single" w:color="BFBFBF" w:sz="4"/>
+              <w:bottom w:val="single" w:color="BFBFBF" w:sz="4"/>
+              <w:right w:val="single" w:color="BFBFBF" w:sz="4"/>
+            </w:tcBorders>
+            <w:tcMar>
+              <w:top w:type="dxa" w:w="60"/>
+              <w:left w:type="dxa" w:w="100"/>
+              <w:bottom w:type="dxa" w:w="60"/>
+              <w:right w:type="dxa" w:w="100"/>
+            </w:tcMar>
+          </w:tcPr>
+          <w:p>
+            <w:r>
+              <w:rPr>
+                <w:sz w:val="19"/>
+                <w:szCs w:val="19"/>
+              </w:rPr>
+              <w:t xml:space="preserve">Unggah foto profil / gambar barang menampilkan "500 Server Error"</w:t>
+            </w:r>
+          </w:p>
+        </w:tc>
+        <w:tc>
+          <w:tcPr>
+            <w:tcW w:type="dxa" w:w="2527"/>
+            <w:tcBorders>
+              <w:top w:val="single" w:color="BFBFBF" w:sz="4"/>
+              <w:left w:val="single" w:color="BFBFBF" w:sz="4"/>
+              <w:bottom w:val="single" w:color="BFBFBF" w:sz="4"/>
+              <w:right w:val="single" w:color="BFBFBF" w:sz="4"/>
+            </w:tcBorders>
+            <w:tcMar>
+              <w:top w:type="dxa" w:w="60"/>
+              <w:left w:type="dxa" w:w="100"/>
+              <w:bottom w:type="dxa" w:w="60"/>
+              <w:right w:type="dxa" w:w="100"/>
+            </w:tcMar>
+          </w:tcPr>
+          <w:p>
+            <w:r>
+              <w:rPr>
+                <w:sz w:val="19"/>
+                <w:szCs w:val="19"/>
+              </w:rPr>
+              <w:t xml:space="preserve">Kegagalan diubah menjadi </w:t>
+            </w:r>
+            <w:r>
+              <w:rPr>
+                <w:rFonts w:ascii="Consolas" w:cs="Consolas" w:eastAsia="Consolas" w:hAnsi="Consolas"/>
+                <w:color w:val="1F4E79"/>
+                <w:sz w:val="17"/>
+                <w:szCs w:val="17"/>
+              </w:rPr>
+              <w:t xml:space="preserve">GambarGagalDisimpanException</w:t>
+            </w:r>
+            <w:r>
+              <w:rPr>
+                <w:sz w:val="19"/>
+                <w:szCs w:val="19"/>
+              </w:rPr>
+              <w:t xml:space="preserve">: penyebab asli dicatat di log, pengguna kembali ke form dengan pesan jelas, data tidak tersimpan setengah jadi</w:t>
             </w:r>
           </w:p>
         </w:tc>
@@ -13655,13 +13913,12 @@
     <w:p>
       <w:pPr>
         <w:pStyle w:val="Heading2"/>
-        <w:keepNext/>
       </w:pPr>
-      <w:bookmarkStart w:name="_Toc28" w:id="28"/>
+      <w:bookmarkStart w:name="_Toc29" w:id="29"/>
       <w:r>
         <w:t xml:space="preserve">9.2 Teknik Debugging</w:t>
       </w:r>
-      <w:bookmarkEnd w:id="28"/>
+      <w:bookmarkEnd w:id="29"/>
     </w:p>
     <w:p>
       <w:pPr>
@@ -13860,13 +14117,12 @@
     <w:p>
       <w:pPr>
         <w:pStyle w:val="Heading1"/>
-        <w:keepNext/>
       </w:pPr>
-      <w:bookmarkStart w:name="_Toc29" w:id="29"/>
+      <w:bookmarkStart w:name="_Toc30" w:id="30"/>
       <w:r>
         <w:t xml:space="preserve">10. Pengujian Unit Program</w:t>
       </w:r>
-      <w:bookmarkEnd w:id="29"/>
+      <w:bookmarkEnd w:id="30"/>
     </w:p>
     <w:p>
       <w:r>
@@ -13952,7 +14208,7 @@
           <w:b/>
           <w:bCs/>
         </w:rPr>
-        <w:t xml:space="preserve">75 passed (257 assertions)</w:t>
+        <w:t xml:space="preserve">78 passed (271 assertions)</w:t>
       </w:r>
       <w:r>
         <w:t xml:space="preserve">.</w:t>
@@ -15239,6 +15495,117 @@
                 <w:sz w:val="17"/>
                 <w:szCs w:val="17"/>
               </w:rPr>
+              <w:t xml:space="preserve">tests/Feature/GambarGagalTest.php</w:t>
+            </w:r>
+          </w:p>
+        </w:tc>
+        <w:tc>
+          <w:tcPr>
+            <w:tcW w:type="dxa" w:w="520"/>
+            <w:tcBorders>
+              <w:top w:val="single" w:color="BFBFBF" w:sz="4"/>
+              <w:left w:val="single" w:color="BFBFBF" w:sz="4"/>
+              <w:bottom w:val="single" w:color="BFBFBF" w:sz="4"/>
+              <w:right w:val="single" w:color="BFBFBF" w:sz="4"/>
+            </w:tcBorders>
+            <w:tcMar>
+              <w:top w:type="dxa" w:w="60"/>
+              <w:left w:type="dxa" w:w="100"/>
+              <w:bottom w:type="dxa" w:w="60"/>
+              <w:right w:type="dxa" w:w="100"/>
+            </w:tcMar>
+          </w:tcPr>
+          <w:p>
+            <w:r>
+              <w:rPr>
+                <w:sz w:val="19"/>
+                <w:szCs w:val="19"/>
+              </w:rPr>
+              <w:t xml:space="preserve">Fitur</w:t>
+            </w:r>
+          </w:p>
+        </w:tc>
+        <w:tc>
+          <w:tcPr>
+            <w:tcW w:type="dxa" w:w="520"/>
+            <w:tcBorders>
+              <w:top w:val="single" w:color="BFBFBF" w:sz="4"/>
+              <w:left w:val="single" w:color="BFBFBF" w:sz="4"/>
+              <w:bottom w:val="single" w:color="BFBFBF" w:sz="4"/>
+              <w:right w:val="single" w:color="BFBFBF" w:sz="4"/>
+            </w:tcBorders>
+            <w:tcMar>
+              <w:top w:type="dxa" w:w="60"/>
+              <w:left w:type="dxa" w:w="100"/>
+              <w:bottom w:type="dxa" w:w="60"/>
+              <w:right w:type="dxa" w:w="100"/>
+            </w:tcMar>
+          </w:tcPr>
+          <w:p>
+            <w:r>
+              <w:rPr>
+                <w:sz w:val="19"/>
+                <w:szCs w:val="19"/>
+              </w:rPr>
+              <w:t xml:space="preserve">3</w:t>
+            </w:r>
+          </w:p>
+        </w:tc>
+        <w:tc>
+          <w:tcPr>
+            <w:tcW w:type="dxa" w:w="5212"/>
+            <w:tcBorders>
+              <w:top w:val="single" w:color="BFBFBF" w:sz="4"/>
+              <w:left w:val="single" w:color="BFBFBF" w:sz="4"/>
+              <w:bottom w:val="single" w:color="BFBFBF" w:sz="4"/>
+              <w:right w:val="single" w:color="BFBFBF" w:sz="4"/>
+            </w:tcBorders>
+            <w:tcMar>
+              <w:top w:type="dxa" w:w="60"/>
+              <w:left w:type="dxa" w:w="100"/>
+              <w:bottom w:type="dxa" w:w="60"/>
+              <w:right w:type="dxa" w:w="100"/>
+            </w:tcMar>
+          </w:tcPr>
+          <w:p>
+            <w:r>
+              <w:rPr>
+                <w:sz w:val="19"/>
+                <w:szCs w:val="19"/>
+              </w:rPr>
+              <w:t xml:space="preserve">Penyimpanan gambar gagal (profil, barang, barang keluar): kembali ke form dengan pesan, bukan error 500, data tidak tersimpan</w:t>
+            </w:r>
+          </w:p>
+        </w:tc>
+      </w:tr>
+      <w:tr>
+        <w:trPr>
+          <w:tblHeader w:val="off"/>
+        </w:trPr>
+        <w:tc>
+          <w:tcPr>
+            <w:tcW w:type="dxa" w:w="3386"/>
+            <w:tcBorders>
+              <w:top w:val="single" w:color="BFBFBF" w:sz="4"/>
+              <w:left w:val="single" w:color="BFBFBF" w:sz="4"/>
+              <w:bottom w:val="single" w:color="BFBFBF" w:sz="4"/>
+              <w:right w:val="single" w:color="BFBFBF" w:sz="4"/>
+            </w:tcBorders>
+            <w:tcMar>
+              <w:top w:type="dxa" w:w="60"/>
+              <w:left w:type="dxa" w:w="100"/>
+              <w:bottom w:type="dxa" w:w="60"/>
+              <w:right w:type="dxa" w:w="100"/>
+            </w:tcMar>
+          </w:tcPr>
+          <w:p>
+            <w:r>
+              <w:rPr>
+                <w:rFonts w:ascii="Consolas" w:cs="Consolas" w:eastAsia="Consolas" w:hAnsi="Consolas"/>
+                <w:color w:val="1F4E79"/>
+                <w:sz w:val="17"/>
+                <w:szCs w:val="17"/>
+              </w:rPr>
               <w:t xml:space="preserve">tests/Feature/PopupTest.php</w:t>
             </w:r>
           </w:p>
@@ -16357,13 +16724,12 @@
     <w:p>
       <w:pPr>
         <w:pStyle w:val="Heading1"/>
-        <w:keepNext/>
       </w:pPr>
-      <w:bookmarkStart w:name="_Toc30" w:id="30"/>
+      <w:bookmarkStart w:name="_Toc31" w:id="31"/>
       <w:r>
         <w:t xml:space="preserve">11. Pemetaan Unit Kompetensi</w:t>
       </w:r>
-      <w:bookmarkEnd w:id="30"/>
+      <w:bookmarkEnd w:id="31"/>
     </w:p>
     <w:tbl>
       <w:tblPr>
@@ -17688,7 +18054,7 @@
                 <w:sz w:val="19"/>
                 <w:szCs w:val="19"/>
               </w:rPr>
-              <w:t xml:space="preserve">75 test PHPUnit unit dan fitur (Bagian 10)</w:t>
+              <w:t xml:space="preserve">78 test PHPUnit unit dan fitur (Bagian 10)</w:t>
             </w:r>
           </w:p>
         </w:tc>
@@ -17702,13 +18068,12 @@
     <w:p>
       <w:pPr>
         <w:pStyle w:val="Heading1"/>
-        <w:keepNext/>
       </w:pPr>
-      <w:bookmarkStart w:name="_Toc31" w:id="31"/>
+      <w:bookmarkStart w:name="_Toc32" w:id="32"/>
       <w:r>
         <w:t xml:space="preserve">12. Skenario Demo</w:t>
       </w:r>
-      <w:bookmarkEnd w:id="31"/>
+      <w:bookmarkEnd w:id="32"/>
     </w:p>
     <w:p>
       <w:pPr>
@@ -17898,7 +18263,7 @@
         <w:t xml:space="preserve">php artisan test</w:t>
       </w:r>
       <w:r>
-        <w:t xml:space="preserve"> → 75 test lulus.</w:t>
+        <w:t xml:space="preserve"> → 78 test lulus.</w:t>
       </w:r>
     </w:p>
     <w:p>

</xml_diff>

<commit_message>
Catat penyebab gagal simpan gambar dalam satu baris log
</commit_message>
<xml_diff>
--- a/dokumen/02_DOKUMENTASI_PROGRAM.docx
+++ b/dokumen/02_DOKUMENTASI_PROGRAM.docx
@@ -573,7 +573,7 @@
                 <w:sz w:val="19"/>
                 <w:szCs w:val="19"/>
               </w:rPr>
-              <w:t xml:space="preserve">PHPUnit 11 — 78 test, 271 assertion, semua lulus</w:t>
+              <w:t xml:space="preserve">PHPUnit 11 — 79 test, 274 assertion, semua lulus</w:t>
             </w:r>
           </w:p>
         </w:tc>
@@ -8387,7 +8387,7 @@
                 <w:sz w:val="19"/>
                 <w:szCs w:val="19"/>
               </w:rPr>
-              <w:t xml:space="preserve">78 test PHPUnit</w:t>
+              <w:t xml:space="preserve">79 test PHPUnit</w:t>
             </w:r>
           </w:p>
         </w:tc>
@@ -9807,7 +9807,7 @@
         <w:t xml:space="preserve">bootstrap/app.php</w:t>
       </w:r>
       <w:r>
-        <w:t xml:space="preserve"> mengembalikan pengguna ke form dengan pesan jelas, dan penyebab aslinya dicatat ke log (di Vercel: menu Logs).</w:t>
+        <w:t xml:space="preserve"> mengembalikan pengguna ke form dengan pesan jelas, dan penyebab aslinya dicatat ke log dalam satu baris pendek berawalan "Gambar gagal disimpan:" (di Vercel: menu Logs, cari kata itu).</w:t>
       </w:r>
     </w:p>
     <w:p>
@@ -14208,7 +14208,7 @@
           <w:b/>
           <w:bCs/>
         </w:rPr>
-        <w:t xml:space="preserve">78 passed (271 assertions)</w:t>
+        <w:t xml:space="preserve">79 passed (274 assertions)</w:t>
       </w:r>
       <w:r>
         <w:t xml:space="preserve">.</w:t>
@@ -15547,7 +15547,7 @@
                 <w:sz w:val="19"/>
                 <w:szCs w:val="19"/>
               </w:rPr>
-              <w:t xml:space="preserve">3</w:t>
+              <w:t xml:space="preserve">4</w:t>
             </w:r>
           </w:p>
         </w:tc>
@@ -15573,7 +15573,7 @@
                 <w:sz w:val="19"/>
                 <w:szCs w:val="19"/>
               </w:rPr>
-              <w:t xml:space="preserve">Penyimpanan gambar gagal (profil, barang, barang keluar): kembali ke form dengan pesan, bukan error 500, data tidak tersimpan</w:t>
+              <w:t xml:space="preserve">Penyimpanan gambar gagal (profil, barang, barang keluar): kembali ke form dengan pesan, bukan error 500, data tidak tersimpan; penyebab dicatat dalam satu baris log pendek</w:t>
             </w:r>
           </w:p>
         </w:tc>
@@ -18054,7 +18054,7 @@
                 <w:sz w:val="19"/>
                 <w:szCs w:val="19"/>
               </w:rPr>
-              <w:t xml:space="preserve">78 test PHPUnit unit dan fitur (Bagian 10)</w:t>
+              <w:t xml:space="preserve">79 test PHPUnit unit dan fitur (Bagian 10)</w:t>
             </w:r>
           </w:p>
         </w:tc>
@@ -18263,7 +18263,7 @@
         <w:t xml:space="preserve">php artisan test</w:t>
       </w:r>
       <w:r>
-        <w:t xml:space="preserve"> → 78 test lulus.</w:t>
+        <w:t xml:space="preserve"> → 79 test lulus.</w:t>
       </w:r>
     </w:p>
     <w:p>

</xml_diff>

<commit_message>
Tampilkan penyebab gagal simpan gambar untuk Admin
</commit_message>
<xml_diff>
--- a/dokumen/02_DOKUMENTASI_PROGRAM.docx
+++ b/dokumen/02_DOKUMENTASI_PROGRAM.docx
@@ -573,7 +573,7 @@
                 <w:sz w:val="19"/>
                 <w:szCs w:val="19"/>
               </w:rPr>
-              <w:t xml:space="preserve">PHPUnit 11 — 79 test, 274 assertion, semua lulus</w:t>
+              <w:t xml:space="preserve">PHPUnit 11 — 80 test, 276 assertion, semua lulus</w:t>
             </w:r>
           </w:p>
         </w:tc>
@@ -8387,7 +8387,7 @@
                 <w:sz w:val="19"/>
                 <w:szCs w:val="19"/>
               </w:rPr>
-              <w:t xml:space="preserve">79 test PHPUnit</w:t>
+              <w:t xml:space="preserve">80 test PHPUnit</w:t>
             </w:r>
           </w:p>
         </w:tc>
@@ -9807,7 +9807,7 @@
         <w:t xml:space="preserve">bootstrap/app.php</w:t>
       </w:r>
       <w:r>
-        <w:t xml:space="preserve"> mengembalikan pengguna ke form dengan pesan jelas, dan penyebab aslinya dicatat ke log dalam satu baris pendek berawalan "Gambar gagal disimpan:" (di Vercel: menu Logs, cari kata itu).</w:t>
+        <w:t xml:space="preserve"> mengembalikan pengguna ke form dengan pesan jelas, dan penyebab aslinya dicatat ke log dalam satu baris pendek berawalan "Gambar gagal disimpan:" (di Vercel: menu Logs, cari kata itu). Bila yang mengunggah adalah Admin, penyebab singkat itu juga ditampilkan langsung di pesan error.</w:t>
       </w:r>
     </w:p>
     <w:p>
@@ -14208,7 +14208,7 @@
           <w:b/>
           <w:bCs/>
         </w:rPr>
-        <w:t xml:space="preserve">79 passed (274 assertions)</w:t>
+        <w:t xml:space="preserve">80 passed (276 assertions)</w:t>
       </w:r>
       <w:r>
         <w:t xml:space="preserve">.</w:t>
@@ -15547,7 +15547,7 @@
                 <w:sz w:val="19"/>
                 <w:szCs w:val="19"/>
               </w:rPr>
-              <w:t xml:space="preserve">4</w:t>
+              <w:t xml:space="preserve">5</w:t>
             </w:r>
           </w:p>
         </w:tc>
@@ -15573,7 +15573,7 @@
                 <w:sz w:val="19"/>
                 <w:szCs w:val="19"/>
               </w:rPr>
-              <w:t xml:space="preserve">Penyimpanan gambar gagal (profil, barang, barang keluar): kembali ke form dengan pesan, bukan error 500, data tidak tersimpan; penyebab dicatat dalam satu baris log pendek</w:t>
+              <w:t xml:space="preserve">Penyimpanan gambar gagal (profil, barang, barang keluar): kembali ke form dengan pesan, bukan error 500, data tidak tersimpan; penyebab dicatat dalam satu baris log pendek dan ditampilkan untuk Admin</w:t>
             </w:r>
           </w:p>
         </w:tc>
@@ -18054,7 +18054,7 @@
                 <w:sz w:val="19"/>
                 <w:szCs w:val="19"/>
               </w:rPr>
-              <w:t xml:space="preserve">79 test PHPUnit unit dan fitur (Bagian 10)</w:t>
+              <w:t xml:space="preserve">80 test PHPUnit unit dan fitur (Bagian 10)</w:t>
             </w:r>
           </w:p>
         </w:tc>
@@ -18263,7 +18263,7 @@
         <w:t xml:space="preserve">php artisan test</w:t>
       </w:r>
       <w:r>
-        <w:t xml:space="preserve"> → 79 test lulus.</w:t>
+        <w:t xml:space="preserve"> → 80 test lulus.</w:t>
       </w:r>
     </w:p>
     <w:p>

</xml_diff>

<commit_message>
Tambah lisensi MIT, daftar versi alat, dan rapikan pesan gagal simpan gambar
</commit_message>
<xml_diff>
--- a/dokumen/02_DOKUMENTASI_PROGRAM.docx
+++ b/dokumen/02_DOKUMENTASI_PROGRAM.docx
@@ -329,7 +329,7 @@
                 <w:sz w:val="19"/>
                 <w:szCs w:val="19"/>
               </w:rPr>
-              <w:t xml:space="preserve">Laravel 12 (PHP 8.2)</w:t>
+              <w:t xml:space="preserve">Laravel 12.69.2 (PHP 8.2.12)</w:t>
             </w:r>
           </w:p>
         </w:tc>
@@ -386,7 +386,7 @@
                 <w:sz w:val="19"/>
                 <w:szCs w:val="19"/>
               </w:rPr>
-              <w:t xml:space="preserve">MySQL / MariaDB (XAMPP) untuk lokal; PostgreSQL (Supabase) untuk versi online</w:t>
+              <w:t xml:space="preserve">MariaDB 10.4.32 (XAMPP) untuk lokal; PostgreSQL 17.11 (Supabase) untuk versi online</w:t>
             </w:r>
           </w:p>
         </w:tc>
@@ -516,7 +516,7 @@
                 <w:sz w:val="19"/>
                 <w:szCs w:val="19"/>
               </w:rPr>
-              <w:t xml:space="preserve">Blade + Tailwind CSS 4 (dibuild dengan Vite), responsif untuk komputer dan HP</w:t>
+              <w:t xml:space="preserve">Blade + Tailwind CSS 4.3.3 (dibuild dengan Vite 7.3.6) dan Hotwire Turbo 8, responsif untuk komputer dan HP</w:t>
             </w:r>
           </w:p>
         </w:tc>
@@ -547,6 +547,63 @@
                 <w:sz w:val="19"/>
                 <w:szCs w:val="19"/>
               </w:rPr>
+              <w:t xml:space="preserve">Editor</w:t>
+            </w:r>
+          </w:p>
+        </w:tc>
+        <w:tc>
+          <w:tcPr>
+            <w:tcW w:type="dxa" w:w="7414"/>
+            <w:tcBorders>
+              <w:top w:val="single" w:color="BFBFBF" w:sz="4"/>
+              <w:left w:val="single" w:color="BFBFBF" w:sz="4"/>
+              <w:bottom w:val="single" w:color="BFBFBF" w:sz="4"/>
+              <w:right w:val="single" w:color="BFBFBF" w:sz="4"/>
+            </w:tcBorders>
+            <w:tcMar>
+              <w:top w:type="dxa" w:w="60"/>
+              <w:left w:type="dxa" w:w="100"/>
+              <w:bottom w:type="dxa" w:w="60"/>
+              <w:right w:type="dxa" w:w="100"/>
+            </w:tcMar>
+          </w:tcPr>
+          <w:p>
+            <w:r>
+              <w:rPr>
+                <w:sz w:val="19"/>
+                <w:szCs w:val="19"/>
+              </w:rPr>
+              <w:t xml:space="preserve">Antigravity IDE 2.5.5</w:t>
+            </w:r>
+          </w:p>
+        </w:tc>
+      </w:tr>
+      <w:tr>
+        <w:trPr>
+          <w:tblHeader w:val="off"/>
+        </w:trPr>
+        <w:tc>
+          <w:tcPr>
+            <w:tcW w:type="dxa" w:w="2224"/>
+            <w:tcBorders>
+              <w:top w:val="single" w:color="BFBFBF" w:sz="4"/>
+              <w:left w:val="single" w:color="BFBFBF" w:sz="4"/>
+              <w:bottom w:val="single" w:color="BFBFBF" w:sz="4"/>
+              <w:right w:val="single" w:color="BFBFBF" w:sz="4"/>
+            </w:tcBorders>
+            <w:tcMar>
+              <w:top w:type="dxa" w:w="60"/>
+              <w:left w:type="dxa" w:w="100"/>
+              <w:bottom w:type="dxa" w:w="60"/>
+              <w:right w:type="dxa" w:w="100"/>
+            </w:tcMar>
+          </w:tcPr>
+          <w:p>
+            <w:r>
+              <w:rPr>
+                <w:sz w:val="19"/>
+                <w:szCs w:val="19"/>
+              </w:rPr>
               <w:t xml:space="preserve">Pengujian</w:t>
             </w:r>
           </w:p>
@@ -573,7 +630,7 @@
                 <w:sz w:val="19"/>
                 <w:szCs w:val="19"/>
               </w:rPr>
-              <w:t xml:space="preserve">PHPUnit 11 — 80 test, 276 assertion, semua lulus</w:t>
+              <w:t xml:space="preserve">PHPUnit 11.5.56 — 80 test, 275 assertion, semua lulus</w:t>
             </w:r>
           </w:p>
         </w:tc>
@@ -752,37 +809,37 @@
         </w:p>
         <w:p>
           <w:pPr>
-            <w:pStyle w:val="TOC1"/>
-            <w:tabs>
-              <w:tab w:val="right" w:pos="9638" w:leader="dot"/>
-            </w:tabs>
-          </w:pPr>
-          <w:hyperlink w:history="1" w:anchor="_Toc5">
-            <w:r>
-              <w:t xml:space="preserve">3. Spesifikasi Program</w:t>
-            </w:r>
-            <w:r>
-              <w:tab/>
-            </w:r>
-            <w:r>
-              <w:fldChar w:fldCharType="begin" w:dirty="true"/>
-              <w:instrText xml:space="preserve">PAGEREF _Toc5 \h</w:instrText>
-              <w:fldChar w:fldCharType="separate"/>
-              <w:fldChar w:fldCharType="end"/>
-            </w:r>
-          </w:hyperlink>
-        </w:p>
-        <w:p>
-          <w:pPr>
             <w:pStyle w:val="TOC2"/>
             <w:tabs>
               <w:tab w:val="right" w:pos="9638" w:leader="dot"/>
             </w:tabs>
             <w:ind w:left="220"/>
           </w:pPr>
+          <w:hyperlink w:history="1" w:anchor="_Toc5">
+            <w:r>
+              <w:t xml:space="preserve">2.1 Versi Alat dan Teknologi yang Digunakan</w:t>
+            </w:r>
+            <w:r>
+              <w:tab/>
+            </w:r>
+            <w:r>
+              <w:fldChar w:fldCharType="begin" w:dirty="true"/>
+              <w:instrText xml:space="preserve">PAGEREF _Toc5 \h</w:instrText>
+              <w:fldChar w:fldCharType="separate"/>
+              <w:fldChar w:fldCharType="end"/>
+            </w:r>
+          </w:hyperlink>
+        </w:p>
+        <w:p>
+          <w:pPr>
+            <w:pStyle w:val="TOC1"/>
+            <w:tabs>
+              <w:tab w:val="right" w:pos="9638" w:leader="dot"/>
+            </w:tabs>
+          </w:pPr>
           <w:hyperlink w:history="1" w:anchor="_Toc6">
             <w:r>
-              <w:t xml:space="preserve">3.1 Hak Akses per Role</w:t>
+              <w:t xml:space="preserve">3. Spesifikasi Program</w:t>
             </w:r>
             <w:r>
               <w:tab/>
@@ -805,7 +862,7 @@
           </w:pPr>
           <w:hyperlink w:history="1" w:anchor="_Toc7">
             <w:r>
-              <w:t xml:space="preserve">3.2 Aturan Bisnis dan Validasi</w:t>
+              <w:t xml:space="preserve">3.1 Hak Akses per Role</w:t>
             </w:r>
             <w:r>
               <w:tab/>
@@ -828,7 +885,7 @@
           </w:pPr>
           <w:hyperlink w:history="1" w:anchor="_Toc8">
             <w:r>
-              <w:t xml:space="preserve">3.3 Alur Barang Keluar</w:t>
+              <w:t xml:space="preserve">3.2 Aturan Bisnis dan Validasi</w:t>
             </w:r>
             <w:r>
               <w:tab/>
@@ -851,7 +908,7 @@
           </w:pPr>
           <w:hyperlink w:history="1" w:anchor="_Toc9">
             <w:r>
-              <w:t xml:space="preserve">3.4 Batasan Sistem</w:t>
+              <w:t xml:space="preserve">3.3 Alur Barang Keluar</w:t>
             </w:r>
             <w:r>
               <w:tab/>
@@ -866,14 +923,15 @@
         </w:p>
         <w:p>
           <w:pPr>
-            <w:pStyle w:val="TOC1"/>
+            <w:pStyle w:val="TOC2"/>
             <w:tabs>
               <w:tab w:val="right" w:pos="9638" w:leader="dot"/>
             </w:tabs>
+            <w:ind w:left="220"/>
           </w:pPr>
           <w:hyperlink w:history="1" w:anchor="_Toc10">
             <w:r>
-              <w:t xml:space="preserve">4. Database</w:t>
+              <w:t xml:space="preserve">3.4 Batasan Sistem</w:t>
             </w:r>
             <w:r>
               <w:tab/>
@@ -895,7 +953,7 @@
           </w:pPr>
           <w:hyperlink w:history="1" w:anchor="_Toc11">
             <w:r>
-              <w:t xml:space="preserve">5. Struktur Program (MVC)</w:t>
+              <w:t xml:space="preserve">4. Database</w:t>
             </w:r>
             <w:r>
               <w:tab/>
@@ -917,7 +975,7 @@
           </w:pPr>
           <w:hyperlink w:history="1" w:anchor="_Toc12">
             <w:r>
-              <w:t xml:space="preserve">6. Desain Antarmuka</w:t>
+              <w:t xml:space="preserve">5. Struktur Program (MVC)</w:t>
             </w:r>
             <w:r>
               <w:tab/>
@@ -939,7 +997,7 @@
           </w:pPr>
           <w:hyperlink w:history="1" w:anchor="_Toc13">
             <w:r>
-              <w:t xml:space="preserve">7. Penjelasan Kode Penting</w:t>
+              <w:t xml:space="preserve">6. Desain Antarmuka</w:t>
             </w:r>
             <w:r>
               <w:tab/>
@@ -954,15 +1012,14 @@
         </w:p>
         <w:p>
           <w:pPr>
-            <w:pStyle w:val="TOC2"/>
+            <w:pStyle w:val="TOC1"/>
             <w:tabs>
               <w:tab w:val="right" w:pos="9638" w:leader="dot"/>
             </w:tabs>
-            <w:ind w:left="220"/>
           </w:pPr>
           <w:hyperlink w:history="1" w:anchor="_Toc14">
             <w:r>
-              <w:t xml:space="preserve">7.1 Login — AuthController::login()</w:t>
+              <w:t xml:space="preserve">7. Penjelasan Kode Penting</w:t>
             </w:r>
             <w:r>
               <w:tab/>
@@ -985,7 +1042,7 @@
           </w:pPr>
           <w:hyperlink w:history="1" w:anchor="_Toc15">
             <w:r>
-              <w:t xml:space="preserve">7.2 Hak Akses — CekRole::handle()</w:t>
+              <w:t xml:space="preserve">7.1 Login — AuthController::login()</w:t>
             </w:r>
             <w:r>
               <w:tab/>
@@ -1008,7 +1065,7 @@
           </w:pPr>
           <w:hyperlink w:history="1" w:anchor="_Toc16">
             <w:r>
-              <w:t xml:space="preserve">7.3 Kode Barang Otomatis — Barang::generateKode()</w:t>
+              <w:t xml:space="preserve">7.2 Hak Akses — CekRole::handle()</w:t>
             </w:r>
             <w:r>
               <w:tab/>
@@ -1031,7 +1088,7 @@
           </w:pPr>
           <w:hyperlink w:history="1" w:anchor="_Toc17">
             <w:r>
-              <w:t xml:space="preserve">7.4 Stok — StokService</w:t>
+              <w:t xml:space="preserve">7.3 Kode Barang Otomatis — Barang::generateKode()</w:t>
             </w:r>
             <w:r>
               <w:tab/>
@@ -1054,7 +1111,7 @@
           </w:pPr>
           <w:hyperlink w:history="1" w:anchor="_Toc18">
             <w:r>
-              <w:t xml:space="preserve">7.5 Verifikasi — BarangKeluarController::setujui() dan tolak()</w:t>
+              <w:t xml:space="preserve">7.4 Stok — StokService</w:t>
             </w:r>
             <w:r>
               <w:tab/>
@@ -1077,7 +1134,7 @@
           </w:pPr>
           <w:hyperlink w:history="1" w:anchor="_Toc19">
             <w:r>
-              <w:t xml:space="preserve">7.6 Validasi — Form Request</w:t>
+              <w:t xml:space="preserve">7.5 Verifikasi — BarangKeluarController::setujui() dan tolak()</w:t>
             </w:r>
             <w:r>
               <w:tab/>
@@ -1100,7 +1157,7 @@
           </w:pPr>
           <w:hyperlink w:history="1" w:anchor="_Toc20">
             <w:r>
-              <w:t xml:space="preserve">7.7 Unggah Gambar — GambarService</w:t>
+              <w:t xml:space="preserve">7.6 Validasi — Form Request</w:t>
             </w:r>
             <w:r>
               <w:tab/>
@@ -1123,7 +1180,7 @@
           </w:pPr>
           <w:hyperlink w:history="1" w:anchor="_Toc21">
             <w:r>
-              <w:t xml:space="preserve">7.8 Suasana Login dan Audio — App\Support\Suasana</w:t>
+              <w:t xml:space="preserve">7.7 Unggah Gambar — GambarService</w:t>
             </w:r>
             <w:r>
               <w:tab/>
@@ -1146,7 +1203,7 @@
           </w:pPr>
           <w:hyperlink w:history="1" w:anchor="_Toc22">
             <w:r>
-              <w:t xml:space="preserve">7.9 Mode Terang / Gelap — resources/js/tema.js</w:t>
+              <w:t xml:space="preserve">7.8 Suasana Login dan Audio — App\Support\Suasana</w:t>
             </w:r>
             <w:r>
               <w:tab/>
@@ -1169,7 +1226,7 @@
           </w:pPr>
           <w:hyperlink w:history="1" w:anchor="_Toc23">
             <w:r>
-              <w:t xml:space="preserve">7.10 Musik Bad Apple!! — resources/js/musik.js</w:t>
+              <w:t xml:space="preserve">7.9 Mode Terang / Gelap — resources/js/tema.js</w:t>
             </w:r>
             <w:r>
               <w:tab/>
@@ -1192,7 +1249,7 @@
           </w:pPr>
           <w:hyperlink w:history="1" w:anchor="_Toc24">
             <w:r>
-              <w:t xml:space="preserve">7.11 Tanpa Pindah Halaman dan Popup — Turbo</w:t>
+              <w:t xml:space="preserve">7.10 Musik Bad Apple!! — resources/js/musik.js</w:t>
             </w:r>
             <w:r>
               <w:tab/>
@@ -1215,7 +1272,7 @@
           </w:pPr>
           <w:hyperlink w:history="1" w:anchor="_Toc25">
             <w:r>
-              <w:t xml:space="preserve">7.12 Penanganan Error 419 — bootstrap/app.php</w:t>
+              <w:t xml:space="preserve">7.11 Tanpa Pindah Halaman dan Popup — Turbo</w:t>
             </w:r>
             <w:r>
               <w:tab/>
@@ -1230,14 +1287,15 @@
         </w:p>
         <w:p>
           <w:pPr>
-            <w:pStyle w:val="TOC1"/>
+            <w:pStyle w:val="TOC2"/>
             <w:tabs>
               <w:tab w:val="right" w:pos="9638" w:leader="dot"/>
             </w:tabs>
+            <w:ind w:left="220"/>
           </w:pPr>
           <w:hyperlink w:history="1" w:anchor="_Toc26">
             <w:r>
-              <w:t xml:space="preserve">8. Keamanan</w:t>
+              <w:t xml:space="preserve">7.12 Penanganan Error 419 — bootstrap/app.php</w:t>
             </w:r>
             <w:r>
               <w:tab/>
@@ -1259,7 +1317,7 @@
           </w:pPr>
           <w:hyperlink w:history="1" w:anchor="_Toc27">
             <w:r>
-              <w:t xml:space="preserve">9. Debugging</w:t>
+              <w:t xml:space="preserve">8. Keamanan</w:t>
             </w:r>
             <w:r>
               <w:tab/>
@@ -1274,15 +1332,14 @@
         </w:p>
         <w:p>
           <w:pPr>
-            <w:pStyle w:val="TOC2"/>
+            <w:pStyle w:val="TOC1"/>
             <w:tabs>
               <w:tab w:val="right" w:pos="9638" w:leader="dot"/>
             </w:tabs>
-            <w:ind w:left="220"/>
           </w:pPr>
           <w:hyperlink w:history="1" w:anchor="_Toc28">
             <w:r>
-              <w:t xml:space="preserve">9.1 Bug yang Ditemukan dan Perbaikannya</w:t>
+              <w:t xml:space="preserve">9. Debugging</w:t>
             </w:r>
             <w:r>
               <w:tab/>
@@ -1305,7 +1362,7 @@
           </w:pPr>
           <w:hyperlink w:history="1" w:anchor="_Toc29">
             <w:r>
-              <w:t xml:space="preserve">9.2 Teknik Debugging</w:t>
+              <w:t xml:space="preserve">9.1 Bug yang Ditemukan dan Perbaikannya</w:t>
             </w:r>
             <w:r>
               <w:tab/>
@@ -1320,14 +1377,15 @@
         </w:p>
         <w:p>
           <w:pPr>
-            <w:pStyle w:val="TOC1"/>
+            <w:pStyle w:val="TOC2"/>
             <w:tabs>
               <w:tab w:val="right" w:pos="9638" w:leader="dot"/>
             </w:tabs>
+            <w:ind w:left="220"/>
           </w:pPr>
           <w:hyperlink w:history="1" w:anchor="_Toc30">
             <w:r>
-              <w:t xml:space="preserve">10. Pengujian Unit Program</w:t>
+              <w:t xml:space="preserve">9.2 Teknik Debugging</w:t>
             </w:r>
             <w:r>
               <w:tab/>
@@ -1349,7 +1407,7 @@
           </w:pPr>
           <w:hyperlink w:history="1" w:anchor="_Toc31">
             <w:r>
-              <w:t xml:space="preserve">11. Pemetaan Unit Kompetensi</w:t>
+              <w:t xml:space="preserve">10. Pengujian Unit Program</w:t>
             </w:r>
             <w:r>
               <w:tab/>
@@ -1371,7 +1429,7 @@
           </w:pPr>
           <w:hyperlink w:history="1" w:anchor="_Toc32">
             <w:r>
-              <w:t xml:space="preserve">12. Skenario Demo</w:t>
+              <w:t xml:space="preserve">11. Pemetaan Unit Kompetensi</w:t>
             </w:r>
             <w:r>
               <w:tab/>
@@ -1379,6 +1437,28 @@
             <w:r>
               <w:fldChar w:fldCharType="begin" w:dirty="true"/>
               <w:instrText xml:space="preserve">PAGEREF _Toc32 \h</w:instrText>
+              <w:fldChar w:fldCharType="separate"/>
+              <w:fldChar w:fldCharType="end"/>
+            </w:r>
+          </w:hyperlink>
+        </w:p>
+        <w:p>
+          <w:pPr>
+            <w:pStyle w:val="TOC1"/>
+            <w:tabs>
+              <w:tab w:val="right" w:pos="9638" w:leader="dot"/>
+            </w:tabs>
+          </w:pPr>
+          <w:hyperlink w:history="1" w:anchor="_Toc33">
+            <w:r>
+              <w:t xml:space="preserve">12. Skenario Demo</w:t>
+            </w:r>
+            <w:r>
+              <w:tab/>
+            </w:r>
+            <w:r>
+              <w:fldChar w:fldCharType="begin" w:dirty="true"/>
+              <w:instrText xml:space="preserve">PAGEREF _Toc33 \h</w:instrText>
               <w:fldChar w:fldCharType="separate"/>
               <w:fldChar w:fldCharType="end"/>
             </w:r>
@@ -3412,23 +3492,3349 @@
     </w:p>
     <w:p>
       <w:pPr>
+        <w:pStyle w:val="Heading2"/>
+      </w:pPr>
+      <w:bookmarkStart w:name="_Toc5" w:id="5"/>
+      <w:r>
+        <w:t xml:space="preserve">2.1 Versi Alat dan Teknologi yang Digunakan</w:t>
+      </w:r>
+      <w:bookmarkEnd w:id="5"/>
+    </w:p>
+    <w:p>
+      <w:r>
+        <w:t xml:space="preserve">Versi di bawah ini dibaca langsung dari laptop pengembang dan dari proyek (</w:t>
+      </w:r>
+      <w:r>
+        <w:rPr>
+          <w:rFonts w:ascii="Consolas" w:cs="Consolas" w:eastAsia="Consolas" w:hAnsi="Consolas"/>
+          <w:color w:val="1F4E79"/>
+          <w:sz w:val="20"/>
+          <w:szCs w:val="20"/>
+        </w:rPr>
+        <w:t xml:space="preserve">composer.json</w:t>
+      </w:r>
+      <w:r>
+        <w:t xml:space="preserve">, </w:t>
+      </w:r>
+      <w:r>
+        <w:rPr>
+          <w:rFonts w:ascii="Consolas" w:cs="Consolas" w:eastAsia="Consolas" w:hAnsi="Consolas"/>
+          <w:color w:val="1F4E79"/>
+          <w:sz w:val="20"/>
+          <w:szCs w:val="20"/>
+        </w:rPr>
+        <w:t xml:space="preserve">package.json</w:t>
+      </w:r>
+      <w:r>
+        <w:t xml:space="preserve">, </w:t>
+      </w:r>
+      <w:r>
+        <w:rPr>
+          <w:rFonts w:ascii="Consolas" w:cs="Consolas" w:eastAsia="Consolas" w:hAnsi="Consolas"/>
+          <w:color w:val="1F4E79"/>
+          <w:sz w:val="20"/>
+          <w:szCs w:val="20"/>
+        </w:rPr>
+        <w:t xml:space="preserve">vercel.json</w:t>
+      </w:r>
+      <w:r>
+        <w:t xml:space="preserve">) pada 12 Oktober 2026.</w:t>
+      </w:r>
+    </w:p>
+    <w:p>
+      <w:r>
+        <w:rPr>
+          <w:b/>
+          <w:bCs/>
+        </w:rPr>
+        <w:t xml:space="preserve">a. Perangkat dan editor</w:t>
+      </w:r>
+    </w:p>
+    <w:tbl>
+      <w:tblPr>
+        <w:tblW w:type="dxa" w:w="9638"/>
+        <w:tblBorders>
+          <w:top w:val="single" w:color="auto" w:sz="4"/>
+          <w:left w:val="single" w:color="auto" w:sz="4"/>
+          <w:bottom w:val="single" w:color="auto" w:sz="4"/>
+          <w:right w:val="single" w:color="auto" w:sz="4"/>
+          <w:insideH w:val="single" w:color="auto" w:sz="4"/>
+          <w:insideV w:val="single" w:color="auto" w:sz="4"/>
+        </w:tblBorders>
+      </w:tblPr>
+      <w:tblGrid>
+        <w:gridCol w:w="1225"/>
+        <w:gridCol w:w="3512"/>
+        <w:gridCol w:w="4901"/>
+      </w:tblGrid>
+      <w:tr>
+        <w:trPr>
+          <w:tblHeader/>
+        </w:trPr>
+        <w:tc>
+          <w:tcPr>
+            <w:tcW w:type="dxa" w:w="1225"/>
+            <w:tcBorders>
+              <w:top w:val="single" w:color="BFBFBF" w:sz="4"/>
+              <w:left w:val="single" w:color="BFBFBF" w:sz="4"/>
+              <w:bottom w:val="single" w:color="BFBFBF" w:sz="4"/>
+              <w:right w:val="single" w:color="BFBFBF" w:sz="4"/>
+            </w:tcBorders>
+            <w:shd w:fill="1F4E79" w:color="auto" w:val="clear"/>
+            <w:tcMar>
+              <w:top w:type="dxa" w:w="60"/>
+              <w:left w:type="dxa" w:w="100"/>
+              <w:bottom w:type="dxa" w:w="60"/>
+              <w:right w:type="dxa" w:w="100"/>
+            </w:tcMar>
+          </w:tcPr>
+          <w:p>
+            <w:r>
+              <w:rPr>
+                <w:b/>
+                <w:bCs/>
+                <w:color w:val="FFFFFF"/>
+                <w:sz w:val="19"/>
+                <w:szCs w:val="19"/>
+              </w:rPr>
+              <w:t xml:space="preserve">Alat</w:t>
+            </w:r>
+          </w:p>
+        </w:tc>
+        <w:tc>
+          <w:tcPr>
+            <w:tcW w:type="dxa" w:w="3512"/>
+            <w:tcBorders>
+              <w:top w:val="single" w:color="BFBFBF" w:sz="4"/>
+              <w:left w:val="single" w:color="BFBFBF" w:sz="4"/>
+              <w:bottom w:val="single" w:color="BFBFBF" w:sz="4"/>
+              <w:right w:val="single" w:color="BFBFBF" w:sz="4"/>
+            </w:tcBorders>
+            <w:shd w:fill="1F4E79" w:color="auto" w:val="clear"/>
+            <w:tcMar>
+              <w:top w:type="dxa" w:w="60"/>
+              <w:left w:type="dxa" w:w="100"/>
+              <w:bottom w:type="dxa" w:w="60"/>
+              <w:right w:type="dxa" w:w="100"/>
+            </w:tcMar>
+          </w:tcPr>
+          <w:p>
+            <w:r>
+              <w:rPr>
+                <w:b/>
+                <w:bCs/>
+                <w:color w:val="FFFFFF"/>
+                <w:sz w:val="19"/>
+                <w:szCs w:val="19"/>
+              </w:rPr>
+              <w:t xml:space="preserve">Versi</w:t>
+            </w:r>
+          </w:p>
+        </w:tc>
+        <w:tc>
+          <w:tcPr>
+            <w:tcW w:type="dxa" w:w="4901"/>
+            <w:tcBorders>
+              <w:top w:val="single" w:color="BFBFBF" w:sz="4"/>
+              <w:left w:val="single" w:color="BFBFBF" w:sz="4"/>
+              <w:bottom w:val="single" w:color="BFBFBF" w:sz="4"/>
+              <w:right w:val="single" w:color="BFBFBF" w:sz="4"/>
+            </w:tcBorders>
+            <w:shd w:fill="1F4E79" w:color="auto" w:val="clear"/>
+            <w:tcMar>
+              <w:top w:type="dxa" w:w="60"/>
+              <w:left w:type="dxa" w:w="100"/>
+              <w:bottom w:type="dxa" w:w="60"/>
+              <w:right w:type="dxa" w:w="100"/>
+            </w:tcMar>
+          </w:tcPr>
+          <w:p>
+            <w:r>
+              <w:rPr>
+                <w:b/>
+                <w:bCs/>
+                <w:color w:val="FFFFFF"/>
+                <w:sz w:val="19"/>
+                <w:szCs w:val="19"/>
+              </w:rPr>
+              <w:t xml:space="preserve">Keterangan</w:t>
+            </w:r>
+          </w:p>
+        </w:tc>
+      </w:tr>
+      <w:tr>
+        <w:trPr>
+          <w:tblHeader w:val="off"/>
+        </w:trPr>
+        <w:tc>
+          <w:tcPr>
+            <w:tcW w:type="dxa" w:w="1225"/>
+            <w:tcBorders>
+              <w:top w:val="single" w:color="BFBFBF" w:sz="4"/>
+              <w:left w:val="single" w:color="BFBFBF" w:sz="4"/>
+              <w:bottom w:val="single" w:color="BFBFBF" w:sz="4"/>
+              <w:right w:val="single" w:color="BFBFBF" w:sz="4"/>
+            </w:tcBorders>
+            <w:tcMar>
+              <w:top w:type="dxa" w:w="60"/>
+              <w:left w:type="dxa" w:w="100"/>
+              <w:bottom w:type="dxa" w:w="60"/>
+              <w:right w:type="dxa" w:w="100"/>
+            </w:tcMar>
+          </w:tcPr>
+          <w:p>
+            <w:r>
+              <w:rPr>
+                <w:sz w:val="19"/>
+                <w:szCs w:val="19"/>
+              </w:rPr>
+              <w:t xml:space="preserve">Sistem operasi</w:t>
+            </w:r>
+          </w:p>
+        </w:tc>
+        <w:tc>
+          <w:tcPr>
+            <w:tcW w:type="dxa" w:w="3512"/>
+            <w:tcBorders>
+              <w:top w:val="single" w:color="BFBFBF" w:sz="4"/>
+              <w:left w:val="single" w:color="BFBFBF" w:sz="4"/>
+              <w:bottom w:val="single" w:color="BFBFBF" w:sz="4"/>
+              <w:right w:val="single" w:color="BFBFBF" w:sz="4"/>
+            </w:tcBorders>
+            <w:tcMar>
+              <w:top w:type="dxa" w:w="60"/>
+              <w:left w:type="dxa" w:w="100"/>
+              <w:bottom w:type="dxa" w:w="60"/>
+              <w:right w:type="dxa" w:w="100"/>
+            </w:tcMar>
+          </w:tcPr>
+          <w:p>
+            <w:r>
+              <w:rPr>
+                <w:sz w:val="19"/>
+                <w:szCs w:val="19"/>
+              </w:rPr>
+              <w:t xml:space="preserve">Windows 11 Pro 25H2 (build 10.0.26200, x64)</w:t>
+            </w:r>
+          </w:p>
+        </w:tc>
+        <w:tc>
+          <w:tcPr>
+            <w:tcW w:type="dxa" w:w="4901"/>
+            <w:tcBorders>
+              <w:top w:val="single" w:color="BFBFBF" w:sz="4"/>
+              <w:left w:val="single" w:color="BFBFBF" w:sz="4"/>
+              <w:bottom w:val="single" w:color="BFBFBF" w:sz="4"/>
+              <w:right w:val="single" w:color="BFBFBF" w:sz="4"/>
+            </w:tcBorders>
+            <w:tcMar>
+              <w:top w:type="dxa" w:w="60"/>
+              <w:left w:type="dxa" w:w="100"/>
+              <w:bottom w:type="dxa" w:w="60"/>
+              <w:right w:type="dxa" w:w="100"/>
+            </w:tcMar>
+          </w:tcPr>
+          <w:p>
+            <w:r>
+              <w:rPr>
+                <w:sz w:val="19"/>
+                <w:szCs w:val="19"/>
+              </w:rPr>
+              <w:t xml:space="preserve">Laptop pengembang</w:t>
+            </w:r>
+          </w:p>
+        </w:tc>
+      </w:tr>
+      <w:tr>
+        <w:trPr>
+          <w:tblHeader w:val="off"/>
+        </w:trPr>
+        <w:tc>
+          <w:tcPr>
+            <w:tcW w:type="dxa" w:w="1225"/>
+            <w:tcBorders>
+              <w:top w:val="single" w:color="BFBFBF" w:sz="4"/>
+              <w:left w:val="single" w:color="BFBFBF" w:sz="4"/>
+              <w:bottom w:val="single" w:color="BFBFBF" w:sz="4"/>
+              <w:right w:val="single" w:color="BFBFBF" w:sz="4"/>
+            </w:tcBorders>
+            <w:tcMar>
+              <w:top w:type="dxa" w:w="60"/>
+              <w:left w:type="dxa" w:w="100"/>
+              <w:bottom w:type="dxa" w:w="60"/>
+              <w:right w:type="dxa" w:w="100"/>
+            </w:tcMar>
+          </w:tcPr>
+          <w:p>
+            <w:r>
+              <w:rPr>
+                <w:sz w:val="19"/>
+                <w:szCs w:val="19"/>
+              </w:rPr>
+              <w:t xml:space="preserve">Antigravity IDE</w:t>
+            </w:r>
+          </w:p>
+        </w:tc>
+        <w:tc>
+          <w:tcPr>
+            <w:tcW w:type="dxa" w:w="3512"/>
+            <w:tcBorders>
+              <w:top w:val="single" w:color="BFBFBF" w:sz="4"/>
+              <w:left w:val="single" w:color="BFBFBF" w:sz="4"/>
+              <w:bottom w:val="single" w:color="BFBFBF" w:sz="4"/>
+              <w:right w:val="single" w:color="BFBFBF" w:sz="4"/>
+            </w:tcBorders>
+            <w:tcMar>
+              <w:top w:type="dxa" w:w="60"/>
+              <w:left w:type="dxa" w:w="100"/>
+              <w:bottom w:type="dxa" w:w="60"/>
+              <w:right w:type="dxa" w:w="100"/>
+            </w:tcMar>
+          </w:tcPr>
+          <w:p>
+            <w:r>
+              <w:rPr>
+                <w:sz w:val="19"/>
+                <w:szCs w:val="19"/>
+              </w:rPr>
+              <w:t xml:space="preserve">2.5.5</w:t>
+            </w:r>
+          </w:p>
+        </w:tc>
+        <w:tc>
+          <w:tcPr>
+            <w:tcW w:type="dxa" w:w="4901"/>
+            <w:tcBorders>
+              <w:top w:val="single" w:color="BFBFBF" w:sz="4"/>
+              <w:left w:val="single" w:color="BFBFBF" w:sz="4"/>
+              <w:bottom w:val="single" w:color="BFBFBF" w:sz="4"/>
+              <w:right w:val="single" w:color="BFBFBF" w:sz="4"/>
+            </w:tcBorders>
+            <w:tcMar>
+              <w:top w:type="dxa" w:w="60"/>
+              <w:left w:type="dxa" w:w="100"/>
+              <w:bottom w:type="dxa" w:w="60"/>
+              <w:right w:type="dxa" w:w="100"/>
+            </w:tcMar>
+          </w:tcPr>
+          <w:p>
+            <w:r>
+              <w:rPr>
+                <w:sz w:val="19"/>
+                <w:szCs w:val="19"/>
+              </w:rPr>
+              <w:t xml:space="preserve">Editor kode (berbasis VS Code OSS 1.107.0, Electron 39.2.3, Chromium 142.0.7444.175, Node.js 22.21.1, V8 14.2.231.21)</w:t>
+            </w:r>
+          </w:p>
+        </w:tc>
+      </w:tr>
+      <w:tr>
+        <w:trPr>
+          <w:tblHeader w:val="off"/>
+        </w:trPr>
+        <w:tc>
+          <w:tcPr>
+            <w:tcW w:type="dxa" w:w="1225"/>
+            <w:tcBorders>
+              <w:top w:val="single" w:color="BFBFBF" w:sz="4"/>
+              <w:left w:val="single" w:color="BFBFBF" w:sz="4"/>
+              <w:bottom w:val="single" w:color="BFBFBF" w:sz="4"/>
+              <w:right w:val="single" w:color="BFBFBF" w:sz="4"/>
+            </w:tcBorders>
+            <w:tcMar>
+              <w:top w:type="dxa" w:w="60"/>
+              <w:left w:type="dxa" w:w="100"/>
+              <w:bottom w:type="dxa" w:w="60"/>
+              <w:right w:type="dxa" w:w="100"/>
+            </w:tcMar>
+          </w:tcPr>
+          <w:p>
+            <w:r>
+              <w:rPr>
+                <w:sz w:val="19"/>
+                <w:szCs w:val="19"/>
+              </w:rPr>
+              <w:t xml:space="preserve">Google Chrome</w:t>
+            </w:r>
+          </w:p>
+        </w:tc>
+        <w:tc>
+          <w:tcPr>
+            <w:tcW w:type="dxa" w:w="3512"/>
+            <w:tcBorders>
+              <w:top w:val="single" w:color="BFBFBF" w:sz="4"/>
+              <w:left w:val="single" w:color="BFBFBF" w:sz="4"/>
+              <w:bottom w:val="single" w:color="BFBFBF" w:sz="4"/>
+              <w:right w:val="single" w:color="BFBFBF" w:sz="4"/>
+            </w:tcBorders>
+            <w:tcMar>
+              <w:top w:type="dxa" w:w="60"/>
+              <w:left w:type="dxa" w:w="100"/>
+              <w:bottom w:type="dxa" w:w="60"/>
+              <w:right w:type="dxa" w:w="100"/>
+            </w:tcMar>
+          </w:tcPr>
+          <w:p>
+            <w:r>
+              <w:rPr>
+                <w:sz w:val="19"/>
+                <w:szCs w:val="19"/>
+              </w:rPr>
+              <w:t xml:space="preserve">154.0.8037.98</w:t>
+            </w:r>
+          </w:p>
+        </w:tc>
+        <w:tc>
+          <w:tcPr>
+            <w:tcW w:type="dxa" w:w="4901"/>
+            <w:tcBorders>
+              <w:top w:val="single" w:color="BFBFBF" w:sz="4"/>
+              <w:left w:val="single" w:color="BFBFBF" w:sz="4"/>
+              <w:bottom w:val="single" w:color="BFBFBF" w:sz="4"/>
+              <w:right w:val="single" w:color="BFBFBF" w:sz="4"/>
+            </w:tcBorders>
+            <w:tcMar>
+              <w:top w:type="dxa" w:w="60"/>
+              <w:left w:type="dxa" w:w="100"/>
+              <w:bottom w:type="dxa" w:w="60"/>
+              <w:right w:type="dxa" w:w="100"/>
+            </w:tcMar>
+          </w:tcPr>
+          <w:p>
+            <w:r>
+              <w:rPr>
+                <w:sz w:val="19"/>
+                <w:szCs w:val="19"/>
+              </w:rPr>
+              <w:t xml:space="preserve">Browser untuk uji tampilan</w:t>
+            </w:r>
+          </w:p>
+        </w:tc>
+      </w:tr>
+      <w:tr>
+        <w:trPr>
+          <w:tblHeader w:val="off"/>
+        </w:trPr>
+        <w:tc>
+          <w:tcPr>
+            <w:tcW w:type="dxa" w:w="1225"/>
+            <w:tcBorders>
+              <w:top w:val="single" w:color="BFBFBF" w:sz="4"/>
+              <w:left w:val="single" w:color="BFBFBF" w:sz="4"/>
+              <w:bottom w:val="single" w:color="BFBFBF" w:sz="4"/>
+              <w:right w:val="single" w:color="BFBFBF" w:sz="4"/>
+            </w:tcBorders>
+            <w:tcMar>
+              <w:top w:type="dxa" w:w="60"/>
+              <w:left w:type="dxa" w:w="100"/>
+              <w:bottom w:type="dxa" w:w="60"/>
+              <w:right w:type="dxa" w:w="100"/>
+            </w:tcMar>
+          </w:tcPr>
+          <w:p>
+            <w:r>
+              <w:rPr>
+                <w:sz w:val="19"/>
+                <w:szCs w:val="19"/>
+              </w:rPr>
+              <w:t xml:space="preserve">Git</w:t>
+            </w:r>
+          </w:p>
+        </w:tc>
+        <w:tc>
+          <w:tcPr>
+            <w:tcW w:type="dxa" w:w="3512"/>
+            <w:tcBorders>
+              <w:top w:val="single" w:color="BFBFBF" w:sz="4"/>
+              <w:left w:val="single" w:color="BFBFBF" w:sz="4"/>
+              <w:bottom w:val="single" w:color="BFBFBF" w:sz="4"/>
+              <w:right w:val="single" w:color="BFBFBF" w:sz="4"/>
+            </w:tcBorders>
+            <w:tcMar>
+              <w:top w:type="dxa" w:w="60"/>
+              <w:left w:type="dxa" w:w="100"/>
+              <w:bottom w:type="dxa" w:w="60"/>
+              <w:right w:type="dxa" w:w="100"/>
+            </w:tcMar>
+          </w:tcPr>
+          <w:p>
+            <w:r>
+              <w:rPr>
+                <w:sz w:val="19"/>
+                <w:szCs w:val="19"/>
+              </w:rPr>
+              <w:t xml:space="preserve">2.55.0 (windows.4)</w:t>
+            </w:r>
+          </w:p>
+        </w:tc>
+        <w:tc>
+          <w:tcPr>
+            <w:tcW w:type="dxa" w:w="4901"/>
+            <w:tcBorders>
+              <w:top w:val="single" w:color="BFBFBF" w:sz="4"/>
+              <w:left w:val="single" w:color="BFBFBF" w:sz="4"/>
+              <w:bottom w:val="single" w:color="BFBFBF" w:sz="4"/>
+              <w:right w:val="single" w:color="BFBFBF" w:sz="4"/>
+            </w:tcBorders>
+            <w:tcMar>
+              <w:top w:type="dxa" w:w="60"/>
+              <w:left w:type="dxa" w:w="100"/>
+              <w:bottom w:type="dxa" w:w="60"/>
+              <w:right w:type="dxa" w:w="100"/>
+            </w:tcMar>
+          </w:tcPr>
+          <w:p>
+            <w:r>
+              <w:rPr>
+                <w:sz w:val="19"/>
+                <w:szCs w:val="19"/>
+              </w:rPr>
+              <w:t xml:space="preserve">Pengelolaan versi kode, terhubung ke GitHub</w:t>
+            </w:r>
+          </w:p>
+        </w:tc>
+      </w:tr>
+    </w:tbl>
+    <w:p>
+      <w:pPr>
+        <w:spacing w:after="60"/>
+      </w:pPr>
+    </w:p>
+    <w:p>
+      <w:r>
+        <w:rPr>
+          <w:b/>
+          <w:bCs/>
+        </w:rPr>
+        <w:t xml:space="preserve">b. Server lokal (XAMPP)</w:t>
+      </w:r>
+    </w:p>
+    <w:tbl>
+      <w:tblPr>
+        <w:tblW w:type="dxa" w:w="9638"/>
+        <w:tblBorders>
+          <w:top w:val="single" w:color="auto" w:sz="4"/>
+          <w:left w:val="single" w:color="auto" w:sz="4"/>
+          <w:bottom w:val="single" w:color="auto" w:sz="4"/>
+          <w:right w:val="single" w:color="auto" w:sz="4"/>
+          <w:insideH w:val="single" w:color="auto" w:sz="4"/>
+          <w:insideV w:val="single" w:color="auto" w:sz="4"/>
+        </w:tblBorders>
+      </w:tblPr>
+      <w:tblGrid>
+        <w:gridCol w:w="1902"/>
+        <w:gridCol w:w="3550"/>
+        <w:gridCol w:w="4186"/>
+      </w:tblGrid>
+      <w:tr>
+        <w:trPr>
+          <w:tblHeader/>
+        </w:trPr>
+        <w:tc>
+          <w:tcPr>
+            <w:tcW w:type="dxa" w:w="1902"/>
+            <w:tcBorders>
+              <w:top w:val="single" w:color="BFBFBF" w:sz="4"/>
+              <w:left w:val="single" w:color="BFBFBF" w:sz="4"/>
+              <w:bottom w:val="single" w:color="BFBFBF" w:sz="4"/>
+              <w:right w:val="single" w:color="BFBFBF" w:sz="4"/>
+            </w:tcBorders>
+            <w:shd w:fill="1F4E79" w:color="auto" w:val="clear"/>
+            <w:tcMar>
+              <w:top w:type="dxa" w:w="60"/>
+              <w:left w:type="dxa" w:w="100"/>
+              <w:bottom w:type="dxa" w:w="60"/>
+              <w:right w:type="dxa" w:w="100"/>
+            </w:tcMar>
+          </w:tcPr>
+          <w:p>
+            <w:r>
+              <w:rPr>
+                <w:b/>
+                <w:bCs/>
+                <w:color w:val="FFFFFF"/>
+                <w:sz w:val="19"/>
+                <w:szCs w:val="19"/>
+              </w:rPr>
+              <w:t xml:space="preserve">Alat</w:t>
+            </w:r>
+          </w:p>
+        </w:tc>
+        <w:tc>
+          <w:tcPr>
+            <w:tcW w:type="dxa" w:w="3550"/>
+            <w:tcBorders>
+              <w:top w:val="single" w:color="BFBFBF" w:sz="4"/>
+              <w:left w:val="single" w:color="BFBFBF" w:sz="4"/>
+              <w:bottom w:val="single" w:color="BFBFBF" w:sz="4"/>
+              <w:right w:val="single" w:color="BFBFBF" w:sz="4"/>
+            </w:tcBorders>
+            <w:shd w:fill="1F4E79" w:color="auto" w:val="clear"/>
+            <w:tcMar>
+              <w:top w:type="dxa" w:w="60"/>
+              <w:left w:type="dxa" w:w="100"/>
+              <w:bottom w:type="dxa" w:w="60"/>
+              <w:right w:type="dxa" w:w="100"/>
+            </w:tcMar>
+          </w:tcPr>
+          <w:p>
+            <w:r>
+              <w:rPr>
+                <w:b/>
+                <w:bCs/>
+                <w:color w:val="FFFFFF"/>
+                <w:sz w:val="19"/>
+                <w:szCs w:val="19"/>
+              </w:rPr>
+              <w:t xml:space="preserve">Versi</w:t>
+            </w:r>
+          </w:p>
+        </w:tc>
+        <w:tc>
+          <w:tcPr>
+            <w:tcW w:type="dxa" w:w="4186"/>
+            <w:tcBorders>
+              <w:top w:val="single" w:color="BFBFBF" w:sz="4"/>
+              <w:left w:val="single" w:color="BFBFBF" w:sz="4"/>
+              <w:bottom w:val="single" w:color="BFBFBF" w:sz="4"/>
+              <w:right w:val="single" w:color="BFBFBF" w:sz="4"/>
+            </w:tcBorders>
+            <w:shd w:fill="1F4E79" w:color="auto" w:val="clear"/>
+            <w:tcMar>
+              <w:top w:type="dxa" w:w="60"/>
+              <w:left w:type="dxa" w:w="100"/>
+              <w:bottom w:type="dxa" w:w="60"/>
+              <w:right w:type="dxa" w:w="100"/>
+            </w:tcMar>
+          </w:tcPr>
+          <w:p>
+            <w:r>
+              <w:rPr>
+                <w:b/>
+                <w:bCs/>
+                <w:color w:val="FFFFFF"/>
+                <w:sz w:val="19"/>
+                <w:szCs w:val="19"/>
+              </w:rPr>
+              <w:t xml:space="preserve">Keterangan</w:t>
+            </w:r>
+          </w:p>
+        </w:tc>
+      </w:tr>
+      <w:tr>
+        <w:trPr>
+          <w:tblHeader w:val="off"/>
+        </w:trPr>
+        <w:tc>
+          <w:tcPr>
+            <w:tcW w:type="dxa" w:w="1902"/>
+            <w:tcBorders>
+              <w:top w:val="single" w:color="BFBFBF" w:sz="4"/>
+              <w:left w:val="single" w:color="BFBFBF" w:sz="4"/>
+              <w:bottom w:val="single" w:color="BFBFBF" w:sz="4"/>
+              <w:right w:val="single" w:color="BFBFBF" w:sz="4"/>
+            </w:tcBorders>
+            <w:tcMar>
+              <w:top w:type="dxa" w:w="60"/>
+              <w:left w:type="dxa" w:w="100"/>
+              <w:bottom w:type="dxa" w:w="60"/>
+              <w:right w:type="dxa" w:w="100"/>
+            </w:tcMar>
+          </w:tcPr>
+          <w:p>
+            <w:r>
+              <w:rPr>
+                <w:sz w:val="19"/>
+                <w:szCs w:val="19"/>
+              </w:rPr>
+              <w:t xml:space="preserve">XAMPP</w:t>
+            </w:r>
+          </w:p>
+        </w:tc>
+        <w:tc>
+          <w:tcPr>
+            <w:tcW w:type="dxa" w:w="3550"/>
+            <w:tcBorders>
+              <w:top w:val="single" w:color="BFBFBF" w:sz="4"/>
+              <w:left w:val="single" w:color="BFBFBF" w:sz="4"/>
+              <w:bottom w:val="single" w:color="BFBFBF" w:sz="4"/>
+              <w:right w:val="single" w:color="BFBFBF" w:sz="4"/>
+            </w:tcBorders>
+            <w:tcMar>
+              <w:top w:type="dxa" w:w="60"/>
+              <w:left w:type="dxa" w:w="100"/>
+              <w:bottom w:type="dxa" w:w="60"/>
+              <w:right w:type="dxa" w:w="100"/>
+            </w:tcMar>
+          </w:tcPr>
+          <w:p>
+            <w:r>
+              <w:rPr>
+                <w:sz w:val="19"/>
+                <w:szCs w:val="19"/>
+              </w:rPr>
+              <w:t xml:space="preserve">8.2.12 (Control Panel 3.3.0)</w:t>
+            </w:r>
+          </w:p>
+        </w:tc>
+        <w:tc>
+          <w:tcPr>
+            <w:tcW w:type="dxa" w:w="4186"/>
+            <w:tcBorders>
+              <w:top w:val="single" w:color="BFBFBF" w:sz="4"/>
+              <w:left w:val="single" w:color="BFBFBF" w:sz="4"/>
+              <w:bottom w:val="single" w:color="BFBFBF" w:sz="4"/>
+              <w:right w:val="single" w:color="BFBFBF" w:sz="4"/>
+            </w:tcBorders>
+            <w:tcMar>
+              <w:top w:type="dxa" w:w="60"/>
+              <w:left w:type="dxa" w:w="100"/>
+              <w:bottom w:type="dxa" w:w="60"/>
+              <w:right w:type="dxa" w:w="100"/>
+            </w:tcMar>
+          </w:tcPr>
+          <w:p>
+            <w:r>
+              <w:rPr>
+                <w:sz w:val="19"/>
+                <w:szCs w:val="19"/>
+              </w:rPr>
+              <w:t xml:space="preserve">Paket server lokal</w:t>
+            </w:r>
+          </w:p>
+        </w:tc>
+      </w:tr>
+      <w:tr>
+        <w:trPr>
+          <w:tblHeader w:val="off"/>
+        </w:trPr>
+        <w:tc>
+          <w:tcPr>
+            <w:tcW w:type="dxa" w:w="1902"/>
+            <w:tcBorders>
+              <w:top w:val="single" w:color="BFBFBF" w:sz="4"/>
+              <w:left w:val="single" w:color="BFBFBF" w:sz="4"/>
+              <w:bottom w:val="single" w:color="BFBFBF" w:sz="4"/>
+              <w:right w:val="single" w:color="BFBFBF" w:sz="4"/>
+            </w:tcBorders>
+            <w:tcMar>
+              <w:top w:type="dxa" w:w="60"/>
+              <w:left w:type="dxa" w:w="100"/>
+              <w:bottom w:type="dxa" w:w="60"/>
+              <w:right w:type="dxa" w:w="100"/>
+            </w:tcMar>
+          </w:tcPr>
+          <w:p>
+            <w:r>
+              <w:rPr>
+                <w:sz w:val="19"/>
+                <w:szCs w:val="19"/>
+              </w:rPr>
+              <w:t xml:space="preserve">PHP</w:t>
+            </w:r>
+          </w:p>
+        </w:tc>
+        <w:tc>
+          <w:tcPr>
+            <w:tcW w:type="dxa" w:w="3550"/>
+            <w:tcBorders>
+              <w:top w:val="single" w:color="BFBFBF" w:sz="4"/>
+              <w:left w:val="single" w:color="BFBFBF" w:sz="4"/>
+              <w:bottom w:val="single" w:color="BFBFBF" w:sz="4"/>
+              <w:right w:val="single" w:color="BFBFBF" w:sz="4"/>
+            </w:tcBorders>
+            <w:tcMar>
+              <w:top w:type="dxa" w:w="60"/>
+              <w:left w:type="dxa" w:w="100"/>
+              <w:bottom w:type="dxa" w:w="60"/>
+              <w:right w:type="dxa" w:w="100"/>
+            </w:tcMar>
+          </w:tcPr>
+          <w:p>
+            <w:r>
+              <w:rPr>
+                <w:sz w:val="19"/>
+                <w:szCs w:val="19"/>
+              </w:rPr>
+              <w:t xml:space="preserve">8.2.12</w:t>
+            </w:r>
+          </w:p>
+        </w:tc>
+        <w:tc>
+          <w:tcPr>
+            <w:tcW w:type="dxa" w:w="4186"/>
+            <w:tcBorders>
+              <w:top w:val="single" w:color="BFBFBF" w:sz="4"/>
+              <w:left w:val="single" w:color="BFBFBF" w:sz="4"/>
+              <w:bottom w:val="single" w:color="BFBFBF" w:sz="4"/>
+              <w:right w:val="single" w:color="BFBFBF" w:sz="4"/>
+            </w:tcBorders>
+            <w:tcMar>
+              <w:top w:type="dxa" w:w="60"/>
+              <w:left w:type="dxa" w:w="100"/>
+              <w:bottom w:type="dxa" w:w="60"/>
+              <w:right w:type="dxa" w:w="100"/>
+            </w:tcMar>
+          </w:tcPr>
+          <w:p>
+            <w:r>
+              <w:rPr>
+                <w:sz w:val="19"/>
+                <w:szCs w:val="19"/>
+              </w:rPr>
+              <w:t xml:space="preserve">Bahasa pemrograman (dibawa XAMPP)</w:t>
+            </w:r>
+          </w:p>
+        </w:tc>
+      </w:tr>
+      <w:tr>
+        <w:trPr>
+          <w:tblHeader w:val="off"/>
+        </w:trPr>
+        <w:tc>
+          <w:tcPr>
+            <w:tcW w:type="dxa" w:w="1902"/>
+            <w:tcBorders>
+              <w:top w:val="single" w:color="BFBFBF" w:sz="4"/>
+              <w:left w:val="single" w:color="BFBFBF" w:sz="4"/>
+              <w:bottom w:val="single" w:color="BFBFBF" w:sz="4"/>
+              <w:right w:val="single" w:color="BFBFBF" w:sz="4"/>
+            </w:tcBorders>
+            <w:tcMar>
+              <w:top w:type="dxa" w:w="60"/>
+              <w:left w:type="dxa" w:w="100"/>
+              <w:bottom w:type="dxa" w:w="60"/>
+              <w:right w:type="dxa" w:w="100"/>
+            </w:tcMar>
+          </w:tcPr>
+          <w:p>
+            <w:r>
+              <w:rPr>
+                <w:sz w:val="19"/>
+                <w:szCs w:val="19"/>
+              </w:rPr>
+              <w:t xml:space="preserve">MariaDB (MySQL)</w:t>
+            </w:r>
+          </w:p>
+        </w:tc>
+        <w:tc>
+          <w:tcPr>
+            <w:tcW w:type="dxa" w:w="3550"/>
+            <w:tcBorders>
+              <w:top w:val="single" w:color="BFBFBF" w:sz="4"/>
+              <w:left w:val="single" w:color="BFBFBF" w:sz="4"/>
+              <w:bottom w:val="single" w:color="BFBFBF" w:sz="4"/>
+              <w:right w:val="single" w:color="BFBFBF" w:sz="4"/>
+            </w:tcBorders>
+            <w:tcMar>
+              <w:top w:type="dxa" w:w="60"/>
+              <w:left w:type="dxa" w:w="100"/>
+              <w:bottom w:type="dxa" w:w="60"/>
+              <w:right w:type="dxa" w:w="100"/>
+            </w:tcMar>
+          </w:tcPr>
+          <w:p>
+            <w:r>
+              <w:rPr>
+                <w:sz w:val="19"/>
+                <w:szCs w:val="19"/>
+              </w:rPr>
+              <w:t xml:space="preserve">10.4.32</w:t>
+            </w:r>
+          </w:p>
+        </w:tc>
+        <w:tc>
+          <w:tcPr>
+            <w:tcW w:type="dxa" w:w="4186"/>
+            <w:tcBorders>
+              <w:top w:val="single" w:color="BFBFBF" w:sz="4"/>
+              <w:left w:val="single" w:color="BFBFBF" w:sz="4"/>
+              <w:bottom w:val="single" w:color="BFBFBF" w:sz="4"/>
+              <w:right w:val="single" w:color="BFBFBF" w:sz="4"/>
+            </w:tcBorders>
+            <w:tcMar>
+              <w:top w:type="dxa" w:w="60"/>
+              <w:left w:type="dxa" w:w="100"/>
+              <w:bottom w:type="dxa" w:w="60"/>
+              <w:right w:type="dxa" w:w="100"/>
+            </w:tcMar>
+          </w:tcPr>
+          <w:p>
+            <w:r>
+              <w:rPr>
+                <w:sz w:val="19"/>
+                <w:szCs w:val="19"/>
+              </w:rPr>
+              <w:t xml:space="preserve">Database lokal </w:t>
+            </w:r>
+            <w:r>
+              <w:rPr>
+                <w:rFonts w:ascii="Consolas" w:cs="Consolas" w:eastAsia="Consolas" w:hAnsi="Consolas"/>
+                <w:color w:val="1F4E79"/>
+                <w:sz w:val="17"/>
+                <w:szCs w:val="17"/>
+              </w:rPr>
+              <w:t xml:space="preserve">gudang_sekolah</w:t>
+            </w:r>
+          </w:p>
+        </w:tc>
+      </w:tr>
+      <w:tr>
+        <w:trPr>
+          <w:tblHeader w:val="off"/>
+        </w:trPr>
+        <w:tc>
+          <w:tcPr>
+            <w:tcW w:type="dxa" w:w="1902"/>
+            <w:tcBorders>
+              <w:top w:val="single" w:color="BFBFBF" w:sz="4"/>
+              <w:left w:val="single" w:color="BFBFBF" w:sz="4"/>
+              <w:bottom w:val="single" w:color="BFBFBF" w:sz="4"/>
+              <w:right w:val="single" w:color="BFBFBF" w:sz="4"/>
+            </w:tcBorders>
+            <w:tcMar>
+              <w:top w:type="dxa" w:w="60"/>
+              <w:left w:type="dxa" w:w="100"/>
+              <w:bottom w:type="dxa" w:w="60"/>
+              <w:right w:type="dxa" w:w="100"/>
+            </w:tcMar>
+          </w:tcPr>
+          <w:p>
+            <w:r>
+              <w:rPr>
+                <w:sz w:val="19"/>
+                <w:szCs w:val="19"/>
+              </w:rPr>
+              <w:t xml:space="preserve">Apache</w:t>
+            </w:r>
+          </w:p>
+        </w:tc>
+        <w:tc>
+          <w:tcPr>
+            <w:tcW w:type="dxa" w:w="3550"/>
+            <w:tcBorders>
+              <w:top w:val="single" w:color="BFBFBF" w:sz="4"/>
+              <w:left w:val="single" w:color="BFBFBF" w:sz="4"/>
+              <w:bottom w:val="single" w:color="BFBFBF" w:sz="4"/>
+              <w:right w:val="single" w:color="BFBFBF" w:sz="4"/>
+            </w:tcBorders>
+            <w:tcMar>
+              <w:top w:type="dxa" w:w="60"/>
+              <w:left w:type="dxa" w:w="100"/>
+              <w:bottom w:type="dxa" w:w="60"/>
+              <w:right w:type="dxa" w:w="100"/>
+            </w:tcMar>
+          </w:tcPr>
+          <w:p>
+            <w:r>
+              <w:rPr>
+                <w:sz w:val="19"/>
+                <w:szCs w:val="19"/>
+              </w:rPr>
+              <w:t xml:space="preserve">2.4.58</w:t>
+            </w:r>
+          </w:p>
+        </w:tc>
+        <w:tc>
+          <w:tcPr>
+            <w:tcW w:type="dxa" w:w="4186"/>
+            <w:tcBorders>
+              <w:top w:val="single" w:color="BFBFBF" w:sz="4"/>
+              <w:left w:val="single" w:color="BFBFBF" w:sz="4"/>
+              <w:bottom w:val="single" w:color="BFBFBF" w:sz="4"/>
+              <w:right w:val="single" w:color="BFBFBF" w:sz="4"/>
+            </w:tcBorders>
+            <w:tcMar>
+              <w:top w:type="dxa" w:w="60"/>
+              <w:left w:type="dxa" w:w="100"/>
+              <w:bottom w:type="dxa" w:w="60"/>
+              <w:right w:type="dxa" w:w="100"/>
+            </w:tcMar>
+          </w:tcPr>
+          <w:p>
+            <w:r>
+              <w:rPr>
+                <w:sz w:val="19"/>
+                <w:szCs w:val="19"/>
+              </w:rPr>
+              <w:t xml:space="preserve">Web server bawaan XAMPP</w:t>
+            </w:r>
+          </w:p>
+        </w:tc>
+      </w:tr>
+      <w:tr>
+        <w:trPr>
+          <w:tblHeader w:val="off"/>
+        </w:trPr>
+        <w:tc>
+          <w:tcPr>
+            <w:tcW w:type="dxa" w:w="1902"/>
+            <w:tcBorders>
+              <w:top w:val="single" w:color="BFBFBF" w:sz="4"/>
+              <w:left w:val="single" w:color="BFBFBF" w:sz="4"/>
+              <w:bottom w:val="single" w:color="BFBFBF" w:sz="4"/>
+              <w:right w:val="single" w:color="BFBFBF" w:sz="4"/>
+            </w:tcBorders>
+            <w:tcMar>
+              <w:top w:type="dxa" w:w="60"/>
+              <w:left w:type="dxa" w:w="100"/>
+              <w:bottom w:type="dxa" w:w="60"/>
+              <w:right w:type="dxa" w:w="100"/>
+            </w:tcMar>
+          </w:tcPr>
+          <w:p>
+            <w:r>
+              <w:rPr>
+                <w:sz w:val="19"/>
+                <w:szCs w:val="19"/>
+              </w:rPr>
+              <w:t xml:space="preserve">phpMyAdmin</w:t>
+            </w:r>
+          </w:p>
+        </w:tc>
+        <w:tc>
+          <w:tcPr>
+            <w:tcW w:type="dxa" w:w="3550"/>
+            <w:tcBorders>
+              <w:top w:val="single" w:color="BFBFBF" w:sz="4"/>
+              <w:left w:val="single" w:color="BFBFBF" w:sz="4"/>
+              <w:bottom w:val="single" w:color="BFBFBF" w:sz="4"/>
+              <w:right w:val="single" w:color="BFBFBF" w:sz="4"/>
+            </w:tcBorders>
+            <w:tcMar>
+              <w:top w:type="dxa" w:w="60"/>
+              <w:left w:type="dxa" w:w="100"/>
+              <w:bottom w:type="dxa" w:w="60"/>
+              <w:right w:type="dxa" w:w="100"/>
+            </w:tcMar>
+          </w:tcPr>
+          <w:p>
+            <w:r>
+              <w:rPr>
+                <w:sz w:val="19"/>
+                <w:szCs w:val="19"/>
+              </w:rPr>
+              <w:t xml:space="preserve">5.2.1</w:t>
+            </w:r>
+          </w:p>
+        </w:tc>
+        <w:tc>
+          <w:tcPr>
+            <w:tcW w:type="dxa" w:w="4186"/>
+            <w:tcBorders>
+              <w:top w:val="single" w:color="BFBFBF" w:sz="4"/>
+              <w:left w:val="single" w:color="BFBFBF" w:sz="4"/>
+              <w:bottom w:val="single" w:color="BFBFBF" w:sz="4"/>
+              <w:right w:val="single" w:color="BFBFBF" w:sz="4"/>
+            </w:tcBorders>
+            <w:tcMar>
+              <w:top w:type="dxa" w:w="60"/>
+              <w:left w:type="dxa" w:w="100"/>
+              <w:bottom w:type="dxa" w:w="60"/>
+              <w:right w:type="dxa" w:w="100"/>
+            </w:tcMar>
+          </w:tcPr>
+          <w:p>
+            <w:r>
+              <w:rPr>
+                <w:sz w:val="19"/>
+                <w:szCs w:val="19"/>
+              </w:rPr>
+              <w:t xml:space="preserve">Mengelola database lewat browser</w:t>
+            </w:r>
+          </w:p>
+        </w:tc>
+      </w:tr>
+    </w:tbl>
+    <w:p>
+      <w:pPr>
+        <w:spacing w:after="60"/>
+      </w:pPr>
+    </w:p>
+    <w:p>
+      <w:r>
+        <w:rPr>
+          <w:b/>
+          <w:bCs/>
+        </w:rPr>
+        <w:t xml:space="preserve">c. Bahasa, framework, dan pustaka PHP (Composer)</w:t>
+      </w:r>
+    </w:p>
+    <w:tbl>
+      <w:tblPr>
+        <w:tblW w:type="dxa" w:w="9638"/>
+        <w:tblBorders>
+          <w:top w:val="single" w:color="auto" w:sz="4"/>
+          <w:left w:val="single" w:color="auto" w:sz="4"/>
+          <w:bottom w:val="single" w:color="auto" w:sz="4"/>
+          <w:right w:val="single" w:color="auto" w:sz="4"/>
+          <w:insideH w:val="single" w:color="auto" w:sz="4"/>
+          <w:insideV w:val="single" w:color="auto" w:sz="4"/>
+        </w:tblBorders>
+      </w:tblPr>
+      <w:tblGrid>
+        <w:gridCol w:w="2948"/>
+        <w:gridCol w:w="793"/>
+        <w:gridCol w:w="5897"/>
+      </w:tblGrid>
+      <w:tr>
+        <w:trPr>
+          <w:tblHeader/>
+        </w:trPr>
+        <w:tc>
+          <w:tcPr>
+            <w:tcW w:type="dxa" w:w="2948"/>
+            <w:tcBorders>
+              <w:top w:val="single" w:color="BFBFBF" w:sz="4"/>
+              <w:left w:val="single" w:color="BFBFBF" w:sz="4"/>
+              <w:bottom w:val="single" w:color="BFBFBF" w:sz="4"/>
+              <w:right w:val="single" w:color="BFBFBF" w:sz="4"/>
+            </w:tcBorders>
+            <w:shd w:fill="1F4E79" w:color="auto" w:val="clear"/>
+            <w:tcMar>
+              <w:top w:type="dxa" w:w="60"/>
+              <w:left w:type="dxa" w:w="100"/>
+              <w:bottom w:type="dxa" w:w="60"/>
+              <w:right w:type="dxa" w:w="100"/>
+            </w:tcMar>
+          </w:tcPr>
+          <w:p>
+            <w:r>
+              <w:rPr>
+                <w:b/>
+                <w:bCs/>
+                <w:color w:val="FFFFFF"/>
+                <w:sz w:val="19"/>
+                <w:szCs w:val="19"/>
+              </w:rPr>
+              <w:t xml:space="preserve">Alat</w:t>
+            </w:r>
+          </w:p>
+        </w:tc>
+        <w:tc>
+          <w:tcPr>
+            <w:tcW w:type="dxa" w:w="793"/>
+            <w:tcBorders>
+              <w:top w:val="single" w:color="BFBFBF" w:sz="4"/>
+              <w:left w:val="single" w:color="BFBFBF" w:sz="4"/>
+              <w:bottom w:val="single" w:color="BFBFBF" w:sz="4"/>
+              <w:right w:val="single" w:color="BFBFBF" w:sz="4"/>
+            </w:tcBorders>
+            <w:shd w:fill="1F4E79" w:color="auto" w:val="clear"/>
+            <w:tcMar>
+              <w:top w:type="dxa" w:w="60"/>
+              <w:left w:type="dxa" w:w="100"/>
+              <w:bottom w:type="dxa" w:w="60"/>
+              <w:right w:type="dxa" w:w="100"/>
+            </w:tcMar>
+          </w:tcPr>
+          <w:p>
+            <w:r>
+              <w:rPr>
+                <w:b/>
+                <w:bCs/>
+                <w:color w:val="FFFFFF"/>
+                <w:sz w:val="19"/>
+                <w:szCs w:val="19"/>
+              </w:rPr>
+              <w:t xml:space="preserve">Versi</w:t>
+            </w:r>
+          </w:p>
+        </w:tc>
+        <w:tc>
+          <w:tcPr>
+            <w:tcW w:type="dxa" w:w="5897"/>
+            <w:tcBorders>
+              <w:top w:val="single" w:color="BFBFBF" w:sz="4"/>
+              <w:left w:val="single" w:color="BFBFBF" w:sz="4"/>
+              <w:bottom w:val="single" w:color="BFBFBF" w:sz="4"/>
+              <w:right w:val="single" w:color="BFBFBF" w:sz="4"/>
+            </w:tcBorders>
+            <w:shd w:fill="1F4E79" w:color="auto" w:val="clear"/>
+            <w:tcMar>
+              <w:top w:type="dxa" w:w="60"/>
+              <w:left w:type="dxa" w:w="100"/>
+              <w:bottom w:type="dxa" w:w="60"/>
+              <w:right w:type="dxa" w:w="100"/>
+            </w:tcMar>
+          </w:tcPr>
+          <w:p>
+            <w:r>
+              <w:rPr>
+                <w:b/>
+                <w:bCs/>
+                <w:color w:val="FFFFFF"/>
+                <w:sz w:val="19"/>
+                <w:szCs w:val="19"/>
+              </w:rPr>
+              <w:t xml:space="preserve">Keterangan</w:t>
+            </w:r>
+          </w:p>
+        </w:tc>
+      </w:tr>
+      <w:tr>
+        <w:trPr>
+          <w:tblHeader w:val="off"/>
+        </w:trPr>
+        <w:tc>
+          <w:tcPr>
+            <w:tcW w:type="dxa" w:w="2948"/>
+            <w:tcBorders>
+              <w:top w:val="single" w:color="BFBFBF" w:sz="4"/>
+              <w:left w:val="single" w:color="BFBFBF" w:sz="4"/>
+              <w:bottom w:val="single" w:color="BFBFBF" w:sz="4"/>
+              <w:right w:val="single" w:color="BFBFBF" w:sz="4"/>
+            </w:tcBorders>
+            <w:tcMar>
+              <w:top w:type="dxa" w:w="60"/>
+              <w:left w:type="dxa" w:w="100"/>
+              <w:bottom w:type="dxa" w:w="60"/>
+              <w:right w:type="dxa" w:w="100"/>
+            </w:tcMar>
+          </w:tcPr>
+          <w:p>
+            <w:r>
+              <w:rPr>
+                <w:sz w:val="19"/>
+                <w:szCs w:val="19"/>
+              </w:rPr>
+              <w:t xml:space="preserve">Composer</w:t>
+            </w:r>
+          </w:p>
+        </w:tc>
+        <w:tc>
+          <w:tcPr>
+            <w:tcW w:type="dxa" w:w="793"/>
+            <w:tcBorders>
+              <w:top w:val="single" w:color="BFBFBF" w:sz="4"/>
+              <w:left w:val="single" w:color="BFBFBF" w:sz="4"/>
+              <w:bottom w:val="single" w:color="BFBFBF" w:sz="4"/>
+              <w:right w:val="single" w:color="BFBFBF" w:sz="4"/>
+            </w:tcBorders>
+            <w:tcMar>
+              <w:top w:type="dxa" w:w="60"/>
+              <w:left w:type="dxa" w:w="100"/>
+              <w:bottom w:type="dxa" w:w="60"/>
+              <w:right w:type="dxa" w:w="100"/>
+            </w:tcMar>
+          </w:tcPr>
+          <w:p>
+            <w:r>
+              <w:rPr>
+                <w:sz w:val="19"/>
+                <w:szCs w:val="19"/>
+              </w:rPr>
+              <w:t xml:space="preserve">2.10.3</w:t>
+            </w:r>
+          </w:p>
+        </w:tc>
+        <w:tc>
+          <w:tcPr>
+            <w:tcW w:type="dxa" w:w="5897"/>
+            <w:tcBorders>
+              <w:top w:val="single" w:color="BFBFBF" w:sz="4"/>
+              <w:left w:val="single" w:color="BFBFBF" w:sz="4"/>
+              <w:bottom w:val="single" w:color="BFBFBF" w:sz="4"/>
+              <w:right w:val="single" w:color="BFBFBF" w:sz="4"/>
+            </w:tcBorders>
+            <w:tcMar>
+              <w:top w:type="dxa" w:w="60"/>
+              <w:left w:type="dxa" w:w="100"/>
+              <w:bottom w:type="dxa" w:w="60"/>
+              <w:right w:type="dxa" w:w="100"/>
+            </w:tcMar>
+          </w:tcPr>
+          <w:p>
+            <w:r>
+              <w:rPr>
+                <w:sz w:val="19"/>
+                <w:szCs w:val="19"/>
+              </w:rPr>
+              <w:t xml:space="preserve">Pengelola pustaka PHP</w:t>
+            </w:r>
+          </w:p>
+        </w:tc>
+      </w:tr>
+      <w:tr>
+        <w:trPr>
+          <w:tblHeader w:val="off"/>
+        </w:trPr>
+        <w:tc>
+          <w:tcPr>
+            <w:tcW w:type="dxa" w:w="2948"/>
+            <w:tcBorders>
+              <w:top w:val="single" w:color="BFBFBF" w:sz="4"/>
+              <w:left w:val="single" w:color="BFBFBF" w:sz="4"/>
+              <w:bottom w:val="single" w:color="BFBFBF" w:sz="4"/>
+              <w:right w:val="single" w:color="BFBFBF" w:sz="4"/>
+            </w:tcBorders>
+            <w:tcMar>
+              <w:top w:type="dxa" w:w="60"/>
+              <w:left w:type="dxa" w:w="100"/>
+              <w:bottom w:type="dxa" w:w="60"/>
+              <w:right w:type="dxa" w:w="100"/>
+            </w:tcMar>
+          </w:tcPr>
+          <w:p>
+            <w:r>
+              <w:rPr>
+                <w:sz w:val="19"/>
+                <w:szCs w:val="19"/>
+              </w:rPr>
+              <w:t xml:space="preserve">Laravel Framework</w:t>
+            </w:r>
+          </w:p>
+        </w:tc>
+        <w:tc>
+          <w:tcPr>
+            <w:tcW w:type="dxa" w:w="793"/>
+            <w:tcBorders>
+              <w:top w:val="single" w:color="BFBFBF" w:sz="4"/>
+              <w:left w:val="single" w:color="BFBFBF" w:sz="4"/>
+              <w:bottom w:val="single" w:color="BFBFBF" w:sz="4"/>
+              <w:right w:val="single" w:color="BFBFBF" w:sz="4"/>
+            </w:tcBorders>
+            <w:tcMar>
+              <w:top w:type="dxa" w:w="60"/>
+              <w:left w:type="dxa" w:w="100"/>
+              <w:bottom w:type="dxa" w:w="60"/>
+              <w:right w:type="dxa" w:w="100"/>
+            </w:tcMar>
+          </w:tcPr>
+          <w:p>
+            <w:r>
+              <w:rPr>
+                <w:sz w:val="19"/>
+                <w:szCs w:val="19"/>
+              </w:rPr>
+              <w:t xml:space="preserve">12.69.2</w:t>
+            </w:r>
+          </w:p>
+        </w:tc>
+        <w:tc>
+          <w:tcPr>
+            <w:tcW w:type="dxa" w:w="5897"/>
+            <w:tcBorders>
+              <w:top w:val="single" w:color="BFBFBF" w:sz="4"/>
+              <w:left w:val="single" w:color="BFBFBF" w:sz="4"/>
+              <w:bottom w:val="single" w:color="BFBFBF" w:sz="4"/>
+              <w:right w:val="single" w:color="BFBFBF" w:sz="4"/>
+            </w:tcBorders>
+            <w:tcMar>
+              <w:top w:type="dxa" w:w="60"/>
+              <w:left w:type="dxa" w:w="100"/>
+              <w:bottom w:type="dxa" w:w="60"/>
+              <w:right w:type="dxa" w:w="100"/>
+            </w:tcMar>
+          </w:tcPr>
+          <w:p>
+            <w:r>
+              <w:rPr>
+                <w:sz w:val="19"/>
+                <w:szCs w:val="19"/>
+              </w:rPr>
+              <w:t xml:space="preserve">Framework utama (MVC)</w:t>
+            </w:r>
+          </w:p>
+        </w:tc>
+      </w:tr>
+      <w:tr>
+        <w:trPr>
+          <w:tblHeader w:val="off"/>
+        </w:trPr>
+        <w:tc>
+          <w:tcPr>
+            <w:tcW w:type="dxa" w:w="2948"/>
+            <w:tcBorders>
+              <w:top w:val="single" w:color="BFBFBF" w:sz="4"/>
+              <w:left w:val="single" w:color="BFBFBF" w:sz="4"/>
+              <w:bottom w:val="single" w:color="BFBFBF" w:sz="4"/>
+              <w:right w:val="single" w:color="BFBFBF" w:sz="4"/>
+            </w:tcBorders>
+            <w:tcMar>
+              <w:top w:type="dxa" w:w="60"/>
+              <w:left w:type="dxa" w:w="100"/>
+              <w:bottom w:type="dxa" w:w="60"/>
+              <w:right w:type="dxa" w:w="100"/>
+            </w:tcMar>
+          </w:tcPr>
+          <w:p>
+            <w:r>
+              <w:rPr>
+                <w:sz w:val="19"/>
+                <w:szCs w:val="19"/>
+              </w:rPr>
+              <w:t xml:space="preserve">PHPUnit</w:t>
+            </w:r>
+          </w:p>
+        </w:tc>
+        <w:tc>
+          <w:tcPr>
+            <w:tcW w:type="dxa" w:w="793"/>
+            <w:tcBorders>
+              <w:top w:val="single" w:color="BFBFBF" w:sz="4"/>
+              <w:left w:val="single" w:color="BFBFBF" w:sz="4"/>
+              <w:bottom w:val="single" w:color="BFBFBF" w:sz="4"/>
+              <w:right w:val="single" w:color="BFBFBF" w:sz="4"/>
+            </w:tcBorders>
+            <w:tcMar>
+              <w:top w:type="dxa" w:w="60"/>
+              <w:left w:type="dxa" w:w="100"/>
+              <w:bottom w:type="dxa" w:w="60"/>
+              <w:right w:type="dxa" w:w="100"/>
+            </w:tcMar>
+          </w:tcPr>
+          <w:p>
+            <w:r>
+              <w:rPr>
+                <w:sz w:val="19"/>
+                <w:szCs w:val="19"/>
+              </w:rPr>
+              <w:t xml:space="preserve">11.5.56</w:t>
+            </w:r>
+          </w:p>
+        </w:tc>
+        <w:tc>
+          <w:tcPr>
+            <w:tcW w:type="dxa" w:w="5897"/>
+            <w:tcBorders>
+              <w:top w:val="single" w:color="BFBFBF" w:sz="4"/>
+              <w:left w:val="single" w:color="BFBFBF" w:sz="4"/>
+              <w:bottom w:val="single" w:color="BFBFBF" w:sz="4"/>
+              <w:right w:val="single" w:color="BFBFBF" w:sz="4"/>
+            </w:tcBorders>
+            <w:tcMar>
+              <w:top w:type="dxa" w:w="60"/>
+              <w:left w:type="dxa" w:w="100"/>
+              <w:bottom w:type="dxa" w:w="60"/>
+              <w:right w:type="dxa" w:w="100"/>
+            </w:tcMar>
+          </w:tcPr>
+          <w:p>
+            <w:r>
+              <w:rPr>
+                <w:sz w:val="19"/>
+                <w:szCs w:val="19"/>
+              </w:rPr>
+              <w:t xml:space="preserve">Pengujian unit dan fitur</w:t>
+            </w:r>
+          </w:p>
+        </w:tc>
+      </w:tr>
+      <w:tr>
+        <w:trPr>
+          <w:tblHeader w:val="off"/>
+        </w:trPr>
+        <w:tc>
+          <w:tcPr>
+            <w:tcW w:type="dxa" w:w="2948"/>
+            <w:tcBorders>
+              <w:top w:val="single" w:color="BFBFBF" w:sz="4"/>
+              <w:left w:val="single" w:color="BFBFBF" w:sz="4"/>
+              <w:bottom w:val="single" w:color="BFBFBF" w:sz="4"/>
+              <w:right w:val="single" w:color="BFBFBF" w:sz="4"/>
+            </w:tcBorders>
+            <w:tcMar>
+              <w:top w:type="dxa" w:w="60"/>
+              <w:left w:type="dxa" w:w="100"/>
+              <w:bottom w:type="dxa" w:w="60"/>
+              <w:right w:type="dxa" w:w="100"/>
+            </w:tcMar>
+          </w:tcPr>
+          <w:p>
+            <w:r>
+              <w:rPr>
+                <w:sz w:val="19"/>
+                <w:szCs w:val="19"/>
+              </w:rPr>
+              <w:t xml:space="preserve">league/flysystem-aws-s3-v3</w:t>
+            </w:r>
+          </w:p>
+        </w:tc>
+        <w:tc>
+          <w:tcPr>
+            <w:tcW w:type="dxa" w:w="793"/>
+            <w:tcBorders>
+              <w:top w:val="single" w:color="BFBFBF" w:sz="4"/>
+              <w:left w:val="single" w:color="BFBFBF" w:sz="4"/>
+              <w:bottom w:val="single" w:color="BFBFBF" w:sz="4"/>
+              <w:right w:val="single" w:color="BFBFBF" w:sz="4"/>
+            </w:tcBorders>
+            <w:tcMar>
+              <w:top w:type="dxa" w:w="60"/>
+              <w:left w:type="dxa" w:w="100"/>
+              <w:bottom w:type="dxa" w:w="60"/>
+              <w:right w:type="dxa" w:w="100"/>
+            </w:tcMar>
+          </w:tcPr>
+          <w:p>
+            <w:r>
+              <w:rPr>
+                <w:sz w:val="19"/>
+                <w:szCs w:val="19"/>
+              </w:rPr>
+              <w:t xml:space="preserve">3.35.3</w:t>
+            </w:r>
+          </w:p>
+        </w:tc>
+        <w:tc>
+          <w:tcPr>
+            <w:tcW w:type="dxa" w:w="5897"/>
+            <w:tcBorders>
+              <w:top w:val="single" w:color="BFBFBF" w:sz="4"/>
+              <w:left w:val="single" w:color="BFBFBF" w:sz="4"/>
+              <w:bottom w:val="single" w:color="BFBFBF" w:sz="4"/>
+              <w:right w:val="single" w:color="BFBFBF" w:sz="4"/>
+            </w:tcBorders>
+            <w:tcMar>
+              <w:top w:type="dxa" w:w="60"/>
+              <w:left w:type="dxa" w:w="100"/>
+              <w:bottom w:type="dxa" w:w="60"/>
+              <w:right w:type="dxa" w:w="100"/>
+            </w:tcMar>
+          </w:tcPr>
+          <w:p>
+            <w:r>
+              <w:rPr>
+                <w:sz w:val="19"/>
+                <w:szCs w:val="19"/>
+              </w:rPr>
+              <w:t xml:space="preserve">Penyimpanan gambar ke Supabase Storage (protokol S3)</w:t>
+            </w:r>
+          </w:p>
+        </w:tc>
+      </w:tr>
+      <w:tr>
+        <w:trPr>
+          <w:tblHeader w:val="off"/>
+        </w:trPr>
+        <w:tc>
+          <w:tcPr>
+            <w:tcW w:type="dxa" w:w="2948"/>
+            <w:tcBorders>
+              <w:top w:val="single" w:color="BFBFBF" w:sz="4"/>
+              <w:left w:val="single" w:color="BFBFBF" w:sz="4"/>
+              <w:bottom w:val="single" w:color="BFBFBF" w:sz="4"/>
+              <w:right w:val="single" w:color="BFBFBF" w:sz="4"/>
+            </w:tcBorders>
+            <w:tcMar>
+              <w:top w:type="dxa" w:w="60"/>
+              <w:left w:type="dxa" w:w="100"/>
+              <w:bottom w:type="dxa" w:w="60"/>
+              <w:right w:type="dxa" w:w="100"/>
+            </w:tcMar>
+          </w:tcPr>
+          <w:p>
+            <w:r>
+              <w:rPr>
+                <w:sz w:val="19"/>
+                <w:szCs w:val="19"/>
+              </w:rPr>
+              <w:t xml:space="preserve">laravel/tinker</w:t>
+            </w:r>
+          </w:p>
+        </w:tc>
+        <w:tc>
+          <w:tcPr>
+            <w:tcW w:type="dxa" w:w="793"/>
+            <w:tcBorders>
+              <w:top w:val="single" w:color="BFBFBF" w:sz="4"/>
+              <w:left w:val="single" w:color="BFBFBF" w:sz="4"/>
+              <w:bottom w:val="single" w:color="BFBFBF" w:sz="4"/>
+              <w:right w:val="single" w:color="BFBFBF" w:sz="4"/>
+            </w:tcBorders>
+            <w:tcMar>
+              <w:top w:type="dxa" w:w="60"/>
+              <w:left w:type="dxa" w:w="100"/>
+              <w:bottom w:type="dxa" w:w="60"/>
+              <w:right w:type="dxa" w:w="100"/>
+            </w:tcMar>
+          </w:tcPr>
+          <w:p>
+            <w:r>
+              <w:rPr>
+                <w:sz w:val="19"/>
+                <w:szCs w:val="19"/>
+              </w:rPr>
+              <w:t xml:space="preserve">2.11.1</w:t>
+            </w:r>
+          </w:p>
+        </w:tc>
+        <w:tc>
+          <w:tcPr>
+            <w:tcW w:type="dxa" w:w="5897"/>
+            <w:tcBorders>
+              <w:top w:val="single" w:color="BFBFBF" w:sz="4"/>
+              <w:left w:val="single" w:color="BFBFBF" w:sz="4"/>
+              <w:bottom w:val="single" w:color="BFBFBF" w:sz="4"/>
+              <w:right w:val="single" w:color="BFBFBF" w:sz="4"/>
+            </w:tcBorders>
+            <w:tcMar>
+              <w:top w:type="dxa" w:w="60"/>
+              <w:left w:type="dxa" w:w="100"/>
+              <w:bottom w:type="dxa" w:w="60"/>
+              <w:right w:type="dxa" w:w="100"/>
+            </w:tcMar>
+          </w:tcPr>
+          <w:p>
+            <w:r>
+              <w:rPr>
+                <w:sz w:val="19"/>
+                <w:szCs w:val="19"/>
+              </w:rPr>
+              <w:t xml:space="preserve">Konsol interaktif Laravel</w:t>
+            </w:r>
+          </w:p>
+        </w:tc>
+      </w:tr>
+      <w:tr>
+        <w:trPr>
+          <w:tblHeader w:val="off"/>
+        </w:trPr>
+        <w:tc>
+          <w:tcPr>
+            <w:tcW w:type="dxa" w:w="2948"/>
+            <w:tcBorders>
+              <w:top w:val="single" w:color="BFBFBF" w:sz="4"/>
+              <w:left w:val="single" w:color="BFBFBF" w:sz="4"/>
+              <w:bottom w:val="single" w:color="BFBFBF" w:sz="4"/>
+              <w:right w:val="single" w:color="BFBFBF" w:sz="4"/>
+            </w:tcBorders>
+            <w:tcMar>
+              <w:top w:type="dxa" w:w="60"/>
+              <w:left w:type="dxa" w:w="100"/>
+              <w:bottom w:type="dxa" w:w="60"/>
+              <w:right w:type="dxa" w:w="100"/>
+            </w:tcMar>
+          </w:tcPr>
+          <w:p>
+            <w:r>
+              <w:rPr>
+                <w:sz w:val="19"/>
+                <w:szCs w:val="19"/>
+              </w:rPr>
+              <w:t xml:space="preserve">laravel/pint</w:t>
+            </w:r>
+          </w:p>
+        </w:tc>
+        <w:tc>
+          <w:tcPr>
+            <w:tcW w:type="dxa" w:w="793"/>
+            <w:tcBorders>
+              <w:top w:val="single" w:color="BFBFBF" w:sz="4"/>
+              <w:left w:val="single" w:color="BFBFBF" w:sz="4"/>
+              <w:bottom w:val="single" w:color="BFBFBF" w:sz="4"/>
+              <w:right w:val="single" w:color="BFBFBF" w:sz="4"/>
+            </w:tcBorders>
+            <w:tcMar>
+              <w:top w:type="dxa" w:w="60"/>
+              <w:left w:type="dxa" w:w="100"/>
+              <w:bottom w:type="dxa" w:w="60"/>
+              <w:right w:type="dxa" w:w="100"/>
+            </w:tcMar>
+          </w:tcPr>
+          <w:p>
+            <w:r>
+              <w:rPr>
+                <w:sz w:val="19"/>
+                <w:szCs w:val="19"/>
+              </w:rPr>
+              <w:t xml:space="preserve">1.30.4</w:t>
+            </w:r>
+          </w:p>
+        </w:tc>
+        <w:tc>
+          <w:tcPr>
+            <w:tcW w:type="dxa" w:w="5897"/>
+            <w:tcBorders>
+              <w:top w:val="single" w:color="BFBFBF" w:sz="4"/>
+              <w:left w:val="single" w:color="BFBFBF" w:sz="4"/>
+              <w:bottom w:val="single" w:color="BFBFBF" w:sz="4"/>
+              <w:right w:val="single" w:color="BFBFBF" w:sz="4"/>
+            </w:tcBorders>
+            <w:tcMar>
+              <w:top w:type="dxa" w:w="60"/>
+              <w:left w:type="dxa" w:w="100"/>
+              <w:bottom w:type="dxa" w:w="60"/>
+              <w:right w:type="dxa" w:w="100"/>
+            </w:tcMar>
+          </w:tcPr>
+          <w:p>
+            <w:r>
+              <w:rPr>
+                <w:sz w:val="19"/>
+                <w:szCs w:val="19"/>
+              </w:rPr>
+              <w:t xml:space="preserve">Perapi format kode PHP</w:t>
+            </w:r>
+          </w:p>
+        </w:tc>
+      </w:tr>
+      <w:tr>
+        <w:trPr>
+          <w:tblHeader w:val="off"/>
+        </w:trPr>
+        <w:tc>
+          <w:tcPr>
+            <w:tcW w:type="dxa" w:w="2948"/>
+            <w:tcBorders>
+              <w:top w:val="single" w:color="BFBFBF" w:sz="4"/>
+              <w:left w:val="single" w:color="BFBFBF" w:sz="4"/>
+              <w:bottom w:val="single" w:color="BFBFBF" w:sz="4"/>
+              <w:right w:val="single" w:color="BFBFBF" w:sz="4"/>
+            </w:tcBorders>
+            <w:tcMar>
+              <w:top w:type="dxa" w:w="60"/>
+              <w:left w:type="dxa" w:w="100"/>
+              <w:bottom w:type="dxa" w:w="60"/>
+              <w:right w:type="dxa" w:w="100"/>
+            </w:tcMar>
+          </w:tcPr>
+          <w:p>
+            <w:r>
+              <w:rPr>
+                <w:sz w:val="19"/>
+                <w:szCs w:val="19"/>
+              </w:rPr>
+              <w:t xml:space="preserve">fakerphp/faker</w:t>
+            </w:r>
+          </w:p>
+        </w:tc>
+        <w:tc>
+          <w:tcPr>
+            <w:tcW w:type="dxa" w:w="793"/>
+            <w:tcBorders>
+              <w:top w:val="single" w:color="BFBFBF" w:sz="4"/>
+              <w:left w:val="single" w:color="BFBFBF" w:sz="4"/>
+              <w:bottom w:val="single" w:color="BFBFBF" w:sz="4"/>
+              <w:right w:val="single" w:color="BFBFBF" w:sz="4"/>
+            </w:tcBorders>
+            <w:tcMar>
+              <w:top w:type="dxa" w:w="60"/>
+              <w:left w:type="dxa" w:w="100"/>
+              <w:bottom w:type="dxa" w:w="60"/>
+              <w:right w:type="dxa" w:w="100"/>
+            </w:tcMar>
+          </w:tcPr>
+          <w:p>
+            <w:r>
+              <w:rPr>
+                <w:sz w:val="19"/>
+                <w:szCs w:val="19"/>
+              </w:rPr>
+              <w:t xml:space="preserve">1.24.1</w:t>
+            </w:r>
+          </w:p>
+        </w:tc>
+        <w:tc>
+          <w:tcPr>
+            <w:tcW w:type="dxa" w:w="5897"/>
+            <w:tcBorders>
+              <w:top w:val="single" w:color="BFBFBF" w:sz="4"/>
+              <w:left w:val="single" w:color="BFBFBF" w:sz="4"/>
+              <w:bottom w:val="single" w:color="BFBFBF" w:sz="4"/>
+              <w:right w:val="single" w:color="BFBFBF" w:sz="4"/>
+            </w:tcBorders>
+            <w:tcMar>
+              <w:top w:type="dxa" w:w="60"/>
+              <w:left w:type="dxa" w:w="100"/>
+              <w:bottom w:type="dxa" w:w="60"/>
+              <w:right w:type="dxa" w:w="100"/>
+            </w:tcMar>
+          </w:tcPr>
+          <w:p>
+            <w:r>
+              <w:rPr>
+                <w:sz w:val="19"/>
+                <w:szCs w:val="19"/>
+              </w:rPr>
+              <w:t xml:space="preserve">Data palsu untuk pengujian</w:t>
+            </w:r>
+          </w:p>
+        </w:tc>
+      </w:tr>
+      <w:tr>
+        <w:trPr>
+          <w:tblHeader w:val="off"/>
+        </w:trPr>
+        <w:tc>
+          <w:tcPr>
+            <w:tcW w:type="dxa" w:w="2948"/>
+            <w:tcBorders>
+              <w:top w:val="single" w:color="BFBFBF" w:sz="4"/>
+              <w:left w:val="single" w:color="BFBFBF" w:sz="4"/>
+              <w:bottom w:val="single" w:color="BFBFBF" w:sz="4"/>
+              <w:right w:val="single" w:color="BFBFBF" w:sz="4"/>
+            </w:tcBorders>
+            <w:tcMar>
+              <w:top w:type="dxa" w:w="60"/>
+              <w:left w:type="dxa" w:w="100"/>
+              <w:bottom w:type="dxa" w:w="60"/>
+              <w:right w:type="dxa" w:w="100"/>
+            </w:tcMar>
+          </w:tcPr>
+          <w:p>
+            <w:r>
+              <w:rPr>
+                <w:sz w:val="19"/>
+                <w:szCs w:val="19"/>
+              </w:rPr>
+              <w:t xml:space="preserve">mockery/mockery</w:t>
+            </w:r>
+          </w:p>
+        </w:tc>
+        <w:tc>
+          <w:tcPr>
+            <w:tcW w:type="dxa" w:w="793"/>
+            <w:tcBorders>
+              <w:top w:val="single" w:color="BFBFBF" w:sz="4"/>
+              <w:left w:val="single" w:color="BFBFBF" w:sz="4"/>
+              <w:bottom w:val="single" w:color="BFBFBF" w:sz="4"/>
+              <w:right w:val="single" w:color="BFBFBF" w:sz="4"/>
+            </w:tcBorders>
+            <w:tcMar>
+              <w:top w:type="dxa" w:w="60"/>
+              <w:left w:type="dxa" w:w="100"/>
+              <w:bottom w:type="dxa" w:w="60"/>
+              <w:right w:type="dxa" w:w="100"/>
+            </w:tcMar>
+          </w:tcPr>
+          <w:p>
+            <w:r>
+              <w:rPr>
+                <w:sz w:val="19"/>
+                <w:szCs w:val="19"/>
+              </w:rPr>
+              <w:t xml:space="preserve">1.6.15</w:t>
+            </w:r>
+          </w:p>
+        </w:tc>
+        <w:tc>
+          <w:tcPr>
+            <w:tcW w:type="dxa" w:w="5897"/>
+            <w:tcBorders>
+              <w:top w:val="single" w:color="BFBFBF" w:sz="4"/>
+              <w:left w:val="single" w:color="BFBFBF" w:sz="4"/>
+              <w:bottom w:val="single" w:color="BFBFBF" w:sz="4"/>
+              <w:right w:val="single" w:color="BFBFBF" w:sz="4"/>
+            </w:tcBorders>
+            <w:tcMar>
+              <w:top w:type="dxa" w:w="60"/>
+              <w:left w:type="dxa" w:w="100"/>
+              <w:bottom w:type="dxa" w:w="60"/>
+              <w:right w:type="dxa" w:w="100"/>
+            </w:tcMar>
+          </w:tcPr>
+          <w:p>
+            <w:r>
+              <w:rPr>
+                <w:sz w:val="19"/>
+                <w:szCs w:val="19"/>
+              </w:rPr>
+              <w:t xml:space="preserve">Objek tiruan untuk pengujian</w:t>
+            </w:r>
+          </w:p>
+        </w:tc>
+      </w:tr>
+      <w:tr>
+        <w:trPr>
+          <w:tblHeader w:val="off"/>
+        </w:trPr>
+        <w:tc>
+          <w:tcPr>
+            <w:tcW w:type="dxa" w:w="2948"/>
+            <w:tcBorders>
+              <w:top w:val="single" w:color="BFBFBF" w:sz="4"/>
+              <w:left w:val="single" w:color="BFBFBF" w:sz="4"/>
+              <w:bottom w:val="single" w:color="BFBFBF" w:sz="4"/>
+              <w:right w:val="single" w:color="BFBFBF" w:sz="4"/>
+            </w:tcBorders>
+            <w:tcMar>
+              <w:top w:type="dxa" w:w="60"/>
+              <w:left w:type="dxa" w:w="100"/>
+              <w:bottom w:type="dxa" w:w="60"/>
+              <w:right w:type="dxa" w:w="100"/>
+            </w:tcMar>
+          </w:tcPr>
+          <w:p>
+            <w:r>
+              <w:rPr>
+                <w:sz w:val="19"/>
+                <w:szCs w:val="19"/>
+              </w:rPr>
+              <w:t xml:space="preserve">nunomaduro/collision</w:t>
+            </w:r>
+          </w:p>
+        </w:tc>
+        <w:tc>
+          <w:tcPr>
+            <w:tcW w:type="dxa" w:w="793"/>
+            <w:tcBorders>
+              <w:top w:val="single" w:color="BFBFBF" w:sz="4"/>
+              <w:left w:val="single" w:color="BFBFBF" w:sz="4"/>
+              <w:bottom w:val="single" w:color="BFBFBF" w:sz="4"/>
+              <w:right w:val="single" w:color="BFBFBF" w:sz="4"/>
+            </w:tcBorders>
+            <w:tcMar>
+              <w:top w:type="dxa" w:w="60"/>
+              <w:left w:type="dxa" w:w="100"/>
+              <w:bottom w:type="dxa" w:w="60"/>
+              <w:right w:type="dxa" w:w="100"/>
+            </w:tcMar>
+          </w:tcPr>
+          <w:p>
+            <w:r>
+              <w:rPr>
+                <w:sz w:val="19"/>
+                <w:szCs w:val="19"/>
+              </w:rPr>
+              <w:t xml:space="preserve">8.9.5</w:t>
+            </w:r>
+          </w:p>
+        </w:tc>
+        <w:tc>
+          <w:tcPr>
+            <w:tcW w:type="dxa" w:w="5897"/>
+            <w:tcBorders>
+              <w:top w:val="single" w:color="BFBFBF" w:sz="4"/>
+              <w:left w:val="single" w:color="BFBFBF" w:sz="4"/>
+              <w:bottom w:val="single" w:color="BFBFBF" w:sz="4"/>
+              <w:right w:val="single" w:color="BFBFBF" w:sz="4"/>
+            </w:tcBorders>
+            <w:tcMar>
+              <w:top w:type="dxa" w:w="60"/>
+              <w:left w:type="dxa" w:w="100"/>
+              <w:bottom w:type="dxa" w:w="60"/>
+              <w:right w:type="dxa" w:w="100"/>
+            </w:tcMar>
+          </w:tcPr>
+          <w:p>
+            <w:r>
+              <w:rPr>
+                <w:sz w:val="19"/>
+                <w:szCs w:val="19"/>
+              </w:rPr>
+              <w:t xml:space="preserve">Tampilan error di terminal</w:t>
+            </w:r>
+          </w:p>
+        </w:tc>
+      </w:tr>
+    </w:tbl>
+    <w:p>
+      <w:pPr>
+        <w:spacing w:after="60"/>
+      </w:pPr>
+    </w:p>
+    <w:p>
+      <w:r>
+        <w:rPr>
+          <w:b/>
+          <w:bCs/>
+        </w:rPr>
+        <w:t xml:space="preserve">d. Tampilan dan JavaScript (npm)</w:t>
+      </w:r>
+    </w:p>
+    <w:tbl>
+      <w:tblPr>
+        <w:tblW w:type="dxa" w:w="9638"/>
+        <w:tblBorders>
+          <w:top w:val="single" w:color="auto" w:sz="4"/>
+          <w:left w:val="single" w:color="auto" w:sz="4"/>
+          <w:bottom w:val="single" w:color="auto" w:sz="4"/>
+          <w:right w:val="single" w:color="auto" w:sz="4"/>
+          <w:insideH w:val="single" w:color="auto" w:sz="4"/>
+          <w:insideV w:val="single" w:color="auto" w:sz="4"/>
+        </w:tblBorders>
+      </w:tblPr>
+      <w:tblGrid>
+        <w:gridCol w:w="4209"/>
+        <w:gridCol w:w="775"/>
+        <w:gridCol w:w="4654"/>
+      </w:tblGrid>
+      <w:tr>
+        <w:trPr>
+          <w:tblHeader/>
+        </w:trPr>
+        <w:tc>
+          <w:tcPr>
+            <w:tcW w:type="dxa" w:w="4209"/>
+            <w:tcBorders>
+              <w:top w:val="single" w:color="BFBFBF" w:sz="4"/>
+              <w:left w:val="single" w:color="BFBFBF" w:sz="4"/>
+              <w:bottom w:val="single" w:color="BFBFBF" w:sz="4"/>
+              <w:right w:val="single" w:color="BFBFBF" w:sz="4"/>
+            </w:tcBorders>
+            <w:shd w:fill="1F4E79" w:color="auto" w:val="clear"/>
+            <w:tcMar>
+              <w:top w:type="dxa" w:w="60"/>
+              <w:left w:type="dxa" w:w="100"/>
+              <w:bottom w:type="dxa" w:w="60"/>
+              <w:right w:type="dxa" w:w="100"/>
+            </w:tcMar>
+          </w:tcPr>
+          <w:p>
+            <w:r>
+              <w:rPr>
+                <w:b/>
+                <w:bCs/>
+                <w:color w:val="FFFFFF"/>
+                <w:sz w:val="19"/>
+                <w:szCs w:val="19"/>
+              </w:rPr>
+              <w:t xml:space="preserve">Alat</w:t>
+            </w:r>
+          </w:p>
+        </w:tc>
+        <w:tc>
+          <w:tcPr>
+            <w:tcW w:type="dxa" w:w="775"/>
+            <w:tcBorders>
+              <w:top w:val="single" w:color="BFBFBF" w:sz="4"/>
+              <w:left w:val="single" w:color="BFBFBF" w:sz="4"/>
+              <w:bottom w:val="single" w:color="BFBFBF" w:sz="4"/>
+              <w:right w:val="single" w:color="BFBFBF" w:sz="4"/>
+            </w:tcBorders>
+            <w:shd w:fill="1F4E79" w:color="auto" w:val="clear"/>
+            <w:tcMar>
+              <w:top w:type="dxa" w:w="60"/>
+              <w:left w:type="dxa" w:w="100"/>
+              <w:bottom w:type="dxa" w:w="60"/>
+              <w:right w:type="dxa" w:w="100"/>
+            </w:tcMar>
+          </w:tcPr>
+          <w:p>
+            <w:r>
+              <w:rPr>
+                <w:b/>
+                <w:bCs/>
+                <w:color w:val="FFFFFF"/>
+                <w:sz w:val="19"/>
+                <w:szCs w:val="19"/>
+              </w:rPr>
+              <w:t xml:space="preserve">Versi</w:t>
+            </w:r>
+          </w:p>
+        </w:tc>
+        <w:tc>
+          <w:tcPr>
+            <w:tcW w:type="dxa" w:w="4654"/>
+            <w:tcBorders>
+              <w:top w:val="single" w:color="BFBFBF" w:sz="4"/>
+              <w:left w:val="single" w:color="BFBFBF" w:sz="4"/>
+              <w:bottom w:val="single" w:color="BFBFBF" w:sz="4"/>
+              <w:right w:val="single" w:color="BFBFBF" w:sz="4"/>
+            </w:tcBorders>
+            <w:shd w:fill="1F4E79" w:color="auto" w:val="clear"/>
+            <w:tcMar>
+              <w:top w:type="dxa" w:w="60"/>
+              <w:left w:type="dxa" w:w="100"/>
+              <w:bottom w:type="dxa" w:w="60"/>
+              <w:right w:type="dxa" w:w="100"/>
+            </w:tcMar>
+          </w:tcPr>
+          <w:p>
+            <w:r>
+              <w:rPr>
+                <w:b/>
+                <w:bCs/>
+                <w:color w:val="FFFFFF"/>
+                <w:sz w:val="19"/>
+                <w:szCs w:val="19"/>
+              </w:rPr>
+              <w:t xml:space="preserve">Keterangan</w:t>
+            </w:r>
+          </w:p>
+        </w:tc>
+      </w:tr>
+      <w:tr>
+        <w:trPr>
+          <w:tblHeader w:val="off"/>
+        </w:trPr>
+        <w:tc>
+          <w:tcPr>
+            <w:tcW w:type="dxa" w:w="4209"/>
+            <w:tcBorders>
+              <w:top w:val="single" w:color="BFBFBF" w:sz="4"/>
+              <w:left w:val="single" w:color="BFBFBF" w:sz="4"/>
+              <w:bottom w:val="single" w:color="BFBFBF" w:sz="4"/>
+              <w:right w:val="single" w:color="BFBFBF" w:sz="4"/>
+            </w:tcBorders>
+            <w:tcMar>
+              <w:top w:type="dxa" w:w="60"/>
+              <w:left w:type="dxa" w:w="100"/>
+              <w:bottom w:type="dxa" w:w="60"/>
+              <w:right w:type="dxa" w:w="100"/>
+            </w:tcMar>
+          </w:tcPr>
+          <w:p>
+            <w:r>
+              <w:rPr>
+                <w:sz w:val="19"/>
+                <w:szCs w:val="19"/>
+              </w:rPr>
+              <w:t xml:space="preserve">Node.js</w:t>
+            </w:r>
+          </w:p>
+        </w:tc>
+        <w:tc>
+          <w:tcPr>
+            <w:tcW w:type="dxa" w:w="775"/>
+            <w:tcBorders>
+              <w:top w:val="single" w:color="BFBFBF" w:sz="4"/>
+              <w:left w:val="single" w:color="BFBFBF" w:sz="4"/>
+              <w:bottom w:val="single" w:color="BFBFBF" w:sz="4"/>
+              <w:right w:val="single" w:color="BFBFBF" w:sz="4"/>
+            </w:tcBorders>
+            <w:tcMar>
+              <w:top w:type="dxa" w:w="60"/>
+              <w:left w:type="dxa" w:w="100"/>
+              <w:bottom w:type="dxa" w:w="60"/>
+              <w:right w:type="dxa" w:w="100"/>
+            </w:tcMar>
+          </w:tcPr>
+          <w:p>
+            <w:r>
+              <w:rPr>
+                <w:sz w:val="19"/>
+                <w:szCs w:val="19"/>
+              </w:rPr>
+              <w:t xml:space="preserve">26.7.0</w:t>
+            </w:r>
+          </w:p>
+        </w:tc>
+        <w:tc>
+          <w:tcPr>
+            <w:tcW w:type="dxa" w:w="4654"/>
+            <w:tcBorders>
+              <w:top w:val="single" w:color="BFBFBF" w:sz="4"/>
+              <w:left w:val="single" w:color="BFBFBF" w:sz="4"/>
+              <w:bottom w:val="single" w:color="BFBFBF" w:sz="4"/>
+              <w:right w:val="single" w:color="BFBFBF" w:sz="4"/>
+            </w:tcBorders>
+            <w:tcMar>
+              <w:top w:type="dxa" w:w="60"/>
+              <w:left w:type="dxa" w:w="100"/>
+              <w:bottom w:type="dxa" w:w="60"/>
+              <w:right w:type="dxa" w:w="100"/>
+            </w:tcMar>
+          </w:tcPr>
+          <w:p>
+            <w:r>
+              <w:rPr>
+                <w:sz w:val="19"/>
+                <w:szCs w:val="19"/>
+              </w:rPr>
+              <w:t xml:space="preserve">Menjalankan alat build tampilan</w:t>
+            </w:r>
+          </w:p>
+        </w:tc>
+      </w:tr>
+      <w:tr>
+        <w:trPr>
+          <w:tblHeader w:val="off"/>
+        </w:trPr>
+        <w:tc>
+          <w:tcPr>
+            <w:tcW w:type="dxa" w:w="4209"/>
+            <w:tcBorders>
+              <w:top w:val="single" w:color="BFBFBF" w:sz="4"/>
+              <w:left w:val="single" w:color="BFBFBF" w:sz="4"/>
+              <w:bottom w:val="single" w:color="BFBFBF" w:sz="4"/>
+              <w:right w:val="single" w:color="BFBFBF" w:sz="4"/>
+            </w:tcBorders>
+            <w:tcMar>
+              <w:top w:type="dxa" w:w="60"/>
+              <w:left w:type="dxa" w:w="100"/>
+              <w:bottom w:type="dxa" w:w="60"/>
+              <w:right w:type="dxa" w:w="100"/>
+            </w:tcMar>
+          </w:tcPr>
+          <w:p>
+            <w:r>
+              <w:rPr>
+                <w:sz w:val="19"/>
+                <w:szCs w:val="19"/>
+              </w:rPr>
+              <w:t xml:space="preserve">npm</w:t>
+            </w:r>
+          </w:p>
+        </w:tc>
+        <w:tc>
+          <w:tcPr>
+            <w:tcW w:type="dxa" w:w="775"/>
+            <w:tcBorders>
+              <w:top w:val="single" w:color="BFBFBF" w:sz="4"/>
+              <w:left w:val="single" w:color="BFBFBF" w:sz="4"/>
+              <w:bottom w:val="single" w:color="BFBFBF" w:sz="4"/>
+              <w:right w:val="single" w:color="BFBFBF" w:sz="4"/>
+            </w:tcBorders>
+            <w:tcMar>
+              <w:top w:type="dxa" w:w="60"/>
+              <w:left w:type="dxa" w:w="100"/>
+              <w:bottom w:type="dxa" w:w="60"/>
+              <w:right w:type="dxa" w:w="100"/>
+            </w:tcMar>
+          </w:tcPr>
+          <w:p>
+            <w:r>
+              <w:rPr>
+                <w:sz w:val="19"/>
+                <w:szCs w:val="19"/>
+              </w:rPr>
+              <w:t xml:space="preserve">11.19.0</w:t>
+            </w:r>
+          </w:p>
+        </w:tc>
+        <w:tc>
+          <w:tcPr>
+            <w:tcW w:type="dxa" w:w="4654"/>
+            <w:tcBorders>
+              <w:top w:val="single" w:color="BFBFBF" w:sz="4"/>
+              <w:left w:val="single" w:color="BFBFBF" w:sz="4"/>
+              <w:bottom w:val="single" w:color="BFBFBF" w:sz="4"/>
+              <w:right w:val="single" w:color="BFBFBF" w:sz="4"/>
+            </w:tcBorders>
+            <w:tcMar>
+              <w:top w:type="dxa" w:w="60"/>
+              <w:left w:type="dxa" w:w="100"/>
+              <w:bottom w:type="dxa" w:w="60"/>
+              <w:right w:type="dxa" w:w="100"/>
+            </w:tcMar>
+          </w:tcPr>
+          <w:p>
+            <w:r>
+              <w:rPr>
+                <w:sz w:val="19"/>
+                <w:szCs w:val="19"/>
+              </w:rPr>
+              <w:t xml:space="preserve">Pengelola pustaka JavaScript</w:t>
+            </w:r>
+          </w:p>
+        </w:tc>
+      </w:tr>
+      <w:tr>
+        <w:trPr>
+          <w:tblHeader w:val="off"/>
+        </w:trPr>
+        <w:tc>
+          <w:tcPr>
+            <w:tcW w:type="dxa" w:w="4209"/>
+            <w:tcBorders>
+              <w:top w:val="single" w:color="BFBFBF" w:sz="4"/>
+              <w:left w:val="single" w:color="BFBFBF" w:sz="4"/>
+              <w:bottom w:val="single" w:color="BFBFBF" w:sz="4"/>
+              <w:right w:val="single" w:color="BFBFBF" w:sz="4"/>
+            </w:tcBorders>
+            <w:tcMar>
+              <w:top w:type="dxa" w:w="60"/>
+              <w:left w:type="dxa" w:w="100"/>
+              <w:bottom w:type="dxa" w:w="60"/>
+              <w:right w:type="dxa" w:w="100"/>
+            </w:tcMar>
+          </w:tcPr>
+          <w:p>
+            <w:r>
+              <w:rPr>
+                <w:sz w:val="19"/>
+                <w:szCs w:val="19"/>
+              </w:rPr>
+              <w:t xml:space="preserve">Vite</w:t>
+            </w:r>
+          </w:p>
+        </w:tc>
+        <w:tc>
+          <w:tcPr>
+            <w:tcW w:type="dxa" w:w="775"/>
+            <w:tcBorders>
+              <w:top w:val="single" w:color="BFBFBF" w:sz="4"/>
+              <w:left w:val="single" w:color="BFBFBF" w:sz="4"/>
+              <w:bottom w:val="single" w:color="BFBFBF" w:sz="4"/>
+              <w:right w:val="single" w:color="BFBFBF" w:sz="4"/>
+            </w:tcBorders>
+            <w:tcMar>
+              <w:top w:type="dxa" w:w="60"/>
+              <w:left w:type="dxa" w:w="100"/>
+              <w:bottom w:type="dxa" w:w="60"/>
+              <w:right w:type="dxa" w:w="100"/>
+            </w:tcMar>
+          </w:tcPr>
+          <w:p>
+            <w:r>
+              <w:rPr>
+                <w:sz w:val="19"/>
+                <w:szCs w:val="19"/>
+              </w:rPr>
+              <w:t xml:space="preserve">7.3.6</w:t>
+            </w:r>
+          </w:p>
+        </w:tc>
+        <w:tc>
+          <w:tcPr>
+            <w:tcW w:type="dxa" w:w="4654"/>
+            <w:tcBorders>
+              <w:top w:val="single" w:color="BFBFBF" w:sz="4"/>
+              <w:left w:val="single" w:color="BFBFBF" w:sz="4"/>
+              <w:bottom w:val="single" w:color="BFBFBF" w:sz="4"/>
+              <w:right w:val="single" w:color="BFBFBF" w:sz="4"/>
+            </w:tcBorders>
+            <w:tcMar>
+              <w:top w:type="dxa" w:w="60"/>
+              <w:left w:type="dxa" w:w="100"/>
+              <w:bottom w:type="dxa" w:w="60"/>
+              <w:right w:type="dxa" w:w="100"/>
+            </w:tcMar>
+          </w:tcPr>
+          <w:p>
+            <w:r>
+              <w:rPr>
+                <w:sz w:val="19"/>
+                <w:szCs w:val="19"/>
+              </w:rPr>
+              <w:t xml:space="preserve">Build CSS dan JavaScript ke </w:t>
+            </w:r>
+            <w:r>
+              <w:rPr>
+                <w:rFonts w:ascii="Consolas" w:cs="Consolas" w:eastAsia="Consolas" w:hAnsi="Consolas"/>
+                <w:color w:val="1F4E79"/>
+                <w:sz w:val="17"/>
+                <w:szCs w:val="17"/>
+              </w:rPr>
+              <w:t xml:space="preserve">public/build</w:t>
+            </w:r>
+          </w:p>
+        </w:tc>
+      </w:tr>
+      <w:tr>
+        <w:trPr>
+          <w:tblHeader w:val="off"/>
+        </w:trPr>
+        <w:tc>
+          <w:tcPr>
+            <w:tcW w:type="dxa" w:w="4209"/>
+            <w:tcBorders>
+              <w:top w:val="single" w:color="BFBFBF" w:sz="4"/>
+              <w:left w:val="single" w:color="BFBFBF" w:sz="4"/>
+              <w:bottom w:val="single" w:color="BFBFBF" w:sz="4"/>
+              <w:right w:val="single" w:color="BFBFBF" w:sz="4"/>
+            </w:tcBorders>
+            <w:tcMar>
+              <w:top w:type="dxa" w:w="60"/>
+              <w:left w:type="dxa" w:w="100"/>
+              <w:bottom w:type="dxa" w:w="60"/>
+              <w:right w:type="dxa" w:w="100"/>
+            </w:tcMar>
+          </w:tcPr>
+          <w:p>
+            <w:r>
+              <w:rPr>
+                <w:sz w:val="19"/>
+                <w:szCs w:val="19"/>
+              </w:rPr>
+              <w:t xml:space="preserve">laravel-vite-plugin</w:t>
+            </w:r>
+          </w:p>
+        </w:tc>
+        <w:tc>
+          <w:tcPr>
+            <w:tcW w:type="dxa" w:w="775"/>
+            <w:tcBorders>
+              <w:top w:val="single" w:color="BFBFBF" w:sz="4"/>
+              <w:left w:val="single" w:color="BFBFBF" w:sz="4"/>
+              <w:bottom w:val="single" w:color="BFBFBF" w:sz="4"/>
+              <w:right w:val="single" w:color="BFBFBF" w:sz="4"/>
+            </w:tcBorders>
+            <w:tcMar>
+              <w:top w:type="dxa" w:w="60"/>
+              <w:left w:type="dxa" w:w="100"/>
+              <w:bottom w:type="dxa" w:w="60"/>
+              <w:right w:type="dxa" w:w="100"/>
+            </w:tcMar>
+          </w:tcPr>
+          <w:p>
+            <w:r>
+              <w:rPr>
+                <w:sz w:val="19"/>
+                <w:szCs w:val="19"/>
+              </w:rPr>
+              <w:t xml:space="preserve">2.1.0</w:t>
+            </w:r>
+          </w:p>
+        </w:tc>
+        <w:tc>
+          <w:tcPr>
+            <w:tcW w:type="dxa" w:w="4654"/>
+            <w:tcBorders>
+              <w:top w:val="single" w:color="BFBFBF" w:sz="4"/>
+              <w:left w:val="single" w:color="BFBFBF" w:sz="4"/>
+              <w:bottom w:val="single" w:color="BFBFBF" w:sz="4"/>
+              <w:right w:val="single" w:color="BFBFBF" w:sz="4"/>
+            </w:tcBorders>
+            <w:tcMar>
+              <w:top w:type="dxa" w:w="60"/>
+              <w:left w:type="dxa" w:w="100"/>
+              <w:bottom w:type="dxa" w:w="60"/>
+              <w:right w:type="dxa" w:w="100"/>
+            </w:tcMar>
+          </w:tcPr>
+          <w:p>
+            <w:r>
+              <w:rPr>
+                <w:sz w:val="19"/>
+                <w:szCs w:val="19"/>
+              </w:rPr>
+              <w:t xml:space="preserve">Penghubung Vite dengan Laravel</w:t>
+            </w:r>
+          </w:p>
+        </w:tc>
+      </w:tr>
+      <w:tr>
+        <w:trPr>
+          <w:tblHeader w:val="off"/>
+        </w:trPr>
+        <w:tc>
+          <w:tcPr>
+            <w:tcW w:type="dxa" w:w="4209"/>
+            <w:tcBorders>
+              <w:top w:val="single" w:color="BFBFBF" w:sz="4"/>
+              <w:left w:val="single" w:color="BFBFBF" w:sz="4"/>
+              <w:bottom w:val="single" w:color="BFBFBF" w:sz="4"/>
+              <w:right w:val="single" w:color="BFBFBF" w:sz="4"/>
+            </w:tcBorders>
+            <w:tcMar>
+              <w:top w:type="dxa" w:w="60"/>
+              <w:left w:type="dxa" w:w="100"/>
+              <w:bottom w:type="dxa" w:w="60"/>
+              <w:right w:type="dxa" w:w="100"/>
+            </w:tcMar>
+          </w:tcPr>
+          <w:p>
+            <w:r>
+              <w:rPr>
+                <w:sz w:val="19"/>
+                <w:szCs w:val="19"/>
+              </w:rPr>
+              <w:t xml:space="preserve">Tailwind CSS (+ @tailwindcss/vite)</w:t>
+            </w:r>
+          </w:p>
+        </w:tc>
+        <w:tc>
+          <w:tcPr>
+            <w:tcW w:type="dxa" w:w="775"/>
+            <w:tcBorders>
+              <w:top w:val="single" w:color="BFBFBF" w:sz="4"/>
+              <w:left w:val="single" w:color="BFBFBF" w:sz="4"/>
+              <w:bottom w:val="single" w:color="BFBFBF" w:sz="4"/>
+              <w:right w:val="single" w:color="BFBFBF" w:sz="4"/>
+            </w:tcBorders>
+            <w:tcMar>
+              <w:top w:type="dxa" w:w="60"/>
+              <w:left w:type="dxa" w:w="100"/>
+              <w:bottom w:type="dxa" w:w="60"/>
+              <w:right w:type="dxa" w:w="100"/>
+            </w:tcMar>
+          </w:tcPr>
+          <w:p>
+            <w:r>
+              <w:rPr>
+                <w:sz w:val="19"/>
+                <w:szCs w:val="19"/>
+              </w:rPr>
+              <w:t xml:space="preserve">4.3.3</w:t>
+            </w:r>
+          </w:p>
+        </w:tc>
+        <w:tc>
+          <w:tcPr>
+            <w:tcW w:type="dxa" w:w="4654"/>
+            <w:tcBorders>
+              <w:top w:val="single" w:color="BFBFBF" w:sz="4"/>
+              <w:left w:val="single" w:color="BFBFBF" w:sz="4"/>
+              <w:bottom w:val="single" w:color="BFBFBF" w:sz="4"/>
+              <w:right w:val="single" w:color="BFBFBF" w:sz="4"/>
+            </w:tcBorders>
+            <w:tcMar>
+              <w:top w:type="dxa" w:w="60"/>
+              <w:left w:type="dxa" w:w="100"/>
+              <w:bottom w:type="dxa" w:w="60"/>
+              <w:right w:type="dxa" w:w="100"/>
+            </w:tcMar>
+          </w:tcPr>
+          <w:p>
+            <w:r>
+              <w:rPr>
+                <w:sz w:val="19"/>
+                <w:szCs w:val="19"/>
+              </w:rPr>
+              <w:t xml:space="preserve">Kerangka gaya tampilan</w:t>
+            </w:r>
+          </w:p>
+        </w:tc>
+      </w:tr>
+      <w:tr>
+        <w:trPr>
+          <w:tblHeader w:val="off"/>
+        </w:trPr>
+        <w:tc>
+          <w:tcPr>
+            <w:tcW w:type="dxa" w:w="4209"/>
+            <w:tcBorders>
+              <w:top w:val="single" w:color="BFBFBF" w:sz="4"/>
+              <w:left w:val="single" w:color="BFBFBF" w:sz="4"/>
+              <w:bottom w:val="single" w:color="BFBFBF" w:sz="4"/>
+              <w:right w:val="single" w:color="BFBFBF" w:sz="4"/>
+            </w:tcBorders>
+            <w:tcMar>
+              <w:top w:type="dxa" w:w="60"/>
+              <w:left w:type="dxa" w:w="100"/>
+              <w:bottom w:type="dxa" w:w="60"/>
+              <w:right w:type="dxa" w:w="100"/>
+            </w:tcMar>
+          </w:tcPr>
+          <w:p>
+            <w:r>
+              <w:rPr>
+                <w:sz w:val="19"/>
+                <w:szCs w:val="19"/>
+              </w:rPr>
+              <w:t xml:space="preserve">Hotwire Turbo (@hotwired/turbo)</w:t>
+            </w:r>
+          </w:p>
+        </w:tc>
+        <w:tc>
+          <w:tcPr>
+            <w:tcW w:type="dxa" w:w="775"/>
+            <w:tcBorders>
+              <w:top w:val="single" w:color="BFBFBF" w:sz="4"/>
+              <w:left w:val="single" w:color="BFBFBF" w:sz="4"/>
+              <w:bottom w:val="single" w:color="BFBFBF" w:sz="4"/>
+              <w:right w:val="single" w:color="BFBFBF" w:sz="4"/>
+            </w:tcBorders>
+            <w:tcMar>
+              <w:top w:type="dxa" w:w="60"/>
+              <w:left w:type="dxa" w:w="100"/>
+              <w:bottom w:type="dxa" w:w="60"/>
+              <w:right w:type="dxa" w:w="100"/>
+            </w:tcMar>
+          </w:tcPr>
+          <w:p>
+            <w:r>
+              <w:rPr>
+                <w:sz w:val="19"/>
+                <w:szCs w:val="19"/>
+              </w:rPr>
+              <w:t xml:space="preserve">8.0.23</w:t>
+            </w:r>
+          </w:p>
+        </w:tc>
+        <w:tc>
+          <w:tcPr>
+            <w:tcW w:type="dxa" w:w="4654"/>
+            <w:tcBorders>
+              <w:top w:val="single" w:color="BFBFBF" w:sz="4"/>
+              <w:left w:val="single" w:color="BFBFBF" w:sz="4"/>
+              <w:bottom w:val="single" w:color="BFBFBF" w:sz="4"/>
+              <w:right w:val="single" w:color="BFBFBF" w:sz="4"/>
+            </w:tcBorders>
+            <w:tcMar>
+              <w:top w:type="dxa" w:w="60"/>
+              <w:left w:type="dxa" w:w="100"/>
+              <w:bottom w:type="dxa" w:w="60"/>
+              <w:right w:type="dxa" w:w="100"/>
+            </w:tcMar>
+          </w:tcPr>
+          <w:p>
+            <w:r>
+              <w:rPr>
+                <w:sz w:val="19"/>
+                <w:szCs w:val="19"/>
+              </w:rPr>
+              <w:t xml:space="preserve">Pindah halaman tanpa muat ulang dan popup</w:t>
+            </w:r>
+          </w:p>
+        </w:tc>
+      </w:tr>
+      <w:tr>
+        <w:trPr>
+          <w:tblHeader w:val="off"/>
+        </w:trPr>
+        <w:tc>
+          <w:tcPr>
+            <w:tcW w:type="dxa" w:w="4209"/>
+            <w:tcBorders>
+              <w:top w:val="single" w:color="BFBFBF" w:sz="4"/>
+              <w:left w:val="single" w:color="BFBFBF" w:sz="4"/>
+              <w:bottom w:val="single" w:color="BFBFBF" w:sz="4"/>
+              <w:right w:val="single" w:color="BFBFBF" w:sz="4"/>
+            </w:tcBorders>
+            <w:tcMar>
+              <w:top w:type="dxa" w:w="60"/>
+              <w:left w:type="dxa" w:w="100"/>
+              <w:bottom w:type="dxa" w:w="60"/>
+              <w:right w:type="dxa" w:w="100"/>
+            </w:tcMar>
+          </w:tcPr>
+          <w:p>
+            <w:r>
+              <w:rPr>
+                <w:sz w:val="19"/>
+                <w:szCs w:val="19"/>
+              </w:rPr>
+              <w:t xml:space="preserve">@fontsource-variable/plus-jakarta-sans</w:t>
+            </w:r>
+          </w:p>
+        </w:tc>
+        <w:tc>
+          <w:tcPr>
+            <w:tcW w:type="dxa" w:w="775"/>
+            <w:tcBorders>
+              <w:top w:val="single" w:color="BFBFBF" w:sz="4"/>
+              <w:left w:val="single" w:color="BFBFBF" w:sz="4"/>
+              <w:bottom w:val="single" w:color="BFBFBF" w:sz="4"/>
+              <w:right w:val="single" w:color="BFBFBF" w:sz="4"/>
+            </w:tcBorders>
+            <w:tcMar>
+              <w:top w:type="dxa" w:w="60"/>
+              <w:left w:type="dxa" w:w="100"/>
+              <w:bottom w:type="dxa" w:w="60"/>
+              <w:right w:type="dxa" w:w="100"/>
+            </w:tcMar>
+          </w:tcPr>
+          <w:p>
+            <w:r>
+              <w:rPr>
+                <w:sz w:val="19"/>
+                <w:szCs w:val="19"/>
+              </w:rPr>
+              <w:t xml:space="preserve">5.3.0</w:t>
+            </w:r>
+          </w:p>
+        </w:tc>
+        <w:tc>
+          <w:tcPr>
+            <w:tcW w:type="dxa" w:w="4654"/>
+            <w:tcBorders>
+              <w:top w:val="single" w:color="BFBFBF" w:sz="4"/>
+              <w:left w:val="single" w:color="BFBFBF" w:sz="4"/>
+              <w:bottom w:val="single" w:color="BFBFBF" w:sz="4"/>
+              <w:right w:val="single" w:color="BFBFBF" w:sz="4"/>
+            </w:tcBorders>
+            <w:tcMar>
+              <w:top w:type="dxa" w:w="60"/>
+              <w:left w:type="dxa" w:w="100"/>
+              <w:bottom w:type="dxa" w:w="60"/>
+              <w:right w:type="dxa" w:w="100"/>
+            </w:tcMar>
+          </w:tcPr>
+          <w:p>
+            <w:r>
+              <w:rPr>
+                <w:sz w:val="19"/>
+                <w:szCs w:val="19"/>
+              </w:rPr>
+              <w:t xml:space="preserve">Font aplikasi (dibundel, tanpa internet)</w:t>
+            </w:r>
+          </w:p>
+        </w:tc>
+      </w:tr>
+      <w:tr>
+        <w:trPr>
+          <w:tblHeader w:val="off"/>
+        </w:trPr>
+        <w:tc>
+          <w:tcPr>
+            <w:tcW w:type="dxa" w:w="4209"/>
+            <w:tcBorders>
+              <w:top w:val="single" w:color="BFBFBF" w:sz="4"/>
+              <w:left w:val="single" w:color="BFBFBF" w:sz="4"/>
+              <w:bottom w:val="single" w:color="BFBFBF" w:sz="4"/>
+              <w:right w:val="single" w:color="BFBFBF" w:sz="4"/>
+            </w:tcBorders>
+            <w:tcMar>
+              <w:top w:type="dxa" w:w="60"/>
+              <w:left w:type="dxa" w:w="100"/>
+              <w:bottom w:type="dxa" w:w="60"/>
+              <w:right w:type="dxa" w:w="100"/>
+            </w:tcMar>
+          </w:tcPr>
+          <w:p>
+            <w:r>
+              <w:rPr>
+                <w:sz w:val="19"/>
+                <w:szCs w:val="19"/>
+              </w:rPr>
+              <w:t xml:space="preserve">axios</w:t>
+            </w:r>
+          </w:p>
+        </w:tc>
+        <w:tc>
+          <w:tcPr>
+            <w:tcW w:type="dxa" w:w="775"/>
+            <w:tcBorders>
+              <w:top w:val="single" w:color="BFBFBF" w:sz="4"/>
+              <w:left w:val="single" w:color="BFBFBF" w:sz="4"/>
+              <w:bottom w:val="single" w:color="BFBFBF" w:sz="4"/>
+              <w:right w:val="single" w:color="BFBFBF" w:sz="4"/>
+            </w:tcBorders>
+            <w:tcMar>
+              <w:top w:type="dxa" w:w="60"/>
+              <w:left w:type="dxa" w:w="100"/>
+              <w:bottom w:type="dxa" w:w="60"/>
+              <w:right w:type="dxa" w:w="100"/>
+            </w:tcMar>
+          </w:tcPr>
+          <w:p>
+            <w:r>
+              <w:rPr>
+                <w:sz w:val="19"/>
+                <w:szCs w:val="19"/>
+              </w:rPr>
+              <w:t xml:space="preserve">1.20.0</w:t>
+            </w:r>
+          </w:p>
+        </w:tc>
+        <w:tc>
+          <w:tcPr>
+            <w:tcW w:type="dxa" w:w="4654"/>
+            <w:tcBorders>
+              <w:top w:val="single" w:color="BFBFBF" w:sz="4"/>
+              <w:left w:val="single" w:color="BFBFBF" w:sz="4"/>
+              <w:bottom w:val="single" w:color="BFBFBF" w:sz="4"/>
+              <w:right w:val="single" w:color="BFBFBF" w:sz="4"/>
+            </w:tcBorders>
+            <w:tcMar>
+              <w:top w:type="dxa" w:w="60"/>
+              <w:left w:type="dxa" w:w="100"/>
+              <w:bottom w:type="dxa" w:w="60"/>
+              <w:right w:type="dxa" w:w="100"/>
+            </w:tcMar>
+          </w:tcPr>
+          <w:p>
+            <w:r>
+              <w:rPr>
+                <w:sz w:val="19"/>
+                <w:szCs w:val="19"/>
+              </w:rPr>
+              <w:t xml:space="preserve">Pustaka permintaan HTTP bawaan Laravel</w:t>
+            </w:r>
+          </w:p>
+        </w:tc>
+      </w:tr>
+    </w:tbl>
+    <w:p>
+      <w:pPr>
+        <w:spacing w:after="60"/>
+      </w:pPr>
+    </w:p>
+    <w:p>
+      <w:r>
+        <w:rPr>
+          <w:b/>
+          <w:bCs/>
+        </w:rPr>
+        <w:t xml:space="preserve">e. Layanan online (hosting)</w:t>
+      </w:r>
+    </w:p>
+    <w:tbl>
+      <w:tblPr>
+        <w:tblW w:type="dxa" w:w="9638"/>
+        <w:tblBorders>
+          <w:top w:val="single" w:color="auto" w:sz="4"/>
+          <w:left w:val="single" w:color="auto" w:sz="4"/>
+          <w:bottom w:val="single" w:color="auto" w:sz="4"/>
+          <w:right w:val="single" w:color="auto" w:sz="4"/>
+          <w:insideH w:val="single" w:color="auto" w:sz="4"/>
+          <w:insideV w:val="single" w:color="auto" w:sz="4"/>
+        </w:tblBorders>
+      </w:tblPr>
+      <w:tblGrid>
+        <w:gridCol w:w="1453"/>
+        <w:gridCol w:w="4589"/>
+        <w:gridCol w:w="3596"/>
+      </w:tblGrid>
+      <w:tr>
+        <w:trPr>
+          <w:tblHeader/>
+        </w:trPr>
+        <w:tc>
+          <w:tcPr>
+            <w:tcW w:type="dxa" w:w="1453"/>
+            <w:tcBorders>
+              <w:top w:val="single" w:color="BFBFBF" w:sz="4"/>
+              <w:left w:val="single" w:color="BFBFBF" w:sz="4"/>
+              <w:bottom w:val="single" w:color="BFBFBF" w:sz="4"/>
+              <w:right w:val="single" w:color="BFBFBF" w:sz="4"/>
+            </w:tcBorders>
+            <w:shd w:fill="1F4E79" w:color="auto" w:val="clear"/>
+            <w:tcMar>
+              <w:top w:type="dxa" w:w="60"/>
+              <w:left w:type="dxa" w:w="100"/>
+              <w:bottom w:type="dxa" w:w="60"/>
+              <w:right w:type="dxa" w:w="100"/>
+            </w:tcMar>
+          </w:tcPr>
+          <w:p>
+            <w:r>
+              <w:rPr>
+                <w:b/>
+                <w:bCs/>
+                <w:color w:val="FFFFFF"/>
+                <w:sz w:val="19"/>
+                <w:szCs w:val="19"/>
+              </w:rPr>
+              <w:t xml:space="preserve">Layanan</w:t>
+            </w:r>
+          </w:p>
+        </w:tc>
+        <w:tc>
+          <w:tcPr>
+            <w:tcW w:type="dxa" w:w="4589"/>
+            <w:tcBorders>
+              <w:top w:val="single" w:color="BFBFBF" w:sz="4"/>
+              <w:left w:val="single" w:color="BFBFBF" w:sz="4"/>
+              <w:bottom w:val="single" w:color="BFBFBF" w:sz="4"/>
+              <w:right w:val="single" w:color="BFBFBF" w:sz="4"/>
+            </w:tcBorders>
+            <w:shd w:fill="1F4E79" w:color="auto" w:val="clear"/>
+            <w:tcMar>
+              <w:top w:type="dxa" w:w="60"/>
+              <w:left w:type="dxa" w:w="100"/>
+              <w:bottom w:type="dxa" w:w="60"/>
+              <w:right w:type="dxa" w:w="100"/>
+            </w:tcMar>
+          </w:tcPr>
+          <w:p>
+            <w:r>
+              <w:rPr>
+                <w:b/>
+                <w:bCs/>
+                <w:color w:val="FFFFFF"/>
+                <w:sz w:val="19"/>
+                <w:szCs w:val="19"/>
+              </w:rPr>
+              <w:t xml:space="preserve">Versi / Paket</w:t>
+            </w:r>
+          </w:p>
+        </w:tc>
+        <w:tc>
+          <w:tcPr>
+            <w:tcW w:type="dxa" w:w="3596"/>
+            <w:tcBorders>
+              <w:top w:val="single" w:color="BFBFBF" w:sz="4"/>
+              <w:left w:val="single" w:color="BFBFBF" w:sz="4"/>
+              <w:bottom w:val="single" w:color="BFBFBF" w:sz="4"/>
+              <w:right w:val="single" w:color="BFBFBF" w:sz="4"/>
+            </w:tcBorders>
+            <w:shd w:fill="1F4E79" w:color="auto" w:val="clear"/>
+            <w:tcMar>
+              <w:top w:type="dxa" w:w="60"/>
+              <w:left w:type="dxa" w:w="100"/>
+              <w:bottom w:type="dxa" w:w="60"/>
+              <w:right w:type="dxa" w:w="100"/>
+            </w:tcMar>
+          </w:tcPr>
+          <w:p>
+            <w:r>
+              <w:rPr>
+                <w:b/>
+                <w:bCs/>
+                <w:color w:val="FFFFFF"/>
+                <w:sz w:val="19"/>
+                <w:szCs w:val="19"/>
+              </w:rPr>
+              <w:t xml:space="preserve">Keterangan</w:t>
+            </w:r>
+          </w:p>
+        </w:tc>
+      </w:tr>
+      <w:tr>
+        <w:trPr>
+          <w:tblHeader w:val="off"/>
+        </w:trPr>
+        <w:tc>
+          <w:tcPr>
+            <w:tcW w:type="dxa" w:w="1453"/>
+            <w:tcBorders>
+              <w:top w:val="single" w:color="BFBFBF" w:sz="4"/>
+              <w:left w:val="single" w:color="BFBFBF" w:sz="4"/>
+              <w:bottom w:val="single" w:color="BFBFBF" w:sz="4"/>
+              <w:right w:val="single" w:color="BFBFBF" w:sz="4"/>
+            </w:tcBorders>
+            <w:tcMar>
+              <w:top w:type="dxa" w:w="60"/>
+              <w:left w:type="dxa" w:w="100"/>
+              <w:bottom w:type="dxa" w:w="60"/>
+              <w:right w:type="dxa" w:w="100"/>
+            </w:tcMar>
+          </w:tcPr>
+          <w:p>
+            <w:r>
+              <w:rPr>
+                <w:sz w:val="19"/>
+                <w:szCs w:val="19"/>
+              </w:rPr>
+              <w:t xml:space="preserve">GitHub</w:t>
+            </w:r>
+          </w:p>
+        </w:tc>
+        <w:tc>
+          <w:tcPr>
+            <w:tcW w:type="dxa" w:w="4589"/>
+            <w:tcBorders>
+              <w:top w:val="single" w:color="BFBFBF" w:sz="4"/>
+              <w:left w:val="single" w:color="BFBFBF" w:sz="4"/>
+              <w:bottom w:val="single" w:color="BFBFBF" w:sz="4"/>
+              <w:right w:val="single" w:color="BFBFBF" w:sz="4"/>
+            </w:tcBorders>
+            <w:tcMar>
+              <w:top w:type="dxa" w:w="60"/>
+              <w:left w:type="dxa" w:w="100"/>
+              <w:bottom w:type="dxa" w:w="60"/>
+              <w:right w:type="dxa" w:w="100"/>
+            </w:tcMar>
+          </w:tcPr>
+          <w:p>
+            <w:r>
+              <w:rPr>
+                <w:sz w:val="19"/>
+                <w:szCs w:val="19"/>
+              </w:rPr>
+              <w:t xml:space="preserve">—</w:t>
+            </w:r>
+          </w:p>
+        </w:tc>
+        <w:tc>
+          <w:tcPr>
+            <w:tcW w:type="dxa" w:w="3596"/>
+            <w:tcBorders>
+              <w:top w:val="single" w:color="BFBFBF" w:sz="4"/>
+              <w:left w:val="single" w:color="BFBFBF" w:sz="4"/>
+              <w:bottom w:val="single" w:color="BFBFBF" w:sz="4"/>
+              <w:right w:val="single" w:color="BFBFBF" w:sz="4"/>
+            </w:tcBorders>
+            <w:tcMar>
+              <w:top w:type="dxa" w:w="60"/>
+              <w:left w:type="dxa" w:w="100"/>
+              <w:bottom w:type="dxa" w:w="60"/>
+              <w:right w:type="dxa" w:w="100"/>
+            </w:tcMar>
+          </w:tcPr>
+          <w:p>
+            <w:r>
+              <w:rPr>
+                <w:sz w:val="19"/>
+                <w:szCs w:val="19"/>
+              </w:rPr>
+              <w:t xml:space="preserve">Menyimpan kode (repository </w:t>
+            </w:r>
+            <w:r>
+              <w:rPr>
+                <w:rFonts w:ascii="Consolas" w:cs="Consolas" w:eastAsia="Consolas" w:hAnsi="Consolas"/>
+                <w:color w:val="1F4E79"/>
+                <w:sz w:val="17"/>
+                <w:szCs w:val="17"/>
+              </w:rPr>
+              <w:t xml:space="preserve">Ujikom-Inventaris</w:t>
+            </w:r>
+            <w:r>
+              <w:rPr>
+                <w:sz w:val="19"/>
+                <w:szCs w:val="19"/>
+              </w:rPr>
+              <w:t xml:space="preserve">)</w:t>
+            </w:r>
+          </w:p>
+        </w:tc>
+      </w:tr>
+      <w:tr>
+        <w:trPr>
+          <w:tblHeader w:val="off"/>
+        </w:trPr>
+        <w:tc>
+          <w:tcPr>
+            <w:tcW w:type="dxa" w:w="1453"/>
+            <w:tcBorders>
+              <w:top w:val="single" w:color="BFBFBF" w:sz="4"/>
+              <w:left w:val="single" w:color="BFBFBF" w:sz="4"/>
+              <w:bottom w:val="single" w:color="BFBFBF" w:sz="4"/>
+              <w:right w:val="single" w:color="BFBFBF" w:sz="4"/>
+            </w:tcBorders>
+            <w:tcMar>
+              <w:top w:type="dxa" w:w="60"/>
+              <w:left w:type="dxa" w:w="100"/>
+              <w:bottom w:type="dxa" w:w="60"/>
+              <w:right w:type="dxa" w:w="100"/>
+            </w:tcMar>
+          </w:tcPr>
+          <w:p>
+            <w:r>
+              <w:rPr>
+                <w:sz w:val="19"/>
+                <w:szCs w:val="19"/>
+              </w:rPr>
+              <w:t xml:space="preserve">Vercel</w:t>
+            </w:r>
+          </w:p>
+        </w:tc>
+        <w:tc>
+          <w:tcPr>
+            <w:tcW w:type="dxa" w:w="4589"/>
+            <w:tcBorders>
+              <w:top w:val="single" w:color="BFBFBF" w:sz="4"/>
+              <w:left w:val="single" w:color="BFBFBF" w:sz="4"/>
+              <w:bottom w:val="single" w:color="BFBFBF" w:sz="4"/>
+              <w:right w:val="single" w:color="BFBFBF" w:sz="4"/>
+            </w:tcBorders>
+            <w:tcMar>
+              <w:top w:type="dxa" w:w="60"/>
+              <w:left w:type="dxa" w:w="100"/>
+              <w:bottom w:type="dxa" w:w="60"/>
+              <w:right w:type="dxa" w:w="100"/>
+            </w:tcMar>
+          </w:tcPr>
+          <w:p>
+            <w:r>
+              <w:rPr>
+                <w:sz w:val="19"/>
+                <w:szCs w:val="19"/>
+              </w:rPr>
+              <w:t xml:space="preserve">Paket Hobby (gratis), runtime </w:t>
+            </w:r>
+            <w:r>
+              <w:rPr>
+                <w:rFonts w:ascii="Consolas" w:cs="Consolas" w:eastAsia="Consolas" w:hAnsi="Consolas"/>
+                <w:color w:val="1F4E79"/>
+                <w:sz w:val="17"/>
+                <w:szCs w:val="17"/>
+              </w:rPr>
+              <w:t xml:space="preserve">vercel-php@0.7.4</w:t>
+            </w:r>
+            <w:r>
+              <w:rPr>
+                <w:sz w:val="19"/>
+                <w:szCs w:val="19"/>
+              </w:rPr>
+              <w:t xml:space="preserve"> (PHP 8.3), region Singapura (</w:t>
+            </w:r>
+            <w:r>
+              <w:rPr>
+                <w:rFonts w:ascii="Consolas" w:cs="Consolas" w:eastAsia="Consolas" w:hAnsi="Consolas"/>
+                <w:color w:val="1F4E79"/>
+                <w:sz w:val="17"/>
+                <w:szCs w:val="17"/>
+              </w:rPr>
+              <w:t xml:space="preserve">sin1</w:t>
+            </w:r>
+            <w:r>
+              <w:rPr>
+                <w:sz w:val="19"/>
+                <w:szCs w:val="19"/>
+              </w:rPr>
+              <w:t xml:space="preserve">)</w:t>
+            </w:r>
+          </w:p>
+        </w:tc>
+        <w:tc>
+          <w:tcPr>
+            <w:tcW w:type="dxa" w:w="3596"/>
+            <w:tcBorders>
+              <w:top w:val="single" w:color="BFBFBF" w:sz="4"/>
+              <w:left w:val="single" w:color="BFBFBF" w:sz="4"/>
+              <w:bottom w:val="single" w:color="BFBFBF" w:sz="4"/>
+              <w:right w:val="single" w:color="BFBFBF" w:sz="4"/>
+            </w:tcBorders>
+            <w:tcMar>
+              <w:top w:type="dxa" w:w="60"/>
+              <w:left w:type="dxa" w:w="100"/>
+              <w:bottom w:type="dxa" w:w="60"/>
+              <w:right w:type="dxa" w:w="100"/>
+            </w:tcMar>
+          </w:tcPr>
+          <w:p>
+            <w:r>
+              <w:rPr>
+                <w:sz w:val="19"/>
+                <w:szCs w:val="19"/>
+              </w:rPr>
+              <w:t xml:space="preserve">Hosting aplikasi</w:t>
+            </w:r>
+          </w:p>
+        </w:tc>
+      </w:tr>
+      <w:tr>
+        <w:trPr>
+          <w:tblHeader w:val="off"/>
+        </w:trPr>
+        <w:tc>
+          <w:tcPr>
+            <w:tcW w:type="dxa" w:w="1453"/>
+            <w:tcBorders>
+              <w:top w:val="single" w:color="BFBFBF" w:sz="4"/>
+              <w:left w:val="single" w:color="BFBFBF" w:sz="4"/>
+              <w:bottom w:val="single" w:color="BFBFBF" w:sz="4"/>
+              <w:right w:val="single" w:color="BFBFBF" w:sz="4"/>
+            </w:tcBorders>
+            <w:tcMar>
+              <w:top w:type="dxa" w:w="60"/>
+              <w:left w:type="dxa" w:w="100"/>
+              <w:bottom w:type="dxa" w:w="60"/>
+              <w:right w:type="dxa" w:w="100"/>
+            </w:tcMar>
+          </w:tcPr>
+          <w:p>
+            <w:r>
+              <w:rPr>
+                <w:sz w:val="19"/>
+                <w:szCs w:val="19"/>
+              </w:rPr>
+              <w:t xml:space="preserve">Supabase PostgreSQL</w:t>
+            </w:r>
+          </w:p>
+        </w:tc>
+        <w:tc>
+          <w:tcPr>
+            <w:tcW w:type="dxa" w:w="4589"/>
+            <w:tcBorders>
+              <w:top w:val="single" w:color="BFBFBF" w:sz="4"/>
+              <w:left w:val="single" w:color="BFBFBF" w:sz="4"/>
+              <w:bottom w:val="single" w:color="BFBFBF" w:sz="4"/>
+              <w:right w:val="single" w:color="BFBFBF" w:sz="4"/>
+            </w:tcBorders>
+            <w:tcMar>
+              <w:top w:type="dxa" w:w="60"/>
+              <w:left w:type="dxa" w:w="100"/>
+              <w:bottom w:type="dxa" w:w="60"/>
+              <w:right w:type="dxa" w:w="100"/>
+            </w:tcMar>
+          </w:tcPr>
+          <w:p>
+            <w:r>
+              <w:rPr>
+                <w:sz w:val="19"/>
+                <w:szCs w:val="19"/>
+              </w:rPr>
+              <w:t xml:space="preserve">17.11</w:t>
+            </w:r>
+          </w:p>
+        </w:tc>
+        <w:tc>
+          <w:tcPr>
+            <w:tcW w:type="dxa" w:w="3596"/>
+            <w:tcBorders>
+              <w:top w:val="single" w:color="BFBFBF" w:sz="4"/>
+              <w:left w:val="single" w:color="BFBFBF" w:sz="4"/>
+              <w:bottom w:val="single" w:color="BFBFBF" w:sz="4"/>
+              <w:right w:val="single" w:color="BFBFBF" w:sz="4"/>
+            </w:tcBorders>
+            <w:tcMar>
+              <w:top w:type="dxa" w:w="60"/>
+              <w:left w:type="dxa" w:w="100"/>
+              <w:bottom w:type="dxa" w:w="60"/>
+              <w:right w:type="dxa" w:w="100"/>
+            </w:tcMar>
+          </w:tcPr>
+          <w:p>
+            <w:r>
+              <w:rPr>
+                <w:sz w:val="19"/>
+                <w:szCs w:val="19"/>
+              </w:rPr>
+              <w:t xml:space="preserve">Database versi online</w:t>
+            </w:r>
+          </w:p>
+        </w:tc>
+      </w:tr>
+      <w:tr>
+        <w:trPr>
+          <w:tblHeader w:val="off"/>
+        </w:trPr>
+        <w:tc>
+          <w:tcPr>
+            <w:tcW w:type="dxa" w:w="1453"/>
+            <w:tcBorders>
+              <w:top w:val="single" w:color="BFBFBF" w:sz="4"/>
+              <w:left w:val="single" w:color="BFBFBF" w:sz="4"/>
+              <w:bottom w:val="single" w:color="BFBFBF" w:sz="4"/>
+              <w:right w:val="single" w:color="BFBFBF" w:sz="4"/>
+            </w:tcBorders>
+            <w:tcMar>
+              <w:top w:type="dxa" w:w="60"/>
+              <w:left w:type="dxa" w:w="100"/>
+              <w:bottom w:type="dxa" w:w="60"/>
+              <w:right w:type="dxa" w:w="100"/>
+            </w:tcMar>
+          </w:tcPr>
+          <w:p>
+            <w:r>
+              <w:rPr>
+                <w:sz w:val="19"/>
+                <w:szCs w:val="19"/>
+              </w:rPr>
+              <w:t xml:space="preserve">Supabase Storage</w:t>
+            </w:r>
+          </w:p>
+        </w:tc>
+        <w:tc>
+          <w:tcPr>
+            <w:tcW w:type="dxa" w:w="4589"/>
+            <w:tcBorders>
+              <w:top w:val="single" w:color="BFBFBF" w:sz="4"/>
+              <w:left w:val="single" w:color="BFBFBF" w:sz="4"/>
+              <w:bottom w:val="single" w:color="BFBFBF" w:sz="4"/>
+              <w:right w:val="single" w:color="BFBFBF" w:sz="4"/>
+            </w:tcBorders>
+            <w:tcMar>
+              <w:top w:type="dxa" w:w="60"/>
+              <w:left w:type="dxa" w:w="100"/>
+              <w:bottom w:type="dxa" w:w="60"/>
+              <w:right w:type="dxa" w:w="100"/>
+            </w:tcMar>
+          </w:tcPr>
+          <w:p>
+            <w:r>
+              <w:rPr>
+                <w:sz w:val="19"/>
+                <w:szCs w:val="19"/>
+              </w:rPr>
+              <w:t xml:space="preserve">Protokol S3</w:t>
+            </w:r>
+          </w:p>
+        </w:tc>
+        <w:tc>
+          <w:tcPr>
+            <w:tcW w:type="dxa" w:w="3596"/>
+            <w:tcBorders>
+              <w:top w:val="single" w:color="BFBFBF" w:sz="4"/>
+              <w:left w:val="single" w:color="BFBFBF" w:sz="4"/>
+              <w:bottom w:val="single" w:color="BFBFBF" w:sz="4"/>
+              <w:right w:val="single" w:color="BFBFBF" w:sz="4"/>
+            </w:tcBorders>
+            <w:tcMar>
+              <w:top w:type="dxa" w:w="60"/>
+              <w:left w:type="dxa" w:w="100"/>
+              <w:bottom w:type="dxa" w:w="60"/>
+              <w:right w:type="dxa" w:w="100"/>
+            </w:tcMar>
+          </w:tcPr>
+          <w:p>
+            <w:r>
+              <w:rPr>
+                <w:sz w:val="19"/>
+                <w:szCs w:val="19"/>
+              </w:rPr>
+              <w:t xml:space="preserve">Penyimpanan gambar versi online</w:t>
+            </w:r>
+          </w:p>
+        </w:tc>
+      </w:tr>
+    </w:tbl>
+    <w:p>
+      <w:pPr>
+        <w:spacing w:after="60"/>
+      </w:pPr>
+    </w:p>
+    <w:p>
+      <w:r>
+        <w:rPr>
+          <w:b/>
+          <w:bCs/>
+        </w:rPr>
+        <w:t xml:space="preserve">f. Kebutuhan minimum</w:t>
+      </w:r>
+    </w:p>
+    <w:p>
+      <w:r>
+        <w:t xml:space="preserve">PHP </w:t>
+      </w:r>
+      <w:r>
+        <w:rPr>
+          <w:b/>
+          <w:bCs/>
+        </w:rPr>
+        <w:t xml:space="preserve">8.2</w:t>
+      </w:r>
+      <w:r>
+        <w:t xml:space="preserve"> atau lebih baru (sesuai </w:t>
+      </w:r>
+      <w:r>
+        <w:rPr>
+          <w:rFonts w:ascii="Consolas" w:cs="Consolas" w:eastAsia="Consolas" w:hAnsi="Consolas"/>
+          <w:color w:val="1F4E79"/>
+          <w:sz w:val="20"/>
+          <w:szCs w:val="20"/>
+        </w:rPr>
+        <w:t xml:space="preserve">composer.json</w:t>
+      </w:r>
+      <w:r>
+        <w:t xml:space="preserve">) dengan ekstensi </w:t>
+      </w:r>
+      <w:r>
+        <w:rPr>
+          <w:rFonts w:ascii="Consolas" w:cs="Consolas" w:eastAsia="Consolas" w:hAnsi="Consolas"/>
+          <w:color w:val="1F4E79"/>
+          <w:sz w:val="20"/>
+          <w:szCs w:val="20"/>
+        </w:rPr>
+        <w:t xml:space="preserve">gd</w:t>
+      </w:r>
+      <w:r>
+        <w:t xml:space="preserve">, </w:t>
+      </w:r>
+      <w:r>
+        <w:rPr>
+          <w:rFonts w:ascii="Consolas" w:cs="Consolas" w:eastAsia="Consolas" w:hAnsi="Consolas"/>
+          <w:color w:val="1F4E79"/>
+          <w:sz w:val="20"/>
+          <w:szCs w:val="20"/>
+        </w:rPr>
+        <w:t xml:space="preserve">fileinfo</w:t>
+      </w:r>
+      <w:r>
+        <w:t xml:space="preserve">, </w:t>
+      </w:r>
+      <w:r>
+        <w:rPr>
+          <w:rFonts w:ascii="Consolas" w:cs="Consolas" w:eastAsia="Consolas" w:hAnsi="Consolas"/>
+          <w:color w:val="1F4E79"/>
+          <w:sz w:val="20"/>
+          <w:szCs w:val="20"/>
+        </w:rPr>
+        <w:t xml:space="preserve">pdo_mysql</w:t>
+      </w:r>
+      <w:r>
+        <w:t xml:space="preserve"> (lokal) / </w:t>
+      </w:r>
+      <w:r>
+        <w:rPr>
+          <w:rFonts w:ascii="Consolas" w:cs="Consolas" w:eastAsia="Consolas" w:hAnsi="Consolas"/>
+          <w:color w:val="1F4E79"/>
+          <w:sz w:val="20"/>
+          <w:szCs w:val="20"/>
+        </w:rPr>
+        <w:t xml:space="preserve">pdo_pgsql</w:t>
+      </w:r>
+      <w:r>
+        <w:t xml:space="preserve"> (online); MySQL 5.7+/MariaDB 10.3+ atau PostgreSQL; Composer 2; Node.js 20 atau lebih baru untuk build tampilan.</w:t>
+      </w:r>
+    </w:p>
+    <w:p>
+      <w:pPr>
         <w:pStyle w:val="Heading1"/>
       </w:pPr>
-      <w:bookmarkStart w:name="_Toc5" w:id="5"/>
+      <w:bookmarkStart w:name="_Toc6" w:id="6"/>
       <w:r>
         <w:t xml:space="preserve">3. Spesifikasi Program</w:t>
       </w:r>
-      <w:bookmarkEnd w:id="5"/>
+      <w:bookmarkEnd w:id="6"/>
     </w:p>
     <w:p>
       <w:pPr>
         <w:pStyle w:val="Heading2"/>
       </w:pPr>
-      <w:bookmarkStart w:name="_Toc6" w:id="6"/>
+      <w:bookmarkStart w:name="_Toc7" w:id="7"/>
       <w:r>
         <w:t xml:space="preserve">3.1 Hak Akses per Role</w:t>
       </w:r>
-      <w:bookmarkEnd w:id="6"/>
+      <w:bookmarkEnd w:id="7"/>
     </w:p>
     <w:tbl>
       <w:tblPr>
@@ -5307,11 +8713,11 @@
       <w:pPr>
         <w:pStyle w:val="Heading2"/>
       </w:pPr>
-      <w:bookmarkStart w:name="_Toc7" w:id="7"/>
+      <w:bookmarkStart w:name="_Toc8" w:id="8"/>
       <w:r>
         <w:t xml:space="preserve">3.2 Aturan Bisnis dan Validasi</w:t>
       </w:r>
-      <w:bookmarkEnd w:id="7"/>
+      <w:bookmarkEnd w:id="8"/>
     </w:p>
     <w:p>
       <w:pPr>
@@ -5473,11 +8879,11 @@
       <w:pPr>
         <w:pStyle w:val="Heading2"/>
       </w:pPr>
-      <w:bookmarkStart w:name="_Toc8" w:id="8"/>
+      <w:bookmarkStart w:name="_Toc9" w:id="9"/>
       <w:r>
         <w:t xml:space="preserve">3.3 Alur Barang Keluar</w:t>
       </w:r>
-      <w:bookmarkEnd w:id="8"/>
+      <w:bookmarkEnd w:id="9"/>
     </w:p>
     <w:p>
       <w:pPr>
@@ -5603,11 +9009,11 @@
       <w:pPr>
         <w:pStyle w:val="Heading2"/>
       </w:pPr>
-      <w:bookmarkStart w:name="_Toc9" w:id="9"/>
+      <w:bookmarkStart w:name="_Toc10" w:id="10"/>
       <w:r>
         <w:t xml:space="preserve">3.4 Batasan Sistem</w:t>
       </w:r>
-      <w:bookmarkEnd w:id="9"/>
+      <w:bookmarkEnd w:id="10"/>
     </w:p>
     <w:p>
       <w:pPr>
@@ -5649,11 +9055,11 @@
       <w:pPr>
         <w:pStyle w:val="Heading1"/>
       </w:pPr>
-      <w:bookmarkStart w:name="_Toc10" w:id="10"/>
+      <w:bookmarkStart w:name="_Toc11" w:id="11"/>
       <w:r>
         <w:t xml:space="preserve">4. Database</w:t>
       </w:r>
-      <w:bookmarkEnd w:id="10"/>
+      <w:bookmarkEnd w:id="11"/>
     </w:p>
     <w:p>
       <w:r>
@@ -6622,11 +10028,11 @@
       <w:pPr>
         <w:pStyle w:val="Heading1"/>
       </w:pPr>
-      <w:bookmarkStart w:name="_Toc11" w:id="11"/>
+      <w:bookmarkStart w:name="_Toc12" w:id="12"/>
       <w:r>
         <w:t xml:space="preserve">5. Struktur Program (MVC)</w:t>
       </w:r>
-      <w:bookmarkEnd w:id="11"/>
+      <w:bookmarkEnd w:id="12"/>
     </w:p>
     <w:p>
       <w:r>
@@ -8477,11 +11883,11 @@
       <w:pPr>
         <w:pStyle w:val="Heading1"/>
       </w:pPr>
-      <w:bookmarkStart w:name="_Toc12" w:id="12"/>
+      <w:bookmarkStart w:name="_Toc13" w:id="13"/>
       <w:r>
         <w:t xml:space="preserve">6. Desain Antarmuka</w:t>
       </w:r>
-      <w:bookmarkEnd w:id="12"/>
+      <w:bookmarkEnd w:id="13"/>
     </w:p>
     <w:p>
       <w:pPr>
@@ -8792,90 +12198,11 @@
       <w:pPr>
         <w:pStyle w:val="Heading1"/>
       </w:pPr>
-      <w:bookmarkStart w:name="_Toc13" w:id="13"/>
+      <w:bookmarkStart w:name="_Toc14" w:id="14"/>
       <w:r>
         <w:t xml:space="preserve">7. Penjelasan Kode Penting</w:t>
       </w:r>
-      <w:bookmarkEnd w:id="13"/>
-    </w:p>
-    <w:p>
-      <w:pPr>
-        <w:pStyle w:val="Heading2"/>
-      </w:pPr>
-      <w:bookmarkStart w:name="_Toc14" w:id="14"/>
-      <w:r>
-        <w:t xml:space="preserve">7.1 Login — </w:t>
-      </w:r>
-      <w:r>
-        <w:rPr>
-          <w:rFonts w:ascii="Consolas" w:cs="Consolas" w:eastAsia="Consolas" w:hAnsi="Consolas"/>
-          <w:color w:val="1F4E79"/>
-          <w:sz w:val="20"/>
-          <w:szCs w:val="20"/>
-        </w:rPr>
-        <w:t xml:space="preserve">AuthController::login()</w:t>
-      </w:r>
       <w:bookmarkEnd w:id="14"/>
-    </w:p>
-    <w:p>
-      <w:r>
-        <w:rPr>
-          <w:rFonts w:ascii="Consolas" w:cs="Consolas" w:eastAsia="Consolas" w:hAnsi="Consolas"/>
-          <w:color w:val="1F4E79"/>
-          <w:sz w:val="20"/>
-          <w:szCs w:val="20"/>
-        </w:rPr>
-        <w:t xml:space="preserve">Auth::attempt()</w:t>
-      </w:r>
-      <w:r>
-        <w:t xml:space="preserve"> mencari user berdasarkan username lalu mencocokkan password dengan hash bcrypt. Bila cocok, sesi dibuat ulang (</w:t>
-      </w:r>
-      <w:r>
-        <w:rPr>
-          <w:rFonts w:ascii="Consolas" w:cs="Consolas" w:eastAsia="Consolas" w:hAnsi="Consolas"/>
-          <w:color w:val="1F4E79"/>
-          <w:sz w:val="20"/>
-          <w:szCs w:val="20"/>
-        </w:rPr>
-        <w:t xml:space="preserve">session()-&gt;regenerate()</w:t>
-      </w:r>
-      <w:r>
-        <w:t xml:space="preserve">) untuk mencegah </w:t>
-      </w:r>
-      <w:r>
-        <w:rPr>
-          <w:i/>
-          <w:iCs/>
-        </w:rPr>
-        <w:t xml:space="preserve">session fixation</w:t>
-      </w:r>
-      <w:r>
-        <w:t xml:space="preserve">. Model </w:t>
-      </w:r>
-      <w:r>
-        <w:rPr>
-          <w:rFonts w:ascii="Consolas" w:cs="Consolas" w:eastAsia="Consolas" w:hAnsi="Consolas"/>
-          <w:color w:val="1F4E79"/>
-          <w:sz w:val="20"/>
-          <w:szCs w:val="20"/>
-        </w:rPr>
-        <w:t xml:space="preserve">User</w:t>
-      </w:r>
-      <w:r>
-        <w:t xml:space="preserve"> memakai cast </w:t>
-      </w:r>
-      <w:r>
-        <w:rPr>
-          <w:rFonts w:ascii="Consolas" w:cs="Consolas" w:eastAsia="Consolas" w:hAnsi="Consolas"/>
-          <w:color w:val="1F4E79"/>
-          <w:sz w:val="20"/>
-          <w:szCs w:val="20"/>
-        </w:rPr>
-        <w:t xml:space="preserve">'password' =&gt; 'hashed'</w:t>
-      </w:r>
-      <w:r>
-        <w:t xml:space="preserve"> sehingga password selalu tersimpan ter-hash.</w:t>
-      </w:r>
     </w:p>
     <w:p>
       <w:pPr>
@@ -8883,7 +12210,7 @@
       </w:pPr>
       <w:bookmarkStart w:name="_Toc15" w:id="15"/>
       <w:r>
-        <w:t xml:space="preserve">7.2 Hak Akses — </w:t>
+        <w:t xml:space="preserve">7.1 Login — </w:t>
       </w:r>
       <w:r>
         <w:rPr>
@@ -8892,14 +12219,11 @@
           <w:sz w:val="20"/>
           <w:szCs w:val="20"/>
         </w:rPr>
-        <w:t xml:space="preserve">CekRole::handle()</w:t>
+        <w:t xml:space="preserve">AuthController::login()</w:t>
       </w:r>
       <w:bookmarkEnd w:id="15"/>
     </w:p>
     <w:p>
-      <w:r>
-        <w:t xml:space="preserve">Middleware menerima daftar role yang diizinkan, misalnya </w:t>
-      </w:r>
       <w:r>
         <w:rPr>
           <w:rFonts w:ascii="Consolas" w:cs="Consolas" w:eastAsia="Consolas" w:hAnsi="Consolas"/>
@@ -8907,10 +12231,10 @@
           <w:sz w:val="20"/>
           <w:szCs w:val="20"/>
         </w:rPr>
-        <w:t xml:space="preserve">role:Admin</w:t>
-      </w:r>
-      <w:r>
-        <w:t xml:space="preserve">, </w:t>
+        <w:t xml:space="preserve">Auth::attempt()</w:t>
+      </w:r>
+      <w:r>
+        <w:t xml:space="preserve"> mencari user berdasarkan username lalu mencocokkan password dengan hash bcrypt. Bila cocok, sesi dibuat ulang (</w:t>
       </w:r>
       <w:r>
         <w:rPr>
@@ -8919,10 +12243,20 @@
           <w:sz w:val="20"/>
           <w:szCs w:val="20"/>
         </w:rPr>
-        <w:t xml:space="preserve">role:Manager</w:t>
-      </w:r>
-      <w:r>
-        <w:t xml:space="preserve">, atau </w:t>
+        <w:t xml:space="preserve">session()-&gt;regenerate()</w:t>
+      </w:r>
+      <w:r>
+        <w:t xml:space="preserve">) untuk mencegah </w:t>
+      </w:r>
+      <w:r>
+        <w:rPr>
+          <w:i/>
+          <w:iCs/>
+        </w:rPr>
+        <w:t xml:space="preserve">session fixation</w:t>
+      </w:r>
+      <w:r>
+        <w:t xml:space="preserve">. Model </w:t>
       </w:r>
       <w:r>
         <w:rPr>
@@ -8931,20 +12265,10 @@
           <w:sz w:val="20"/>
           <w:szCs w:val="20"/>
         </w:rPr>
-        <w:t xml:space="preserve">role:Admin,Operator</w:t>
-      </w:r>
-      <w:r>
-        <w:t xml:space="preserve">. Bila role pengguna tidak termasuk, server mengembalikan </w:t>
-      </w:r>
-      <w:r>
-        <w:rPr>
-          <w:b/>
-          <w:bCs/>
-        </w:rPr>
-        <w:t xml:space="preserve">403 Forbidden</w:t>
-      </w:r>
-      <w:r>
-        <w:t xml:space="preserve">. Tampilan juga menyembunyikan tombol yang tidak berhak (</w:t>
+        <w:t xml:space="preserve">User</w:t>
+      </w:r>
+      <w:r>
+        <w:t xml:space="preserve"> memakai cast </w:t>
       </w:r>
       <w:r>
         <w:rPr>
@@ -8953,34 +12277,10 @@
           <w:sz w:val="20"/>
           <w:szCs w:val="20"/>
         </w:rPr>
-        <w:t xml:space="preserve">isAdmin()</w:t>
-      </w:r>
-      <w:r>
-        <w:t xml:space="preserve">, </w:t>
-      </w:r>
-      <w:r>
-        <w:rPr>
-          <w:rFonts w:ascii="Consolas" w:cs="Consolas" w:eastAsia="Consolas" w:hAnsi="Consolas"/>
-          <w:color w:val="1F4E79"/>
-          <w:sz w:val="20"/>
-          <w:szCs w:val="20"/>
-        </w:rPr>
-        <w:t xml:space="preserve">isOperator()</w:t>
-      </w:r>
-      <w:r>
-        <w:t xml:space="preserve">, </w:t>
-      </w:r>
-      <w:r>
-        <w:rPr>
-          <w:rFonts w:ascii="Consolas" w:cs="Consolas" w:eastAsia="Consolas" w:hAnsi="Consolas"/>
-          <w:color w:val="1F4E79"/>
-          <w:sz w:val="20"/>
-          <w:szCs w:val="20"/>
-        </w:rPr>
-        <w:t xml:space="preserve">isManager()</w:t>
-      </w:r>
-      <w:r>
-        <w:t xml:space="preserve">).</w:t>
+        <w:t xml:space="preserve">'password' =&gt; 'hashed'</w:t>
+      </w:r>
+      <w:r>
+        <w:t xml:space="preserve"> sehingga password selalu tersimpan ter-hash.</w:t>
       </w:r>
     </w:p>
     <w:p>
@@ -8989,7 +12289,7 @@
       </w:pPr>
       <w:bookmarkStart w:name="_Toc16" w:id="16"/>
       <w:r>
-        <w:t xml:space="preserve">7.3 Kode Barang Otomatis — </w:t>
+        <w:t xml:space="preserve">7.2 Hak Akses — </w:t>
       </w:r>
       <w:r>
         <w:rPr>
@@ -8998,9 +12298,115 @@
           <w:sz w:val="20"/>
           <w:szCs w:val="20"/>
         </w:rPr>
+        <w:t xml:space="preserve">CekRole::handle()</w:t>
+      </w:r>
+      <w:bookmarkEnd w:id="16"/>
+    </w:p>
+    <w:p>
+      <w:r>
+        <w:t xml:space="preserve">Middleware menerima daftar role yang diizinkan, misalnya </w:t>
+      </w:r>
+      <w:r>
+        <w:rPr>
+          <w:rFonts w:ascii="Consolas" w:cs="Consolas" w:eastAsia="Consolas" w:hAnsi="Consolas"/>
+          <w:color w:val="1F4E79"/>
+          <w:sz w:val="20"/>
+          <w:szCs w:val="20"/>
+        </w:rPr>
+        <w:t xml:space="preserve">role:Admin</w:t>
+      </w:r>
+      <w:r>
+        <w:t xml:space="preserve">, </w:t>
+      </w:r>
+      <w:r>
+        <w:rPr>
+          <w:rFonts w:ascii="Consolas" w:cs="Consolas" w:eastAsia="Consolas" w:hAnsi="Consolas"/>
+          <w:color w:val="1F4E79"/>
+          <w:sz w:val="20"/>
+          <w:szCs w:val="20"/>
+        </w:rPr>
+        <w:t xml:space="preserve">role:Manager</w:t>
+      </w:r>
+      <w:r>
+        <w:t xml:space="preserve">, atau </w:t>
+      </w:r>
+      <w:r>
+        <w:rPr>
+          <w:rFonts w:ascii="Consolas" w:cs="Consolas" w:eastAsia="Consolas" w:hAnsi="Consolas"/>
+          <w:color w:val="1F4E79"/>
+          <w:sz w:val="20"/>
+          <w:szCs w:val="20"/>
+        </w:rPr>
+        <w:t xml:space="preserve">role:Admin,Operator</w:t>
+      </w:r>
+      <w:r>
+        <w:t xml:space="preserve">. Bila role pengguna tidak termasuk, server mengembalikan </w:t>
+      </w:r>
+      <w:r>
+        <w:rPr>
+          <w:b/>
+          <w:bCs/>
+        </w:rPr>
+        <w:t xml:space="preserve">403 Forbidden</w:t>
+      </w:r>
+      <w:r>
+        <w:t xml:space="preserve">. Tampilan juga menyembunyikan tombol yang tidak berhak (</w:t>
+      </w:r>
+      <w:r>
+        <w:rPr>
+          <w:rFonts w:ascii="Consolas" w:cs="Consolas" w:eastAsia="Consolas" w:hAnsi="Consolas"/>
+          <w:color w:val="1F4E79"/>
+          <w:sz w:val="20"/>
+          <w:szCs w:val="20"/>
+        </w:rPr>
+        <w:t xml:space="preserve">isAdmin()</w:t>
+      </w:r>
+      <w:r>
+        <w:t xml:space="preserve">, </w:t>
+      </w:r>
+      <w:r>
+        <w:rPr>
+          <w:rFonts w:ascii="Consolas" w:cs="Consolas" w:eastAsia="Consolas" w:hAnsi="Consolas"/>
+          <w:color w:val="1F4E79"/>
+          <w:sz w:val="20"/>
+          <w:szCs w:val="20"/>
+        </w:rPr>
+        <w:t xml:space="preserve">isOperator()</w:t>
+      </w:r>
+      <w:r>
+        <w:t xml:space="preserve">, </w:t>
+      </w:r>
+      <w:r>
+        <w:rPr>
+          <w:rFonts w:ascii="Consolas" w:cs="Consolas" w:eastAsia="Consolas" w:hAnsi="Consolas"/>
+          <w:color w:val="1F4E79"/>
+          <w:sz w:val="20"/>
+          <w:szCs w:val="20"/>
+        </w:rPr>
+        <w:t xml:space="preserve">isManager()</w:t>
+      </w:r>
+      <w:r>
+        <w:t xml:space="preserve">).</w:t>
+      </w:r>
+    </w:p>
+    <w:p>
+      <w:pPr>
+        <w:pStyle w:val="Heading2"/>
+      </w:pPr>
+      <w:bookmarkStart w:name="_Toc17" w:id="17"/>
+      <w:r>
+        <w:t xml:space="preserve">7.3 Kode Barang Otomatis — </w:t>
+      </w:r>
+      <w:r>
+        <w:rPr>
+          <w:rFonts w:ascii="Consolas" w:cs="Consolas" w:eastAsia="Consolas" w:hAnsi="Consolas"/>
+          <w:color w:val="1F4E79"/>
+          <w:sz w:val="20"/>
+          <w:szCs w:val="20"/>
+        </w:rPr>
         <w:t xml:space="preserve">Barang::generateKode()</w:t>
       </w:r>
-      <w:bookmarkEnd w:id="16"/>
+      <w:bookmarkEnd w:id="17"/>
     </w:p>
     <w:p>
       <w:pPr>
@@ -9126,7 +12532,7 @@
       <w:pPr>
         <w:pStyle w:val="Heading2"/>
       </w:pPr>
-      <w:bookmarkStart w:name="_Toc17" w:id="17"/>
+      <w:bookmarkStart w:name="_Toc18" w:id="18"/>
       <w:r>
         <w:t xml:space="preserve">7.4 Stok — </w:t>
       </w:r>
@@ -9139,7 +12545,7 @@
         </w:rPr>
         <w:t xml:space="preserve">StokService</w:t>
       </w:r>
-      <w:bookmarkEnd w:id="17"/>
+      <w:bookmarkEnd w:id="18"/>
     </w:p>
     <w:p>
       <w:r>
@@ -9216,102 +12622,6 @@
       </w:r>
       <w:r>
         <w:t xml:space="preserve"> mengunci baris barang agar dua proses bersamaan tidak mengacaukan stok.</w:t>
-      </w:r>
-    </w:p>
-    <w:p>
-      <w:pPr>
-        <w:pStyle w:val="Heading2"/>
-      </w:pPr>
-      <w:bookmarkStart w:name="_Toc18" w:id="18"/>
-      <w:r>
-        <w:t xml:space="preserve">7.5 Verifikasi — </w:t>
-      </w:r>
-      <w:r>
-        <w:rPr>
-          <w:rFonts w:ascii="Consolas" w:cs="Consolas" w:eastAsia="Consolas" w:hAnsi="Consolas"/>
-          <w:color w:val="1F4E79"/>
-          <w:sz w:val="20"/>
-          <w:szCs w:val="20"/>
-        </w:rPr>
-        <w:t xml:space="preserve">BarangKeluarController::setujui()</w:t>
-      </w:r>
-      <w:r>
-        <w:t xml:space="preserve"> dan </w:t>
-      </w:r>
-      <w:r>
-        <w:rPr>
-          <w:rFonts w:ascii="Consolas" w:cs="Consolas" w:eastAsia="Consolas" w:hAnsi="Consolas"/>
-          <w:color w:val="1F4E79"/>
-          <w:sz w:val="20"/>
-          <w:szCs w:val="20"/>
-        </w:rPr>
-        <w:t xml:space="preserve">tolak()</w:t>
-      </w:r>
-      <w:bookmarkEnd w:id="18"/>
-    </w:p>
-    <w:p>
-      <w:r>
-        <w:t xml:space="preserve">Hanya Manager yang dapat mengaksesnya. Di dalam transaksi, </w:t>
-      </w:r>
-      <w:r>
-        <w:rPr>
-          <w:rFonts w:ascii="Consolas" w:cs="Consolas" w:eastAsia="Consolas" w:hAnsi="Consolas"/>
-          <w:color w:val="1F4E79"/>
-          <w:sz w:val="20"/>
-          <w:szCs w:val="20"/>
-        </w:rPr>
-        <w:t xml:space="preserve">kunciPermintaanPending()</w:t>
-      </w:r>
-      <w:r>
-        <w:t xml:space="preserve"> mengunci baris permintaan dan memastikan statusnya masih Pending; bila dua Manager menyetujui bersamaan, yang kedua menunggu lalu mendapati status sudah berubah. </w:t>
-      </w:r>
-      <w:r>
-        <w:rPr>
-          <w:rFonts w:ascii="Consolas" w:cs="Consolas" w:eastAsia="Consolas" w:hAnsi="Consolas"/>
-          <w:color w:val="1F4E79"/>
-          <w:sz w:val="20"/>
-          <w:szCs w:val="20"/>
-        </w:rPr>
-        <w:t xml:space="preserve">simpanVerifikasi()</w:t>
-      </w:r>
-      <w:r>
-        <w:t xml:space="preserve"> mengisi status, </w:t>
-      </w:r>
-      <w:r>
-        <w:rPr>
-          <w:rFonts w:ascii="Consolas" w:cs="Consolas" w:eastAsia="Consolas" w:hAnsi="Consolas"/>
-          <w:color w:val="1F4E79"/>
-          <w:sz w:val="20"/>
-          <w:szCs w:val="20"/>
-        </w:rPr>
-        <w:t xml:space="preserve">id_verifikator</w:t>
-      </w:r>
-      <w:r>
-        <w:t xml:space="preserve">, </w:t>
-      </w:r>
-      <w:r>
-        <w:rPr>
-          <w:rFonts w:ascii="Consolas" w:cs="Consolas" w:eastAsia="Consolas" w:hAnsi="Consolas"/>
-          <w:color w:val="1F4E79"/>
-          <w:sz w:val="20"/>
-          <w:szCs w:val="20"/>
-        </w:rPr>
-        <w:t xml:space="preserve">tanggal_verifikasi</w:t>
-      </w:r>
-      <w:r>
-        <w:t xml:space="preserve">, dan catatan. Pada </w:t>
-      </w:r>
-      <w:r>
-        <w:rPr>
-          <w:rFonts w:ascii="Consolas" w:cs="Consolas" w:eastAsia="Consolas" w:hAnsi="Consolas"/>
-          <w:color w:val="1F4E79"/>
-          <w:sz w:val="20"/>
-          <w:szCs w:val="20"/>
-        </w:rPr>
-        <w:t xml:space="preserve">tolak()</w:t>
-      </w:r>
-      <w:r>
-        <w:t xml:space="preserve">, catatan wajib diisi.</w:t>
       </w:r>
     </w:p>
     <w:p>
@@ -9320,13 +12630,7 @@
       </w:pPr>
       <w:bookmarkStart w:name="_Toc19" w:id="19"/>
       <w:r>
-        <w:t xml:space="preserve">7.6 Validasi — Form Request</w:t>
-      </w:r>
-      <w:bookmarkEnd w:id="19"/>
-    </w:p>
-    <w:p>
-      <w:r>
-        <w:t xml:space="preserve">Contoh </w:t>
+        <w:t xml:space="preserve">7.5 Verifikasi — </w:t>
       </w:r>
       <w:r>
         <w:rPr>
@@ -9335,10 +12639,10 @@
           <w:sz w:val="20"/>
           <w:szCs w:val="20"/>
         </w:rPr>
-        <w:t xml:space="preserve">BarangKeluarRequest</w:t>
-      </w:r>
-      <w:r>
-        <w:t xml:space="preserve">: </w:t>
+        <w:t xml:space="preserve">BarangKeluarController::setujui()</w:t>
+      </w:r>
+      <w:r>
+        <w:t xml:space="preserve"> dan </w:t>
       </w:r>
       <w:r>
         <w:rPr>
@@ -9347,10 +12651,13 @@
           <w:sz w:val="20"/>
           <w:szCs w:val="20"/>
         </w:rPr>
-        <w:t xml:space="preserve">required</w:t>
-      </w:r>
-      <w:r>
-        <w:t xml:space="preserve">, </w:t>
+        <w:t xml:space="preserve">tolak()</w:t>
+      </w:r>
+      <w:bookmarkEnd w:id="19"/>
+    </w:p>
+    <w:p>
+      <w:r>
+        <w:t xml:space="preserve">Hanya Manager yang dapat mengaksesnya. Di dalam transaksi, </w:t>
       </w:r>
       <w:r>
         <w:rPr>
@@ -9359,10 +12666,10 @@
           <w:sz w:val="20"/>
           <w:szCs w:val="20"/>
         </w:rPr>
-        <w:t xml:space="preserve">integer</w:t>
-      </w:r>
-      <w:r>
-        <w:t xml:space="preserve">, </w:t>
+        <w:t xml:space="preserve">kunciPermintaanPending()</w:t>
+      </w:r>
+      <w:r>
+        <w:t xml:space="preserve"> mengunci baris permintaan dan memastikan statusnya masih Pending; bila dua Manager menyetujui bersamaan, yang kedua menunggu lalu mendapati status sudah berubah. </w:t>
       </w:r>
       <w:r>
         <w:rPr>
@@ -9371,10 +12678,10 @@
           <w:sz w:val="20"/>
           <w:szCs w:val="20"/>
         </w:rPr>
-        <w:t xml:space="preserve">min:1</w:t>
-      </w:r>
-      <w:r>
-        <w:t xml:space="preserve">, </w:t>
+        <w:t xml:space="preserve">simpanVerifikasi()</w:t>
+      </w:r>
+      <w:r>
+        <w:t xml:space="preserve"> mengisi status, </w:t>
       </w:r>
       <w:r>
         <w:rPr>
@@ -9383,7 +12690,7 @@
           <w:sz w:val="20"/>
           <w:szCs w:val="20"/>
         </w:rPr>
-        <w:t xml:space="preserve">exists:barang,id_barang</w:t>
+        <w:t xml:space="preserve">id_verifikator</w:t>
       </w:r>
       <w:r>
         <w:t xml:space="preserve">, </w:t>
@@ -9395,10 +12702,10 @@
           <w:sz w:val="20"/>
           <w:szCs w:val="20"/>
         </w:rPr>
-        <w:t xml:space="preserve">Rule::in(Barang::STATUS_BARANG)</w:t>
-      </w:r>
-      <w:r>
-        <w:t xml:space="preserve">, aturan foto (</w:t>
+        <w:t xml:space="preserve">tanggal_verifikasi</w:t>
+      </w:r>
+      <w:r>
+        <w:t xml:space="preserve">, dan catatan. Pada </w:t>
       </w:r>
       <w:r>
         <w:rPr>
@@ -9407,94 +12714,10 @@
           <w:sz w:val="20"/>
           <w:szCs w:val="20"/>
         </w:rPr>
-        <w:t xml:space="preserve">required</w:t>
-      </w:r>
-      <w:r>
-        <w:t xml:space="preserve">, </w:t>
-      </w:r>
-      <w:r>
-        <w:rPr>
-          <w:rFonts w:ascii="Consolas" w:cs="Consolas" w:eastAsia="Consolas" w:hAnsi="Consolas"/>
-          <w:color w:val="1F4E79"/>
-          <w:sz w:val="20"/>
-          <w:szCs w:val="20"/>
-        </w:rPr>
-        <w:t xml:space="preserve">image</w:t>
-      </w:r>
-      <w:r>
-        <w:t xml:space="preserve">, </w:t>
-      </w:r>
-      <w:r>
-        <w:rPr>
-          <w:rFonts w:ascii="Consolas" w:cs="Consolas" w:eastAsia="Consolas" w:hAnsi="Consolas"/>
-          <w:color w:val="1F4E79"/>
-          <w:sz w:val="20"/>
-          <w:szCs w:val="20"/>
-        </w:rPr>
-        <w:t xml:space="preserve">mimes:jpg,jpeg,png,webp</w:t>
-      </w:r>
-      <w:r>
-        <w:t xml:space="preserve">, </w:t>
-      </w:r>
-      <w:r>
-        <w:rPr>
-          <w:rFonts w:ascii="Consolas" w:cs="Consolas" w:eastAsia="Consolas" w:hAnsi="Consolas"/>
-          <w:color w:val="1F4E79"/>
-          <w:sz w:val="20"/>
-          <w:szCs w:val="20"/>
-        </w:rPr>
-        <w:t xml:space="preserve">max:2048</w:t>
-      </w:r>
-      <w:r>
-        <w:t xml:space="preserve">), dan pengecekan stok di method </w:t>
-      </w:r>
-      <w:r>
-        <w:rPr>
-          <w:rFonts w:ascii="Consolas" w:cs="Consolas" w:eastAsia="Consolas" w:hAnsi="Consolas"/>
-          <w:color w:val="1F4E79"/>
-          <w:sz w:val="20"/>
-          <w:szCs w:val="20"/>
-        </w:rPr>
-        <w:t xml:space="preserve">after()</w:t>
-      </w:r>
-      <w:r>
-        <w:t xml:space="preserve">. </w:t>
-      </w:r>
-      <w:r>
-        <w:rPr>
-          <w:rFonts w:ascii="Consolas" w:cs="Consolas" w:eastAsia="Consolas" w:hAnsi="Consolas"/>
-          <w:color w:val="1F4E79"/>
-          <w:sz w:val="20"/>
-          <w:szCs w:val="20"/>
-        </w:rPr>
-        <w:t xml:space="preserve">ProfilRequest</w:t>
-      </w:r>
-      <w:r>
-        <w:t xml:space="preserve"> memakai </w:t>
-      </w:r>
-      <w:r>
-        <w:rPr>
-          <w:rFonts w:ascii="Consolas" w:cs="Consolas" w:eastAsia="Consolas" w:hAnsi="Consolas"/>
-          <w:color w:val="1F4E79"/>
-          <w:sz w:val="20"/>
-          <w:szCs w:val="20"/>
-        </w:rPr>
-        <w:t xml:space="preserve">current_password</w:t>
-      </w:r>
-      <w:r>
-        <w:t xml:space="preserve"> untuk memastikan password lama benar. Pesan error tampil di bawah input lewat komponen </w:t>
-      </w:r>
-      <w:r>
-        <w:rPr>
-          <w:rFonts w:ascii="Consolas" w:cs="Consolas" w:eastAsia="Consolas" w:hAnsi="Consolas"/>
-          <w:color w:val="1F4E79"/>
-          <w:sz w:val="20"/>
-          <w:szCs w:val="20"/>
-        </w:rPr>
-        <w:t xml:space="preserve">&lt;x-error&gt;</w:t>
-      </w:r>
-      <w:r>
-        <w:t xml:space="preserve">.</w:t>
+        <w:t xml:space="preserve">tolak()</w:t>
+      </w:r>
+      <w:r>
+        <w:t xml:space="preserve">, catatan wajib diisi.</w:t>
       </w:r>
     </w:p>
     <w:p>
@@ -9503,7 +12726,13 @@
       </w:pPr>
       <w:bookmarkStart w:name="_Toc20" w:id="20"/>
       <w:r>
-        <w:t xml:space="preserve">7.7 Unggah Gambar — </w:t>
+        <w:t xml:space="preserve">7.6 Validasi — Form Request</w:t>
+      </w:r>
+      <w:bookmarkEnd w:id="20"/>
+    </w:p>
+    <w:p>
+      <w:r>
+        <w:t xml:space="preserve">Contoh </w:t>
       </w:r>
       <w:r>
         <w:rPr>
@@ -9512,9 +12741,186 @@
           <w:sz w:val="20"/>
           <w:szCs w:val="20"/>
         </w:rPr>
+        <w:t xml:space="preserve">BarangKeluarRequest</w:t>
+      </w:r>
+      <w:r>
+        <w:t xml:space="preserve">: </w:t>
+      </w:r>
+      <w:r>
+        <w:rPr>
+          <w:rFonts w:ascii="Consolas" w:cs="Consolas" w:eastAsia="Consolas" w:hAnsi="Consolas"/>
+          <w:color w:val="1F4E79"/>
+          <w:sz w:val="20"/>
+          <w:szCs w:val="20"/>
+        </w:rPr>
+        <w:t xml:space="preserve">required</w:t>
+      </w:r>
+      <w:r>
+        <w:t xml:space="preserve">, </w:t>
+      </w:r>
+      <w:r>
+        <w:rPr>
+          <w:rFonts w:ascii="Consolas" w:cs="Consolas" w:eastAsia="Consolas" w:hAnsi="Consolas"/>
+          <w:color w:val="1F4E79"/>
+          <w:sz w:val="20"/>
+          <w:szCs w:val="20"/>
+        </w:rPr>
+        <w:t xml:space="preserve">integer</w:t>
+      </w:r>
+      <w:r>
+        <w:t xml:space="preserve">, </w:t>
+      </w:r>
+      <w:r>
+        <w:rPr>
+          <w:rFonts w:ascii="Consolas" w:cs="Consolas" w:eastAsia="Consolas" w:hAnsi="Consolas"/>
+          <w:color w:val="1F4E79"/>
+          <w:sz w:val="20"/>
+          <w:szCs w:val="20"/>
+        </w:rPr>
+        <w:t xml:space="preserve">min:1</w:t>
+      </w:r>
+      <w:r>
+        <w:t xml:space="preserve">, </w:t>
+      </w:r>
+      <w:r>
+        <w:rPr>
+          <w:rFonts w:ascii="Consolas" w:cs="Consolas" w:eastAsia="Consolas" w:hAnsi="Consolas"/>
+          <w:color w:val="1F4E79"/>
+          <w:sz w:val="20"/>
+          <w:szCs w:val="20"/>
+        </w:rPr>
+        <w:t xml:space="preserve">exists:barang,id_barang</w:t>
+      </w:r>
+      <w:r>
+        <w:t xml:space="preserve">, </w:t>
+      </w:r>
+      <w:r>
+        <w:rPr>
+          <w:rFonts w:ascii="Consolas" w:cs="Consolas" w:eastAsia="Consolas" w:hAnsi="Consolas"/>
+          <w:color w:val="1F4E79"/>
+          <w:sz w:val="20"/>
+          <w:szCs w:val="20"/>
+        </w:rPr>
+        <w:t xml:space="preserve">Rule::in(Barang::STATUS_BARANG)</w:t>
+      </w:r>
+      <w:r>
+        <w:t xml:space="preserve">, aturan foto (</w:t>
+      </w:r>
+      <w:r>
+        <w:rPr>
+          <w:rFonts w:ascii="Consolas" w:cs="Consolas" w:eastAsia="Consolas" w:hAnsi="Consolas"/>
+          <w:color w:val="1F4E79"/>
+          <w:sz w:val="20"/>
+          <w:szCs w:val="20"/>
+        </w:rPr>
+        <w:t xml:space="preserve">required</w:t>
+      </w:r>
+      <w:r>
+        <w:t xml:space="preserve">, </w:t>
+      </w:r>
+      <w:r>
+        <w:rPr>
+          <w:rFonts w:ascii="Consolas" w:cs="Consolas" w:eastAsia="Consolas" w:hAnsi="Consolas"/>
+          <w:color w:val="1F4E79"/>
+          <w:sz w:val="20"/>
+          <w:szCs w:val="20"/>
+        </w:rPr>
+        <w:t xml:space="preserve">image</w:t>
+      </w:r>
+      <w:r>
+        <w:t xml:space="preserve">, </w:t>
+      </w:r>
+      <w:r>
+        <w:rPr>
+          <w:rFonts w:ascii="Consolas" w:cs="Consolas" w:eastAsia="Consolas" w:hAnsi="Consolas"/>
+          <w:color w:val="1F4E79"/>
+          <w:sz w:val="20"/>
+          <w:szCs w:val="20"/>
+        </w:rPr>
+        <w:t xml:space="preserve">mimes:jpg,jpeg,png,webp</w:t>
+      </w:r>
+      <w:r>
+        <w:t xml:space="preserve">, </w:t>
+      </w:r>
+      <w:r>
+        <w:rPr>
+          <w:rFonts w:ascii="Consolas" w:cs="Consolas" w:eastAsia="Consolas" w:hAnsi="Consolas"/>
+          <w:color w:val="1F4E79"/>
+          <w:sz w:val="20"/>
+          <w:szCs w:val="20"/>
+        </w:rPr>
+        <w:t xml:space="preserve">max:2048</w:t>
+      </w:r>
+      <w:r>
+        <w:t xml:space="preserve">), dan pengecekan stok di method </w:t>
+      </w:r>
+      <w:r>
+        <w:rPr>
+          <w:rFonts w:ascii="Consolas" w:cs="Consolas" w:eastAsia="Consolas" w:hAnsi="Consolas"/>
+          <w:color w:val="1F4E79"/>
+          <w:sz w:val="20"/>
+          <w:szCs w:val="20"/>
+        </w:rPr>
+        <w:t xml:space="preserve">after()</w:t>
+      </w:r>
+      <w:r>
+        <w:t xml:space="preserve">. </w:t>
+      </w:r>
+      <w:r>
+        <w:rPr>
+          <w:rFonts w:ascii="Consolas" w:cs="Consolas" w:eastAsia="Consolas" w:hAnsi="Consolas"/>
+          <w:color w:val="1F4E79"/>
+          <w:sz w:val="20"/>
+          <w:szCs w:val="20"/>
+        </w:rPr>
+        <w:t xml:space="preserve">ProfilRequest</w:t>
+      </w:r>
+      <w:r>
+        <w:t xml:space="preserve"> memakai </w:t>
+      </w:r>
+      <w:r>
+        <w:rPr>
+          <w:rFonts w:ascii="Consolas" w:cs="Consolas" w:eastAsia="Consolas" w:hAnsi="Consolas"/>
+          <w:color w:val="1F4E79"/>
+          <w:sz w:val="20"/>
+          <w:szCs w:val="20"/>
+        </w:rPr>
+        <w:t xml:space="preserve">current_password</w:t>
+      </w:r>
+      <w:r>
+        <w:t xml:space="preserve"> untuk memastikan password lama benar. Pesan error tampil di bawah input lewat komponen </w:t>
+      </w:r>
+      <w:r>
+        <w:rPr>
+          <w:rFonts w:ascii="Consolas" w:cs="Consolas" w:eastAsia="Consolas" w:hAnsi="Consolas"/>
+          <w:color w:val="1F4E79"/>
+          <w:sz w:val="20"/>
+          <w:szCs w:val="20"/>
+        </w:rPr>
+        <w:t xml:space="preserve">&lt;x-error&gt;</w:t>
+      </w:r>
+      <w:r>
+        <w:t xml:space="preserve">.</w:t>
+      </w:r>
+    </w:p>
+    <w:p>
+      <w:pPr>
+        <w:pStyle w:val="Heading2"/>
+      </w:pPr>
+      <w:bookmarkStart w:name="_Toc21" w:id="21"/>
+      <w:r>
+        <w:t xml:space="preserve">7.7 Unggah Gambar — </w:t>
+      </w:r>
+      <w:r>
+        <w:rPr>
+          <w:rFonts w:ascii="Consolas" w:cs="Consolas" w:eastAsia="Consolas" w:hAnsi="Consolas"/>
+          <w:color w:val="1F4E79"/>
+          <w:sz w:val="20"/>
+          <w:szCs w:val="20"/>
+        </w:rPr>
         <w:t xml:space="preserve">GambarService</w:t>
       </w:r>
-      <w:bookmarkEnd w:id="20"/>
+      <w:bookmarkEnd w:id="21"/>
     </w:p>
     <w:p>
       <w:pPr>
@@ -9807,14 +13213,14 @@
         <w:t xml:space="preserve">bootstrap/app.php</w:t>
       </w:r>
       <w:r>
-        <w:t xml:space="preserve"> mengembalikan pengguna ke form dengan pesan jelas, dan penyebab aslinya dicatat ke log dalam satu baris pendek berawalan "Gambar gagal disimpan:" (di Vercel: menu Logs, cari kata itu). Bila yang mengunggah adalah Admin, penyebab singkat itu juga ditampilkan langsung di pesan error.</w:t>
+        <w:t xml:space="preserve"> mengembalikan pengguna ke form dengan pesan jelas, dan penyebab aslinya dicatat ke log dalam satu baris pendek berawalan "Gambar gagal disimpan:" (di Vercel: menu Logs, cari kata itu).</w:t>
       </w:r>
     </w:p>
     <w:p>
       <w:pPr>
         <w:pStyle w:val="Heading2"/>
       </w:pPr>
-      <w:bookmarkStart w:name="_Toc21" w:id="21"/>
+      <w:bookmarkStart w:name="_Toc22" w:id="22"/>
       <w:r>
         <w:t xml:space="preserve">7.8 Suasana Login dan Audio — </w:t>
       </w:r>
@@ -9827,7 +13233,7 @@
         </w:rPr>
         <w:t xml:space="preserve">App\Support\Suasana</w:t>
       </w:r>
-      <w:bookmarkEnd w:id="21"/>
+      <w:bookmarkEnd w:id="22"/>
     </w:p>
     <w:p>
       <w:pPr>
@@ -9980,7 +13386,7 @@
       <w:pPr>
         <w:pStyle w:val="Heading2"/>
       </w:pPr>
-      <w:bookmarkStart w:name="_Toc22" w:id="22"/>
+      <w:bookmarkStart w:name="_Toc23" w:id="23"/>
       <w:r>
         <w:t xml:space="preserve">7.9 Mode Terang / Gelap — </w:t>
       </w:r>
@@ -9993,7 +13399,7 @@
         </w:rPr>
         <w:t xml:space="preserve">resources/js/tema.js</w:t>
       </w:r>
-      <w:bookmarkEnd w:id="22"/>
+      <w:bookmarkEnd w:id="23"/>
     </w:p>
     <w:p>
       <w:pPr>
@@ -10149,7 +13555,7 @@
       <w:pPr>
         <w:pStyle w:val="Heading2"/>
       </w:pPr>
-      <w:bookmarkStart w:name="_Toc23" w:id="23"/>
+      <w:bookmarkStart w:name="_Toc24" w:id="24"/>
       <w:r>
         <w:t xml:space="preserve">7.10 Musik Bad Apple!! — </w:t>
       </w:r>
@@ -10162,7 +13568,7 @@
         </w:rPr>
         <w:t xml:space="preserve">resources/js/musik.js</w:t>
       </w:r>
-      <w:bookmarkEnd w:id="23"/>
+      <w:bookmarkEnd w:id="24"/>
     </w:p>
     <w:p>
       <w:pPr>
@@ -10288,11 +13694,11 @@
       <w:pPr>
         <w:pStyle w:val="Heading2"/>
       </w:pPr>
-      <w:bookmarkStart w:name="_Toc24" w:id="24"/>
+      <w:bookmarkStart w:name="_Toc25" w:id="25"/>
       <w:r>
         <w:t xml:space="preserve">7.11 Tanpa Pindah Halaman dan Popup — Turbo</w:t>
       </w:r>
-      <w:bookmarkEnd w:id="24"/>
+      <w:bookmarkEnd w:id="25"/>
     </w:p>
     <w:p>
       <w:pPr>
@@ -10497,7 +13903,7 @@
       <w:pPr>
         <w:pStyle w:val="Heading2"/>
       </w:pPr>
-      <w:bookmarkStart w:name="_Toc25" w:id="25"/>
+      <w:bookmarkStart w:name="_Toc26" w:id="26"/>
       <w:r>
         <w:t xml:space="preserve">7.12 Penanganan Error 419 — </w:t>
       </w:r>
@@ -10510,7 +13916,7 @@
         </w:rPr>
         <w:t xml:space="preserve">bootstrap/app.php</w:t>
       </w:r>
-      <w:bookmarkEnd w:id="25"/>
+      <w:bookmarkEnd w:id="26"/>
     </w:p>
     <w:p>
       <w:r>
@@ -10521,11 +13927,11 @@
       <w:pPr>
         <w:pStyle w:val="Heading1"/>
       </w:pPr>
-      <w:bookmarkStart w:name="_Toc26" w:id="26"/>
+      <w:bookmarkStart w:name="_Toc27" w:id="27"/>
       <w:r>
         <w:t xml:space="preserve">8. Keamanan</w:t>
       </w:r>
-      <w:bookmarkEnd w:id="26"/>
+      <w:bookmarkEnd w:id="27"/>
     </w:p>
     <w:tbl>
       <w:tblPr>
@@ -11336,21 +14742,21 @@
       <w:pPr>
         <w:pStyle w:val="Heading1"/>
       </w:pPr>
-      <w:bookmarkStart w:name="_Toc27" w:id="27"/>
+      <w:bookmarkStart w:name="_Toc28" w:id="28"/>
       <w:r>
         <w:t xml:space="preserve">9. Debugging</w:t>
       </w:r>
-      <w:bookmarkEnd w:id="27"/>
+      <w:bookmarkEnd w:id="28"/>
     </w:p>
     <w:p>
       <w:pPr>
         <w:pStyle w:val="Heading2"/>
       </w:pPr>
-      <w:bookmarkStart w:name="_Toc28" w:id="28"/>
+      <w:bookmarkStart w:name="_Toc29" w:id="29"/>
       <w:r>
         <w:t xml:space="preserve">9.1 Bug yang Ditemukan dan Perbaikannya</w:t>
       </w:r>
-      <w:bookmarkEnd w:id="28"/>
+      <w:bookmarkEnd w:id="29"/>
     </w:p>
     <w:tbl>
       <w:tblPr>
@@ -13914,11 +17320,11 @@
       <w:pPr>
         <w:pStyle w:val="Heading2"/>
       </w:pPr>
-      <w:bookmarkStart w:name="_Toc29" w:id="29"/>
+      <w:bookmarkStart w:name="_Toc30" w:id="30"/>
       <w:r>
         <w:t xml:space="preserve">9.2 Teknik Debugging</w:t>
       </w:r>
-      <w:bookmarkEnd w:id="29"/>
+      <w:bookmarkEnd w:id="30"/>
     </w:p>
     <w:p>
       <w:pPr>
@@ -14118,11 +17524,11 @@
       <w:pPr>
         <w:pStyle w:val="Heading1"/>
       </w:pPr>
-      <w:bookmarkStart w:name="_Toc30" w:id="30"/>
+      <w:bookmarkStart w:name="_Toc31" w:id="31"/>
       <w:r>
         <w:t xml:space="preserve">10. Pengujian Unit Program</w:t>
       </w:r>
-      <w:bookmarkEnd w:id="30"/>
+      <w:bookmarkEnd w:id="31"/>
     </w:p>
     <w:p>
       <w:r>
@@ -14208,7 +17614,7 @@
           <w:b/>
           <w:bCs/>
         </w:rPr>
-        <w:t xml:space="preserve">80 passed (276 assertions)</w:t>
+        <w:t xml:space="preserve">80 passed (275 assertions)</w:t>
       </w:r>
       <w:r>
         <w:t xml:space="preserve">.</w:t>
@@ -15573,7 +18979,7 @@
                 <w:sz w:val="19"/>
                 <w:szCs w:val="19"/>
               </w:rPr>
-              <w:t xml:space="preserve">Penyimpanan gambar gagal (profil, barang, barang keluar): kembali ke form dengan pesan, bukan error 500, data tidak tersimpan; penyebab dicatat dalam satu baris log pendek dan ditampilkan untuk Admin</w:t>
+              <w:t xml:space="preserve">Penyimpanan gambar gagal (profil, barang, barang keluar): kembali ke form dengan pesan, bukan error 500, data tidak tersimpan; penyebab dicatat dalam satu baris log pendek, pesan di layar tanpa detail teknis</w:t>
             </w:r>
           </w:p>
         </w:tc>
@@ -16725,11 +20131,11 @@
       <w:pPr>
         <w:pStyle w:val="Heading1"/>
       </w:pPr>
-      <w:bookmarkStart w:name="_Toc31" w:id="31"/>
+      <w:bookmarkStart w:name="_Toc32" w:id="32"/>
       <w:r>
         <w:t xml:space="preserve">11. Pemetaan Unit Kompetensi</w:t>
       </w:r>
-      <w:bookmarkEnd w:id="31"/>
+      <w:bookmarkEnd w:id="32"/>
     </w:p>
     <w:tbl>
       <w:tblPr>
@@ -18069,11 +21475,11 @@
       <w:pPr>
         <w:pStyle w:val="Heading1"/>
       </w:pPr>
-      <w:bookmarkStart w:name="_Toc32" w:id="32"/>
+      <w:bookmarkStart w:name="_Toc33" w:id="33"/>
       <w:r>
         <w:t xml:space="preserve">12. Skenario Demo</w:t>
       </w:r>
-      <w:bookmarkEnd w:id="32"/>
+      <w:bookmarkEnd w:id="33"/>
     </w:p>
     <w:p>
       <w:pPr>

</xml_diff>